<commit_message>
docs(articulo): update the article, evaluation and documentation to the final system
- Re-run the prototype evaluation on the redesigned system: k6 over the real interface flow
  (p95 45/168/420 ms with 1/20/50 users, 0 % errors), 13 of 13 security cases (new: static asset
  headers, literal search wildcards, login attempt limit) and Lighthouse (accessibility 100 on
  the three pages evaluated).
- Add the alert-model calibration figure and results, the data quality audit findings, the
  corrected explanation defect, the plain-language explanation layer and new interface figures.
- Keep the abstract within the template's 200-250 words; keep tables of up to eight rows on one page.
- Update the traceability map, README and decision log (D15, D16).
</commit_message>
<xml_diff>
--- a/docs/articulo/Articulo_Cientifico_Final.docx
+++ b/docs/articulo/Articulo_Cientifico_Final.docx
@@ -81,7 +81,7 @@
           <w:sz w:val="20"/>
           <w:szCs w:val="20"/>
         </w:rPr>
-        <w:t xml:space="preserve">La detección tardía del atraso en obras públicas genera sobrecostos y paralizaciones: en junio de 2026 la Contraloría reportaba 2 262 obras paralizadas en el Perú. El objetivo fue desarrollar y evaluar un prototipo de alerta temprana que estime, solo con datos abiertos oficiales, el riesgo de que una obra en ejecución incurra en atraso normativo. Se aplicó investigación basada en diseño con evaluación cuantitativa retrospectiva: se integraron registros de OECE, MEF y Contraloría (precisión de enlace: 99,1 %), se construyó un panel obra-mes sin fuga temporal a partir de 2,73 millones de asientos del cuaderno de obra digital y se comparó un modelo LightGBM con variables estructuradas (A) frente a otro que incorpora el texto de los asientos (B). El evento fue el primer asiento que aplica la regla del 80 % del RLCE (art. 203) o del RLGCP (art. 207) dentro de 60 días. En la prueba temporal ciega nacional (16 756 observaciones de 5 158 obras; prevalencia 5,0 %), B elevó el ROC-AUC de 0,742 a 0,774 (diferencia +0,032; IC 95 % [0,019; 0,045]) y el PR-AUC de 0,139 a 0,158; en Arequipa la mejora no fue significativa. Un segundo modelo sobre 139 159 obras de INFOBRAS alcanzó ROC-AUC de 0,753 con seguimiento presupuestal mensual. El prototipo web explica cada alerta con TreeSHAP y evidencia trazable, aprobó 10 de 10 pruebas de seguridad y respondió con p95 de 191 ms ante 20 usuarios concurrentes. Los datos abiertos permiten priorizar la supervisión con señal moderada, no decidir automáticamente.</w:t>
+        <w:t xml:space="preserve">La detección tardía del atraso en obras públicas genera sobrecostos y paralizaciones: en junio de 2026 la Contraloría reportaba 2 262 obras paralizadas en el Perú. El objetivo fue desarrollar y evaluar un prototipo de alerta temprana que estime, solo con datos abiertos oficiales, el riesgo de que una obra en ejecución incurra en atraso normativo. Se aplicó investigación basada en diseño con evaluación cuantitativa retrospectiva: se integraron registros de OECE, MEF y Contraloría (precisión de enlace: 99,1 %), se construyó un panel obra-mes sin fuga temporal con 2,73 millones de asientos del cuaderno de obra digital y se comparó un modelo LightGBM con variables estructuradas (A) frente a otro que incorpora el texto de los asientos (B). El evento fue el primer asiento que aplica la regla del 80 % (RLCE, art. 203; RLGCP, art. 207) dentro de 60 días. En la prueba temporal ciega nacional (16 756 observaciones; prevalencia 5,0 %), B elevó el ROC-AUC de 0,742 a 0,774 (diferencia con IC 95 % [0,019; 0,045]) y el PR-AUC de 0,139 a 0,158, con probabilidades calibradas; en Arequipa la mejora no fue significativa. Un segundo modelo sobre 139 159 obras de INFOBRAS alcanzó un ROC-AUC de 0,753 con seguimiento presupuestal mensual. El prototipo web explica cada estimación en lenguaje claro con TreeSHAP y evidencia trazable, aprobó 13 de 13 pruebas de seguridad y respondió con p95 de 168 ms ante 20 usuarios concurrentes. Los datos abiertos permiten priorizar la supervisión con señal moderada, no decidir automáticamente.</w:t>
       </w:r>
     </w:p>
     <w:p>
@@ -139,7 +139,7 @@
           <w:sz w:val="20"/>
           <w:szCs w:val="20"/>
         </w:rPr>
-        <w:t xml:space="preserve">Late detection of delays in public works leads to cost overruns, disputes and stoppages: as of June 2026, Peru’s Office of the Comptroller General reported 2,262 stalled public works. This study aimed to develop and evaluate an early warning prototype that estimates, using only official open data, the risk that an ongoing public work will incur a regulatory delay. A design science approach with retrospective quantitative evaluation was followed: records from OECE, MEF and the Comptroller’s Office were integrated through entity resolution with a measured precision of 99.1%, a leakage-free work-month panel was built from 2.73 million entries of the digital site logbook, and a LightGBM model with structured variables (A) was compared with a model that also uses the text of logbook entries (B). The target event was the first entry applying the 80% rule of the procurement regulations (RLCE art. 203; RLGCP art. 207) within 60 days. On the blind national temporal test set (16,756 observations from 5,158 works; prevalence 5.0%), model B increased ROC-AUC from 0.742 to 0.774 (difference +0.032; 95% CI [0.019, 0.045]) and PR-AUC from 0.139 to 0.158; in Arequipa the improvement was not significant. A second model over 139,159 INFOBRAS works reached a ROC-AUC of 0.753 with monthly budget execution tracking. The web prototype explains each alert with TreeSHAP and traceable evidence, passed 10 of 10 security tests and served requests with a p95 latency of 191 ms under 20 concurrent users. Open data support prioritizing supervision with a moderate signal, not automated decisions.</w:t>
+        <w:t xml:space="preserve">Late detection of delays in public works leads to cost overruns and stoppages: in June 2026, Peru's Office of the Comptroller General reported 2,262 stalled public works. This study aimed to develop and evaluate an early warning prototype that estimates, using only official open data, the risk that an ongoing public work will incur a regulatory delay. A design science approach with retrospective quantitative evaluation was followed: records from OECE, MEF and the Comptroller's Office were integrated (entity resolution precision: 99.1%), a leakage-free work-month panel was built from 2.73 million entries of the digital site logbook, and a LightGBM model with structured variables (A) was compared with a model that also uses the text of logbook entries (B). The target event was the first entry applying the 80% rule (RLCE art. 203; RLGCP art. 207) within 60 days. On the blind national temporal test set (16,756 observations; prevalence 5.0%), model B increased ROC-AUC from 0.742 to 0.774 (difference 95% CI [0.019, 0.045]) and PR-AUC from 0.139 to 0.158, with calibrated probabilities; in Arequipa the improvement was not significant. A second model over 139,159 INFOBRAS works reached a ROC-AUC of 0.753 with monthly budget execution tracking. The web prototype explains each estimate in plain language with TreeSHAP and traceable evidence, passed 13 of 13 security tests and served requests with a p95 latency of 168 ms under 20 concurrent users. Open data support prioritizing supervision with a moderate signal, not automated decisions.</w:t>
       </w:r>
     </w:p>
     <w:p>
@@ -540,7 +540,7 @@
           <w:sz w:val="21"/>
           <w:szCs w:val="21"/>
         </w:rPr>
-        <w:t xml:space="preserve"> Implementar un prototipo web con explicaciones por predicción y evidencia trazable, y evaluarlo en rendimiento, seguridad, accesibilidad y pruebas automatizadas.</w:t>
+        <w:t xml:space="preserve"> Implementar un prototipo web con explicaciones por predicción en lenguaje comprensible y evidencia trazable, y evaluarlo en rendimiento, seguridad, accesibilidad, calidad de datos y pruebas automatizadas.</w:t>
       </w:r>
     </w:p>
     <w:p>
@@ -640,7 +640,7 @@
           <w:sz w:val="21"/>
           <w:szCs w:val="21"/>
         </w:rPr>
-        <w:t xml:space="preserve">El trabajo aporta: (i) el primer uso documentado, en la búsqueda realizada, de los asientos abiertos del cuaderno de obra digital para alerta temprana; (ii) una etiqueta normativa reproducible; (iii) la integración medida de cinco fuentes oficiales; (iv) una evaluación libre de fuga con simulación de la operación; y (v) un prototipo funcional que liga cada alerta con sus registros de origen.</w:t>
+        <w:t xml:space="preserve">El trabajo aporta: (i) el primer uso documentado, en la búsqueda realizada, de los asientos abiertos del cuaderno de obra digital para alerta temprana; (ii) una etiqueta normativa reproducible; (iii) la integración medida de cinco fuentes oficiales; (iv) una evaluación libre de fuga con simulación de la operación y verificación de la calibración; y (v) un prototipo funcional que explica cada alerta en lenguaje claro, con la confiabilidad observada de su nivel de riesgo, y la liga con sus registros de origen.</w:t>
       </w:r>
     </w:p>
     <w:p>
@@ -1238,7 +1238,7 @@
           </w:tcPr>
           <w:p>
             <w:pPr>
-              <w:keepNext w:val="false"/>
+              <w:keepNext/>
               <w:spacing w:after="0" w:line="240"/>
               <w:jc w:val="left"/>
             </w:pPr>
@@ -1265,7 +1265,7 @@
           </w:tcPr>
           <w:p>
             <w:pPr>
-              <w:keepNext w:val="false"/>
+              <w:keepNext/>
               <w:spacing w:after="0" w:line="240"/>
               <w:jc w:val="left"/>
             </w:pPr>
@@ -1292,7 +1292,7 @@
           </w:tcPr>
           <w:p>
             <w:pPr>
-              <w:keepNext w:val="false"/>
+              <w:keepNext/>
               <w:spacing w:after="0" w:line="240"/>
               <w:jc w:val="left"/>
             </w:pPr>
@@ -1319,7 +1319,7 @@
           </w:tcPr>
           <w:p>
             <w:pPr>
-              <w:keepNext w:val="false"/>
+              <w:keepNext/>
               <w:spacing w:after="0" w:line="240"/>
               <w:jc w:val="left"/>
             </w:pPr>
@@ -1346,7 +1346,7 @@
           </w:tcPr>
           <w:p>
             <w:pPr>
-              <w:keepNext w:val="false"/>
+              <w:keepNext/>
               <w:spacing w:after="0" w:line="240"/>
               <w:jc w:val="left"/>
             </w:pPr>
@@ -1373,7 +1373,7 @@
           </w:tcPr>
           <w:p>
             <w:pPr>
-              <w:keepNext w:val="false"/>
+              <w:keepNext/>
               <w:spacing w:after="0" w:line="240"/>
               <w:jc w:val="left"/>
             </w:pPr>
@@ -1406,7 +1406,7 @@
           </w:tcPr>
           <w:p>
             <w:pPr>
-              <w:keepNext w:val="false"/>
+              <w:keepNext/>
               <w:spacing w:after="0" w:line="240"/>
               <w:jc w:val="left"/>
             </w:pPr>
@@ -1434,7 +1434,7 @@
           </w:tcPr>
           <w:p>
             <w:pPr>
-              <w:keepNext w:val="false"/>
+              <w:keepNext/>
               <w:spacing w:after="0" w:line="240"/>
               <w:jc w:val="left"/>
             </w:pPr>
@@ -1462,7 +1462,7 @@
           </w:tcPr>
           <w:p>
             <w:pPr>
-              <w:keepNext w:val="false"/>
+              <w:keepNext/>
               <w:spacing w:after="0" w:line="240"/>
               <w:jc w:val="left"/>
             </w:pPr>
@@ -1490,7 +1490,7 @@
           </w:tcPr>
           <w:p>
             <w:pPr>
-              <w:keepNext w:val="false"/>
+              <w:keepNext/>
               <w:spacing w:after="0" w:line="240"/>
               <w:jc w:val="left"/>
             </w:pPr>
@@ -1518,7 +1518,7 @@
           </w:tcPr>
           <w:p>
             <w:pPr>
-              <w:keepNext w:val="false"/>
+              <w:keepNext/>
               <w:spacing w:after="0" w:line="240"/>
               <w:jc w:val="left"/>
             </w:pPr>
@@ -1546,7 +1546,7 @@
           </w:tcPr>
           <w:p>
             <w:pPr>
-              <w:keepNext w:val="false"/>
+              <w:keepNext/>
               <w:spacing w:after="0" w:line="240"/>
               <w:jc w:val="left"/>
             </w:pPr>
@@ -1578,7 +1578,7 @@
           </w:tcPr>
           <w:p>
             <w:pPr>
-              <w:keepNext w:val="false"/>
+              <w:keepNext/>
               <w:spacing w:after="0" w:line="240"/>
               <w:jc w:val="left"/>
             </w:pPr>
@@ -1605,7 +1605,7 @@
           </w:tcPr>
           <w:p>
             <w:pPr>
-              <w:keepNext w:val="false"/>
+              <w:keepNext/>
               <w:spacing w:after="0" w:line="240"/>
               <w:jc w:val="left"/>
             </w:pPr>
@@ -1632,7 +1632,7 @@
           </w:tcPr>
           <w:p>
             <w:pPr>
-              <w:keepNext w:val="false"/>
+              <w:keepNext/>
               <w:spacing w:after="0" w:line="240"/>
               <w:jc w:val="left"/>
             </w:pPr>
@@ -1659,7 +1659,7 @@
           </w:tcPr>
           <w:p>
             <w:pPr>
-              <w:keepNext w:val="false"/>
+              <w:keepNext/>
               <w:spacing w:after="0" w:line="240"/>
               <w:jc w:val="left"/>
             </w:pPr>
@@ -1686,7 +1686,7 @@
           </w:tcPr>
           <w:p>
             <w:pPr>
-              <w:keepNext w:val="false"/>
+              <w:keepNext/>
               <w:spacing w:after="0" w:line="240"/>
               <w:jc w:val="left"/>
             </w:pPr>
@@ -1713,7 +1713,7 @@
           </w:tcPr>
           <w:p>
             <w:pPr>
-              <w:keepNext w:val="false"/>
+              <w:keepNext/>
               <w:spacing w:after="0" w:line="240"/>
               <w:jc w:val="left"/>
             </w:pPr>
@@ -1746,7 +1746,7 @@
           </w:tcPr>
           <w:p>
             <w:pPr>
-              <w:keepNext w:val="false"/>
+              <w:keepNext/>
               <w:spacing w:after="0" w:line="240"/>
               <w:jc w:val="left"/>
             </w:pPr>
@@ -1774,7 +1774,7 @@
           </w:tcPr>
           <w:p>
             <w:pPr>
-              <w:keepNext w:val="false"/>
+              <w:keepNext/>
               <w:spacing w:after="0" w:line="240"/>
               <w:jc w:val="left"/>
             </w:pPr>
@@ -1802,7 +1802,7 @@
           </w:tcPr>
           <w:p>
             <w:pPr>
-              <w:keepNext w:val="false"/>
+              <w:keepNext/>
               <w:spacing w:after="0" w:line="240"/>
               <w:jc w:val="left"/>
             </w:pPr>
@@ -1830,7 +1830,7 @@
           </w:tcPr>
           <w:p>
             <w:pPr>
-              <w:keepNext w:val="false"/>
+              <w:keepNext/>
               <w:spacing w:after="0" w:line="240"/>
               <w:jc w:val="left"/>
             </w:pPr>
@@ -1858,7 +1858,7 @@
           </w:tcPr>
           <w:p>
             <w:pPr>
-              <w:keepNext w:val="false"/>
+              <w:keepNext/>
               <w:spacing w:after="0" w:line="240"/>
               <w:jc w:val="left"/>
             </w:pPr>
@@ -1886,7 +1886,7 @@
           </w:tcPr>
           <w:p>
             <w:pPr>
-              <w:keepNext w:val="false"/>
+              <w:keepNext/>
               <w:spacing w:after="0" w:line="240"/>
               <w:jc w:val="left"/>
             </w:pPr>
@@ -1918,7 +1918,7 @@
           </w:tcPr>
           <w:p>
             <w:pPr>
-              <w:keepNext w:val="false"/>
+              <w:keepNext/>
               <w:spacing w:after="0" w:line="240"/>
               <w:jc w:val="left"/>
             </w:pPr>
@@ -1945,7 +1945,7 @@
           </w:tcPr>
           <w:p>
             <w:pPr>
-              <w:keepNext w:val="false"/>
+              <w:keepNext/>
               <w:spacing w:after="0" w:line="240"/>
               <w:jc w:val="left"/>
             </w:pPr>
@@ -1972,7 +1972,7 @@
           </w:tcPr>
           <w:p>
             <w:pPr>
-              <w:keepNext w:val="false"/>
+              <w:keepNext/>
               <w:spacing w:after="0" w:line="240"/>
               <w:jc w:val="left"/>
             </w:pPr>
@@ -1999,7 +1999,7 @@
           </w:tcPr>
           <w:p>
             <w:pPr>
-              <w:keepNext w:val="false"/>
+              <w:keepNext/>
               <w:spacing w:after="0" w:line="240"/>
               <w:jc w:val="left"/>
             </w:pPr>
@@ -2026,7 +2026,7 @@
           </w:tcPr>
           <w:p>
             <w:pPr>
-              <w:keepNext w:val="false"/>
+              <w:keepNext/>
               <w:spacing w:after="0" w:line="240"/>
               <w:jc w:val="left"/>
             </w:pPr>
@@ -2053,7 +2053,7 @@
           </w:tcPr>
           <w:p>
             <w:pPr>
-              <w:keepNext w:val="false"/>
+              <w:keepNext/>
               <w:spacing w:after="0" w:line="240"/>
               <w:jc w:val="left"/>
             </w:pPr>
@@ -2086,7 +2086,7 @@
           </w:tcPr>
           <w:p>
             <w:pPr>
-              <w:keepNext w:val="false"/>
+              <w:keepNext/>
               <w:spacing w:after="0" w:line="240"/>
               <w:jc w:val="left"/>
             </w:pPr>
@@ -2114,7 +2114,7 @@
           </w:tcPr>
           <w:p>
             <w:pPr>
-              <w:keepNext w:val="false"/>
+              <w:keepNext/>
               <w:spacing w:after="0" w:line="240"/>
               <w:jc w:val="left"/>
             </w:pPr>
@@ -2142,7 +2142,7 @@
           </w:tcPr>
           <w:p>
             <w:pPr>
-              <w:keepNext w:val="false"/>
+              <w:keepNext/>
               <w:spacing w:after="0" w:line="240"/>
               <w:jc w:val="left"/>
             </w:pPr>
@@ -2170,7 +2170,7 @@
           </w:tcPr>
           <w:p>
             <w:pPr>
-              <w:keepNext w:val="false"/>
+              <w:keepNext/>
               <w:spacing w:after="0" w:line="240"/>
               <w:jc w:val="left"/>
             </w:pPr>
@@ -2198,7 +2198,7 @@
           </w:tcPr>
           <w:p>
             <w:pPr>
-              <w:keepNext w:val="false"/>
+              <w:keepNext/>
               <w:spacing w:after="0" w:line="240"/>
               <w:jc w:val="left"/>
             </w:pPr>
@@ -2226,7 +2226,7 @@
           </w:tcPr>
           <w:p>
             <w:pPr>
-              <w:keepNext w:val="false"/>
+              <w:keepNext/>
               <w:spacing w:after="0" w:line="240"/>
               <w:jc w:val="left"/>
             </w:pPr>
@@ -2258,7 +2258,7 @@
           </w:tcPr>
           <w:p>
             <w:pPr>
-              <w:keepNext w:val="false"/>
+              <w:keepNext/>
               <w:spacing w:after="0" w:line="240"/>
               <w:jc w:val="left"/>
             </w:pPr>
@@ -2285,7 +2285,7 @@
           </w:tcPr>
           <w:p>
             <w:pPr>
-              <w:keepNext w:val="false"/>
+              <w:keepNext/>
               <w:spacing w:after="0" w:line="240"/>
               <w:jc w:val="left"/>
             </w:pPr>
@@ -2312,7 +2312,7 @@
           </w:tcPr>
           <w:p>
             <w:pPr>
-              <w:keepNext w:val="false"/>
+              <w:keepNext/>
               <w:spacing w:after="0" w:line="240"/>
               <w:jc w:val="left"/>
             </w:pPr>
@@ -2339,7 +2339,7 @@
           </w:tcPr>
           <w:p>
             <w:pPr>
-              <w:keepNext w:val="false"/>
+              <w:keepNext/>
               <w:spacing w:after="0" w:line="240"/>
               <w:jc w:val="left"/>
             </w:pPr>
@@ -2366,7 +2366,7 @@
           </w:tcPr>
           <w:p>
             <w:pPr>
-              <w:keepNext w:val="false"/>
+              <w:keepNext/>
               <w:spacing w:after="0" w:line="240"/>
               <w:jc w:val="left"/>
             </w:pPr>
@@ -2393,7 +2393,7 @@
           </w:tcPr>
           <w:p>
             <w:pPr>
-              <w:keepNext w:val="false"/>
+              <w:keepNext/>
               <w:spacing w:after="0" w:line="240"/>
               <w:jc w:val="left"/>
             </w:pPr>
@@ -4272,7 +4272,7 @@
                 <w:sz w:val="16"/>
                 <w:szCs w:val="16"/>
               </w:rPr>
-              <w:t xml:space="preserve">Precisión y exhaustividad operativas</w:t>
+              <w:t xml:space="preserve">Calibración</w:t>
             </w:r>
           </w:p>
         </w:tc>
@@ -4300,7 +4300,7 @@
                 <w:sz w:val="16"/>
                 <w:szCs w:val="16"/>
               </w:rPr>
-              <w:t xml:space="preserve">TP/(TP+FP) y TP/(TP+FN) de la política de alerta en cada corte mensual</w:t>
+              <w:t xml:space="preserve">Tasa observada del evento frente a la probabilidad media estimada, por decil y por nivel de riesgo [39]</w:t>
             </w:r>
           </w:p>
         </w:tc>
@@ -4360,7 +4360,7 @@
                 <w:sz w:val="16"/>
                 <w:szCs w:val="16"/>
               </w:rPr>
-              <w:t xml:space="preserve">Diferencia B − A</w:t>
+              <w:t xml:space="preserve">Precisión y exhaustividad operativas</w:t>
             </w:r>
           </w:p>
         </w:tc>
@@ -4387,7 +4387,7 @@
                 <w:sz w:val="16"/>
                 <w:szCs w:val="16"/>
               </w:rPr>
-              <w:t xml:space="preserve">Media e IC 95 % por bootstrap pareado de obras (1 000 remuestreos) [39]</w:t>
+              <w:t xml:space="preserve">TP/(TP+FP) y TP/(TP+FN) de la política de alerta en cada corte mensual</w:t>
             </w:r>
           </w:p>
         </w:tc>
@@ -4414,7 +4414,7 @@
                 <w:sz w:val="16"/>
                 <w:szCs w:val="16"/>
               </w:rPr>
-              <w:t xml:space="preserve">Script de comparación</w:t>
+              <w:t xml:space="preserve">Backtest as-of</w:t>
             </w:r>
           </w:p>
         </w:tc>
@@ -4447,7 +4447,7 @@
                 <w:sz w:val="16"/>
                 <w:szCs w:val="16"/>
               </w:rPr>
-              <w:t xml:space="preserve">Precisión de enlace</w:t>
+              <w:t xml:space="preserve">Diferencia B − A</w:t>
             </w:r>
           </w:p>
         </w:tc>
@@ -4475,7 +4475,7 @@
                 <w:sz w:val="16"/>
                 <w:szCs w:val="16"/>
               </w:rPr>
-              <w:t xml:space="preserve">Proporción de enlaces cuaderno→CUI correctos en pares con CUI explícito</w:t>
+              <w:t xml:space="preserve">Media e IC 95 % por bootstrap pareado de obras (1 000 remuestreos) [40]</w:t>
             </w:r>
           </w:p>
         </w:tc>
@@ -4503,7 +4503,7 @@
                 <w:sz w:val="16"/>
                 <w:szCs w:val="16"/>
               </w:rPr>
-              <w:t xml:space="preserve">Conjunto de verdad de 10 075 pares</w:t>
+              <w:t xml:space="preserve">Script de comparación</w:t>
             </w:r>
           </w:p>
         </w:tc>
@@ -4535,7 +4535,7 @@
                 <w:sz w:val="16"/>
                 <w:szCs w:val="16"/>
               </w:rPr>
-              <w:t xml:space="preserve">Latencia p95 y throughput</w:t>
+              <w:t xml:space="preserve">Precisión de enlace</w:t>
             </w:r>
           </w:p>
         </w:tc>
@@ -4562,7 +4562,7 @@
                 <w:sz w:val="16"/>
                 <w:szCs w:val="16"/>
               </w:rPr>
-              <w:t xml:space="preserve">Percentil 95 del tiempo de respuesta y solicitudes/s con 1, 20 y 50 usuarios concurrentes</w:t>
+              <w:t xml:space="preserve">Proporción de enlaces cuaderno→CUI correctos en pares con CUI explícito</w:t>
             </w:r>
           </w:p>
         </w:tc>
@@ -4589,7 +4589,7 @@
                 <w:sz w:val="16"/>
                 <w:szCs w:val="16"/>
               </w:rPr>
-              <w:t xml:space="preserve">k6</w:t>
+              <w:t xml:space="preserve">Conjunto de verdad de 10 075 pares</w:t>
             </w:r>
           </w:p>
         </w:tc>
@@ -4622,7 +4622,7 @@
                 <w:sz w:val="16"/>
                 <w:szCs w:val="16"/>
               </w:rPr>
-              <w:t xml:space="preserve">Casos de seguridad aprobados</w:t>
+              <w:t xml:space="preserve">Latencia p95 y throughput</w:t>
             </w:r>
           </w:p>
         </w:tc>
@@ -4650,7 +4650,7 @@
                 <w:sz w:val="16"/>
                 <w:szCs w:val="16"/>
               </w:rPr>
-              <w:t xml:space="preserve">Casos superados / casos ejecutados, por categoría OWASP Top 10 [40]</w:t>
+              <w:t xml:space="preserve">Percentil 95 del tiempo de respuesta y solicitudes/s con 1, 20 y 50 usuarios concurrentes</w:t>
             </w:r>
           </w:p>
         </w:tc>
@@ -4678,7 +4678,7 @@
                 <w:sz w:val="16"/>
                 <w:szCs w:val="16"/>
               </w:rPr>
-              <w:t xml:space="preserve">Script de pruebas de caja negra</w:t>
+              <w:t xml:space="preserve">k6</w:t>
             </w:r>
           </w:p>
         </w:tc>
@@ -4710,7 +4710,7 @@
                 <w:sz w:val="16"/>
                 <w:szCs w:val="16"/>
               </w:rPr>
-              <w:t xml:space="preserve">Accesibilidad y buenas prácticas</w:t>
+              <w:t xml:space="preserve">Casos de seguridad aprobados</w:t>
             </w:r>
           </w:p>
         </w:tc>
@@ -4737,7 +4737,7 @@
                 <w:sz w:val="16"/>
                 <w:szCs w:val="16"/>
               </w:rPr>
-              <w:t xml:space="preserve">Puntaje de 0 a 100</w:t>
+              <w:t xml:space="preserve">Casos superados / casos ejecutados, por categoría OWASP Top 10 [41]</w:t>
             </w:r>
           </w:p>
         </w:tc>
@@ -4764,7 +4764,7 @@
                 <w:sz w:val="16"/>
                 <w:szCs w:val="16"/>
               </w:rPr>
-              <w:t xml:space="preserve">Lighthouse</w:t>
+              <w:t xml:space="preserve">Script de pruebas de caja negra</w:t>
             </w:r>
           </w:p>
         </w:tc>
@@ -4797,7 +4797,7 @@
                 <w:sz w:val="16"/>
                 <w:szCs w:val="16"/>
               </w:rPr>
-              <w:t xml:space="preserve">Pruebas automatizadas</w:t>
+              <w:t xml:space="preserve">Accesibilidad y buenas prácticas</w:t>
             </w:r>
           </w:p>
         </w:tc>
@@ -4825,7 +4825,182 @@
                 <w:sz w:val="16"/>
                 <w:szCs w:val="16"/>
               </w:rPr>
-              <w:t xml:space="preserve">Pruebas aprobadas / ejecutadas (unitarias, no-fuga, API)</w:t>
+              <w:t xml:space="preserve">Puntaje de 0 a 100</w:t>
+            </w:r>
+          </w:p>
+        </w:tc>
+        <w:tc>
+          <w:tcPr>
+            <w:tcW w:type="dxa" w:w="3387"/>
+            <w:shd w:fill="F5F8FC" w:color="auto" w:val="clear"/>
+            <w:tcMar>
+              <w:top w:type="dxa" w:w="50"/>
+              <w:left w:type="dxa" w:w="80"/>
+              <w:bottom w:type="dxa" w:w="50"/>
+              <w:right w:type="dxa" w:w="80"/>
+            </w:tcMar>
+            <w:vAlign w:val="center"/>
+          </w:tcPr>
+          <w:p>
+            <w:pPr>
+              <w:keepNext w:val="false"/>
+              <w:spacing w:after="0" w:line="240"/>
+              <w:jc w:val="left"/>
+            </w:pPr>
+            <w:r>
+              <w:rPr>
+                <w:rFonts w:ascii="Arial" w:cs="Arial" w:eastAsia="Arial" w:hAnsi="Arial"/>
+                <w:sz w:val="16"/>
+                <w:szCs w:val="16"/>
+              </w:rPr>
+              <w:t xml:space="preserve">Lighthouse</w:t>
+            </w:r>
+          </w:p>
+        </w:tc>
+      </w:tr>
+      <w:tr>
+        <w:trPr>
+          <w:cantSplit/>
+        </w:trPr>
+        <w:tc>
+          <w:tcPr>
+            <w:tcW w:type="dxa" w:w="1880"/>
+            <w:tcMar>
+              <w:top w:type="dxa" w:w="50"/>
+              <w:left w:type="dxa" w:w="80"/>
+              <w:bottom w:type="dxa" w:w="50"/>
+              <w:right w:type="dxa" w:w="80"/>
+            </w:tcMar>
+            <w:vAlign w:val="center"/>
+          </w:tcPr>
+          <w:p>
+            <w:pPr>
+              <w:keepNext w:val="false"/>
+              <w:spacing w:after="0" w:line="240"/>
+              <w:jc w:val="left"/>
+            </w:pPr>
+            <w:r>
+              <w:rPr>
+                <w:rFonts w:ascii="Arial" w:cs="Arial" w:eastAsia="Arial" w:hAnsi="Arial"/>
+                <w:sz w:val="16"/>
+                <w:szCs w:val="16"/>
+              </w:rPr>
+              <w:t xml:space="preserve">Calidad de datos</w:t>
+            </w:r>
+          </w:p>
+        </w:tc>
+        <w:tc>
+          <w:tcPr>
+            <w:tcW w:type="dxa" w:w="4137"/>
+            <w:tcMar>
+              <w:top w:type="dxa" w:w="50"/>
+              <w:left w:type="dxa" w:w="80"/>
+              <w:bottom w:type="dxa" w:w="50"/>
+              <w:right w:type="dxa" w:w="80"/>
+            </w:tcMar>
+            <w:vAlign w:val="center"/>
+          </w:tcPr>
+          <w:p>
+            <w:pPr>
+              <w:keepNext w:val="false"/>
+              <w:spacing w:after="0" w:line="240"/>
+              <w:jc w:val="left"/>
+            </w:pPr>
+            <w:r>
+              <w:rPr>
+                <w:rFonts w:ascii="Arial" w:cs="Arial" w:eastAsia="Arial" w:hAnsi="Arial"/>
+                <w:sz w:val="16"/>
+                <w:szCs w:val="16"/>
+              </w:rPr>
+              <w:t xml:space="preserve">Chequeos con hallazgos / chequeos ejecutados (duplicados, nulos, fechas, relaciones entre fuentes, frescura)</w:t>
+            </w:r>
+          </w:p>
+        </w:tc>
+        <w:tc>
+          <w:tcPr>
+            <w:tcW w:type="dxa" w:w="3387"/>
+            <w:tcMar>
+              <w:top w:type="dxa" w:w="50"/>
+              <w:left w:type="dxa" w:w="80"/>
+              <w:bottom w:type="dxa" w:w="50"/>
+              <w:right w:type="dxa" w:w="80"/>
+            </w:tcMar>
+            <w:vAlign w:val="center"/>
+          </w:tcPr>
+          <w:p>
+            <w:pPr>
+              <w:keepNext w:val="false"/>
+              <w:spacing w:after="0" w:line="240"/>
+              <w:jc w:val="left"/>
+            </w:pPr>
+            <w:r>
+              <w:rPr>
+                <w:rFonts w:ascii="Arial" w:cs="Arial" w:eastAsia="Arial" w:hAnsi="Arial"/>
+                <w:sz w:val="16"/>
+                <w:szCs w:val="16"/>
+              </w:rPr>
+              <w:t xml:space="preserve">Auditoría SQL automática sobre la base cargada</w:t>
+            </w:r>
+          </w:p>
+        </w:tc>
+      </w:tr>
+      <w:tr>
+        <w:trPr>
+          <w:cantSplit/>
+        </w:trPr>
+        <w:tc>
+          <w:tcPr>
+            <w:tcW w:type="dxa" w:w="1880"/>
+            <w:shd w:fill="F5F8FC" w:color="auto" w:val="clear"/>
+            <w:tcMar>
+              <w:top w:type="dxa" w:w="50"/>
+              <w:left w:type="dxa" w:w="80"/>
+              <w:bottom w:type="dxa" w:w="50"/>
+              <w:right w:type="dxa" w:w="80"/>
+            </w:tcMar>
+            <w:vAlign w:val="center"/>
+          </w:tcPr>
+          <w:p>
+            <w:pPr>
+              <w:keepNext w:val="false"/>
+              <w:spacing w:after="0" w:line="240"/>
+              <w:jc w:val="left"/>
+            </w:pPr>
+            <w:r>
+              <w:rPr>
+                <w:rFonts w:ascii="Arial" w:cs="Arial" w:eastAsia="Arial" w:hAnsi="Arial"/>
+                <w:sz w:val="16"/>
+                <w:szCs w:val="16"/>
+              </w:rPr>
+              <w:t xml:space="preserve">Pruebas automatizadas</w:t>
+            </w:r>
+          </w:p>
+        </w:tc>
+        <w:tc>
+          <w:tcPr>
+            <w:tcW w:type="dxa" w:w="4137"/>
+            <w:shd w:fill="F5F8FC" w:color="auto" w:val="clear"/>
+            <w:tcMar>
+              <w:top w:type="dxa" w:w="50"/>
+              <w:left w:type="dxa" w:w="80"/>
+              <w:bottom w:type="dxa" w:w="50"/>
+              <w:right w:type="dxa" w:w="80"/>
+            </w:tcMar>
+            <w:vAlign w:val="center"/>
+          </w:tcPr>
+          <w:p>
+            <w:pPr>
+              <w:keepNext w:val="false"/>
+              <w:spacing w:after="0" w:line="240"/>
+              <w:jc w:val="left"/>
+            </w:pPr>
+            <w:r>
+              <w:rPr>
+                <w:rFonts w:ascii="Arial" w:cs="Arial" w:eastAsia="Arial" w:hAnsi="Arial"/>
+                <w:sz w:val="16"/>
+                <w:szCs w:val="16"/>
+              </w:rPr>
+              <w:t xml:space="preserve">Pruebas aprobadas / ejecutadas (unitarias, no-fuga, API, regresión)</w:t>
             </w:r>
           </w:p>
         </w:tc>
@@ -4893,7 +5068,7 @@
           <w:sz w:val="21"/>
           <w:szCs w:val="21"/>
         </w:rPr>
-        <w:t xml:space="preserve">Se emplearon análisis documental de la normativa (textos oficiales descargados), auditoría de datos (reportes de calidad por fuente), pruebas automatizadas con pytest (incluidas pruebas que recalculan variables sobre los datos reales para detectar fuga), pruebas de carga con k6, pruebas de seguridad de caja negra alineadas con OWASP Top 10, auditorías de Lighthouse y registros de la aplicación. La calidad del producto se organizó según las características de ISO/IEC 25010 [41] (adecuación funcional, eficiencia de desempeño y seguridad).</w:t>
+        <w:t xml:space="preserve">Se emplearon análisis documental de la normativa (textos oficiales descargados), auditoría de datos (reportes de calidad por fuente y 29 chequeos automáticos sobre la base cargada), pruebas automatizadas con pytest (incluidas pruebas que recalculan variables sobre los datos reales para detectar fuga), pruebas de carga con k6, pruebas de seguridad de caja negra alineadas con OWASP Top 10, auditorías de Lighthouse y registros de la aplicación. La calidad del producto se organizó según las características de ISO/IEC 25010 [42] (adecuación funcional, eficiencia de desempeño y seguridad).</w:t>
       </w:r>
     </w:p>
     <w:p>
@@ -4968,7 +5143,7 @@
           <w:sz w:val="21"/>
           <w:szCs w:val="21"/>
         </w:rPr>
-        <w:t xml:space="preserve">Resolución de entidades: el cuaderno no contiene el código único de inversión (CUI); se recuperó mediante expresiones regulares y similitud TF-IDF de n-gramas de caracteres bloqueada por departamento [42], [43], calibrada con 10 075 pares con CUI explícito.</w:t>
+        <w:t xml:space="preserve">Resolución de entidades: el cuaderno no contiene el código único de inversión (CUI); se recuperó mediante expresiones regulares y similitud TF-IDF de n-gramas de caracteres bloqueada por departamento [43], [44], calibrada con 10 075 pares con CUI explícito.</w:t>
       </w:r>
     </w:p>
     <w:p>
@@ -5094,7 +5269,7 @@
           <w:sz w:val="21"/>
           <w:szCs w:val="21"/>
         </w:rPr>
-        <w:t xml:space="preserve">Python 3.12 con pandas y DuckDB para procesar archivos de hasta 10 GB sin servidor de datos; LightGBM [44] por su desempeño en datos tabulares con valores faltantes, comparado con regresión logística, bosques aleatorios [45] y XGBoost [46] en scikit-learn [47]; Sentence-BERT multilingüe (</w:t>
+        <w:t xml:space="preserve">Python 3.12 con pandas y DuckDB para procesar archivos de hasta 10 GB sin servidor de datos; LightGBM [45] por su desempeño en datos tabulares con valores faltantes, comparado con regresión logística, bosques aleatorios [46] y XGBoost [47] en scikit-learn [48]; Sentence-BERT multilingüe (</w:t>
       </w:r>
       <w:r>
         <w:rPr>
@@ -5112,7 +5287,7 @@
           <w:sz w:val="21"/>
           <w:szCs w:val="21"/>
         </w:rPr>
-        <w:t xml:space="preserve">) [48], [49] porque el texto está en español y el modelo no requiere ajuste fino; TreeSHAP [34] por ser exacto para árboles; PostgreSQL 16 con búsqueda de texto completo en español; FastAPI; React con TypeScript; y Docker Compose para reproducir el entorno.</w:t>
+        <w:t xml:space="preserve">) [49], [50] porque el texto está en español y el modelo no requiere ajuste fino; TreeSHAP [34] por ser exacto para árboles; PostgreSQL 16 con búsqueda de texto completo en español; FastAPI; React con TypeScript, Tailwind CSS, componentes accesibles de Radix UI, Recharts y Leaflet para la interfaz; y Docker Compose para reproducir el entorno.</w:t>
       </w:r>
     </w:p>
     <w:p>
@@ -5176,7 +5351,25 @@
           <w:sz w:val="21"/>
           <w:szCs w:val="21"/>
         </w:rPr>
-        <w:t xml:space="preserve">Se usaron intervalos de confianza por bootstrap con remuestreo de obras completas (conglomerados) y p-valores de una cola para diferencias pareadas; en la cartera, el remuestreo fue por entidad. La calibración de los niveles de riesgo se evaluó con la tasa observada del evento por nivel en el periodo de prueba y con el puntaje de Brier [38], [50]. La contribución de cada grupo de variables se midió con la media del valor absoluto de TreeSHAP en el conjunto de prueba.</w:t>
+        <w:t xml:space="preserve">Se usaron intervalos de confianza por bootstrap con remuestreo de obras completas (conglomerados) y p-valores de una cola para diferencias pareadas; en la cartera, el remuestreo fue por entidad. La calibración se evaluó comparando, por deciles de probabilidad y por nivel de riesgo, la probabilidad media estimada con la tasa observada del evento en el backtest </w:t>
+      </w:r>
+      <w:r>
+        <w:rPr>
+          <w:rFonts w:ascii="Arial" w:cs="Arial" w:eastAsia="Arial" w:hAnsi="Arial"/>
+          <w:i/>
+          <w:iCs/>
+          <w:sz w:val="21"/>
+          <w:szCs w:val="21"/>
+        </w:rPr>
+        <w:t xml:space="preserve">as-of</w:t>
+      </w:r>
+      <w:r>
+        <w:rPr>
+          <w:rFonts w:ascii="Arial" w:cs="Arial" w:eastAsia="Arial" w:hAnsi="Arial"/>
+          <w:sz w:val="21"/>
+          <w:szCs w:val="21"/>
+        </w:rPr>
+        <w:t xml:space="preserve">, además del puntaje de Brier [38], [39]. La contribución de cada grupo de variables se midió con la media del valor absoluto de TreeSHAP en el conjunto de prueba.</w:t>
       </w:r>
     </w:p>
     <w:p>
@@ -5756,7 +5949,7 @@
                 <w:sz w:val="16"/>
                 <w:szCs w:val="16"/>
               </w:rPr>
-              <w:t xml:space="preserve">RNF1</w:t>
+              <w:t xml:space="preserve">RF7</w:t>
             </w:r>
           </w:p>
         </w:tc>
@@ -5783,7 +5976,7 @@
                 <w:sz w:val="16"/>
                 <w:szCs w:val="16"/>
               </w:rPr>
-              <w:t xml:space="preserve">Ninguna variable puede usar información posterior a la fecha de corte (verificado con pruebas automatizadas).</w:t>
+              <w:t xml:space="preserve">Expresar cada factor en lenguaje claro e informar la confiabilidad observada del nivel de riesgo, sin convertir la estimación en certeza.</w:t>
             </w:r>
           </w:p>
         </w:tc>
@@ -5816,7 +6009,7 @@
                 <w:sz w:val="16"/>
                 <w:szCs w:val="16"/>
               </w:rPr>
-              <w:t xml:space="preserve">RNF2</w:t>
+              <w:t xml:space="preserve">RF8</w:t>
             </w:r>
           </w:p>
         </w:tc>
@@ -5844,7 +6037,7 @@
                 <w:sz w:val="16"/>
                 <w:szCs w:val="16"/>
               </w:rPr>
-              <w:t xml:space="preserve">Seguridad: validación de entrada, JWT, cabeceras de seguridad, limitación de tasa y errores sin trazas internas.</w:t>
+              <w:t xml:space="preserve">Auditar automáticamente la calidad de los datos cargados y publicar sus hallazgos y la frescura de cada fuente.</w:t>
             </w:r>
           </w:p>
         </w:tc>
@@ -5876,7 +6069,7 @@
                 <w:sz w:val="16"/>
                 <w:szCs w:val="16"/>
               </w:rPr>
-              <w:t xml:space="preserve">RNF3</w:t>
+              <w:t xml:space="preserve">RNF1</w:t>
             </w:r>
           </w:p>
         </w:tc>
@@ -5903,7 +6096,7 @@
                 <w:sz w:val="16"/>
                 <w:szCs w:val="16"/>
               </w:rPr>
-              <w:t xml:space="preserve">Reproducibilidad: pipeline versionado, huellas SHA-256 de las fuentes y despliegue con Docker.</w:t>
+              <w:t xml:space="preserve">Ninguna variable puede usar información posterior a la fecha de corte (verificado con pruebas automatizadas).</w:t>
             </w:r>
           </w:p>
         </w:tc>
@@ -5936,7 +6129,7 @@
                 <w:sz w:val="16"/>
                 <w:szCs w:val="16"/>
               </w:rPr>
-              <w:t xml:space="preserve">RNF4</w:t>
+              <w:t xml:space="preserve">RNF2</w:t>
             </w:r>
           </w:p>
         </w:tc>
@@ -5964,7 +6157,186 @@
                 <w:sz w:val="16"/>
                 <w:szCs w:val="16"/>
               </w:rPr>
+              <w:t xml:space="preserve">Seguridad: validación de entrada, JWT, cabeceras de seguridad, limitación de tasa y errores sin trazas internas.</w:t>
+            </w:r>
+          </w:p>
+        </w:tc>
+      </w:tr>
+      <w:tr>
+        <w:trPr>
+          <w:cantSplit/>
+        </w:trPr>
+        <w:tc>
+          <w:tcPr>
+            <w:tcW w:type="dxa" w:w="940"/>
+            <w:tcMar>
+              <w:top w:type="dxa" w:w="50"/>
+              <w:left w:type="dxa" w:w="80"/>
+              <w:bottom w:type="dxa" w:w="50"/>
+              <w:right w:type="dxa" w:w="80"/>
+            </w:tcMar>
+            <w:vAlign w:val="center"/>
+          </w:tcPr>
+          <w:p>
+            <w:pPr>
+              <w:keepNext w:val="false"/>
+              <w:spacing w:after="0" w:line="240"/>
+              <w:jc w:val="left"/>
+            </w:pPr>
+            <w:r>
+              <w:rPr>
+                <w:rFonts w:ascii="Arial" w:cs="Arial" w:eastAsia="Arial" w:hAnsi="Arial"/>
+                <w:sz w:val="16"/>
+                <w:szCs w:val="16"/>
+              </w:rPr>
+              <w:t xml:space="preserve">RNF3</w:t>
+            </w:r>
+          </w:p>
+        </w:tc>
+        <w:tc>
+          <w:tcPr>
+            <w:tcW w:type="dxa" w:w="8464"/>
+            <w:tcMar>
+              <w:top w:type="dxa" w:w="50"/>
+              <w:left w:type="dxa" w:w="80"/>
+              <w:bottom w:type="dxa" w:w="50"/>
+              <w:right w:type="dxa" w:w="80"/>
+            </w:tcMar>
+            <w:vAlign w:val="center"/>
+          </w:tcPr>
+          <w:p>
+            <w:pPr>
+              <w:keepNext w:val="false"/>
+              <w:spacing w:after="0" w:line="240"/>
+              <w:jc w:val="left"/>
+            </w:pPr>
+            <w:r>
+              <w:rPr>
+                <w:rFonts w:ascii="Arial" w:cs="Arial" w:eastAsia="Arial" w:hAnsi="Arial"/>
+                <w:sz w:val="16"/>
+                <w:szCs w:val="16"/>
+              </w:rPr>
+              <w:t xml:space="preserve">Reproducibilidad: pipeline versionado, huellas SHA-256 de las fuentes y despliegue con Docker.</w:t>
+            </w:r>
+          </w:p>
+        </w:tc>
+      </w:tr>
+      <w:tr>
+        <w:trPr>
+          <w:cantSplit/>
+        </w:trPr>
+        <w:tc>
+          <w:tcPr>
+            <w:tcW w:type="dxa" w:w="940"/>
+            <w:shd w:fill="F5F8FC" w:color="auto" w:val="clear"/>
+            <w:tcMar>
+              <w:top w:type="dxa" w:w="50"/>
+              <w:left w:type="dxa" w:w="80"/>
+              <w:bottom w:type="dxa" w:w="50"/>
+              <w:right w:type="dxa" w:w="80"/>
+            </w:tcMar>
+            <w:vAlign w:val="center"/>
+          </w:tcPr>
+          <w:p>
+            <w:pPr>
+              <w:keepNext w:val="false"/>
+              <w:spacing w:after="0" w:line="240"/>
+              <w:jc w:val="left"/>
+            </w:pPr>
+            <w:r>
+              <w:rPr>
+                <w:rFonts w:ascii="Arial" w:cs="Arial" w:eastAsia="Arial" w:hAnsi="Arial"/>
+                <w:sz w:val="16"/>
+                <w:szCs w:val="16"/>
+              </w:rPr>
+              <w:t xml:space="preserve">RNF4</w:t>
+            </w:r>
+          </w:p>
+        </w:tc>
+        <w:tc>
+          <w:tcPr>
+            <w:tcW w:type="dxa" w:w="8464"/>
+            <w:shd w:fill="F5F8FC" w:color="auto" w:val="clear"/>
+            <w:tcMar>
+              <w:top w:type="dxa" w:w="50"/>
+              <w:left w:type="dxa" w:w="80"/>
+              <w:bottom w:type="dxa" w:w="50"/>
+              <w:right w:type="dxa" w:w="80"/>
+            </w:tcMar>
+            <w:vAlign w:val="center"/>
+          </w:tcPr>
+          <w:p>
+            <w:pPr>
+              <w:keepNext w:val="false"/>
+              <w:spacing w:after="0" w:line="240"/>
+              <w:jc w:val="left"/>
+            </w:pPr>
+            <w:r>
+              <w:rPr>
+                <w:rFonts w:ascii="Arial" w:cs="Arial" w:eastAsia="Arial" w:hAnsi="Arial"/>
+                <w:sz w:val="16"/>
+                <w:szCs w:val="16"/>
+              </w:rPr>
               <w:t xml:space="preserve">Rendimiento: p95 &lt; 1,5 s con 20 usuarios concurrentes; accesibilidad verificable con herramientas automáticas.</w:t>
+            </w:r>
+          </w:p>
+        </w:tc>
+      </w:tr>
+      <w:tr>
+        <w:trPr>
+          <w:cantSplit/>
+        </w:trPr>
+        <w:tc>
+          <w:tcPr>
+            <w:tcW w:type="dxa" w:w="940"/>
+            <w:tcMar>
+              <w:top w:type="dxa" w:w="50"/>
+              <w:left w:type="dxa" w:w="80"/>
+              <w:bottom w:type="dxa" w:w="50"/>
+              <w:right w:type="dxa" w:w="80"/>
+            </w:tcMar>
+            <w:vAlign w:val="center"/>
+          </w:tcPr>
+          <w:p>
+            <w:pPr>
+              <w:keepNext w:val="false"/>
+              <w:spacing w:after="0" w:line="240"/>
+              <w:jc w:val="left"/>
+            </w:pPr>
+            <w:r>
+              <w:rPr>
+                <w:rFonts w:ascii="Arial" w:cs="Arial" w:eastAsia="Arial" w:hAnsi="Arial"/>
+                <w:sz w:val="16"/>
+                <w:szCs w:val="16"/>
+              </w:rPr>
+              <w:t xml:space="preserve">RNF5</w:t>
+            </w:r>
+          </w:p>
+        </w:tc>
+        <w:tc>
+          <w:tcPr>
+            <w:tcW w:type="dxa" w:w="8464"/>
+            <w:tcMar>
+              <w:top w:type="dxa" w:w="50"/>
+              <w:left w:type="dxa" w:w="80"/>
+              <w:bottom w:type="dxa" w:w="50"/>
+              <w:right w:type="dxa" w:w="80"/>
+            </w:tcMar>
+            <w:vAlign w:val="center"/>
+          </w:tcPr>
+          <w:p>
+            <w:pPr>
+              <w:keepNext w:val="false"/>
+              <w:spacing w:after="0" w:line="240"/>
+              <w:jc w:val="left"/>
+            </w:pPr>
+            <w:r>
+              <w:rPr>
+                <w:rFonts w:ascii="Arial" w:cs="Arial" w:eastAsia="Arial" w:hAnsi="Arial"/>
+                <w:sz w:val="16"/>
+                <w:szCs w:val="16"/>
+              </w:rPr>
+              <w:t xml:space="preserve">Usabilidad: información por niveles (resumen, indicadores y detalle bajo demanda), ayuda contextual y diseño adaptable a pantallas móviles.</w:t>
             </w:r>
           </w:p>
         </w:tc>
@@ -5990,71 +6362,7 @@
           <w:sz w:val="22"/>
           <w:szCs w:val="22"/>
         </w:rPr>
-        <w:t xml:space="preserve">4.2 Diseño de la solución</w:t>
-      </w:r>
-    </w:p>
-    <w:p>
-      <w:pPr>
-        <w:spacing w:after="120" w:line="264"/>
-        <w:jc w:val="both"/>
-      </w:pPr>
-      <w:r>
-        <w:rPr>
-          <w:rFonts w:ascii="Arial" w:cs="Arial" w:eastAsia="Arial" w:hAnsi="Arial"/>
-          <w:sz w:val="21"/>
-          <w:szCs w:val="21"/>
-        </w:rPr>
-        <w:t xml:space="preserve">La lógica del sistema es una cadena de trazabilidad: </w:t>
-      </w:r>
-      <w:r>
-        <w:rPr>
-          <w:rFonts w:ascii="Arial" w:cs="Arial" w:eastAsia="Arial" w:hAnsi="Arial"/>
-          <w:i/>
-          <w:iCs/>
-          <w:sz w:val="21"/>
-          <w:szCs w:val="21"/>
-        </w:rPr>
-        <w:t xml:space="preserve">fuente oficial → registro → variable as-of → probabilidad → nivel de riesgo → factores explicativos → evidencia → revisión humana</w:t>
-      </w:r>
-      <w:r>
-        <w:rPr>
-          <w:rFonts w:ascii="Arial" w:cs="Arial" w:eastAsia="Arial" w:hAnsi="Arial"/>
-          <w:sz w:val="21"/>
-          <w:szCs w:val="21"/>
-        </w:rPr>
-        <w:t xml:space="preserve">. Se combinan dos modelos complementarios: el modelo de alerta a 60 días, para contratos con cuaderno de obra digital, y el modelo de cartera, que estima al inicio de la obra y mensualmente con el SIAF el riesgo de terminar con retraso significativo en cualquier modalidad (contrata, administración directa, núcleo ejecutor u obras por impuestos). El nivel ALTO de la alerta usa el umbral F1 de validación; MEDIO, el umbral F2 (vigilancia). En la cartera, los niveles se fijan con los percentiles 80 y 50 de predicciones fuera de tiempo anteriores a la prueba.</w:t>
-      </w:r>
-    </w:p>
-    <w:p>
-      <w:pPr>
-        <w:spacing w:after="120" w:line="264"/>
-        <w:jc w:val="both"/>
-      </w:pPr>
-      <w:r>
-        <w:rPr>
-          <w:rFonts w:ascii="Arial" w:cs="Arial" w:eastAsia="Arial" w:hAnsi="Arial"/>
-          <w:sz w:val="21"/>
-          <w:szCs w:val="21"/>
-        </w:rPr>
-        <w:t xml:space="preserve">La evidencia se construye a partir de los factores con contribución positiva: para cada variable se recuperan los registros que la originaron, como los asientos del tipo o de la categoría léxica que la activaron (con número de asiento, fecha, rol del registrante y archivo mensual de origen), los asientos que el modelo de texto considera más indicativos, los meses del SIAF con su enlace al sistema de seguimiento del MEF, los registros del Formato 12-B y las obras previas del contratista que tuvieron atraso. Así, cada alerta se puede verificar leyendo los documentos oficiales sin confiar en el modelo.</w:t>
-      </w:r>
-    </w:p>
-    <w:p>
-      <w:pPr>
-        <w:pStyle w:val="Heading2"/>
-        <w:keepNext/>
-        <w:spacing w:after="80" w:before="180"/>
-      </w:pPr>
-      <w:r>
-        <w:rPr>
-          <w:rFonts w:ascii="Calibri" w:cs="Calibri" w:eastAsia="Calibri" w:hAnsi="Calibri"/>
-          <w:b/>
-          <w:bCs/>
-          <w:color w:val="2E74B5"/>
-          <w:sz w:val="22"/>
-          <w:szCs w:val="22"/>
-        </w:rPr>
-        <w:t xml:space="preserve">4.3 Arquitectura</w:t>
+        <w:t xml:space="preserve">4.2 Arquitectura</w:t>
       </w:r>
     </w:p>
     <w:p>
@@ -6080,7 +6388,7 @@
       <w:r>
         <w:drawing>
           <wp:inline distT="0" distB="0" distL="0" distR="0">
-            <wp:extent cx="5810250" cy="2990850"/>
+            <wp:extent cx="4943475" cy="2543175"/>
             <wp:effectExtent t="0" r="0" b="0" l="0"/>
             <wp:docPr id="1" name="arquitectura" descr="Arquitectura del prototipo SATO: flujo desde las fuentes oficiales hasta la interfaz." title="Figura 1"/>
             <wp:cNvGraphicFramePr>
@@ -6105,7 +6413,7 @@
                   <pic:spPr bwMode="auto">
                     <a:xfrm>
                       <a:off x="0" y="0"/>
-                      <a:ext cx="5810250" cy="2990850"/>
+                      <a:ext cx="4943475" cy="2543175"/>
                     </a:xfrm>
                     <a:prstGeom prst="rect">
                       <a:avLst/>
@@ -6157,7 +6465,7 @@
           <w:sz w:val="22"/>
           <w:szCs w:val="22"/>
         </w:rPr>
-        <w:t xml:space="preserve">4.4 Modelo de datos</w:t>
+        <w:t xml:space="preserve">4.3 Diseño de la solución</w:t>
       </w:r>
     </w:p>
     <w:p>
@@ -6171,7 +6479,7 @@
           <w:sz w:val="21"/>
           <w:szCs w:val="21"/>
         </w:rPr>
-        <w:t xml:space="preserve">La base de datos tiene 28 tablas en el esquema </w:t>
+        <w:t xml:space="preserve">La lógica del sistema es una cadena de trazabilidad: </w:t>
       </w:r>
       <w:r>
         <w:rPr>
@@ -6181,7 +6489,7 @@
           <w:sz w:val="21"/>
           <w:szCs w:val="21"/>
         </w:rPr>
-        <w:t xml:space="preserve">sato</w:t>
+        <w:t xml:space="preserve">fuente oficial → registro → variable as-of → probabilidad → nivel de riesgo → factores explicativos → evidencia → revisión humana</w:t>
       </w:r>
       <w:r>
         <w:rPr>
@@ -6189,7 +6497,85 @@
           <w:sz w:val="21"/>
           <w:szCs w:val="21"/>
         </w:rPr>
-        <w:t xml:space="preserve"> y ocupa 6 662 MB con la carga nacional. Las entidades centrales son la obra (contrato con cuaderno), la inversión (CUI), la entidad y el contratista (RUC); los asientos, con un índice de búsqueda de texto completo en español (2 424 134 filas); la ejecución SIAF mensual (1 406 371 filas); las predicciones (44 790), con sus explicaciones (358 320), evidencias (176 122) y escenarios de sensibilidad (5 115); la cartera INFOBRAS (139 159 obras y 224 155 estimaciones de riesgo); y las tablas de usuarios, revisiones, auditoría, suscripciones y sincronizaciones.</w:t>
+        <w:t xml:space="preserve">. Se combinan dos modelos complementarios: el modelo de alerta a 60 días, para contratos con cuaderno de obra digital, y el modelo de cartera, que estima al inicio de la obra y mensualmente con el SIAF el riesgo de terminar con retraso significativo en cualquier modalidad (contrata, administración directa, núcleo ejecutor u obras por impuestos). El nivel ALTO de la alerta usa el umbral F1 de validación; MEDIO, el umbral F2 (vigilancia). En la cartera, los niveles se fijan con los percentiles 80 y 50 de predicciones fuera de tiempo anteriores a la prueba.</w:t>
+      </w:r>
+    </w:p>
+    <w:p>
+      <w:pPr>
+        <w:spacing w:after="120" w:line="264"/>
+        <w:jc w:val="both"/>
+      </w:pPr>
+      <w:r>
+        <w:rPr>
+          <w:rFonts w:ascii="Arial" w:cs="Arial" w:eastAsia="Arial" w:hAnsi="Arial"/>
+          <w:sz w:val="21"/>
+          <w:szCs w:val="21"/>
+        </w:rPr>
+        <w:t xml:space="preserve">La evidencia se construye a partir de los factores con contribución positiva: para cada variable se recuperan los registros que la originaron, como los asientos del tipo o de la categoría léxica que la activaron (con número de asiento, fecha, rol del registrante y archivo mensual de origen), los asientos que el modelo de texto considera más indicativos, los meses del SIAF con su enlace al sistema de seguimiento del MEF, los registros del Formato 12-B y las obras previas del contratista que tuvieron atraso. Así, cada alerta se puede verificar leyendo los documentos oficiales sin confiar en el modelo.</w:t>
+      </w:r>
+    </w:p>
+    <w:p>
+      <w:pPr>
+        <w:spacing w:after="120" w:line="264"/>
+        <w:jc w:val="both"/>
+      </w:pPr>
+      <w:r>
+        <w:rPr>
+          <w:rFonts w:ascii="Arial" w:cs="Arial" w:eastAsia="Arial" w:hAnsi="Arial"/>
+          <w:sz w:val="21"/>
+          <w:szCs w:val="21"/>
+        </w:rPr>
+        <w:t xml:space="preserve">Para que la explicación sea comprensible para un auditor, un funcionario o un ciudadano, una capa de lenguaje claro convierte cada variable y su valor real en una frase (por ejemplo, «ha transcurrido el 122 % del plazo original» o «el 9 % de los asientos de los últimos 60 días menciona atraso, retraso o demora»), sin nombres internos de variables ni jerga de modelado; la contribución técnica (TreeSHAP) queda disponible bajo demanda. Cada estimación se acompaña de su nivel, de cuántas veces supera la tasa promedio, de su posición relativa entre las obras del mismo corte y de la confiabilidad observada del nivel en la validación con datos pasados, de modo que la probabilidad no se lea como certeza.</w:t>
+      </w:r>
+    </w:p>
+    <w:p>
+      <w:pPr>
+        <w:pStyle w:val="Heading2"/>
+        <w:keepNext/>
+        <w:spacing w:after="80" w:before="180"/>
+      </w:pPr>
+      <w:r>
+        <w:rPr>
+          <w:rFonts w:ascii="Calibri" w:cs="Calibri" w:eastAsia="Calibri" w:hAnsi="Calibri"/>
+          <w:b/>
+          <w:bCs/>
+          <w:color w:val="2E74B5"/>
+          <w:sz w:val="22"/>
+          <w:szCs w:val="22"/>
+        </w:rPr>
+        <w:t xml:space="preserve">4.4 Modelo de datos</w:t>
+      </w:r>
+    </w:p>
+    <w:p>
+      <w:pPr>
+        <w:spacing w:after="120" w:line="264"/>
+        <w:jc w:val="both"/>
+      </w:pPr>
+      <w:r>
+        <w:rPr>
+          <w:rFonts w:ascii="Arial" w:cs="Arial" w:eastAsia="Arial" w:hAnsi="Arial"/>
+          <w:sz w:val="21"/>
+          <w:szCs w:val="21"/>
+        </w:rPr>
+        <w:t xml:space="preserve">La base de datos tiene 28 tablas en el esquema </w:t>
+      </w:r>
+      <w:r>
+        <w:rPr>
+          <w:rFonts w:ascii="Arial" w:cs="Arial" w:eastAsia="Arial" w:hAnsi="Arial"/>
+          <w:i/>
+          <w:iCs/>
+          <w:sz w:val="21"/>
+          <w:szCs w:val="21"/>
+        </w:rPr>
+        <w:t xml:space="preserve">sato</w:t>
+      </w:r>
+      <w:r>
+        <w:rPr>
+          <w:rFonts w:ascii="Arial" w:cs="Arial" w:eastAsia="Arial" w:hAnsi="Arial"/>
+          <w:sz w:val="21"/>
+          <w:szCs w:val="21"/>
+        </w:rPr>
+        <w:t xml:space="preserve"> y ocupa 6 439 MB con la carga nacional. Las entidades centrales son la obra (contrato con cuaderno), la inversión (CUI), la entidad y el contratista (RUC); los asientos, con un índice de búsqueda de texto completo en español (2 424 134 filas); la ejecución SIAF mensual (1 406 371 filas); las predicciones (44 790), con sus explicaciones (358 320), evidencias (176 122) y escenarios de sensibilidad (5 115); la cartera INFOBRAS (139 159 obras y 224 155 estimaciones de riesgo); y las tablas de usuarios, revisiones, auditoría, suscripciones y sincronizaciones.</w:t>
       </w:r>
     </w:p>
     <w:p>
@@ -6496,7 +6882,7 @@
           <w:sz w:val="21"/>
           <w:szCs w:val="21"/>
         </w:rPr>
-        <w:t xml:space="preserve">): modelo operativo, TreeSHAP, evidencia, simulación, carga de la base de datos y 32 endpoints REST.</w:t>
+        <w:t xml:space="preserve">): modelo operativo, TreeSHAP, evidencia, simulación, carga de la base de datos y 36 endpoints REST.</w:t>
       </w:r>
     </w:p>
     <w:p>
@@ -6543,7 +6929,54 @@
           <w:sz w:val="21"/>
           <w:szCs w:val="21"/>
         </w:rPr>
-        <w:t xml:space="preserve">): 14 rutas: radar, cartera, cuadernos, ficha de obra, comparador, laboratorio de validación, datos y sistema, guía y suscripción.</w:t>
+        <w:t xml:space="preserve">): 15 rutas: panorama, alertas del cuaderno, cartera nacional, fichas de obra, búsqueda, comparador, validación del modelo, datos y fuentes, guía con glosario, suscripción e ingreso de analistas.</w:t>
+      </w:r>
+    </w:p>
+    <w:p>
+      <w:pPr>
+        <w:pStyle w:val="ListParagraph"/>
+        <w:numPr>
+          <w:ilvl w:val="0"/>
+          <w:numId w:val="2"/>
+        </w:numPr>
+        <w:spacing w:after="60" w:line="264"/>
+        <w:jc w:val="both"/>
+      </w:pPr>
+      <w:r>
+        <w:rPr>
+          <w:rFonts w:ascii="Arial" w:cs="Arial" w:eastAsia="Arial" w:hAnsi="Arial"/>
+          <w:b/>
+          <w:bCs/>
+          <w:sz w:val="21"/>
+          <w:szCs w:val="21"/>
+        </w:rPr>
+        <w:t xml:space="preserve">Calidad</w:t>
+      </w:r>
+      <w:r>
+        <w:rPr>
+          <w:rFonts w:ascii="Arial" w:cs="Arial" w:eastAsia="Arial" w:hAnsi="Arial"/>
+          <w:sz w:val="21"/>
+          <w:szCs w:val="21"/>
+        </w:rPr>
+        <w:t xml:space="preserve"> (</w:t>
+      </w:r>
+      <w:r>
+        <w:rPr>
+          <w:rFonts w:ascii="Arial" w:cs="Arial" w:eastAsia="Arial" w:hAnsi="Arial"/>
+          <w:i/>
+          <w:iCs/>
+          <w:sz w:val="21"/>
+          <w:szCs w:val="21"/>
+        </w:rPr>
+        <w:t xml:space="preserve">serving</w:t>
+      </w:r>
+      <w:r>
+        <w:rPr>
+          <w:rFonts w:ascii="Arial" w:cs="Arial" w:eastAsia="Arial" w:hAnsi="Arial"/>
+          <w:sz w:val="21"/>
+          <w:szCs w:val="21"/>
+        </w:rPr>
+        <w:t xml:space="preserve">): auditoría automática de la base cargada (duplicados, nulos, consistencia de fechas, relaciones entre fuentes y frescura).</w:t>
       </w:r>
     </w:p>
     <w:p>
@@ -6575,7 +7008,7 @@
           <w:sz w:val="21"/>
           <w:szCs w:val="21"/>
         </w:rPr>
-        <w:t xml:space="preserve">Las decisiones técnicas relevantes fueron: (i) agregar el SIAF (archivos anuales de 450 a 680 MB comprimidos) por inversión y mes con DuckDB, sin cargarlo completo en memoria; (ii) excluir el presupuesto modificado del año en curso, que el SIAF publica sin fecha, y usar solo atributos fijados al inicio de INFOBRAS, que publica una foto actual; (iii) ajustar vocabularios, reducciones de dimensión y modelos de texto solo con el periodo de entrenamiento y apilar sus puntuaciones fuera de muestra; (iv) calcular los embeddings con GPU una sola vez y reutilizarlos; (v) cargar la base de datos en una transacción, de modo que un error no deje datos parciales; y (vi) restituir la ortografía de los textos generados para la interfaz sin alterar los textos de las fuentes; y (vii) normalizar las denominaciones territoriales que difieren entre fuentes, como la Provincia Constitucional del Callao. El informe técnico en PDF reúne la identificación de la obra, el mensaje de anticipación, los factores explicativos, los escenarios de sensibilidad, la evidencia y el marco normativo, con la advertencia de que no es un documento oficial.</w:t>
+        <w:t xml:space="preserve">Las decisiones técnicas relevantes fueron: (i) agregar el SIAF (archivos anuales de 450 a 680 MB comprimidos) por inversión y mes con DuckDB, sin cargarlo completo en memoria; (ii) excluir el presupuesto modificado del año en curso, que el SIAF publica sin fecha, y usar solo atributos fijados al inicio de INFOBRAS, que publica una foto actual; (iii) ajustar vocabularios, reducciones de dimensión y modelos de texto solo con el periodo de entrenamiento y apilar sus puntuaciones fuera de muestra; (iv) calcular los embeddings con GPU una sola vez y reutilizarlos; (v) cargar la base de datos en una transacción, de modo que un error no deje datos parciales; y (vi) restituir la ortografía de los textos generados para la interfaz sin alterar los textos de las fuentes; (vii) normalizar las denominaciones territoriales que difieren entre fuentes, como la Provincia Constitucional del Callao; (viii) tratar los caracteres % y _ escritos en las búsquedas como texto literal y limitar los intentos de ingreso y de suscripción por dirección IP; y (ix) descargar cada pantalla solo al visitarla, para no cargar el mapa y los gráficos donde no se usan. La auditoría del sistema detectó además un defecto real: el filtro de las explicaciones del modelo de seguimiento exigía un corte igual a la fecha final de INFOBRAS, pero el SIAF llega con un mes de rezago, por lo que 1 800 de las 2 014 obras activas no tenían explicación de su riesgo vigente; se corrigió y se añadió una prueba de regresión, sin cambio alguno en las predicciones (diferencia máxima 0,0). El informe técnico en PDF reúne la identificación de la obra, el mensaje de anticipación, los factores explicativos, los escenarios de sensibilidad, la evidencia y el marco normativo, con la advertencia de que no es un documento oficial.</w:t>
       </w:r>
     </w:p>
     <w:p>
@@ -6639,7 +7072,7 @@
           <w:sz w:val="21"/>
           <w:szCs w:val="21"/>
         </w:rPr>
-        <w:t xml:space="preserve">El radar (Fig. 2) presenta las obras activas del ámbito elegido, sin contar dos veces las evaluadas por ambos modelos, con un mapa de riesgo y la lista priorizada. Al abrir una obra (Fig. 3), el usuario ve la probabilidad a 60 días, el texto de anticipación normativa, los datos integrados, la evolución del riesgo y el acceso al informe en PDF. La Fig. 4 muestra la explicación TreeSHAP y el simulador de sensibilidad, que recalcula el riesgo cambiando una sola señal y advierte que no es una estimación causal. El comparador (Fig. 5) contrasta la tasa histórica de retraso con la proporción de obras activas en nivel alto por departamento o tipo de obra.</w:t>
+        <w:t xml:space="preserve">La interfaz organiza la información por niveles: resumen, indicadores y detalle bajo demanda. El panorama (Fig. 2) resume en una frase el estado del ámbito elegido, muestra cuatro indicadores sin doble conteo, la lista de obras que requieren atención (cada una abre un panel lateral con su explicación), el mapa de riesgo y la tasa real de acierto de cada nivel en la validación con datos pasados. La ficha de una obra (Fig. 3) presenta el nivel de riesgo, la probabilidad, cuántas veces supera el promedio, la posición relativa y la confiabilidad del nivel, con los tres factores principales en lenguaje claro y el acceso al informe en PDF. En la pestaña de factores (Fig. 4) cada factor indica si eleva o reduce el riesgo y abre la evidencia oficial que lo sustenta; el detalle técnico (variable y contribución TreeSHAP) se muestra solo si el usuario lo pide. La página de validación (Fig. 5) responde en lenguaje sencillo si el modelo distingue las obras que se atrasan, si sus probabilidades son realistas y si sirve para priorizar, y conserva en pestañas el detalle técnico. Todos los términos técnicos tienen ayuda contextual enlazada a un glosario.</w:t>
       </w:r>
     </w:p>
     <w:p>
@@ -6651,9 +7084,9 @@
       <w:r>
         <w:drawing>
           <wp:inline distT="0" distB="0" distL="0" distR="0">
-            <wp:extent cx="4533900" cy="3514725"/>
+            <wp:extent cx="3714750" cy="2733675"/>
             <wp:effectExtent t="0" r="0" b="0" l="0"/>
-            <wp:docPr id="1" name="radar" descr="Radar de obras activas (ámbito nacional, corte del 31 de agosto de 2026)." title="Figura 2"/>
+            <wp:docPr id="1" name="panorama" descr="Panorama de riesgo (ámbito nacional, corte del 31 de agosto de 2026): resumen, indicadores, obras que requieren atención, mapa y confiabilidad de las alertas." title="Figura 2"/>
             <wp:cNvGraphicFramePr>
               <a:graphicFrameLocks xmlns:a="http://schemas.openxmlformats.org/drawingml/2006/main" noChangeAspect="1"/>
             </wp:cNvGraphicFramePr>
@@ -6676,7 +7109,7 @@
                   <pic:spPr bwMode="auto">
                     <a:xfrm>
                       <a:off x="0" y="0"/>
-                      <a:ext cx="4533900" cy="3514725"/>
+                      <a:ext cx="3714750" cy="2733675"/>
                     </a:xfrm>
                     <a:prstGeom prst="rect">
                       <a:avLst/>
@@ -6710,7 +7143,7 @@
           <w:sz w:val="18"/>
           <w:szCs w:val="18"/>
         </w:rPr>
-        <w:t xml:space="preserve">Radar de obras activas (ámbito nacional, corte del 31 de agosto de 2026).</w:t>
+        <w:t xml:space="preserve">Panorama de riesgo (ámbito nacional, corte del 31 de agosto de 2026): resumen, indicadores, obras que requieren atención, mapa y confiabilidad de las alertas.</w:t>
       </w:r>
     </w:p>
     <w:p>
@@ -6722,9 +7155,9 @@
       <w:r>
         <w:drawing>
           <wp:inline distT="0" distB="0" distL="0" distR="0">
-            <wp:extent cx="5343525" cy="3019425"/>
+            <wp:extent cx="5810250" cy="2305050"/>
             <wp:effectExtent t="0" r="0" b="0" l="0"/>
-            <wp:docPr id="1" name="ficha" descr="Ficha de una obra en ejecución en Arequipa: probabilidad a 60 días, mensaje de anticipación, datos integrados y evolución del riesgo." title="Figura 3"/>
+            <wp:docPr id="1" name="ficha" descr="Resumen del riesgo en la ficha de una obra en ejecución: nivel, probabilidad, veces el promedio, posición relativa, confiabilidad del nivel y factores principales en lenguaje claro." title="Figura 3"/>
             <wp:cNvGraphicFramePr>
               <a:graphicFrameLocks xmlns:a="http://schemas.openxmlformats.org/drawingml/2006/main" noChangeAspect="1"/>
             </wp:cNvGraphicFramePr>
@@ -6747,7 +7180,7 @@
                   <pic:spPr bwMode="auto">
                     <a:xfrm>
                       <a:off x="0" y="0"/>
-                      <a:ext cx="5343525" cy="3019425"/>
+                      <a:ext cx="5810250" cy="2305050"/>
                     </a:xfrm>
                     <a:prstGeom prst="rect">
                       <a:avLst/>
@@ -6781,7 +7214,7 @@
           <w:sz w:val="18"/>
           <w:szCs w:val="18"/>
         </w:rPr>
-        <w:t xml:space="preserve">Ficha de una obra en ejecución en Arequipa: probabilidad a 60 días, mensaje de anticipación, datos integrados y evolución del riesgo.</w:t>
+        <w:t xml:space="preserve">Resumen del riesgo en la ficha de una obra en ejecución: nivel, probabilidad, veces el promedio, posición relativa, confiabilidad del nivel y factores principales en lenguaje claro.</w:t>
       </w:r>
     </w:p>
     <w:p>
@@ -6793,9 +7226,9 @@
       <w:r>
         <w:drawing>
           <wp:inline distT="0" distB="0" distL="0" distR="0">
-            <wp:extent cx="5810250" cy="2505075"/>
+            <wp:extent cx="5229225" cy="3705225"/>
             <wp:effectExtent t="0" r="0" b="0" l="0"/>
-            <wp:docPr id="1" name="explicacion" descr="Explicación TreeSHAP de la predicción (factores ordenados por contribución, en dos columnas) y simulador de sensibilidad de la misma obra." title="Figura 4"/>
+            <wp:docPr id="1" name="factores" descr="Factores de la misma obra en lenguaje claro, con su efecto sobre el riesgo, el grupo de origen y el acceso a la evidencia documental." title="Figura 4"/>
             <wp:cNvGraphicFramePr>
               <a:graphicFrameLocks xmlns:a="http://schemas.openxmlformats.org/drawingml/2006/main" noChangeAspect="1"/>
             </wp:cNvGraphicFramePr>
@@ -6818,7 +7251,7 @@
                   <pic:spPr bwMode="auto">
                     <a:xfrm>
                       <a:off x="0" y="0"/>
-                      <a:ext cx="5810250" cy="2505075"/>
+                      <a:ext cx="5229225" cy="3705225"/>
                     </a:xfrm>
                     <a:prstGeom prst="rect">
                       <a:avLst/>
@@ -6852,7 +7285,7 @@
           <w:sz w:val="18"/>
           <w:szCs w:val="18"/>
         </w:rPr>
-        <w:t xml:space="preserve">Explicación TreeSHAP de la predicción (factores ordenados por contribución, en dos columnas) y simulador de sensibilidad de la misma obra.</w:t>
+        <w:t xml:space="preserve">Factores de la misma obra en lenguaje claro, con su efecto sobre el riesgo, el grupo de origen y el acceso a la evidencia documental.</w:t>
       </w:r>
     </w:p>
     <w:p>
@@ -6864,9 +7297,9 @@
       <w:r>
         <w:drawing>
           <wp:inline distT="0" distB="0" distL="0" distR="0">
-            <wp:extent cx="4943475" cy="3238500"/>
+            <wp:extent cx="5810250" cy="2295525"/>
             <wp:effectExtent t="0" r="0" b="0" l="0"/>
-            <wp:docPr id="1" name="comparador" descr="Comparador territorial: tasa histórica de retraso significativo y obras activas en nivel alto por departamento." title="Figura 5"/>
+            <wp:docPr id="1" name="validacion" descr="Página de validación: calibración por deciles de riesgo y resultado real de cada nivel en el backtest as-of." title="Figura 5"/>
             <wp:cNvGraphicFramePr>
               <a:graphicFrameLocks xmlns:a="http://schemas.openxmlformats.org/drawingml/2006/main" noChangeAspect="1"/>
             </wp:cNvGraphicFramePr>
@@ -6889,7 +7322,7 @@
                   <pic:spPr bwMode="auto">
                     <a:xfrm>
                       <a:off x="0" y="0"/>
-                      <a:ext cx="4943475" cy="3238500"/>
+                      <a:ext cx="5810250" cy="2295525"/>
                     </a:xfrm>
                     <a:prstGeom prst="rect">
                       <a:avLst/>
@@ -6923,7 +7356,7 @@
           <w:sz w:val="18"/>
           <w:szCs w:val="18"/>
         </w:rPr>
-        <w:t xml:space="preserve">Comparador territorial: tasa histórica de retraso significativo y obras activas en nivel alto por departamento.</w:t>
+        <w:t xml:space="preserve">Página de validación: calibración por deciles de riesgo y resultado real de cada nivel en el backtest as-of.</w:t>
       </w:r>
     </w:p>
     <w:p>
@@ -6973,7 +7406,7 @@
           <w:sz w:val="21"/>
           <w:szCs w:val="21"/>
         </w:rPr>
-        <w:t xml:space="preserve">La auditoría de datos confirmó que el problema de integración es real: de 2 732 593 asientos se repararon 1 308 filas con separadores dentro del texto libre y se rechazó una; ningún conjunto del cuaderno de obra contiene el CUI; el contrato SEACE falta en 66 % de las observaciones del panel y el devengado SIAF en 11 %; y un archivo oficial de contratos cambió de 10 988 a 9 666 filas el mismo día, por lo que cada archivo se registró con su huella SHA-256. La resolución de entidades alcanzó una precisión de 99,1 % sobre 10 075 pares con CUI explícito y enlazó el 90,2 % de los cuadernos de Arequipa. La extracción de avances desde el texto, validada contra las valorizaciones oficiales, acertó el avance ejecutado con error ≤ 1 punto porcentual en 70,9 % de los casos, pero solo cubre 11,9 % de las valorizaciones.</w:t>
+        <w:t xml:space="preserve">La auditoría de datos confirmó que el problema de integración es real: de 2 732 593 asientos se repararon 1 308 filas con separadores dentro del texto libre y se rechazó una; ningún conjunto del cuaderno de obra contiene el CUI; el contrato SEACE falta en 66 % de las observaciones del panel y el devengado SIAF en 11 %; y un archivo oficial de contratos cambió de 10 988 a 9 666 filas el mismo día, por lo que cada archivo se registró con su huella SHA-256. La resolución de entidades alcanzó una precisión de 99,1 % sobre 10 075 pares con CUI explícito y enlazó el 90,2 % de los cuadernos de Arequipa. La extracción de avances desde el texto, validada contra las valorizaciones oficiales, acertó el avance ejecutado con error ≤ 1 punto porcentual en 70,9 % de los casos, pero solo cubre 11,9 % de las valorizaciones. La auditoría automática de la base cargada ejecutó 29 chequeos: 14 sin hallazgos (ningún asiento duplicado, ninguna obra sin entidad o contratista, ninguna fecha invertida ni asiento posterior al corte, ninguna predicción vigente sin explicación), 5 con hallazgos documentados en las fuentes (370 de 17 100 obras del cuaderno y 75 916 de 139 159 obras de INFOBRAS sin coordenadas, 1 338 obras de INFOBRAS sin costo, 9 con un CUI que no tiene siete dígitos y 15 279 en ejecución sin registros en los últimos 12 meses, que no se evalúan) y 10 descriptivos; los hallazgos se informan en la interfaz tal como están en las fuentes, sin corregirlos.</w:t>
       </w:r>
     </w:p>
     <w:p>
@@ -7005,7 +7438,7 @@
           <w:sz w:val="21"/>
           <w:szCs w:val="21"/>
         </w:rPr>
-        <w:t xml:space="preserve">Se implementaron todos los requerimientos de la Tabla 4: el pipeline completo, 32 endpoints, 14 rutas de interfaz, el informe PDF, la suscripción con envío de correo (con respaldo en archivos cuando no hay servidor SMTP) y el proceso de sincronización. La carga nacional de la base de datos tomó 557 s. Al corte vigente, el sistema evalúa 2 970 obras con cuaderno digital, de las cuales 190 están en nivel alto y 461 en vigilancia, y 2 014 obras activas de la cartera INFOBRAS; en total, 4 698 obras activas distintas.</w:t>
+        <w:t xml:space="preserve">Se implementaron todos los requerimientos de la Tabla 4: el pipeline completo, 36 endpoints, 15 rutas de interfaz, el informe PDF, la suscripción con envío de correo (con respaldo en archivos cuando no hay servidor SMTP) y el proceso de sincronización. La carga nacional de la base de datos, con la auditoría de calidad y la evaluación por sector, tomó 634 s. Al corte vigente, el sistema evalúa 2 970 obras con cuaderno digital, de las cuales 190 están en nivel alto y 461 en vigilancia, y 2 014 obras activas de la cartera INFOBRAS; en total, 4 698 obras activas distintas.</w:t>
       </w:r>
     </w:p>
     <w:p>
@@ -7361,7 +7794,7 @@
           </w:tcPr>
           <w:p>
             <w:pPr>
-              <w:keepNext w:val="false"/>
+              <w:keepNext/>
               <w:spacing w:after="0" w:line="240"/>
               <w:jc w:val="center"/>
             </w:pPr>
@@ -7388,7 +7821,7 @@
           </w:tcPr>
           <w:p>
             <w:pPr>
-              <w:keepNext w:val="false"/>
+              <w:keepNext/>
               <w:spacing w:after="0" w:line="240"/>
               <w:jc w:val="left"/>
             </w:pPr>
@@ -7415,7 +7848,7 @@
           </w:tcPr>
           <w:p>
             <w:pPr>
-              <w:keepNext w:val="false"/>
+              <w:keepNext/>
               <w:spacing w:after="0" w:line="240"/>
               <w:jc w:val="left"/>
             </w:pPr>
@@ -7442,7 +7875,7 @@
           </w:tcPr>
           <w:p>
             <w:pPr>
-              <w:keepNext w:val="false"/>
+              <w:keepNext/>
               <w:spacing w:after="0" w:line="240"/>
               <w:jc w:val="center"/>
             </w:pPr>
@@ -7469,7 +7902,7 @@
           </w:tcPr>
           <w:p>
             <w:pPr>
-              <w:keepNext w:val="false"/>
+              <w:keepNext/>
               <w:spacing w:after="0" w:line="240"/>
               <w:jc w:val="center"/>
             </w:pPr>
@@ -7496,7 +7929,7 @@
           </w:tcPr>
           <w:p>
             <w:pPr>
-              <w:keepNext w:val="false"/>
+              <w:keepNext/>
               <w:spacing w:after="0" w:line="240"/>
               <w:jc w:val="center"/>
             </w:pPr>
@@ -7523,7 +7956,7 @@
           </w:tcPr>
           <w:p>
             <w:pPr>
-              <w:keepNext w:val="false"/>
+              <w:keepNext/>
               <w:spacing w:after="0" w:line="240"/>
               <w:jc w:val="center"/>
             </w:pPr>
@@ -7550,7 +7983,7 @@
           </w:tcPr>
           <w:p>
             <w:pPr>
-              <w:keepNext w:val="false"/>
+              <w:keepNext/>
               <w:spacing w:after="0" w:line="240"/>
               <w:jc w:val="center"/>
             </w:pPr>
@@ -7583,7 +8016,7 @@
           </w:tcPr>
           <w:p>
             <w:pPr>
-              <w:keepNext w:val="false"/>
+              <w:keepNext/>
               <w:spacing w:after="0" w:line="240"/>
               <w:jc w:val="center"/>
             </w:pPr>
@@ -7611,7 +8044,7 @@
           </w:tcPr>
           <w:p>
             <w:pPr>
-              <w:keepNext w:val="false"/>
+              <w:keepNext/>
               <w:spacing w:after="0" w:line="240"/>
               <w:jc w:val="left"/>
             </w:pPr>
@@ -7639,7 +8072,7 @@
           </w:tcPr>
           <w:p>
             <w:pPr>
-              <w:keepNext w:val="false"/>
+              <w:keepNext/>
               <w:spacing w:after="0" w:line="240"/>
               <w:jc w:val="left"/>
             </w:pPr>
@@ -7667,7 +8100,7 @@
           </w:tcPr>
           <w:p>
             <w:pPr>
-              <w:keepNext w:val="false"/>
+              <w:keepNext/>
               <w:spacing w:after="0" w:line="240"/>
               <w:jc w:val="center"/>
             </w:pPr>
@@ -7695,7 +8128,7 @@
           </w:tcPr>
           <w:p>
             <w:pPr>
-              <w:keepNext w:val="false"/>
+              <w:keepNext/>
               <w:spacing w:after="0" w:line="240"/>
               <w:jc w:val="center"/>
             </w:pPr>
@@ -7723,7 +8156,7 @@
           </w:tcPr>
           <w:p>
             <w:pPr>
-              <w:keepNext w:val="false"/>
+              <w:keepNext/>
               <w:spacing w:after="0" w:line="240"/>
               <w:jc w:val="center"/>
             </w:pPr>
@@ -7751,7 +8184,7 @@
           </w:tcPr>
           <w:p>
             <w:pPr>
-              <w:keepNext w:val="false"/>
+              <w:keepNext/>
               <w:spacing w:after="0" w:line="240"/>
               <w:jc w:val="center"/>
             </w:pPr>
@@ -7779,7 +8212,7 @@
           </w:tcPr>
           <w:p>
             <w:pPr>
-              <w:keepNext w:val="false"/>
+              <w:keepNext/>
               <w:spacing w:after="0" w:line="240"/>
               <w:jc w:val="center"/>
             </w:pPr>
@@ -7811,7 +8244,7 @@
           </w:tcPr>
           <w:p>
             <w:pPr>
-              <w:keepNext w:val="false"/>
+              <w:keepNext/>
               <w:spacing w:after="0" w:line="240"/>
               <w:jc w:val="center"/>
             </w:pPr>
@@ -7838,7 +8271,7 @@
           </w:tcPr>
           <w:p>
             <w:pPr>
-              <w:keepNext w:val="false"/>
+              <w:keepNext/>
               <w:spacing w:after="0" w:line="240"/>
               <w:jc w:val="left"/>
             </w:pPr>
@@ -7865,7 +8298,7 @@
           </w:tcPr>
           <w:p>
             <w:pPr>
-              <w:keepNext w:val="false"/>
+              <w:keepNext/>
               <w:spacing w:after="0" w:line="240"/>
               <w:jc w:val="left"/>
             </w:pPr>
@@ -7892,7 +8325,7 @@
           </w:tcPr>
           <w:p>
             <w:pPr>
-              <w:keepNext w:val="false"/>
+              <w:keepNext/>
               <w:spacing w:after="0" w:line="240"/>
               <w:jc w:val="center"/>
             </w:pPr>
@@ -7919,7 +8352,7 @@
           </w:tcPr>
           <w:p>
             <w:pPr>
-              <w:keepNext w:val="false"/>
+              <w:keepNext/>
               <w:spacing w:after="0" w:line="240"/>
               <w:jc w:val="center"/>
             </w:pPr>
@@ -7946,7 +8379,7 @@
           </w:tcPr>
           <w:p>
             <w:pPr>
-              <w:keepNext w:val="false"/>
+              <w:keepNext/>
               <w:spacing w:after="0" w:line="240"/>
               <w:jc w:val="center"/>
             </w:pPr>
@@ -7973,7 +8406,7 @@
           </w:tcPr>
           <w:p>
             <w:pPr>
-              <w:keepNext w:val="false"/>
+              <w:keepNext/>
               <w:spacing w:after="0" w:line="240"/>
               <w:jc w:val="center"/>
             </w:pPr>
@@ -8000,7 +8433,7 @@
           </w:tcPr>
           <w:p>
             <w:pPr>
-              <w:keepNext w:val="false"/>
+              <w:keepNext/>
               <w:spacing w:after="0" w:line="240"/>
               <w:jc w:val="center"/>
             </w:pPr>
@@ -8033,7 +8466,7 @@
           </w:tcPr>
           <w:p>
             <w:pPr>
-              <w:keepNext w:val="false"/>
+              <w:keepNext/>
               <w:spacing w:after="0" w:line="240"/>
               <w:jc w:val="center"/>
             </w:pPr>
@@ -8061,7 +8494,7 @@
           </w:tcPr>
           <w:p>
             <w:pPr>
-              <w:keepNext w:val="false"/>
+              <w:keepNext/>
               <w:spacing w:after="0" w:line="240"/>
               <w:jc w:val="left"/>
             </w:pPr>
@@ -8089,7 +8522,7 @@
           </w:tcPr>
           <w:p>
             <w:pPr>
-              <w:keepNext w:val="false"/>
+              <w:keepNext/>
               <w:spacing w:after="0" w:line="240"/>
               <w:jc w:val="left"/>
             </w:pPr>
@@ -8117,7 +8550,7 @@
           </w:tcPr>
           <w:p>
             <w:pPr>
-              <w:keepNext w:val="false"/>
+              <w:keepNext/>
               <w:spacing w:after="0" w:line="240"/>
               <w:jc w:val="center"/>
             </w:pPr>
@@ -8145,7 +8578,7 @@
           </w:tcPr>
           <w:p>
             <w:pPr>
-              <w:keepNext w:val="false"/>
+              <w:keepNext/>
               <w:spacing w:after="0" w:line="240"/>
               <w:jc w:val="center"/>
             </w:pPr>
@@ -8173,7 +8606,7 @@
           </w:tcPr>
           <w:p>
             <w:pPr>
-              <w:keepNext w:val="false"/>
+              <w:keepNext/>
               <w:spacing w:after="0" w:line="240"/>
               <w:jc w:val="center"/>
             </w:pPr>
@@ -8201,7 +8634,7 @@
           </w:tcPr>
           <w:p>
             <w:pPr>
-              <w:keepNext w:val="false"/>
+              <w:keepNext/>
               <w:spacing w:after="0" w:line="240"/>
               <w:jc w:val="center"/>
             </w:pPr>
@@ -8229,7 +8662,7 @@
           </w:tcPr>
           <w:p>
             <w:pPr>
-              <w:keepNext w:val="false"/>
+              <w:keepNext/>
               <w:spacing w:after="0" w:line="240"/>
               <w:jc w:val="center"/>
             </w:pPr>
@@ -8261,7 +8694,7 @@
           </w:tcPr>
           <w:p>
             <w:pPr>
-              <w:keepNext w:val="false"/>
+              <w:keepNext/>
               <w:spacing w:after="0" w:line="240"/>
               <w:jc w:val="center"/>
             </w:pPr>
@@ -8288,7 +8721,7 @@
           </w:tcPr>
           <w:p>
             <w:pPr>
-              <w:keepNext w:val="false"/>
+              <w:keepNext/>
               <w:spacing w:after="0" w:line="240"/>
               <w:jc w:val="left"/>
             </w:pPr>
@@ -8315,7 +8748,7 @@
           </w:tcPr>
           <w:p>
             <w:pPr>
-              <w:keepNext w:val="false"/>
+              <w:keepNext/>
               <w:spacing w:after="0" w:line="240"/>
               <w:jc w:val="left"/>
             </w:pPr>
@@ -8342,7 +8775,7 @@
           </w:tcPr>
           <w:p>
             <w:pPr>
-              <w:keepNext w:val="false"/>
+              <w:keepNext/>
               <w:spacing w:after="0" w:line="240"/>
               <w:jc w:val="center"/>
             </w:pPr>
@@ -8369,7 +8802,7 @@
           </w:tcPr>
           <w:p>
             <w:pPr>
-              <w:keepNext w:val="false"/>
+              <w:keepNext/>
               <w:spacing w:after="0" w:line="240"/>
               <w:jc w:val="center"/>
             </w:pPr>
@@ -8396,7 +8829,7 @@
           </w:tcPr>
           <w:p>
             <w:pPr>
-              <w:keepNext w:val="false"/>
+              <w:keepNext/>
               <w:spacing w:after="0" w:line="240"/>
               <w:jc w:val="center"/>
             </w:pPr>
@@ -8423,7 +8856,7 @@
           </w:tcPr>
           <w:p>
             <w:pPr>
-              <w:keepNext w:val="false"/>
+              <w:keepNext/>
               <w:spacing w:after="0" w:line="240"/>
               <w:jc w:val="center"/>
             </w:pPr>
@@ -8450,7 +8883,7 @@
           </w:tcPr>
           <w:p>
             <w:pPr>
-              <w:keepNext w:val="false"/>
+              <w:keepNext/>
               <w:spacing w:after="0" w:line="240"/>
               <w:jc w:val="center"/>
             </w:pPr>
@@ -8483,7 +8916,7 @@
           </w:tcPr>
           <w:p>
             <w:pPr>
-              <w:keepNext w:val="false"/>
+              <w:keepNext/>
               <w:spacing w:after="0" w:line="240"/>
               <w:jc w:val="center"/>
             </w:pPr>
@@ -8511,7 +8944,7 @@
           </w:tcPr>
           <w:p>
             <w:pPr>
-              <w:keepNext w:val="false"/>
+              <w:keepNext/>
               <w:spacing w:after="0" w:line="240"/>
               <w:jc w:val="left"/>
             </w:pPr>
@@ -8539,7 +8972,7 @@
           </w:tcPr>
           <w:p>
             <w:pPr>
-              <w:keepNext w:val="false"/>
+              <w:keepNext/>
               <w:spacing w:after="0" w:line="240"/>
               <w:jc w:val="left"/>
             </w:pPr>
@@ -8567,7 +9000,7 @@
           </w:tcPr>
           <w:p>
             <w:pPr>
-              <w:keepNext w:val="false"/>
+              <w:keepNext/>
               <w:spacing w:after="0" w:line="240"/>
               <w:jc w:val="center"/>
             </w:pPr>
@@ -8595,7 +9028,7 @@
           </w:tcPr>
           <w:p>
             <w:pPr>
-              <w:keepNext w:val="false"/>
+              <w:keepNext/>
               <w:spacing w:after="0" w:line="240"/>
               <w:jc w:val="center"/>
             </w:pPr>
@@ -8623,7 +9056,7 @@
           </w:tcPr>
           <w:p>
             <w:pPr>
-              <w:keepNext w:val="false"/>
+              <w:keepNext/>
               <w:spacing w:after="0" w:line="240"/>
               <w:jc w:val="center"/>
             </w:pPr>
@@ -8651,7 +9084,7 @@
           </w:tcPr>
           <w:p>
             <w:pPr>
-              <w:keepNext w:val="false"/>
+              <w:keepNext/>
               <w:spacing w:after="0" w:line="240"/>
               <w:jc w:val="center"/>
             </w:pPr>
@@ -8679,7 +9112,7 @@
           </w:tcPr>
           <w:p>
             <w:pPr>
-              <w:keepNext w:val="false"/>
+              <w:keepNext/>
               <w:spacing w:after="0" w:line="240"/>
               <w:jc w:val="center"/>
             </w:pPr>
@@ -8711,7 +9144,7 @@
           </w:tcPr>
           <w:p>
             <w:pPr>
-              <w:keepNext w:val="false"/>
+              <w:keepNext/>
               <w:spacing w:after="0" w:line="240"/>
               <w:jc w:val="center"/>
             </w:pPr>
@@ -8738,7 +9171,7 @@
           </w:tcPr>
           <w:p>
             <w:pPr>
-              <w:keepNext w:val="false"/>
+              <w:keepNext/>
               <w:spacing w:after="0" w:line="240"/>
               <w:jc w:val="left"/>
             </w:pPr>
@@ -8765,7 +9198,7 @@
           </w:tcPr>
           <w:p>
             <w:pPr>
-              <w:keepNext w:val="false"/>
+              <w:keepNext/>
               <w:spacing w:after="0" w:line="240"/>
               <w:jc w:val="left"/>
             </w:pPr>
@@ -8792,7 +9225,7 @@
           </w:tcPr>
           <w:p>
             <w:pPr>
-              <w:keepNext w:val="false"/>
+              <w:keepNext/>
               <w:spacing w:after="0" w:line="240"/>
               <w:jc w:val="center"/>
             </w:pPr>
@@ -8819,7 +9252,7 @@
           </w:tcPr>
           <w:p>
             <w:pPr>
-              <w:keepNext w:val="false"/>
+              <w:keepNext/>
               <w:spacing w:after="0" w:line="240"/>
               <w:jc w:val="center"/>
             </w:pPr>
@@ -8846,7 +9279,7 @@
           </w:tcPr>
           <w:p>
             <w:pPr>
-              <w:keepNext w:val="false"/>
+              <w:keepNext/>
               <w:spacing w:after="0" w:line="240"/>
               <w:jc w:val="center"/>
             </w:pPr>
@@ -8873,7 +9306,7 @@
           </w:tcPr>
           <w:p>
             <w:pPr>
-              <w:keepNext w:val="false"/>
+              <w:keepNext/>
               <w:spacing w:after="0" w:line="240"/>
               <w:jc w:val="center"/>
             </w:pPr>
@@ -8900,7 +9333,7 @@
           </w:tcPr>
           <w:p>
             <w:pPr>
-              <w:keepNext w:val="false"/>
+              <w:keepNext/>
               <w:spacing w:after="0" w:line="240"/>
               <w:jc w:val="center"/>
             </w:pPr>
@@ -9329,7 +9762,7 @@
           <w:sz w:val="21"/>
           <w:szCs w:val="21"/>
         </w:rPr>
-        <w:t xml:space="preserve">Modelos de cartera.</w:t>
+        <w:t xml:space="preserve">Calibración.</w:t>
       </w:r>
       <w:r>
         <w:rPr>
@@ -9337,7 +9770,120 @@
           <w:sz w:val="21"/>
           <w:szCs w:val="21"/>
         </w:rPr>
-        <w:t xml:space="preserve"> La Tabla 6 resume la prueba temporal. Al inicio de la obra, LightGBM alcanzó ROC-AUC de 0,733 frente a 0,658 de la regla basada en el historial de la entidad (diferencia +0,075; IC 95 % [0,063; 0,086]). Con el seguimiento mensual del SIAF, el ROC-AUC subió de 0,723 a 0,753 sobre la misma muestra (+0,030; IC 95 % [0,026; 0,033]). La Fig. 8 muestra que los niveles de riesgo separan efectivamente las tasas de retraso observadas.</w:t>
+        <w:t xml:space="preserve"> En el backtest </w:t>
+      </w:r>
+      <w:r>
+        <w:rPr>
+          <w:rFonts w:ascii="Arial" w:cs="Arial" w:eastAsia="Arial" w:hAnsi="Arial"/>
+          <w:i/>
+          <w:iCs/>
+          <w:sz w:val="21"/>
+          <w:szCs w:val="21"/>
+        </w:rPr>
+        <w:t xml:space="preserve">as-of</w:t>
+      </w:r>
+      <w:r>
+        <w:rPr>
+          <w:rFonts w:ascii="Arial" w:cs="Arial" w:eastAsia="Arial" w:hAnsi="Arial"/>
+          <w:sz w:val="21"/>
+          <w:szCs w:val="21"/>
+        </w:rPr>
+        <w:t xml:space="preserve"> (39 038 observaciones obra-mes con resultado conocido), la probabilidad media estimada y la tasa observada del evento coinciden en los diez deciles de riesgo (Fig. 8): 1,5 % frente a 1,1 % en el decil inferior y 20,0 % frente a 17,7 % en el superior. Por nivel, el evento ocurrió en 17,6 % de las observaciones en nivel alto, 8,5 % en nivel medio y 3,1 % en nivel bajo, frente a una tasa promedio de 5,6 %. Estas tasas son las que la interfaz muestra como confiabilidad de cada nivel.</w:t>
+      </w:r>
+    </w:p>
+    <w:p>
+      <w:pPr>
+        <w:keepNext/>
+        <w:spacing w:after="60" w:before="120"/>
+        <w:jc w:val="center"/>
+      </w:pPr>
+      <w:r>
+        <w:drawing>
+          <wp:inline distT="0" distB="0" distL="0" distR="0">
+            <wp:extent cx="5810250" cy="2266950"/>
+            <wp:effectExtent t="0" r="0" b="0" l="0"/>
+            <wp:docPr id="1" name="calibracion_alerta" descr="Calibración del modelo de alerta en el backtest as-of: (a) probabilidad estimada media frente a tasa observada por decil; (b) tasa observada por nivel de riesgo." title="Figura 8"/>
+            <wp:cNvGraphicFramePr>
+              <a:graphicFrameLocks xmlns:a="http://schemas.openxmlformats.org/drawingml/2006/main" noChangeAspect="1"/>
+            </wp:cNvGraphicFramePr>
+            <a:graphic xmlns:a="http://schemas.openxmlformats.org/drawingml/2006/main">
+              <a:graphicData uri="http://schemas.openxmlformats.org/drawingml/2006/picture">
+                <pic:pic xmlns:pic="http://schemas.openxmlformats.org/drawingml/2006/picture">
+                  <pic:nvPicPr>
+                    <pic:cNvPr id="0" name="" descr=""/>
+                    <pic:cNvPicPr>
+                      <a:picLocks noChangeAspect="1" noChangeArrowheads="1"/>
+                    </pic:cNvPicPr>
+                  </pic:nvPicPr>
+                  <pic:blipFill>
+                    <a:blip r:embed="rId16" cstate="none"/>
+                    <a:srcRect/>
+                    <a:stretch>
+                      <a:fillRect/>
+                    </a:stretch>
+                  </pic:blipFill>
+                  <pic:spPr bwMode="auto">
+                    <a:xfrm>
+                      <a:off x="0" y="0"/>
+                      <a:ext cx="5810250" cy="2266950"/>
+                    </a:xfrm>
+                    <a:prstGeom prst="rect">
+                      <a:avLst/>
+                    </a:prstGeom>
+                  </pic:spPr>
+                </pic:pic>
+              </a:graphicData>
+            </a:graphic>
+          </wp:inline>
+        </w:drawing>
+      </w:r>
+    </w:p>
+    <w:p>
+      <w:pPr>
+        <w:spacing w:after="200"/>
+        <w:jc w:val="center"/>
+      </w:pPr>
+      <w:r>
+        <w:rPr>
+          <w:rFonts w:ascii="Arial" w:cs="Arial" w:eastAsia="Arial" w:hAnsi="Arial"/>
+          <w:b/>
+          <w:bCs/>
+          <w:sz w:val="18"/>
+          <w:szCs w:val="18"/>
+        </w:rPr>
+        <w:t xml:space="preserve">Fig. 8. </w:t>
+      </w:r>
+      <w:r>
+        <w:rPr>
+          <w:rFonts w:ascii="Arial" w:cs="Arial" w:eastAsia="Arial" w:hAnsi="Arial"/>
+          <w:sz w:val="18"/>
+          <w:szCs w:val="18"/>
+        </w:rPr>
+        <w:t xml:space="preserve">Calibración del modelo de alerta en el backtest as-of: (a) probabilidad estimada media frente a tasa observada por decil; (b) tasa observada por nivel de riesgo.</w:t>
+      </w:r>
+    </w:p>
+    <w:p>
+      <w:pPr>
+        <w:spacing w:after="120" w:line="264"/>
+        <w:jc w:val="both"/>
+      </w:pPr>
+      <w:r>
+        <w:rPr>
+          <w:rFonts w:ascii="Arial" w:cs="Arial" w:eastAsia="Arial" w:hAnsi="Arial"/>
+          <w:b/>
+          <w:bCs/>
+          <w:sz w:val="21"/>
+          <w:szCs w:val="21"/>
+        </w:rPr>
+        <w:t xml:space="preserve">Modelos de cartera.</w:t>
+      </w:r>
+      <w:r>
+        <w:rPr>
+          <w:rFonts w:ascii="Arial" w:cs="Arial" w:eastAsia="Arial" w:hAnsi="Arial"/>
+          <w:sz w:val="21"/>
+          <w:szCs w:val="21"/>
+        </w:rPr>
+        <w:t xml:space="preserve"> La Tabla 6 resume la prueba temporal. Al inicio de la obra, LightGBM alcanzó ROC-AUC de 0,733 frente a 0,658 de la regla basada en el historial de la entidad (diferencia +0,075; IC 95 % [0,063; 0,086]). Con el seguimiento mensual del SIAF, el ROC-AUC subió de 0,723 a 0,753 sobre la misma muestra (+0,030; IC 95 % [0,026; 0,033]). La Fig. 9 muestra que los niveles de riesgo separan efectivamente las tasas de retraso observadas.</w:t>
       </w:r>
     </w:p>
     <w:p>
@@ -9589,7 +10135,7 @@
           </w:tcPr>
           <w:p>
             <w:pPr>
-              <w:keepNext w:val="false"/>
+              <w:keepNext/>
               <w:spacing w:after="0" w:line="240"/>
               <w:jc w:val="left"/>
             </w:pPr>
@@ -9616,7 +10162,7 @@
           </w:tcPr>
           <w:p>
             <w:pPr>
-              <w:keepNext w:val="false"/>
+              <w:keepNext/>
               <w:spacing w:after="0" w:line="240"/>
               <w:jc w:val="left"/>
             </w:pPr>
@@ -9643,7 +10189,7 @@
           </w:tcPr>
           <w:p>
             <w:pPr>
-              <w:keepNext w:val="false"/>
+              <w:keepNext/>
               <w:spacing w:after="0" w:line="240"/>
               <w:jc w:val="center"/>
             </w:pPr>
@@ -9670,7 +10216,7 @@
           </w:tcPr>
           <w:p>
             <w:pPr>
-              <w:keepNext w:val="false"/>
+              <w:keepNext/>
               <w:spacing w:after="0" w:line="240"/>
               <w:jc w:val="center"/>
             </w:pPr>
@@ -9697,7 +10243,7 @@
           </w:tcPr>
           <w:p>
             <w:pPr>
-              <w:keepNext w:val="false"/>
+              <w:keepNext/>
               <w:spacing w:after="0" w:line="240"/>
               <w:jc w:val="center"/>
             </w:pPr>
@@ -9724,7 +10270,7 @@
           </w:tcPr>
           <w:p>
             <w:pPr>
-              <w:keepNext w:val="false"/>
+              <w:keepNext/>
               <w:spacing w:after="0" w:line="240"/>
               <w:jc w:val="center"/>
             </w:pPr>
@@ -9757,7 +10303,7 @@
           </w:tcPr>
           <w:p>
             <w:pPr>
-              <w:keepNext w:val="false"/>
+              <w:keepNext/>
               <w:spacing w:after="0" w:line="240"/>
               <w:jc w:val="left"/>
             </w:pPr>
@@ -9785,7 +10331,7 @@
           </w:tcPr>
           <w:p>
             <w:pPr>
-              <w:keepNext w:val="false"/>
+              <w:keepNext/>
               <w:spacing w:after="0" w:line="240"/>
               <w:jc w:val="left"/>
             </w:pPr>
@@ -9813,7 +10359,7 @@
           </w:tcPr>
           <w:p>
             <w:pPr>
-              <w:keepNext w:val="false"/>
+              <w:keepNext/>
               <w:spacing w:after="0" w:line="240"/>
               <w:jc w:val="center"/>
             </w:pPr>
@@ -9841,7 +10387,7 @@
           </w:tcPr>
           <w:p>
             <w:pPr>
-              <w:keepNext w:val="false"/>
+              <w:keepNext/>
               <w:spacing w:after="0" w:line="240"/>
               <w:jc w:val="center"/>
             </w:pPr>
@@ -9869,7 +10415,7 @@
           </w:tcPr>
           <w:p>
             <w:pPr>
-              <w:keepNext w:val="false"/>
+              <w:keepNext/>
               <w:spacing w:after="0" w:line="240"/>
               <w:jc w:val="center"/>
             </w:pPr>
@@ -9897,7 +10443,7 @@
           </w:tcPr>
           <w:p>
             <w:pPr>
-              <w:keepNext w:val="false"/>
+              <w:keepNext/>
               <w:spacing w:after="0" w:line="240"/>
               <w:jc w:val="center"/>
             </w:pPr>
@@ -9929,7 +10475,7 @@
           </w:tcPr>
           <w:p>
             <w:pPr>
-              <w:keepNext w:val="false"/>
+              <w:keepNext/>
               <w:spacing w:after="0" w:line="240"/>
               <w:jc w:val="left"/>
             </w:pPr>
@@ -9956,7 +10502,7 @@
           </w:tcPr>
           <w:p>
             <w:pPr>
-              <w:keepNext w:val="false"/>
+              <w:keepNext/>
               <w:spacing w:after="0" w:line="240"/>
               <w:jc w:val="left"/>
             </w:pPr>
@@ -9983,7 +10529,7 @@
           </w:tcPr>
           <w:p>
             <w:pPr>
-              <w:keepNext w:val="false"/>
+              <w:keepNext/>
               <w:spacing w:after="0" w:line="240"/>
               <w:jc w:val="center"/>
             </w:pPr>
@@ -10010,7 +10556,7 @@
           </w:tcPr>
           <w:p>
             <w:pPr>
-              <w:keepNext w:val="false"/>
+              <w:keepNext/>
               <w:spacing w:after="0" w:line="240"/>
               <w:jc w:val="center"/>
             </w:pPr>
@@ -10037,7 +10583,7 @@
           </w:tcPr>
           <w:p>
             <w:pPr>
-              <w:keepNext w:val="false"/>
+              <w:keepNext/>
               <w:spacing w:after="0" w:line="240"/>
               <w:jc w:val="center"/>
             </w:pPr>
@@ -10064,7 +10610,7 @@
           </w:tcPr>
           <w:p>
             <w:pPr>
-              <w:keepNext w:val="false"/>
+              <w:keepNext/>
               <w:spacing w:after="0" w:line="240"/>
               <w:jc w:val="center"/>
             </w:pPr>
@@ -10097,7 +10643,7 @@
           </w:tcPr>
           <w:p>
             <w:pPr>
-              <w:keepNext w:val="false"/>
+              <w:keepNext/>
               <w:spacing w:after="0" w:line="240"/>
               <w:jc w:val="left"/>
             </w:pPr>
@@ -10125,7 +10671,7 @@
           </w:tcPr>
           <w:p>
             <w:pPr>
-              <w:keepNext w:val="false"/>
+              <w:keepNext/>
               <w:spacing w:after="0" w:line="240"/>
               <w:jc w:val="left"/>
             </w:pPr>
@@ -10153,7 +10699,7 @@
           </w:tcPr>
           <w:p>
             <w:pPr>
-              <w:keepNext w:val="false"/>
+              <w:keepNext/>
               <w:spacing w:after="0" w:line="240"/>
               <w:jc w:val="center"/>
             </w:pPr>
@@ -10181,7 +10727,7 @@
           </w:tcPr>
           <w:p>
             <w:pPr>
-              <w:keepNext w:val="false"/>
+              <w:keepNext/>
               <w:spacing w:after="0" w:line="240"/>
               <w:jc w:val="center"/>
             </w:pPr>
@@ -10209,7 +10755,7 @@
           </w:tcPr>
           <w:p>
             <w:pPr>
-              <w:keepNext w:val="false"/>
+              <w:keepNext/>
               <w:spacing w:after="0" w:line="240"/>
               <w:jc w:val="center"/>
             </w:pPr>
@@ -10237,7 +10783,7 @@
           </w:tcPr>
           <w:p>
             <w:pPr>
-              <w:keepNext w:val="false"/>
+              <w:keepNext/>
               <w:spacing w:after="0" w:line="240"/>
               <w:jc w:val="center"/>
             </w:pPr>
@@ -10269,7 +10815,7 @@
           </w:tcPr>
           <w:p>
             <w:pPr>
-              <w:keepNext w:val="false"/>
+              <w:keepNext/>
               <w:spacing w:after="0" w:line="240"/>
               <w:jc w:val="left"/>
             </w:pPr>
@@ -10296,7 +10842,7 @@
           </w:tcPr>
           <w:p>
             <w:pPr>
-              <w:keepNext w:val="false"/>
+              <w:keepNext/>
               <w:spacing w:after="0" w:line="240"/>
               <w:jc w:val="left"/>
             </w:pPr>
@@ -10323,7 +10869,7 @@
           </w:tcPr>
           <w:p>
             <w:pPr>
-              <w:keepNext w:val="false"/>
+              <w:keepNext/>
               <w:spacing w:after="0" w:line="240"/>
               <w:jc w:val="center"/>
             </w:pPr>
@@ -10350,7 +10896,7 @@
           </w:tcPr>
           <w:p>
             <w:pPr>
-              <w:keepNext w:val="false"/>
+              <w:keepNext/>
               <w:spacing w:after="0" w:line="240"/>
               <w:jc w:val="center"/>
             </w:pPr>
@@ -10377,7 +10923,7 @@
           </w:tcPr>
           <w:p>
             <w:pPr>
-              <w:keepNext w:val="false"/>
+              <w:keepNext/>
               <w:spacing w:after="0" w:line="240"/>
               <w:jc w:val="center"/>
             </w:pPr>
@@ -10404,7 +10950,7 @@
           </w:tcPr>
           <w:p>
             <w:pPr>
-              <w:keepNext w:val="false"/>
+              <w:keepNext/>
               <w:spacing w:after="0" w:line="240"/>
               <w:jc w:val="center"/>
             </w:pPr>
@@ -10437,7 +10983,7 @@
           </w:tcPr>
           <w:p>
             <w:pPr>
-              <w:keepNext w:val="false"/>
+              <w:keepNext/>
               <w:spacing w:after="0" w:line="240"/>
               <w:jc w:val="left"/>
             </w:pPr>
@@ -10465,7 +11011,7 @@
           </w:tcPr>
           <w:p>
             <w:pPr>
-              <w:keepNext w:val="false"/>
+              <w:keepNext/>
               <w:spacing w:after="0" w:line="240"/>
               <w:jc w:val="left"/>
             </w:pPr>
@@ -10493,7 +11039,7 @@
           </w:tcPr>
           <w:p>
             <w:pPr>
-              <w:keepNext w:val="false"/>
+              <w:keepNext/>
               <w:spacing w:after="0" w:line="240"/>
               <w:jc w:val="center"/>
             </w:pPr>
@@ -10521,7 +11067,7 @@
           </w:tcPr>
           <w:p>
             <w:pPr>
-              <w:keepNext w:val="false"/>
+              <w:keepNext/>
               <w:spacing w:after="0" w:line="240"/>
               <w:jc w:val="center"/>
             </w:pPr>
@@ -10549,7 +11095,7 @@
           </w:tcPr>
           <w:p>
             <w:pPr>
-              <w:keepNext w:val="false"/>
+              <w:keepNext/>
               <w:spacing w:after="0" w:line="240"/>
               <w:jc w:val="center"/>
             </w:pPr>
@@ -10577,7 +11123,7 @@
           </w:tcPr>
           <w:p>
             <w:pPr>
-              <w:keepNext w:val="false"/>
+              <w:keepNext/>
               <w:spacing w:after="0" w:line="240"/>
               <w:jc w:val="center"/>
             </w:pPr>
@@ -10786,92 +11332,7 @@
           <wp:inline distT="0" distB="0" distL="0" distR="0">
             <wp:extent cx="5810250" cy="2343150"/>
             <wp:effectExtent t="0" r="0" b="0" l="0"/>
-            <wp:docPr id="1" name="calibracion" descr="Tasa de retraso significativo observada por nivel de riesgo en el periodo de prueba de la cartera INFOBRAS." title="Figura 8"/>
-            <wp:cNvGraphicFramePr>
-              <a:graphicFrameLocks xmlns:a="http://schemas.openxmlformats.org/drawingml/2006/main" noChangeAspect="1"/>
-            </wp:cNvGraphicFramePr>
-            <a:graphic xmlns:a="http://schemas.openxmlformats.org/drawingml/2006/main">
-              <a:graphicData uri="http://schemas.openxmlformats.org/drawingml/2006/picture">
-                <pic:pic xmlns:pic="http://schemas.openxmlformats.org/drawingml/2006/picture">
-                  <pic:nvPicPr>
-                    <pic:cNvPr id="0" name="" descr=""/>
-                    <pic:cNvPicPr>
-                      <a:picLocks noChangeAspect="1" noChangeArrowheads="1"/>
-                    </pic:cNvPicPr>
-                  </pic:nvPicPr>
-                  <pic:blipFill>
-                    <a:blip r:embed="rId16" cstate="none"/>
-                    <a:srcRect/>
-                    <a:stretch>
-                      <a:fillRect/>
-                    </a:stretch>
-                  </pic:blipFill>
-                  <pic:spPr bwMode="auto">
-                    <a:xfrm>
-                      <a:off x="0" y="0"/>
-                      <a:ext cx="5810250" cy="2343150"/>
-                    </a:xfrm>
-                    <a:prstGeom prst="rect">
-                      <a:avLst/>
-                    </a:prstGeom>
-                  </pic:spPr>
-                </pic:pic>
-              </a:graphicData>
-            </a:graphic>
-          </wp:inline>
-        </w:drawing>
-      </w:r>
-    </w:p>
-    <w:p>
-      <w:pPr>
-        <w:spacing w:after="200"/>
-        <w:jc w:val="center"/>
-      </w:pPr>
-      <w:r>
-        <w:rPr>
-          <w:rFonts w:ascii="Arial" w:cs="Arial" w:eastAsia="Arial" w:hAnsi="Arial"/>
-          <w:b/>
-          <w:bCs/>
-          <w:sz w:val="18"/>
-          <w:szCs w:val="18"/>
-        </w:rPr>
-        <w:t xml:space="preserve">Fig. 8. </w:t>
-      </w:r>
-      <w:r>
-        <w:rPr>
-          <w:rFonts w:ascii="Arial" w:cs="Arial" w:eastAsia="Arial" w:hAnsi="Arial"/>
-          <w:sz w:val="18"/>
-          <w:szCs w:val="18"/>
-        </w:rPr>
-        <w:t xml:space="preserve">Tasa de retraso significativo observada por nivel de riesgo en el periodo de prueba de la cartera INFOBRAS.</w:t>
-      </w:r>
-    </w:p>
-    <w:p>
-      <w:pPr>
-        <w:spacing w:after="120" w:line="264"/>
-        <w:jc w:val="both"/>
-      </w:pPr>
-      <w:r>
-        <w:rPr>
-          <w:rFonts w:ascii="Arial" w:cs="Arial" w:eastAsia="Arial" w:hAnsi="Arial"/>
-          <w:sz w:val="21"/>
-          <w:szCs w:val="21"/>
-        </w:rPr>
-        <w:t xml:space="preserve">El análisis de sensibilidad de la etiqueta (Fig. 9) muestra que LightGBM supera a la regla en todos los umbrales (ROC-AUC 0,762, 0,733, 0,721 y 0,705 para 10, 30, 50 y 100 % del plazo; diferencias con IC que excluyen el cero). La ablación del nombre de la obra no cambió el resultado (ROC-AUC 0,732 sin texto frente a 0,733).</w:t>
-      </w:r>
-    </w:p>
-    <w:p>
-      <w:pPr>
-        <w:keepNext/>
-        <w:spacing w:after="60" w:before="120"/>
-        <w:jc w:val="center"/>
-      </w:pPr>
-      <w:r>
-        <w:drawing>
-          <wp:inline distT="0" distB="0" distL="0" distR="0">
-            <wp:extent cx="5810250" cy="2266950"/>
-            <wp:effectExtent t="0" r="0" b="0" l="0"/>
-            <wp:docPr id="1" name="sensibilidad" descr="Sensibilidad del modelo de cartera al umbral que define el retraso significativo." title="Figura 9"/>
+            <wp:docPr id="1" name="calibracion" descr="Tasa de retraso significativo observada por nivel de riesgo en el periodo de prueba de la cartera INFOBRAS." title="Figura 9"/>
             <wp:cNvGraphicFramePr>
               <a:graphicFrameLocks xmlns:a="http://schemas.openxmlformats.org/drawingml/2006/main" noChangeAspect="1"/>
             </wp:cNvGraphicFramePr>
@@ -10894,6 +11355,91 @@
                   <pic:spPr bwMode="auto">
                     <a:xfrm>
                       <a:off x="0" y="0"/>
+                      <a:ext cx="5810250" cy="2343150"/>
+                    </a:xfrm>
+                    <a:prstGeom prst="rect">
+                      <a:avLst/>
+                    </a:prstGeom>
+                  </pic:spPr>
+                </pic:pic>
+              </a:graphicData>
+            </a:graphic>
+          </wp:inline>
+        </w:drawing>
+      </w:r>
+    </w:p>
+    <w:p>
+      <w:pPr>
+        <w:spacing w:after="200"/>
+        <w:jc w:val="center"/>
+      </w:pPr>
+      <w:r>
+        <w:rPr>
+          <w:rFonts w:ascii="Arial" w:cs="Arial" w:eastAsia="Arial" w:hAnsi="Arial"/>
+          <w:b/>
+          <w:bCs/>
+          <w:sz w:val="18"/>
+          <w:szCs w:val="18"/>
+        </w:rPr>
+        <w:t xml:space="preserve">Fig. 9. </w:t>
+      </w:r>
+      <w:r>
+        <w:rPr>
+          <w:rFonts w:ascii="Arial" w:cs="Arial" w:eastAsia="Arial" w:hAnsi="Arial"/>
+          <w:sz w:val="18"/>
+          <w:szCs w:val="18"/>
+        </w:rPr>
+        <w:t xml:space="preserve">Tasa de retraso significativo observada por nivel de riesgo en el periodo de prueba de la cartera INFOBRAS.</w:t>
+      </w:r>
+    </w:p>
+    <w:p>
+      <w:pPr>
+        <w:spacing w:after="120" w:line="264"/>
+        <w:jc w:val="both"/>
+      </w:pPr>
+      <w:r>
+        <w:rPr>
+          <w:rFonts w:ascii="Arial" w:cs="Arial" w:eastAsia="Arial" w:hAnsi="Arial"/>
+          <w:sz w:val="21"/>
+          <w:szCs w:val="21"/>
+        </w:rPr>
+        <w:t xml:space="preserve">El análisis de sensibilidad de la etiqueta (Fig. 10) muestra que LightGBM supera a la regla en todos los umbrales (ROC-AUC 0,762, 0,733, 0,721 y 0,705 para 10, 30, 50 y 100 % del plazo; diferencias con IC que excluyen el cero). La ablación del nombre de la obra no cambió el resultado (ROC-AUC 0,732 sin texto frente a 0,733).</w:t>
+      </w:r>
+    </w:p>
+    <w:p>
+      <w:pPr>
+        <w:keepNext/>
+        <w:spacing w:after="60" w:before="120"/>
+        <w:jc w:val="center"/>
+      </w:pPr>
+      <w:r>
+        <w:drawing>
+          <wp:inline distT="0" distB="0" distL="0" distR="0">
+            <wp:extent cx="5810250" cy="2266950"/>
+            <wp:effectExtent t="0" r="0" b="0" l="0"/>
+            <wp:docPr id="1" name="sensibilidad" descr="Sensibilidad del modelo de cartera al umbral que define el retraso significativo." title="Figura 10"/>
+            <wp:cNvGraphicFramePr>
+              <a:graphicFrameLocks xmlns:a="http://schemas.openxmlformats.org/drawingml/2006/main" noChangeAspect="1"/>
+            </wp:cNvGraphicFramePr>
+            <a:graphic xmlns:a="http://schemas.openxmlformats.org/drawingml/2006/main">
+              <a:graphicData uri="http://schemas.openxmlformats.org/drawingml/2006/picture">
+                <pic:pic xmlns:pic="http://schemas.openxmlformats.org/drawingml/2006/picture">
+                  <pic:nvPicPr>
+                    <pic:cNvPr id="0" name="" descr=""/>
+                    <pic:cNvPicPr>
+                      <a:picLocks noChangeAspect="1" noChangeArrowheads="1"/>
+                    </pic:cNvPicPr>
+                  </pic:nvPicPr>
+                  <pic:blipFill>
+                    <a:blip r:embed="rId18" cstate="none"/>
+                    <a:srcRect/>
+                    <a:stretch>
+                      <a:fillRect/>
+                    </a:stretch>
+                  </pic:blipFill>
+                  <pic:spPr bwMode="auto">
+                    <a:xfrm>
+                      <a:off x="0" y="0"/>
                       <a:ext cx="5810250" cy="2266950"/>
                     </a:xfrm>
                     <a:prstGeom prst="rect">
@@ -10920,7 +11466,7 @@
           <w:sz w:val="18"/>
           <w:szCs w:val="18"/>
         </w:rPr>
-        <w:t xml:space="preserve">Fig. 9. </w:t>
+        <w:t xml:space="preserve">Fig. 10. </w:t>
       </w:r>
       <w:r>
         <w:rPr>
@@ -11148,7 +11694,7 @@
                 <w:sz w:val="16"/>
                 <w:szCs w:val="16"/>
               </w:rPr>
-              <w:t xml:space="preserve">p50 10,1 ms; p95 37,2 ms; 0 % de errores</w:t>
+              <w:t xml:space="preserve">p50 8,7 ms; p95 45,4 ms; 0 % de errores</w:t>
             </w:r>
           </w:p>
         </w:tc>
@@ -11175,7 +11721,7 @@
                 <w:sz w:val="16"/>
                 <w:szCs w:val="16"/>
               </w:rPr>
-              <w:t xml:space="preserve">k6, 60 s, 6 endpoints de consulta</w:t>
+              <w:t xml:space="preserve">k6, 60 s, 8 endpoints del flujo panorama → lista → ficha</w:t>
             </w:r>
           </w:p>
         </w:tc>
@@ -11236,7 +11782,7 @@
                 <w:sz w:val="16"/>
                 <w:szCs w:val="16"/>
               </w:rPr>
-              <w:t xml:space="preserve">p50 60,6 ms; p95 190,9 ms; 261,4 solicitudes/s; 0 % de errores</w:t>
+              <w:t xml:space="preserve">p50 56,7 ms; p95 167,8 ms; 266,4 solicitudes/s; 0 % de errores</w:t>
             </w:r>
           </w:p>
         </w:tc>
@@ -11323,7 +11869,7 @@
                 <w:sz w:val="16"/>
                 <w:szCs w:val="16"/>
               </w:rPr>
-              <w:t xml:space="preserve">p50 165,8 ms; p95 414,3 ms; 254,5 solicitudes/s; 0 % de errores</w:t>
+              <w:t xml:space="preserve">p50 166,5 ms; p95 420,1 ms; 255,7 solicitudes/s; 0 % de errores</w:t>
             </w:r>
           </w:p>
         </w:tc>
@@ -11411,7 +11957,7 @@
                 <w:sz w:val="16"/>
                 <w:szCs w:val="16"/>
               </w:rPr>
-              <w:t xml:space="preserve">10 de 10 casos aprobados (cabeceras, inyección SQL, XSS, control de acceso, JWT falsificado, credenciales inválidas, validación de entrada, errores sin trazas, métodos HTTP, limitación de tasa)</w:t>
+              <w:t xml:space="preserve">13 de 13 casos aprobados (cabeceras en la API y en recursos estáticos, inyección SQL, comodines en búsquedas, XSS, control de acceso, JWT falsificado, credenciales inválidas, validación de entrada, errores sin trazas, métodos HTTP, limitación de tasa y de intentos de ingreso)</w:t>
             </w:r>
           </w:p>
         </w:tc>
@@ -11498,7 +12044,7 @@
                 <w:sz w:val="16"/>
                 <w:szCs w:val="16"/>
               </w:rPr>
-              <w:t xml:space="preserve">100, 100 y 100 (radar, ficha, cartera)</w:t>
+              <w:t xml:space="preserve">100, 100 y 100 (panorama, ficha, cartera)</w:t>
             </w:r>
           </w:p>
         </w:tc>
@@ -11586,7 +12132,7 @@
                 <w:sz w:val="16"/>
                 <w:szCs w:val="16"/>
               </w:rPr>
-              <w:t xml:space="preserve">88, 100 y 95; LCP 1,56 s en el radar</w:t>
+              <w:t xml:space="preserve">93, 99 y 99; LCP 1,67 s en el panorama</w:t>
             </w:r>
           </w:p>
         </w:tc>
@@ -11646,7 +12192,7 @@
                 <w:sz w:val="16"/>
                 <w:szCs w:val="16"/>
               </w:rPr>
-              <w:t xml:space="preserve">Buenas prácticas</w:t>
+              <w:t xml:space="preserve">Buenas prácticas y SEO</w:t>
             </w:r>
           </w:p>
         </w:tc>
@@ -11673,7 +12219,7 @@
                 <w:sz w:val="16"/>
                 <w:szCs w:val="16"/>
               </w:rPr>
-              <w:t xml:space="preserve">100 en las tres páginas</w:t>
+              <w:t xml:space="preserve">100 y 100 en las tres páginas</w:t>
             </w:r>
           </w:p>
         </w:tc>
@@ -11723,17 +12269,17 @@
           </w:tcPr>
           <w:p>
             <w:pPr>
-              <w:keepNext/>
-              <w:spacing w:after="0" w:line="240"/>
-              <w:jc w:val="left"/>
-            </w:pPr>
-            <w:r>
-              <w:rPr>
-                <w:rFonts w:ascii="Arial" w:cs="Arial" w:eastAsia="Arial" w:hAnsi="Arial"/>
-                <w:sz w:val="16"/>
-                <w:szCs w:val="16"/>
-              </w:rPr>
-              <w:t xml:space="preserve">Pruebas automatizadas</w:t>
+              <w:keepNext w:val="false"/>
+              <w:spacing w:after="0" w:line="240"/>
+              <w:jc w:val="left"/>
+            </w:pPr>
+            <w:r>
+              <w:rPr>
+                <w:rFonts w:ascii="Arial" w:cs="Arial" w:eastAsia="Arial" w:hAnsi="Arial"/>
+                <w:sz w:val="16"/>
+                <w:szCs w:val="16"/>
+              </w:rPr>
+              <w:t xml:space="preserve">Calidad de datos</w:t>
             </w:r>
           </w:p>
         </w:tc>
@@ -11751,17 +12297,17 @@
           </w:tcPr>
           <w:p>
             <w:pPr>
-              <w:keepNext/>
-              <w:spacing w:after="0" w:line="240"/>
-              <w:jc w:val="left"/>
-            </w:pPr>
-            <w:r>
-              <w:rPr>
-                <w:rFonts w:ascii="Arial" w:cs="Arial" w:eastAsia="Arial" w:hAnsi="Arial"/>
-                <w:sz w:val="16"/>
-                <w:szCs w:val="16"/>
-              </w:rPr>
-              <w:t xml:space="preserve">43 aprobadas, 0 fallidas</w:t>
+              <w:keepNext w:val="false"/>
+              <w:spacing w:after="0" w:line="240"/>
+              <w:jc w:val="left"/>
+            </w:pPr>
+            <w:r>
+              <w:rPr>
+                <w:rFonts w:ascii="Arial" w:cs="Arial" w:eastAsia="Arial" w:hAnsi="Arial"/>
+                <w:sz w:val="16"/>
+                <w:szCs w:val="16"/>
+              </w:rPr>
+              <w:t xml:space="preserve">29 chequeos: 14 sin hallazgos, 5 con hallazgos documentados, 10 descriptivos</w:t>
             </w:r>
           </w:p>
         </w:tc>
@@ -11769,6 +12315,92 @@
           <w:tcPr>
             <w:tcW w:type="dxa" w:w="2823"/>
             <w:shd w:fill="F5F8FC" w:color="auto" w:val="clear"/>
+            <w:tcMar>
+              <w:top w:type="dxa" w:w="50"/>
+              <w:left w:type="dxa" w:w="80"/>
+              <w:bottom w:type="dxa" w:w="50"/>
+              <w:right w:type="dxa" w:w="80"/>
+            </w:tcMar>
+            <w:vAlign w:val="center"/>
+          </w:tcPr>
+          <w:p>
+            <w:pPr>
+              <w:keepNext w:val="false"/>
+              <w:spacing w:after="0" w:line="240"/>
+              <w:jc w:val="left"/>
+            </w:pPr>
+            <w:r>
+              <w:rPr>
+                <w:rFonts w:ascii="Arial" w:cs="Arial" w:eastAsia="Arial" w:hAnsi="Arial"/>
+                <w:sz w:val="16"/>
+                <w:szCs w:val="16"/>
+              </w:rPr>
+              <w:t xml:space="preserve">Auditoría SQL automática</w:t>
+            </w:r>
+          </w:p>
+        </w:tc>
+      </w:tr>
+      <w:tr>
+        <w:trPr>
+          <w:cantSplit/>
+        </w:trPr>
+        <w:tc>
+          <w:tcPr>
+            <w:tcW w:type="dxa" w:w="2256"/>
+            <w:tcMar>
+              <w:top w:type="dxa" w:w="50"/>
+              <w:left w:type="dxa" w:w="80"/>
+              <w:bottom w:type="dxa" w:w="50"/>
+              <w:right w:type="dxa" w:w="80"/>
+            </w:tcMar>
+            <w:vAlign w:val="center"/>
+          </w:tcPr>
+          <w:p>
+            <w:pPr>
+              <w:keepNext/>
+              <w:spacing w:after="0" w:line="240"/>
+              <w:jc w:val="left"/>
+            </w:pPr>
+            <w:r>
+              <w:rPr>
+                <w:rFonts w:ascii="Arial" w:cs="Arial" w:eastAsia="Arial" w:hAnsi="Arial"/>
+                <w:sz w:val="16"/>
+                <w:szCs w:val="16"/>
+              </w:rPr>
+              <w:t xml:space="preserve">Pruebas automatizadas</w:t>
+            </w:r>
+          </w:p>
+        </w:tc>
+        <w:tc>
+          <w:tcPr>
+            <w:tcW w:type="dxa" w:w="4325"/>
+            <w:tcMar>
+              <w:top w:type="dxa" w:w="50"/>
+              <w:left w:type="dxa" w:w="80"/>
+              <w:bottom w:type="dxa" w:w="50"/>
+              <w:right w:type="dxa" w:w="80"/>
+            </w:tcMar>
+            <w:vAlign w:val="center"/>
+          </w:tcPr>
+          <w:p>
+            <w:pPr>
+              <w:keepNext/>
+              <w:spacing w:after="0" w:line="240"/>
+              <w:jc w:val="left"/>
+            </w:pPr>
+            <w:r>
+              <w:rPr>
+                <w:rFonts w:ascii="Arial" w:cs="Arial" w:eastAsia="Arial" w:hAnsi="Arial"/>
+                <w:sz w:val="16"/>
+                <w:szCs w:val="16"/>
+              </w:rPr>
+              <w:t xml:space="preserve">56 aprobadas, 0 fallidas</w:t>
+            </w:r>
+          </w:p>
+        </w:tc>
+        <w:tc>
+          <w:tcPr>
+            <w:tcW w:type="dxa" w:w="2823"/>
             <w:tcMar>
               <w:top w:type="dxa" w:w="50"/>
               <w:left w:type="dxa" w:w="80"/>
@@ -11807,7 +12439,7 @@
           <w:sz w:val="16"/>
           <w:szCs w:val="16"/>
         </w:rPr>
-        <w:t xml:space="preserve">Nota: La prueba de carga se ejecutó directamente contra la API, con el límite de tasa de la aplicación elevado, porque un generador de carga desde una sola IP solo mediría el limitador. Fuente: docs/articulo/evaluacion/.</w:t>
+        <w:t xml:space="preserve">Nota: La prueba de carga se ejecutó directamente contra la API, con el límite de tasa de la aplicación elevado, porque un generador de carga desde una sola IP solo mediría el limitador. En la primera medición de la interfaz rediseñada la accesibilidad fue 100, 93 y 96; se corrigieron el contraste del texto secundario, un atributo ARIA no permitido y el desplazamiento del diseño al cargar los filtros. Fuente: docs/articulo/evaluacion/.</w:t>
       </w:r>
     </w:p>
     <w:p>
@@ -11839,7 +12471,7 @@
           <w:sz w:val="21"/>
           <w:szCs w:val="21"/>
         </w:rPr>
-        <w:t xml:space="preserve">La Fig. 10 muestra la importancia TreeSHAP por grupo de variables del modelo B: el contenido de los asientos aporta el 46,0 % y los registros estructurados del cuaderno el 28,5 %; el SIAF, el 7,1 %. Entre las representaciones de texto (PR-AUC nacional con H = 60; A = 0,139), el léxico de causas alcanzó 0,147, las puntuaciones supervisadas TF-IDF 0,152 y las de embeddings 0,148, mientras que los embeddings reducidos sin supervisión quedaron en 0,141; la combinación llegó a 0,158. Cualitativamente, en las tres alertas de mayor riesgo del corte vigente los factores principales fueron el vocabulario de los asientos recientes y la proporción de asientos que mencionan atrasos y penalidades, verificables en los asientos citados como evidencia. Por sector, evaluado sin reentrenar sobre la misma prueba, el ROC-AUC del modelo de alerta varió entre 0,752 (educación) y 0,803 (salud) y el del modelo de seguimiento de la cartera entre 0,720 (energía y minas) y 0,783 (agricultura), con intervalos que se superponen en la mayoría de los sectores; ningún sector concentra la señal, lo que respalda un modelo nacional multisectorial en lugar de uno por sector.</w:t>
+        <w:t xml:space="preserve">La Fig. 11 muestra la importancia TreeSHAP por grupo de variables del modelo B: el contenido de los asientos aporta el 46,0 % y los registros estructurados del cuaderno el 28,5 %; el SIAF, el 7,1 %. Entre las representaciones de texto (PR-AUC nacional con H = 60; A = 0,139), el léxico de causas alcanzó 0,147, las puntuaciones supervisadas TF-IDF 0,152 y las de embeddings 0,148, mientras que los embeddings reducidos sin supervisión quedaron en 0,141; la combinación llegó a 0,158. Cualitativamente, en las tres alertas de mayor riesgo del corte vigente los factores principales fueron el vocabulario de los asientos recientes y la proporción de asientos que mencionan atrasos y penalidades, verificables en los asientos citados como evidencia. Por sector, evaluado sin reentrenar sobre la misma prueba, el ROC-AUC del modelo de alerta varió entre 0,752 (educación) y 0,803 (salud) y el del modelo de seguimiento de la cartera entre 0,720 (energía y minas) y 0,783 (agricultura), con intervalos que se superponen en la mayoría de los sectores; ningún sector concentra la señal, lo que respalda un modelo nacional multisectorial en lugar de uno por sector.</w:t>
       </w:r>
     </w:p>
     <w:p>
@@ -11851,9 +12483,9 @@
       <w:r>
         <w:drawing>
           <wp:inline distT="0" distB="0" distL="0" distR="0">
-            <wp:extent cx="5524500" cy="2181225"/>
+            <wp:extent cx="4648200" cy="1838325"/>
             <wp:effectExtent t="0" r="0" b="0" l="0"/>
-            <wp:docPr id="1" name="importancia" descr="Importancia TreeSHAP por grupo de variables del modelo B en la prueba nacional (H = 60)." title="Figura 10"/>
+            <wp:docPr id="1" name="importancia" descr="Importancia TreeSHAP por grupo de variables del modelo B en la prueba nacional (H = 60)." title="Figura 11"/>
             <wp:cNvGraphicFramePr>
               <a:graphicFrameLocks xmlns:a="http://schemas.openxmlformats.org/drawingml/2006/main" noChangeAspect="1"/>
             </wp:cNvGraphicFramePr>
@@ -11867,7 +12499,7 @@
                     </pic:cNvPicPr>
                   </pic:nvPicPr>
                   <pic:blipFill>
-                    <a:blip r:embed="rId18" cstate="none"/>
+                    <a:blip r:embed="rId19" cstate="none"/>
                     <a:srcRect/>
                     <a:stretch>
                       <a:fillRect/>
@@ -11876,7 +12508,7 @@
                   <pic:spPr bwMode="auto">
                     <a:xfrm>
                       <a:off x="0" y="0"/>
-                      <a:ext cx="5524500" cy="2181225"/>
+                      <a:ext cx="4648200" cy="1838325"/>
                     </a:xfrm>
                     <a:prstGeom prst="rect">
                       <a:avLst/>
@@ -11902,7 +12534,7 @@
           <w:sz w:val="18"/>
           <w:szCs w:val="18"/>
         </w:rPr>
-        <w:t xml:space="preserve">Fig. 10. </w:t>
+        <w:t xml:space="preserve">Fig. 11. </w:t>
       </w:r>
       <w:r>
         <w:rPr>
@@ -13197,7 +13829,7 @@
           <w:sz w:val="21"/>
           <w:szCs w:val="21"/>
         </w:rPr>
-        <w:t xml:space="preserve">Una explicación plausible de la mejora modesta del texto es que buena parte de la información ya está en la estructura del cuaderno (tipos de asiento, ritmo, recencia): el registro de una penalidad o de una suspensión aparece como tipo de asiento y como texto a la vez. El que las puntuaciones supervisadas de TF-IDF superen a los embeddings sin ajuste fino es coherente con un dominio de vocabulario técnico y formulaico, en el que los términos discriminantes (penalidad, carta notarial, ausencia del residente) pesan más que la semántica general [49]. La falta de significancia en Arequipa refleja el tamaño de la muestra, no una dirección opuesta. La alta proporción de obras activas de la cartera en nivel alto (1 166 de 2 014) indica que la cohorte en ejecución es más riesgosa que la distribución histórica de referencia y se reporta como tal, sin reajustar los umbrales. La mejora del modelo de seguimiento sobre el de inicio es coherente con la literatura de causas, que ubica los problemas financieros y los pagos tardíos entre los determinantes más frecuentes del atraso [3]: el ritmo del devengado y los meses sin gasto registran esas dificultades antes de que se reflejen en la fecha de término.</w:t>
+        <w:t xml:space="preserve">Una explicación plausible de la mejora modesta del texto es que buena parte de la información ya está en la estructura del cuaderno (tipos de asiento, ritmo, recencia): el registro de una penalidad o de una suspensión aparece como tipo de asiento y como texto a la vez. El que las puntuaciones supervisadas de TF-IDF superen a los embeddings sin ajuste fino es coherente con un dominio de vocabulario técnico y formulaico, en el que los términos discriminantes (penalidad, carta notarial, ausencia del residente) pesan más que la semántica general [50]. La falta de significancia en Arequipa refleja el tamaño de la muestra, no una dirección opuesta. La alta proporción de obras activas de la cartera en nivel alto (1 166 de 2 014) indica que la cohorte en ejecución es más riesgosa que la distribución histórica de referencia y se reporta como tal, sin reajustar los umbrales. La mejora del modelo de seguimiento sobre el de inicio es coherente con la literatura de causas, que ubica los problemas financieros y los pagos tardíos entre los determinantes más frecuentes del atraso [3]: el ritmo del devengado y los meses sin gasto registran esas dificultades antes de que se reflejen en la fecha de término.</w:t>
       </w:r>
     </w:p>
     <w:p>
@@ -13229,7 +13861,7 @@
           <w:sz w:val="21"/>
           <w:szCs w:val="21"/>
         </w:rPr>
-        <w:t xml:space="preserve">Para una entidad o un órgano de control, revisar el 10 % de obras con mayor riesgo permite encontrar cerca de un tercio de los atrasos formales que ocurrirán en dos meses, con una precisión tres veces mayor que el azar. Las explicaciones y la evidencia enlazada permiten verificar cada alerta en minutos y reducen el riesgo de actuar sobre una caja negra [35]. Tecnológicamente, el estudio muestra que un sistema de este tipo puede construirse con datos abiertos y componentes libres, con un costo de infraestructura bajo. Su adopción requeriría, sin embargo, definir quién revisa las alertas, en qué plazo y cómo se registra la decisión; el prototipo incluye el registro de revisiones y la auditoría precisamente para que la priorización quede documentada y pueda evaluarse con el tiempo. También plantea un criterio de gobernanza: publicar puntajes de riesgo sobre obras concretas puede afectar la reputación de entidades y contratistas, por lo que la interfaz explicita que las estimaciones no constituyen imputaciones.</w:t>
+        <w:t xml:space="preserve">Para una entidad o un órgano de control, revisar el 10 % de obras con mayor riesgo permite encontrar cerca de un tercio de los atrasos formales que ocurrirán en dos meses, con una precisión tres veces mayor que el azar. Las explicaciones y la evidencia enlazada permiten verificar cada alerta en minutos y reducen el riesgo de actuar sobre una caja negra [35]. Tecnológicamente, el estudio muestra que un sistema de este tipo puede construirse con datos abiertos y componentes libres, con un costo de infraestructura bajo. Su adopción requeriría, sin embargo, definir quién revisa las alertas, en qué plazo y cómo se registra la decisión; el prototipo incluye el registro de revisiones y la auditoría precisamente para que la priorización quede documentada y pueda evaluarse con el tiempo. También plantea un criterio de gobernanza: publicar puntajes de riesgo sobre obras concretas puede afectar la reputación de entidades y contratistas, por lo que la interfaz explicita que las estimaciones no constituyen imputaciones. La calibración verificada permite, además, comunicar la probabilidad sin exagerarla: mostrar junto a cada alerta que 18 de cada 100 obras de nivel alto registraron el atraso formal obliga a leerla como indicio para revisar y no como diagnóstico, y la traducción de los factores a lenguaje claro acerca la explicación a usuarios sin formación técnica [35].</w:t>
       </w:r>
     </w:p>
     <w:p>
@@ -13406,7 +14038,7 @@
           <w:sz w:val="21"/>
           <w:szCs w:val="21"/>
         </w:rPr>
-        <w:t xml:space="preserve">No se realizó evaluación de usabilidad ni de satisfacción con usuarios reales; la accesibilidad se midió con herramientas automáticas.</w:t>
+        <w:t xml:space="preserve">No se realizó evaluación de usabilidad ni de satisfacción con usuarios reales; la accesibilidad se midió con herramientas automáticas y la comprensión de las frases en lenguaje claro no se validó con supervisores.</w:t>
       </w:r>
     </w:p>
     <w:p>
@@ -13425,6 +14057,25 @@
           <w:sz w:val="21"/>
           <w:szCs w:val="21"/>
         </w:rPr>
+        <w:t xml:space="preserve">Parte de las obras no tiene coordenadas (55 % en INFOBRAS), por lo que el mapa no representa toda la cartera.</w:t>
+      </w:r>
+    </w:p>
+    <w:p>
+      <w:pPr>
+        <w:pStyle w:val="ListParagraph"/>
+        <w:numPr>
+          <w:ilvl w:val="0"/>
+          <w:numId w:val="2"/>
+        </w:numPr>
+        <w:spacing w:after="60" w:line="264"/>
+        <w:jc w:val="both"/>
+      </w:pPr>
+      <w:r>
+        <w:rPr>
+          <w:rFonts w:ascii="Arial" w:cs="Arial" w:eastAsia="Arial" w:hAnsi="Arial"/>
+          <w:sz w:val="21"/>
+          <w:szCs w:val="21"/>
+        </w:rPr>
         <w:t xml:space="preserve">La latencia se midió en un equipo local; el sistema no se desplegó en un servidor público durante el estudio.</w:t>
       </w:r>
     </w:p>
@@ -13539,7 +14190,7 @@
           <w:sz w:val="21"/>
           <w:szCs w:val="21"/>
         </w:rPr>
-        <w:t xml:space="preserve"> El prototipo cumple los requerimientos definidos: responde con p95 de 190,9 ms con 20 usuarios concurrentes y sin errores, aprueba 10 de 10 casos de seguridad, obtiene 100 en accesibilidad automatizada en las páginas evaluadas y supera 43 pruebas automatizadas, incluidas las de no fuga temporal.</w:t>
+        <w:t xml:space="preserve"> El prototipo cumple los requerimientos definidos: responde con p95 de 167,8 ms con 20 usuarios concurrentes y sin errores, aprueba 13 de 13 casos de seguridad, obtiene 100 en accesibilidad automatizada en las páginas evaluadas y supera 56 pruebas automatizadas, incluidas las de no fuga temporal y las de regresión de la explicación y de la calidad de datos. Sus probabilidades están calibradas, lo que permite mostrar a cada usuario la confiabilidad real del nivel de riesgo en lugar de una certeza aparente.</w:t>
       </w:r>
     </w:p>
     <w:p>
@@ -15357,7 +16008,7 @@
           <w:sz w:val="18"/>
           <w:szCs w:val="18"/>
         </w:rPr>
-        <w:t xml:space="preserve">B. Efron, "Bootstrap Methods: Another Look at the Jackknife," </w:t>
+        <w:t xml:space="preserve">A. Niculescu-Mizil and R. Caruana, "Predicting good probabilities with supervised learning," in </w:t>
       </w:r>
       <w:r>
         <w:rPr>
@@ -15367,15 +16018,15 @@
           <w:sz w:val="18"/>
           <w:szCs w:val="18"/>
         </w:rPr>
-        <w:t xml:space="preserve">The Annals of Statistics</w:t>
-      </w:r>
-      <w:r>
-        <w:rPr>
-          <w:rFonts w:ascii="Arial" w:cs="Arial" w:eastAsia="Arial" w:hAnsi="Arial"/>
-          <w:sz w:val="18"/>
-          <w:szCs w:val="18"/>
-        </w:rPr>
-        <w:t xml:space="preserve">, vol. 7, no. 1, pp. 1–26, 1979, doi: 10.1214/aos/1176344552.</w:t>
+        <w:t xml:space="preserve">Proceedings of the 22nd international conference on Machine learning  - ICML '05</w:t>
+      </w:r>
+      <w:r>
+        <w:rPr>
+          <w:rFonts w:ascii="Arial" w:cs="Arial" w:eastAsia="Arial" w:hAnsi="Arial"/>
+          <w:sz w:val="18"/>
+          <w:szCs w:val="18"/>
+        </w:rPr>
+        <w:t xml:space="preserve">, 2005, pp. 625–632, doi: 10.1145/1102351.1102430.</w:t>
       </w:r>
     </w:p>
     <w:p>
@@ -15401,7 +16052,25 @@
           <w:sz w:val="18"/>
           <w:szCs w:val="18"/>
         </w:rPr>
-        <w:t xml:space="preserve">OWASP Foundation, "OWASP Top 10:2021." [Online]. Available: https://owasp.org/Top10/ (accedido: 26 de septiembre de 2026).</w:t>
+        <w:t xml:space="preserve">B. Efron, "Bootstrap Methods: Another Look at the Jackknife," </w:t>
+      </w:r>
+      <w:r>
+        <w:rPr>
+          <w:rFonts w:ascii="Arial" w:cs="Arial" w:eastAsia="Arial" w:hAnsi="Arial"/>
+          <w:i/>
+          <w:iCs/>
+          <w:sz w:val="18"/>
+          <w:szCs w:val="18"/>
+        </w:rPr>
+        <w:t xml:space="preserve">The Annals of Statistics</w:t>
+      </w:r>
+      <w:r>
+        <w:rPr>
+          <w:rFonts w:ascii="Arial" w:cs="Arial" w:eastAsia="Arial" w:hAnsi="Arial"/>
+          <w:sz w:val="18"/>
+          <w:szCs w:val="18"/>
+        </w:rPr>
+        <w:t xml:space="preserve">, vol. 7, no. 1, pp. 1–26, 1979, doi: 10.1214/aos/1176344552.</w:t>
       </w:r>
     </w:p>
     <w:p>
@@ -15427,25 +16096,7 @@
           <w:sz w:val="18"/>
           <w:szCs w:val="18"/>
         </w:rPr>
-        <w:t xml:space="preserve">International Organization for Standardization, </w:t>
-      </w:r>
-      <w:r>
-        <w:rPr>
-          <w:rFonts w:ascii="Arial" w:cs="Arial" w:eastAsia="Arial" w:hAnsi="Arial"/>
-          <w:i/>
-          <w:iCs/>
-          <w:sz w:val="18"/>
-          <w:szCs w:val="18"/>
-        </w:rPr>
-        <w:t xml:space="preserve">ISO/IEC 25010:2023. Systems and software engineering — Systems and software Quality Requirements and Evaluation (SQuaRE) — Product quality model</w:t>
-      </w:r>
-      <w:r>
-        <w:rPr>
-          <w:rFonts w:ascii="Arial" w:cs="Arial" w:eastAsia="Arial" w:hAnsi="Arial"/>
-          <w:sz w:val="18"/>
-          <w:szCs w:val="18"/>
-        </w:rPr>
-        <w:t xml:space="preserve">, Geneva, Switzerland, 2023.</w:t>
+        <w:t xml:space="preserve">OWASP Foundation, "OWASP Top 10:2021." [Online]. Available: https://owasp.org/Top10/ (accedido: 26 de septiembre de 2026).</w:t>
       </w:r>
     </w:p>
     <w:p>
@@ -15471,7 +16122,7 @@
           <w:sz w:val="18"/>
           <w:szCs w:val="18"/>
         </w:rPr>
-        <w:t xml:space="preserve">I. P. Fellegi and A. B. Sunter, "A Theory for Record Linkage," </w:t>
+        <w:t xml:space="preserve">International Organization for Standardization, </w:t>
       </w:r>
       <w:r>
         <w:rPr>
@@ -15481,15 +16132,15 @@
           <w:sz w:val="18"/>
           <w:szCs w:val="18"/>
         </w:rPr>
-        <w:t xml:space="preserve">Journal of the American Statistical Association</w:t>
-      </w:r>
-      <w:r>
-        <w:rPr>
-          <w:rFonts w:ascii="Arial" w:cs="Arial" w:eastAsia="Arial" w:hAnsi="Arial"/>
-          <w:sz w:val="18"/>
-          <w:szCs w:val="18"/>
-        </w:rPr>
-        <w:t xml:space="preserve">, vol. 64, no. 328, pp. 1183–1210, 1969, doi: 10.1080/01621459.1969.10501049.</w:t>
+        <w:t xml:space="preserve">ISO/IEC 25010:2023. Systems and software engineering — Systems and software Quality Requirements and Evaluation (SQuaRE) — Product quality model</w:t>
+      </w:r>
+      <w:r>
+        <w:rPr>
+          <w:rFonts w:ascii="Arial" w:cs="Arial" w:eastAsia="Arial" w:hAnsi="Arial"/>
+          <w:sz w:val="18"/>
+          <w:szCs w:val="18"/>
+        </w:rPr>
+        <w:t xml:space="preserve">, Geneva, Switzerland, 2023.</w:t>
       </w:r>
     </w:p>
     <w:p>
@@ -15515,7 +16166,7 @@
           <w:sz w:val="18"/>
           <w:szCs w:val="18"/>
         </w:rPr>
-        <w:t xml:space="preserve">P. Christen, </w:t>
+        <w:t xml:space="preserve">I. P. Fellegi and A. B. Sunter, "A Theory for Record Linkage," </w:t>
       </w:r>
       <w:r>
         <w:rPr>
@@ -15525,15 +16176,15 @@
           <w:sz w:val="18"/>
           <w:szCs w:val="18"/>
         </w:rPr>
-        <w:t xml:space="preserve">Data Matching: Concepts and Techniques for Record Linkage, Entity Resolution, and Duplicate Detection</w:t>
-      </w:r>
-      <w:r>
-        <w:rPr>
-          <w:rFonts w:ascii="Arial" w:cs="Arial" w:eastAsia="Arial" w:hAnsi="Arial"/>
-          <w:sz w:val="18"/>
-          <w:szCs w:val="18"/>
-        </w:rPr>
-        <w:t xml:space="preserve">. Springer Berlin Heidelberg, 2012, doi: 10.1007/978-3-642-31164-2.</w:t>
+        <w:t xml:space="preserve">Journal of the American Statistical Association</w:t>
+      </w:r>
+      <w:r>
+        <w:rPr>
+          <w:rFonts w:ascii="Arial" w:cs="Arial" w:eastAsia="Arial" w:hAnsi="Arial"/>
+          <w:sz w:val="18"/>
+          <w:szCs w:val="18"/>
+        </w:rPr>
+        <w:t xml:space="preserve">, vol. 64, no. 328, pp. 1183–1210, 1969, doi: 10.1080/01621459.1969.10501049.</w:t>
       </w:r>
     </w:p>
     <w:p>
@@ -15559,7 +16210,7 @@
           <w:sz w:val="18"/>
           <w:szCs w:val="18"/>
         </w:rPr>
-        <w:t xml:space="preserve">G. Ke </w:t>
+        <w:t xml:space="preserve">P. Christen, </w:t>
       </w:r>
       <w:r>
         <w:rPr>
@@ -15569,33 +16220,15 @@
           <w:sz w:val="18"/>
           <w:szCs w:val="18"/>
         </w:rPr>
-        <w:t xml:space="preserve">et al.</w:t>
-      </w:r>
-      <w:r>
-        <w:rPr>
-          <w:rFonts w:ascii="Arial" w:cs="Arial" w:eastAsia="Arial" w:hAnsi="Arial"/>
-          <w:sz w:val="18"/>
-          <w:szCs w:val="18"/>
-        </w:rPr>
-        <w:t xml:space="preserve">, "LightGBM: A highly efficient gradient boosting decision tree," in </w:t>
-      </w:r>
-      <w:r>
-        <w:rPr>
-          <w:rFonts w:ascii="Arial" w:cs="Arial" w:eastAsia="Arial" w:hAnsi="Arial"/>
-          <w:i/>
-          <w:iCs/>
-          <w:sz w:val="18"/>
-          <w:szCs w:val="18"/>
-        </w:rPr>
-        <w:t xml:space="preserve">Advances in Neural Information Processing Systems 30 (NIPS 2017)</w:t>
-      </w:r>
-      <w:r>
-        <w:rPr>
-          <w:rFonts w:ascii="Arial" w:cs="Arial" w:eastAsia="Arial" w:hAnsi="Arial"/>
-          <w:sz w:val="18"/>
-          <w:szCs w:val="18"/>
-        </w:rPr>
-        <w:t xml:space="preserve">, 2017. [Online]. Available: https://papers.nips.cc/paper_files/paper/2017/hash/6449f44a102fde848669bdd9eb6b76fa-Abstract.html</w:t>
+        <w:t xml:space="preserve">Data Matching: Concepts and Techniques for Record Linkage, Entity Resolution, and Duplicate Detection</w:t>
+      </w:r>
+      <w:r>
+        <w:rPr>
+          <w:rFonts w:ascii="Arial" w:cs="Arial" w:eastAsia="Arial" w:hAnsi="Arial"/>
+          <w:sz w:val="18"/>
+          <w:szCs w:val="18"/>
+        </w:rPr>
+        <w:t xml:space="preserve">. Springer Berlin Heidelberg, 2012, doi: 10.1007/978-3-642-31164-2.</w:t>
       </w:r>
     </w:p>
     <w:p>
@@ -15621,7 +16254,7 @@
           <w:sz w:val="18"/>
           <w:szCs w:val="18"/>
         </w:rPr>
-        <w:t xml:space="preserve">L. Breiman, "Random Forests," </w:t>
+        <w:t xml:space="preserve">G. Ke </w:t>
       </w:r>
       <w:r>
         <w:rPr>
@@ -15631,15 +16264,33 @@
           <w:sz w:val="18"/>
           <w:szCs w:val="18"/>
         </w:rPr>
-        <w:t xml:space="preserve">Machine Learning</w:t>
-      </w:r>
-      <w:r>
-        <w:rPr>
-          <w:rFonts w:ascii="Arial" w:cs="Arial" w:eastAsia="Arial" w:hAnsi="Arial"/>
-          <w:sz w:val="18"/>
-          <w:szCs w:val="18"/>
-        </w:rPr>
-        <w:t xml:space="preserve">, vol. 45, no. 1, pp. 5–32, 2001, doi: 10.1023/a:1010933404324.</w:t>
+        <w:t xml:space="preserve">et al.</w:t>
+      </w:r>
+      <w:r>
+        <w:rPr>
+          <w:rFonts w:ascii="Arial" w:cs="Arial" w:eastAsia="Arial" w:hAnsi="Arial"/>
+          <w:sz w:val="18"/>
+          <w:szCs w:val="18"/>
+        </w:rPr>
+        <w:t xml:space="preserve">, "LightGBM: A highly efficient gradient boosting decision tree," in </w:t>
+      </w:r>
+      <w:r>
+        <w:rPr>
+          <w:rFonts w:ascii="Arial" w:cs="Arial" w:eastAsia="Arial" w:hAnsi="Arial"/>
+          <w:i/>
+          <w:iCs/>
+          <w:sz w:val="18"/>
+          <w:szCs w:val="18"/>
+        </w:rPr>
+        <w:t xml:space="preserve">Advances in Neural Information Processing Systems 30 (NIPS 2017)</w:t>
+      </w:r>
+      <w:r>
+        <w:rPr>
+          <w:rFonts w:ascii="Arial" w:cs="Arial" w:eastAsia="Arial" w:hAnsi="Arial"/>
+          <w:sz w:val="18"/>
+          <w:szCs w:val="18"/>
+        </w:rPr>
+        <w:t xml:space="preserve">, 2017. [Online]. Available: https://papers.nips.cc/paper_files/paper/2017/hash/6449f44a102fde848669bdd9eb6b76fa-Abstract.html</w:t>
       </w:r>
     </w:p>
     <w:p>
@@ -15665,7 +16316,7 @@
           <w:sz w:val="18"/>
           <w:szCs w:val="18"/>
         </w:rPr>
-        <w:t xml:space="preserve">T. Chen and C. Guestrin, "XGBoost: A Scalable Tree Boosting System," in </w:t>
+        <w:t xml:space="preserve">L. Breiman, "Random Forests," </w:t>
       </w:r>
       <w:r>
         <w:rPr>
@@ -15675,15 +16326,15 @@
           <w:sz w:val="18"/>
           <w:szCs w:val="18"/>
         </w:rPr>
-        <w:t xml:space="preserve">Proceedings of the 22nd ACM SIGKDD International Conference on Knowledge Discovery and Data Mining</w:t>
-      </w:r>
-      <w:r>
-        <w:rPr>
-          <w:rFonts w:ascii="Arial" w:cs="Arial" w:eastAsia="Arial" w:hAnsi="Arial"/>
-          <w:sz w:val="18"/>
-          <w:szCs w:val="18"/>
-        </w:rPr>
-        <w:t xml:space="preserve">, 2016, pp. 785–794, doi: 10.1145/2939672.2939785.</w:t>
+        <w:t xml:space="preserve">Machine Learning</w:t>
+      </w:r>
+      <w:r>
+        <w:rPr>
+          <w:rFonts w:ascii="Arial" w:cs="Arial" w:eastAsia="Arial" w:hAnsi="Arial"/>
+          <w:sz w:val="18"/>
+          <w:szCs w:val="18"/>
+        </w:rPr>
+        <w:t xml:space="preserve">, vol. 45, no. 1, pp. 5–32, 2001, doi: 10.1023/a:1010933404324.</w:t>
       </w:r>
     </w:p>
     <w:p>
@@ -15709,7 +16360,7 @@
           <w:sz w:val="18"/>
           <w:szCs w:val="18"/>
         </w:rPr>
-        <w:t xml:space="preserve">F. Pedregosa </w:t>
+        <w:t xml:space="preserve">T. Chen and C. Guestrin, "XGBoost: A Scalable Tree Boosting System," in </w:t>
       </w:r>
       <w:r>
         <w:rPr>
@@ -15719,33 +16370,15 @@
           <w:sz w:val="18"/>
           <w:szCs w:val="18"/>
         </w:rPr>
-        <w:t xml:space="preserve">et al.</w:t>
-      </w:r>
-      <w:r>
-        <w:rPr>
-          <w:rFonts w:ascii="Arial" w:cs="Arial" w:eastAsia="Arial" w:hAnsi="Arial"/>
-          <w:sz w:val="18"/>
-          <w:szCs w:val="18"/>
-        </w:rPr>
-        <w:t xml:space="preserve">, "Scikit-learn: Machine learning in Python," </w:t>
-      </w:r>
-      <w:r>
-        <w:rPr>
-          <w:rFonts w:ascii="Arial" w:cs="Arial" w:eastAsia="Arial" w:hAnsi="Arial"/>
-          <w:i/>
-          <w:iCs/>
-          <w:sz w:val="18"/>
-          <w:szCs w:val="18"/>
-        </w:rPr>
-        <w:t xml:space="preserve">Journal of Machine Learning Research</w:t>
-      </w:r>
-      <w:r>
-        <w:rPr>
-          <w:rFonts w:ascii="Arial" w:cs="Arial" w:eastAsia="Arial" w:hAnsi="Arial"/>
-          <w:sz w:val="18"/>
-          <w:szCs w:val="18"/>
-        </w:rPr>
-        <w:t xml:space="preserve">, vol. 12, pp. 2825–2830, 2011. [Online]. Available: https://jmlr.org/papers/v12/pedregosa11a.html</w:t>
+        <w:t xml:space="preserve">Proceedings of the 22nd ACM SIGKDD International Conference on Knowledge Discovery and Data Mining</w:t>
+      </w:r>
+      <w:r>
+        <w:rPr>
+          <w:rFonts w:ascii="Arial" w:cs="Arial" w:eastAsia="Arial" w:hAnsi="Arial"/>
+          <w:sz w:val="18"/>
+          <w:szCs w:val="18"/>
+        </w:rPr>
+        <w:t xml:space="preserve">, 2016, pp. 785–794, doi: 10.1145/2939672.2939785.</w:t>
       </w:r>
     </w:p>
     <w:p>
@@ -15771,7 +16404,7 @@
           <w:sz w:val="18"/>
           <w:szCs w:val="18"/>
         </w:rPr>
-        <w:t xml:space="preserve">N. Reimers and I. Gurevych, "Sentence-BERT: Sentence Embeddings using Siamese BERT-Networks," in </w:t>
+        <w:t xml:space="preserve">F. Pedregosa </w:t>
       </w:r>
       <w:r>
         <w:rPr>
@@ -15781,15 +16414,33 @@
           <w:sz w:val="18"/>
           <w:szCs w:val="18"/>
         </w:rPr>
-        <w:t xml:space="preserve">Proceedings of the 2019 Conference on Empirical Methods in Natural Language Processing and the 9th International Joint Conference on Natural Language Processing (EMNLP-IJCNLP)</w:t>
-      </w:r>
-      <w:r>
-        <w:rPr>
-          <w:rFonts w:ascii="Arial" w:cs="Arial" w:eastAsia="Arial" w:hAnsi="Arial"/>
-          <w:sz w:val="18"/>
-          <w:szCs w:val="18"/>
-        </w:rPr>
-        <w:t xml:space="preserve">, 2019, pp. 3980–3990, doi: 10.18653/v1/d19-1410.</w:t>
+        <w:t xml:space="preserve">et al.</w:t>
+      </w:r>
+      <w:r>
+        <w:rPr>
+          <w:rFonts w:ascii="Arial" w:cs="Arial" w:eastAsia="Arial" w:hAnsi="Arial"/>
+          <w:sz w:val="18"/>
+          <w:szCs w:val="18"/>
+        </w:rPr>
+        <w:t xml:space="preserve">, "Scikit-learn: Machine learning in Python," </w:t>
+      </w:r>
+      <w:r>
+        <w:rPr>
+          <w:rFonts w:ascii="Arial" w:cs="Arial" w:eastAsia="Arial" w:hAnsi="Arial"/>
+          <w:i/>
+          <w:iCs/>
+          <w:sz w:val="18"/>
+          <w:szCs w:val="18"/>
+        </w:rPr>
+        <w:t xml:space="preserve">Journal of Machine Learning Research</w:t>
+      </w:r>
+      <w:r>
+        <w:rPr>
+          <w:rFonts w:ascii="Arial" w:cs="Arial" w:eastAsia="Arial" w:hAnsi="Arial"/>
+          <w:sz w:val="18"/>
+          <w:szCs w:val="18"/>
+        </w:rPr>
+        <w:t xml:space="preserve">, vol. 12, pp. 2825–2830, 2011. [Online]. Available: https://jmlr.org/papers/v12/pedregosa11a.html</w:t>
       </w:r>
     </w:p>
     <w:p>
@@ -15815,7 +16466,7 @@
           <w:sz w:val="18"/>
           <w:szCs w:val="18"/>
         </w:rPr>
-        <w:t xml:space="preserve">N. Reimers and I. Gurevych, "Making Monolingual Sentence Embeddings Multilingual using Knowledge Distillation," in </w:t>
+        <w:t xml:space="preserve">N. Reimers and I. Gurevych, "Sentence-BERT: Sentence Embeddings using Siamese BERT-Networks," in </w:t>
       </w:r>
       <w:r>
         <w:rPr>
@@ -15825,15 +16476,15 @@
           <w:sz w:val="18"/>
           <w:szCs w:val="18"/>
         </w:rPr>
-        <w:t xml:space="preserve">Proceedings of the 2020 Conference on Empirical Methods in Natural Language Processing (EMNLP)</w:t>
-      </w:r>
-      <w:r>
-        <w:rPr>
-          <w:rFonts w:ascii="Arial" w:cs="Arial" w:eastAsia="Arial" w:hAnsi="Arial"/>
-          <w:sz w:val="18"/>
-          <w:szCs w:val="18"/>
-        </w:rPr>
-        <w:t xml:space="preserve">, 2020, pp. 4512–4525, doi: 10.18653/v1/2020.emnlp-main.365.</w:t>
+        <w:t xml:space="preserve">Proceedings of the 2019 Conference on Empirical Methods in Natural Language Processing and the 9th International Joint Conference on Natural Language Processing (EMNLP-IJCNLP)</w:t>
+      </w:r>
+      <w:r>
+        <w:rPr>
+          <w:rFonts w:ascii="Arial" w:cs="Arial" w:eastAsia="Arial" w:hAnsi="Arial"/>
+          <w:sz w:val="18"/>
+          <w:szCs w:val="18"/>
+        </w:rPr>
+        <w:t xml:space="preserve">, 2019, pp. 3980–3990, doi: 10.18653/v1/d19-1410.</w:t>
       </w:r>
     </w:p>
     <w:p>
@@ -15859,7 +16510,7 @@
           <w:sz w:val="18"/>
           <w:szCs w:val="18"/>
         </w:rPr>
-        <w:t xml:space="preserve">A. Niculescu-Mizil and R. Caruana, "Predicting good probabilities with supervised learning," in </w:t>
+        <w:t xml:space="preserve">N. Reimers and I. Gurevych, "Making Monolingual Sentence Embeddings Multilingual using Knowledge Distillation," in </w:t>
       </w:r>
       <w:r>
         <w:rPr>
@@ -15869,15 +16520,15 @@
           <w:sz w:val="18"/>
           <w:szCs w:val="18"/>
         </w:rPr>
-        <w:t xml:space="preserve">Proceedings of the 22nd international conference on Machine learning  - ICML '05</w:t>
-      </w:r>
-      <w:r>
-        <w:rPr>
-          <w:rFonts w:ascii="Arial" w:cs="Arial" w:eastAsia="Arial" w:hAnsi="Arial"/>
-          <w:sz w:val="18"/>
-          <w:szCs w:val="18"/>
-        </w:rPr>
-        <w:t xml:space="preserve">, 2005, pp. 625–632, doi: 10.1145/1102351.1102430.</w:t>
+        <w:t xml:space="preserve">Proceedings of the 2020 Conference on Empirical Methods in Natural Language Processing (EMNLP)</w:t>
+      </w:r>
+      <w:r>
+        <w:rPr>
+          <w:rFonts w:ascii="Arial" w:cs="Arial" w:eastAsia="Arial" w:hAnsi="Arial"/>
+          <w:sz w:val="18"/>
+          <w:szCs w:val="18"/>
+        </w:rPr>
+        <w:t xml:space="preserve">, 2020, pp. 4512–4525, doi: 10.18653/v1/2020.emnlp-main.365.</w:t>
       </w:r>
     </w:p>
     <w:p>
@@ -16951,7 +17602,7 @@
                 <w:sz w:val="14"/>
                 <w:szCs w:val="14"/>
               </w:rPr>
-              <w:t xml:space="preserve">p95 190,9 ms (20 usuarios); 10/10; accesibilidad 100</w:t>
+              <w:t xml:space="preserve">p95 167,8 ms (20 usuarios); 13/13; accesibilidad 100</w:t>
             </w:r>
           </w:p>
         </w:tc>
@@ -17262,7 +17913,7 @@
                 <w:sz w:val="15"/>
                 <w:szCs w:val="15"/>
               </w:rPr>
-              <w:t xml:space="preserve">Primera medición: 96 / 89 / 95</w:t>
+              <w:t xml:space="preserve">Interfaz rediseñada, primera medición: 100 / 93 / 96</w:t>
             </w:r>
           </w:p>
         </w:tc>
@@ -17289,7 +17940,7 @@
                 <w:sz w:val="15"/>
                 <w:szCs w:val="15"/>
               </w:rPr>
-              <w:t xml:space="preserve">100 / 100 / 100 tras corregir contraste y etiquetas</w:t>
+              <w:t xml:space="preserve">100 / 100 / 100 tras corregir contraste, ARIA y desplazamiento</w:t>
             </w:r>
           </w:p>
         </w:tc>
@@ -17433,7 +18084,7 @@
                 <w:sz w:val="15"/>
                 <w:szCs w:val="15"/>
               </w:rPr>
-              <w:t xml:space="preserve">190,9 ms; 0 % errores</w:t>
+              <w:t xml:space="preserve">167,8 ms; 0 % errores</w:t>
             </w:r>
           </w:p>
         </w:tc>
@@ -17859,7 +18510,7 @@
                 <w:sz w:val="15"/>
                 <w:szCs w:val="15"/>
               </w:rPr>
-              <w:t xml:space="preserve">10 de 10 tras limitar la tasa en nginx</w:t>
+              <w:t xml:space="preserve">13 de 13 tras limitar la tasa en nginx y ampliar los casos</w:t>
             </w:r>
           </w:p>
         </w:tc>
@@ -17909,7 +18560,7 @@
           </w:tcPr>
           <w:p>
             <w:pPr>
-              <w:keepNext w:val="false"/>
+              <w:keepNext/>
               <w:spacing w:after="0" w:line="240"/>
               <w:jc w:val="left"/>
             </w:pPr>
@@ -17919,7 +18570,7 @@
                 <w:sz w:val="15"/>
                 <w:szCs w:val="15"/>
               </w:rPr>
-              <w:t xml:space="preserve">Satisfacción</w:t>
+              <w:t xml:space="preserve">Calidad de datos</w:t>
             </w:r>
           </w:p>
         </w:tc>
@@ -17937,7 +18588,7 @@
           </w:tcPr>
           <w:p>
             <w:pPr>
-              <w:keepNext w:val="false"/>
+              <w:keepNext/>
               <w:spacing w:after="0" w:line="240"/>
               <w:jc w:val="left"/>
             </w:pPr>
@@ -17947,7 +18598,7 @@
                 <w:sz w:val="15"/>
                 <w:szCs w:val="15"/>
               </w:rPr>
-              <w:t xml:space="preserve">Satisfacción de usuarios</w:t>
+              <w:t xml:space="preserve">Chequeos automáticos</w:t>
             </w:r>
           </w:p>
         </w:tc>
@@ -17965,7 +18616,7 @@
           </w:tcPr>
           <w:p>
             <w:pPr>
-              <w:keepNext w:val="false"/>
+              <w:keepNext/>
               <w:spacing w:after="0" w:line="240"/>
               <w:jc w:val="left"/>
             </w:pPr>
@@ -17975,7 +18626,7 @@
                 <w:sz w:val="15"/>
                 <w:szCs w:val="15"/>
               </w:rPr>
-              <w:t xml:space="preserve">No disponible</w:t>
+              <w:t xml:space="preserve">Sin auditoría automática</w:t>
             </w:r>
           </w:p>
         </w:tc>
@@ -17993,7 +18644,7 @@
           </w:tcPr>
           <w:p>
             <w:pPr>
-              <w:keepNext w:val="false"/>
+              <w:keepNext/>
               <w:spacing w:after="0" w:line="240"/>
               <w:jc w:val="left"/>
             </w:pPr>
@@ -18003,7 +18654,7 @@
                 <w:sz w:val="15"/>
                 <w:szCs w:val="15"/>
               </w:rPr>
-              <w:t xml:space="preserve">No medida (limitación declarada)</w:t>
+              <w:t xml:space="preserve">29 chequeos; 14 sin hallazgos, 5 hallazgos documentados</w:t>
             </w:r>
           </w:p>
         </w:tc>
@@ -18011,6 +18662,146 @@
           <w:tcPr>
             <w:tcW w:type="dxa" w:w="1696"/>
             <w:shd w:fill="F5F8FC" w:color="auto" w:val="clear"/>
+            <w:tcMar>
+              <w:top w:type="dxa" w:w="50"/>
+              <w:left w:type="dxa" w:w="80"/>
+              <w:bottom w:type="dxa" w:w="50"/>
+              <w:right w:type="dxa" w:w="80"/>
+            </w:tcMar>
+            <w:vAlign w:val="center"/>
+          </w:tcPr>
+          <w:p>
+            <w:pPr>
+              <w:keepNext/>
+              <w:spacing w:after="0" w:line="240"/>
+              <w:jc w:val="left"/>
+            </w:pPr>
+            <w:r>
+              <w:rPr>
+                <w:rFonts w:ascii="Arial" w:cs="Arial" w:eastAsia="Arial" w:hAnsi="Arial"/>
+                <w:sz w:val="15"/>
+                <w:szCs w:val="15"/>
+              </w:rPr>
+              <w:t xml:space="preserve">Auditoría SQL sobre la base</w:t>
+            </w:r>
+          </w:p>
+        </w:tc>
+      </w:tr>
+      <w:tr>
+        <w:trPr>
+          <w:cantSplit/>
+        </w:trPr>
+        <w:tc>
+          <w:tcPr>
+            <w:tcW w:type="dxa" w:w="1316"/>
+            <w:tcMar>
+              <w:top w:type="dxa" w:w="50"/>
+              <w:left w:type="dxa" w:w="80"/>
+              <w:bottom w:type="dxa" w:w="50"/>
+              <w:right w:type="dxa" w:w="80"/>
+            </w:tcMar>
+            <w:vAlign w:val="center"/>
+          </w:tcPr>
+          <w:p>
+            <w:pPr>
+              <w:keepNext w:val="false"/>
+              <w:spacing w:after="0" w:line="240"/>
+              <w:jc w:val="left"/>
+            </w:pPr>
+            <w:r>
+              <w:rPr>
+                <w:rFonts w:ascii="Arial" w:cs="Arial" w:eastAsia="Arial" w:hAnsi="Arial"/>
+                <w:sz w:val="15"/>
+                <w:szCs w:val="15"/>
+              </w:rPr>
+              <w:t xml:space="preserve">Satisfacción</w:t>
+            </w:r>
+          </w:p>
+        </w:tc>
+        <w:tc>
+          <w:tcPr>
+            <w:tcW w:type="dxa" w:w="2256"/>
+            <w:tcMar>
+              <w:top w:type="dxa" w:w="50"/>
+              <w:left w:type="dxa" w:w="80"/>
+              <w:bottom w:type="dxa" w:w="50"/>
+              <w:right w:type="dxa" w:w="80"/>
+            </w:tcMar>
+            <w:vAlign w:val="center"/>
+          </w:tcPr>
+          <w:p>
+            <w:pPr>
+              <w:keepNext w:val="false"/>
+              <w:spacing w:after="0" w:line="240"/>
+              <w:jc w:val="left"/>
+            </w:pPr>
+            <w:r>
+              <w:rPr>
+                <w:rFonts w:ascii="Arial" w:cs="Arial" w:eastAsia="Arial" w:hAnsi="Arial"/>
+                <w:sz w:val="15"/>
+                <w:szCs w:val="15"/>
+              </w:rPr>
+              <w:t xml:space="preserve">Satisfacción de usuarios</w:t>
+            </w:r>
+          </w:p>
+        </w:tc>
+        <w:tc>
+          <w:tcPr>
+            <w:tcW w:type="dxa" w:w="1880"/>
+            <w:tcMar>
+              <w:top w:type="dxa" w:w="50"/>
+              <w:left w:type="dxa" w:w="80"/>
+              <w:bottom w:type="dxa" w:w="50"/>
+              <w:right w:type="dxa" w:w="80"/>
+            </w:tcMar>
+            <w:vAlign w:val="center"/>
+          </w:tcPr>
+          <w:p>
+            <w:pPr>
+              <w:keepNext w:val="false"/>
+              <w:spacing w:after="0" w:line="240"/>
+              <w:jc w:val="left"/>
+            </w:pPr>
+            <w:r>
+              <w:rPr>
+                <w:rFonts w:ascii="Arial" w:cs="Arial" w:eastAsia="Arial" w:hAnsi="Arial"/>
+                <w:sz w:val="15"/>
+                <w:szCs w:val="15"/>
+              </w:rPr>
+              <w:t xml:space="preserve">No disponible</w:t>
+            </w:r>
+          </w:p>
+        </w:tc>
+        <w:tc>
+          <w:tcPr>
+            <w:tcW w:type="dxa" w:w="2256"/>
+            <w:tcMar>
+              <w:top w:type="dxa" w:w="50"/>
+              <w:left w:type="dxa" w:w="80"/>
+              <w:bottom w:type="dxa" w:w="50"/>
+              <w:right w:type="dxa" w:w="80"/>
+            </w:tcMar>
+            <w:vAlign w:val="center"/>
+          </w:tcPr>
+          <w:p>
+            <w:pPr>
+              <w:keepNext w:val="false"/>
+              <w:spacing w:after="0" w:line="240"/>
+              <w:jc w:val="left"/>
+            </w:pPr>
+            <w:r>
+              <w:rPr>
+                <w:rFonts w:ascii="Arial" w:cs="Arial" w:eastAsia="Arial" w:hAnsi="Arial"/>
+                <w:sz w:val="15"/>
+                <w:szCs w:val="15"/>
+              </w:rPr>
+              <w:t xml:space="preserve">No medida (limitación declarada)</w:t>
+            </w:r>
+          </w:p>
+        </w:tc>
+        <w:tc>
+          <w:tcPr>
+            <w:tcW w:type="dxa" w:w="1696"/>
             <w:tcMar>
               <w:top w:type="dxa" w:w="50"/>
               <w:left w:type="dxa" w:w="80"/>

</xml_diff>

<commit_message>
docs(articulo): report production readiness, redesigned interface and project status
Adds section 4.8 (load integrity gate, autonomous operation and drift monitoring, defense-in-depth security, design system and PDF report), updates data quality and test figures, and adds annex C with the status of each component.
</commit_message>
<xml_diff>
--- a/docs/articulo/Articulo_Cientifico_Final.docx
+++ b/docs/articulo/Articulo_Cientifico_Final.docx
@@ -5000,7 +5000,7 @@
                 <w:sz w:val="16"/>
                 <w:szCs w:val="16"/>
               </w:rPr>
-              <w:t xml:space="preserve">Pruebas aprobadas / ejecutadas (unitarias, no-fuga, API, regresión)</w:t>
+              <w:t xml:space="preserve">Pruebas aprobadas / ejecutadas (unitarias, no-fuga, API, contratos, seguridad, concurrencia, extremo a extremo)</w:t>
             </w:r>
           </w:p>
         </w:tc>
@@ -5028,7 +5028,7 @@
                 <w:sz w:val="16"/>
                 <w:szCs w:val="16"/>
               </w:rPr>
-              <w:t xml:space="preserve">pytest</w:t>
+              <w:t xml:space="preserve">pytest, Playwright, Vitest</w:t>
             </w:r>
           </w:p>
         </w:tc>
@@ -5068,7 +5068,7 @@
           <w:sz w:val="21"/>
           <w:szCs w:val="21"/>
         </w:rPr>
-        <w:t xml:space="preserve">Se emplearon análisis documental de la normativa (textos oficiales descargados), auditoría de datos (reportes de calidad por fuente y 29 chequeos automáticos sobre la base cargada), pruebas automatizadas con pytest (incluidas pruebas que recalculan variables sobre los datos reales para detectar fuga), pruebas de carga con k6, pruebas de seguridad de caja negra alineadas con OWASP Top 10, auditorías de Lighthouse y registros de la aplicación. La calidad del producto se organizó según las características de ISO/IEC 25010 [42] (adecuación funcional, eficiencia de desempeño y seguridad).</w:t>
+        <w:t xml:space="preserve">Se emplearon análisis documental de la normativa (textos oficiales descargados), auditoría de datos (reportes de calidad por fuente y 32 chequeos automáticos sobre la base cargada), pruebas automatizadas con pytest (incluidas pruebas que recalculan variables sobre los datos reales para detectar fuga), pruebas de carga con k6, pruebas de seguridad de caja negra alineadas con OWASP Top 10, auditorías de Lighthouse y registros de la aplicación. La calidad del producto se organizó según las características de ISO/IEC 25010 [42] (adecuación funcional, eficiencia de desempeño y seguridad).</w:t>
       </w:r>
     </w:p>
     <w:p>
@@ -7058,7 +7058,121 @@
           <w:sz w:val="22"/>
           <w:szCs w:val="22"/>
         </w:rPr>
-        <w:t xml:space="preserve">4.8 Funcionamiento del prototipo</w:t>
+        <w:t xml:space="preserve">4.8 Preparación para producción: integridad, operación autónoma, seguridad y diseño</w:t>
+      </w:r>
+    </w:p>
+    <w:p>
+      <w:pPr>
+        <w:spacing w:after="120" w:line="264"/>
+        <w:jc w:val="both"/>
+      </w:pPr>
+      <w:r>
+        <w:rPr>
+          <w:rFonts w:ascii="Arial" w:cs="Arial" w:eastAsia="Arial" w:hAnsi="Arial"/>
+          <w:b/>
+          <w:bCs/>
+          <w:sz w:val="21"/>
+          <w:szCs w:val="21"/>
+        </w:rPr>
+        <w:t xml:space="preserve">Compuerta de integridad de la carga.</w:t>
+      </w:r>
+      <w:r>
+        <w:rPr>
+          <w:rFonts w:ascii="Arial" w:cs="Arial" w:eastAsia="Arial" w:hAnsi="Arial"/>
+          <w:sz w:val="21"/>
+          <w:szCs w:val="21"/>
+        </w:rPr>
+        <w:t xml:space="preserve"> Antes de publicar datos nuevos, el cargador valida los archivos de entrada, concilia las filas de cada tabla con la carga anterior, ejecuta 32 chequeos de calidad (11 críticos, 11 de aviso y 10 informativos) y rechaza la carga si algún chequeo crítico falla o si una tabla clave pierde más del 20 % de sus filas. Cada intento queda registrado con su resultado (correcta, rechazada o con error), sus conteos y su conciliación, de modo que el historial de cargas es auditable y conserva también los intentos fallidos. La recarga no bloquea la consulta: las filas se reemplazan dentro de una transacción en lugar de vaciar las tablas, las vistas materializadas de predicciones vigentes y de riesgo de cartera se refrescan de forma concurrente y el mantenimiento de la base se ejecuta después de confirmar la transacción. Durante una recarga nacional completa de 26,8 minutos, la API respondió 417 de 417 solicitudes sin error (p50 de 2,1 s).</w:t>
+      </w:r>
+    </w:p>
+    <w:p>
+      <w:pPr>
+        <w:spacing w:after="120" w:line="264"/>
+        <w:jc w:val="both"/>
+      </w:pPr>
+      <w:r>
+        <w:rPr>
+          <w:rFonts w:ascii="Arial" w:cs="Arial" w:eastAsia="Arial" w:hAnsi="Arial"/>
+          <w:b/>
+          <w:bCs/>
+          <w:sz w:val="21"/>
+          <w:szCs w:val="21"/>
+        </w:rPr>
+        <w:t xml:space="preserve">Operación autónoma.</w:t>
+      </w:r>
+      <w:r>
+        <w:rPr>
+          <w:rFonts w:ascii="Arial" w:cs="Arial" w:eastAsia="Arial" w:hAnsi="Arial"/>
+          <w:sz w:val="21"/>
+          <w:szCs w:val="21"/>
+        </w:rPr>
+        <w:t xml:space="preserve"> El proceso programado usa un candado de la base de datos para impedir dos sincronizaciones simultáneas, reintenta con espera exponencial, limita los intentos por mes, recupera las ejecuciones interrumpidas, registra un latido periódico y envía avisos por correo al equipo responsable. El monitoreo del modelo mide la deriva de cada variable con el índice de estabilidad poblacional (PSI) y detecta anomalías en la proporción de obras en riesgo alto con una puntuación z robusta (mediana y desviación absoluta mediana, umbral 3,5). En el corte vigente el monitor marcó 8 variables con PSI mayor que 0,25 y recomendó evaluar el reentrenamiento; el hallazgo se informa en la página de estado del sistema en lugar de ocultarse.</w:t>
+      </w:r>
+    </w:p>
+    <w:p>
+      <w:pPr>
+        <w:spacing w:after="120" w:line="264"/>
+        <w:jc w:val="both"/>
+      </w:pPr>
+      <w:r>
+        <w:rPr>
+          <w:rFonts w:ascii="Arial" w:cs="Arial" w:eastAsia="Arial" w:hAnsi="Arial"/>
+          <w:b/>
+          <w:bCs/>
+          <w:sz w:val="21"/>
+          <w:szCs w:val="21"/>
+        </w:rPr>
+        <w:t xml:space="preserve">Seguridad en profundidad.</w:t>
+      </w:r>
+      <w:r>
+        <w:rPr>
+          <w:rFonts w:ascii="Arial" w:cs="Arial" w:eastAsia="Arial" w:hAnsi="Arial"/>
+          <w:sz w:val="21"/>
+          <w:szCs w:val="21"/>
+        </w:rPr>
+        <w:t xml:space="preserve"> Se añadieron: límite de intentos de ingreso por cuenta (5) y por dirección IP (20) en 15 minutos, con tiempo de respuesta constante; tokens JWT con emisor y vigencia obligatorios, y rol leído de la base en cada solicitud; respuesta uniforme en la suscripción para no revelar qué correos existen, con enlaces de confirmación que vencen a los 7 días; enlaces construidos con la dirección pública configurada y no con la cabecera del cliente; tiempos máximos por consulta y por bloqueo en la base de datos, con respuesta 503 e indicación de reintento; y confianza en la dirección IP reenviada solo desde el proxy declarado. Esta última corrección se originó en una prueba de extremo a extremo que demostró que una IP falsificada evadía el límite de tasa.</w:t>
+      </w:r>
+    </w:p>
+    <w:p>
+      <w:pPr>
+        <w:spacing w:after="120" w:line="264"/>
+        <w:jc w:val="both"/>
+      </w:pPr>
+      <w:r>
+        <w:rPr>
+          <w:rFonts w:ascii="Arial" w:cs="Arial" w:eastAsia="Arial" w:hAnsi="Arial"/>
+          <w:b/>
+          <w:bCs/>
+          <w:sz w:val="21"/>
+          <w:szCs w:val="21"/>
+        </w:rPr>
+        <w:t xml:space="preserve">Sistema de diseño de la interfaz y del informe.</w:t>
+      </w:r>
+      <w:r>
+        <w:rPr>
+          <w:rFonts w:ascii="Arial" w:cs="Arial" w:eastAsia="Arial" w:hAnsi="Arial"/>
+          <w:sz w:val="21"/>
+          <w:szCs w:val="21"/>
+        </w:rPr>
+        <w:t xml:space="preserve"> La interfaz se rediseñó con un sistema visual institucional y accesible: tipografías Lexend (títulos y cifras) y Source Sans 3 (texto) de 16 px, contraste AAA en el texto secundario, foco visible de 3 px, áreas táctiles de 44 px, colores de riesgo reservados y acompañados siempre de un ícono de forma distinta, una paleta de gráficos validada para daltonismo y contraste, y la eliminación de los gráficos de doble eje, sustituidos por paneles sincronizados. En teléfonos, las listas se muestran como tarjetas; cada gráfico tiene una vista de tabla equivalente; y la suscripción ofrece las provincias tomadas de los datos. El informe técnico en PDF se rediseñó con el mismo sistema: portada institucional, resumen ejecutivo con la escala de riesgo y el umbral del modelo, indicadores clave, serie histórica, barras divergentes de los factores, evidencia documental en tarjetas, numeración de páginas y la advertencia de que no es un documento oficial.</w:t>
+      </w:r>
+    </w:p>
+    <w:p>
+      <w:pPr>
+        <w:pStyle w:val="Heading2"/>
+        <w:keepNext/>
+        <w:spacing w:after="80" w:before="180"/>
+      </w:pPr>
+      <w:r>
+        <w:rPr>
+          <w:rFonts w:ascii="Calibri" w:cs="Calibri" w:eastAsia="Calibri" w:hAnsi="Calibri"/>
+          <w:b/>
+          <w:bCs/>
+          <w:color w:val="2E74B5"/>
+          <w:sz w:val="22"/>
+          <w:szCs w:val="22"/>
+        </w:rPr>
+        <w:t xml:space="preserve">4.9 Funcionamiento del prototipo</w:t>
       </w:r>
     </w:p>
     <w:p>
@@ -7406,7 +7520,7 @@
           <w:sz w:val="21"/>
           <w:szCs w:val="21"/>
         </w:rPr>
-        <w:t xml:space="preserve">La auditoría de datos confirmó que el problema de integración es real: de 2 732 593 asientos se repararon 1 308 filas con separadores dentro del texto libre y se rechazó una; ningún conjunto del cuaderno de obra contiene el CUI; el contrato SEACE falta en 66 % de las observaciones del panel y el devengado SIAF en 11 %; y un archivo oficial de contratos cambió de 10 988 a 9 666 filas el mismo día, por lo que cada archivo se registró con su huella SHA-256. La resolución de entidades alcanzó una precisión de 99,1 % sobre 10 075 pares con CUI explícito y enlazó el 90,2 % de los cuadernos de Arequipa. La extracción de avances desde el texto, validada contra las valorizaciones oficiales, acertó el avance ejecutado con error ≤ 1 punto porcentual en 70,9 % de los casos, pero solo cubre 11,9 % de las valorizaciones. La auditoría automática de la base cargada ejecutó 29 chequeos: 14 sin hallazgos (ningún asiento duplicado, ninguna obra sin entidad o contratista, ninguna fecha invertida ni asiento posterior al corte, ninguna predicción vigente sin explicación), 5 con hallazgos documentados en las fuentes (370 de 17 100 obras del cuaderno y 75 916 de 139 159 obras de INFOBRAS sin coordenadas, 1 338 obras de INFOBRAS sin costo, 9 con un CUI que no tiene siete dígitos y 15 279 en ejecución sin registros en los últimos 12 meses, que no se evalúan) y 10 descriptivos; los hallazgos se informan en la interfaz tal como están en las fuentes, sin corregirlos.</w:t>
+        <w:t xml:space="preserve">La auditoría de datos confirmó que el problema de integración es real: de 2 732 593 asientos se repararon 1 308 filas con separadores dentro del texto libre y se rechazó una; ningún conjunto del cuaderno de obra contiene el CUI; el contrato SEACE falta en 66 % de las observaciones del panel y el devengado SIAF en 11 %; y un archivo oficial de contratos cambió de 10 988 a 9 666 filas el mismo día, por lo que cada archivo se registró con su huella SHA-256. La resolución de entidades alcanzó una precisión de 99,1 % sobre 10 075 pares con CUI explícito y enlazó el 90,2 % de los cuadernos de Arequipa. La extracción de avances desde el texto, validada contra las valorizaciones oficiales, acertó el avance ejecutado con error ≤ 1 punto porcentual en 70,9 % de los casos, pero solo cubre 11,9 % de las valorizaciones. La auditoría automática de la base cargada ejecutó 32 chequeos: 17 sin hallazgos (ningún asiento duplicado, ninguna obra sin entidad o contratista, ninguna fecha invertida ni asiento posterior al corte, ninguna predicción vigente sin explicación), 5 con hallazgos documentados en las fuentes (370 de 17 100 obras del cuaderno y 75 916 de 139 159 obras de INFOBRAS sin coordenadas, 1 338 obras de INFOBRAS sin costo, 9 con un CUI que no tiene siete dígitos y 15 279 en ejecución sin registros en los últimos 12 meses, que no se evalúan) y 10 descriptivos; los hallazgos se informan en la interfaz tal como están en las fuentes, sin corregirlos.</w:t>
       </w:r>
     </w:p>
     <w:p>
@@ -12307,7 +12421,7 @@
                 <w:sz w:val="16"/>
                 <w:szCs w:val="16"/>
               </w:rPr>
-              <w:t xml:space="preserve">29 chequeos: 14 sin hallazgos, 5 con hallazgos documentados, 10 descriptivos</w:t>
+              <w:t xml:space="preserve">32 chequeos: 17 sin hallazgos (incluidos los 11 críticos), 5 con hallazgos documentados, 10 descriptivos</w:t>
             </w:r>
           </w:p>
         </w:tc>
@@ -12335,7 +12449,7 @@
                 <w:sz w:val="16"/>
                 <w:szCs w:val="16"/>
               </w:rPr>
-              <w:t xml:space="preserve">Auditoría SQL automática</w:t>
+              <w:t xml:space="preserve">Auditoría SQL automática y compuerta de carga</w:t>
             </w:r>
           </w:p>
         </w:tc>
@@ -12357,6 +12471,93 @@
           </w:tcPr>
           <w:p>
             <w:pPr>
+              <w:keepNext w:val="false"/>
+              <w:spacing w:after="0" w:line="240"/>
+              <w:jc w:val="left"/>
+            </w:pPr>
+            <w:r>
+              <w:rPr>
+                <w:rFonts w:ascii="Arial" w:cs="Arial" w:eastAsia="Arial" w:hAnsi="Arial"/>
+                <w:sz w:val="16"/>
+                <w:szCs w:val="16"/>
+              </w:rPr>
+              <w:t xml:space="preserve">Disponibilidad durante la recarga</w:t>
+            </w:r>
+          </w:p>
+        </w:tc>
+        <w:tc>
+          <w:tcPr>
+            <w:tcW w:type="dxa" w:w="4325"/>
+            <w:tcMar>
+              <w:top w:type="dxa" w:w="50"/>
+              <w:left w:type="dxa" w:w="80"/>
+              <w:bottom w:type="dxa" w:w="50"/>
+              <w:right w:type="dxa" w:w="80"/>
+            </w:tcMar>
+            <w:vAlign w:val="center"/>
+          </w:tcPr>
+          <w:p>
+            <w:pPr>
+              <w:keepNext w:val="false"/>
+              <w:spacing w:after="0" w:line="240"/>
+              <w:jc w:val="left"/>
+            </w:pPr>
+            <w:r>
+              <w:rPr>
+                <w:rFonts w:ascii="Arial" w:cs="Arial" w:eastAsia="Arial" w:hAnsi="Arial"/>
+                <w:sz w:val="16"/>
+                <w:szCs w:val="16"/>
+              </w:rPr>
+              <w:t xml:space="preserve">417 de 417 solicitudes sin error durante una recarga nacional de 26,8 min (p50 2,1 s)</w:t>
+            </w:r>
+          </w:p>
+        </w:tc>
+        <w:tc>
+          <w:tcPr>
+            <w:tcW w:type="dxa" w:w="2823"/>
+            <w:tcMar>
+              <w:top w:type="dxa" w:w="50"/>
+              <w:left w:type="dxa" w:w="80"/>
+              <w:bottom w:type="dxa" w:w="50"/>
+              <w:right w:type="dxa" w:w="80"/>
+            </w:tcMar>
+            <w:vAlign w:val="center"/>
+          </w:tcPr>
+          <w:p>
+            <w:pPr>
+              <w:keepNext w:val="false"/>
+              <w:spacing w:after="0" w:line="240"/>
+              <w:jc w:val="left"/>
+            </w:pPr>
+            <w:r>
+              <w:rPr>
+                <w:rFonts w:ascii="Arial" w:cs="Arial" w:eastAsia="Arial" w:hAnsi="Arial"/>
+                <w:sz w:val="16"/>
+                <w:szCs w:val="16"/>
+              </w:rPr>
+              <w:t xml:space="preserve">Sondeo continuo de la API</w:t>
+            </w:r>
+          </w:p>
+        </w:tc>
+      </w:tr>
+      <w:tr>
+        <w:trPr>
+          <w:cantSplit/>
+        </w:trPr>
+        <w:tc>
+          <w:tcPr>
+            <w:tcW w:type="dxa" w:w="2256"/>
+            <w:shd w:fill="F5F8FC" w:color="auto" w:val="clear"/>
+            <w:tcMar>
+              <w:top w:type="dxa" w:w="50"/>
+              <w:left w:type="dxa" w:w="80"/>
+              <w:bottom w:type="dxa" w:w="50"/>
+              <w:right w:type="dxa" w:w="80"/>
+            </w:tcMar>
+            <w:vAlign w:val="center"/>
+          </w:tcPr>
+          <w:p>
+            <w:pPr>
               <w:keepNext/>
               <w:spacing w:after="0" w:line="240"/>
               <w:jc w:val="left"/>
@@ -12374,54 +12575,56 @@
         <w:tc>
           <w:tcPr>
             <w:tcW w:type="dxa" w:w="4325"/>
-            <w:tcMar>
-              <w:top w:type="dxa" w:w="50"/>
-              <w:left w:type="dxa" w:w="80"/>
-              <w:bottom w:type="dxa" w:w="50"/>
-              <w:right w:type="dxa" w:w="80"/>
-            </w:tcMar>
-            <w:vAlign w:val="center"/>
-          </w:tcPr>
-          <w:p>
-            <w:pPr>
-              <w:keepNext/>
-              <w:spacing w:after="0" w:line="240"/>
-              <w:jc w:val="left"/>
-            </w:pPr>
-            <w:r>
-              <w:rPr>
-                <w:rFonts w:ascii="Arial" w:cs="Arial" w:eastAsia="Arial" w:hAnsi="Arial"/>
-                <w:sz w:val="16"/>
-                <w:szCs w:val="16"/>
-              </w:rPr>
-              <w:t xml:space="preserve">56 aprobadas, 0 fallidas</w:t>
+            <w:shd w:fill="F5F8FC" w:color="auto" w:val="clear"/>
+            <w:tcMar>
+              <w:top w:type="dxa" w:w="50"/>
+              <w:left w:type="dxa" w:w="80"/>
+              <w:bottom w:type="dxa" w:w="50"/>
+              <w:right w:type="dxa" w:w="80"/>
+            </w:tcMar>
+            <w:vAlign w:val="center"/>
+          </w:tcPr>
+          <w:p>
+            <w:pPr>
+              <w:keepNext/>
+              <w:spacing w:after="0" w:line="240"/>
+              <w:jc w:val="left"/>
+            </w:pPr>
+            <w:r>
+              <w:rPr>
+                <w:rFonts w:ascii="Arial" w:cs="Arial" w:eastAsia="Arial" w:hAnsi="Arial"/>
+                <w:sz w:val="16"/>
+                <w:szCs w:val="16"/>
+              </w:rPr>
+              <w:t xml:space="preserve">192 aprobadas y 0 fallidas en el backend (156 unitarias, de API, contratos, base de datos, seguridad, concurrencia y servicios, y 36 de extremo a extremo en navegador, incluidas pantallas de 375 px); 12 de la interfaz</w:t>
             </w:r>
           </w:p>
         </w:tc>
         <w:tc>
           <w:tcPr>
             <w:tcW w:type="dxa" w:w="2823"/>
-            <w:tcMar>
-              <w:top w:type="dxa" w:w="50"/>
-              <w:left w:type="dxa" w:w="80"/>
-              <w:bottom w:type="dxa" w:w="50"/>
-              <w:right w:type="dxa" w:w="80"/>
-            </w:tcMar>
-            <w:vAlign w:val="center"/>
-          </w:tcPr>
-          <w:p>
-            <w:pPr>
-              <w:keepNext/>
-              <w:spacing w:after="0" w:line="240"/>
-              <w:jc w:val="left"/>
-            </w:pPr>
-            <w:r>
-              <w:rPr>
-                <w:rFonts w:ascii="Arial" w:cs="Arial" w:eastAsia="Arial" w:hAnsi="Arial"/>
-                <w:sz w:val="16"/>
-                <w:szCs w:val="16"/>
-              </w:rPr>
-              <w:t xml:space="preserve">pytest</w:t>
+            <w:shd w:fill="F5F8FC" w:color="auto" w:val="clear"/>
+            <w:tcMar>
+              <w:top w:type="dxa" w:w="50"/>
+              <w:left w:type="dxa" w:w="80"/>
+              <w:bottom w:type="dxa" w:w="50"/>
+              <w:right w:type="dxa" w:w="80"/>
+            </w:tcMar>
+            <w:vAlign w:val="center"/>
+          </w:tcPr>
+          <w:p>
+            <w:pPr>
+              <w:keepNext/>
+              <w:spacing w:after="0" w:line="240"/>
+              <w:jc w:val="left"/>
+            </w:pPr>
+            <w:r>
+              <w:rPr>
+                <w:rFonts w:ascii="Arial" w:cs="Arial" w:eastAsia="Arial" w:hAnsi="Arial"/>
+                <w:sz w:val="16"/>
+                <w:szCs w:val="16"/>
+              </w:rPr>
+              <w:t xml:space="preserve">pytest, Playwright, Vitest</w:t>
             </w:r>
           </w:p>
         </w:tc>
@@ -14190,7 +14393,7 @@
           <w:sz w:val="21"/>
           <w:szCs w:val="21"/>
         </w:rPr>
-        <w:t xml:space="preserve"> El prototipo cumple los requerimientos definidos: responde con p95 de 167,8 ms con 20 usuarios concurrentes y sin errores, aprueba 13 de 13 casos de seguridad, obtiene 100 en accesibilidad automatizada en las páginas evaluadas y supera 56 pruebas automatizadas, incluidas las de no fuga temporal y las de regresión de la explicación y de la calidad de datos. Sus probabilidades están calibradas, lo que permite mostrar a cada usuario la confiabilidad real del nivel de riesgo en lugar de una certeza aparente.</w:t>
+        <w:t xml:space="preserve"> El prototipo cumple los requerimientos definidos: responde con p95 de 167,8 ms con 20 usuarios concurrentes y sin errores, aprueba 13 de 13 casos de seguridad, obtiene 100 en accesibilidad automatizada en las páginas evaluadas y supera 192 pruebas automatizadas del backend y 12 de la interfaz, incluidas las de no fuga temporal y las de regresión de la explicación y de la calidad de datos. Sus probabilidades están calibradas, lo que permite mostrar a cada usuario la confiabilidad real del nivel de riesgo en lugar de una certeza aparente.</w:t>
       </w:r>
     </w:p>
     <w:p>
@@ -18654,7 +18857,7 @@
                 <w:sz w:val="15"/>
                 <w:szCs w:val="15"/>
               </w:rPr>
-              <w:t xml:space="preserve">29 chequeos; 14 sin hallazgos, 5 hallazgos documentados</w:t>
+              <w:t xml:space="preserve">32 chequeos; 17 sin hallazgos, 5 hallazgos documentados; 0 críticos</w:t>
             </w:r>
           </w:p>
         </w:tc>
@@ -18682,7 +18885,7 @@
                 <w:sz w:val="15"/>
                 <w:szCs w:val="15"/>
               </w:rPr>
-              <w:t xml:space="preserve">Auditoría SQL sobre la base</w:t>
+              <w:t xml:space="preserve">Auditoría SQL y compuerta de carga</w:t>
             </w:r>
           </w:p>
         </w:tc>
@@ -18704,7 +18907,7 @@
           </w:tcPr>
           <w:p>
             <w:pPr>
-              <w:keepNext w:val="false"/>
+              <w:keepNext/>
               <w:spacing w:after="0" w:line="240"/>
               <w:jc w:val="left"/>
             </w:pPr>
@@ -18714,7 +18917,7 @@
                 <w:sz w:val="15"/>
                 <w:szCs w:val="15"/>
               </w:rPr>
-              <w:t xml:space="preserve">Satisfacción</w:t>
+              <w:t xml:space="preserve">Disponibilidad</w:t>
             </w:r>
           </w:p>
         </w:tc>
@@ -18731,7 +18934,7 @@
           </w:tcPr>
           <w:p>
             <w:pPr>
-              <w:keepNext w:val="false"/>
+              <w:keepNext/>
               <w:spacing w:after="0" w:line="240"/>
               <w:jc w:val="left"/>
             </w:pPr>
@@ -18741,7 +18944,7 @@
                 <w:sz w:val="15"/>
                 <w:szCs w:val="15"/>
               </w:rPr>
-              <w:t xml:space="preserve">Satisfacción de usuarios</w:t>
+              <w:t xml:space="preserve">Solicitudes atendidas durante una recarga completa</w:t>
             </w:r>
           </w:p>
         </w:tc>
@@ -18758,7 +18961,7 @@
           </w:tcPr>
           <w:p>
             <w:pPr>
-              <w:keepNext w:val="false"/>
+              <w:keepNext/>
               <w:spacing w:after="0" w:line="240"/>
               <w:jc w:val="left"/>
             </w:pPr>
@@ -18768,7 +18971,7 @@
                 <w:sz w:val="15"/>
                 <w:szCs w:val="15"/>
               </w:rPr>
-              <w:t xml:space="preserve">No disponible</w:t>
+              <w:t xml:space="preserve">Recarga con vaciado de tablas: consultas bloqueadas cerca de 10 min</w:t>
             </w:r>
           </w:p>
         </w:tc>
@@ -18785,7 +18988,7 @@
           </w:tcPr>
           <w:p>
             <w:pPr>
-              <w:keepNext w:val="false"/>
+              <w:keepNext/>
               <w:spacing w:after="0" w:line="240"/>
               <w:jc w:val="left"/>
             </w:pPr>
@@ -18795,7 +18998,7 @@
                 <w:sz w:val="15"/>
                 <w:szCs w:val="15"/>
               </w:rPr>
-              <w:t xml:space="preserve">No medida (limitación declarada)</w:t>
+              <w:t xml:space="preserve">417 de 417 sin error en 26,8 min</w:t>
             </w:r>
           </w:p>
         </w:tc>
@@ -18812,7 +19015,7 @@
           </w:tcPr>
           <w:p>
             <w:pPr>
-              <w:keepNext w:val="false"/>
+              <w:keepNext/>
               <w:spacing w:after="0" w:line="240"/>
               <w:jc w:val="left"/>
             </w:pPr>
@@ -18822,7 +19025,1379 @@
                 <w:sz w:val="15"/>
                 <w:szCs w:val="15"/>
               </w:rPr>
+              <w:t xml:space="preserve">Sondeo continuo de la API</w:t>
+            </w:r>
+          </w:p>
+        </w:tc>
+      </w:tr>
+      <w:tr>
+        <w:trPr>
+          <w:cantSplit/>
+        </w:trPr>
+        <w:tc>
+          <w:tcPr>
+            <w:tcW w:type="dxa" w:w="1316"/>
+            <w:shd w:fill="F5F8FC" w:color="auto" w:val="clear"/>
+            <w:tcMar>
+              <w:top w:type="dxa" w:w="50"/>
+              <w:left w:type="dxa" w:w="80"/>
+              <w:bottom w:type="dxa" w:w="50"/>
+              <w:right w:type="dxa" w:w="80"/>
+            </w:tcMar>
+            <w:vAlign w:val="center"/>
+          </w:tcPr>
+          <w:p>
+            <w:pPr>
+              <w:keepNext w:val="false"/>
+              <w:spacing w:after="0" w:line="240"/>
+              <w:jc w:val="left"/>
+            </w:pPr>
+            <w:r>
+              <w:rPr>
+                <w:rFonts w:ascii="Arial" w:cs="Arial" w:eastAsia="Arial" w:hAnsi="Arial"/>
+                <w:sz w:val="15"/>
+                <w:szCs w:val="15"/>
+              </w:rPr>
+              <w:t xml:space="preserve">Satisfacción</w:t>
+            </w:r>
+          </w:p>
+        </w:tc>
+        <w:tc>
+          <w:tcPr>
+            <w:tcW w:type="dxa" w:w="2256"/>
+            <w:shd w:fill="F5F8FC" w:color="auto" w:val="clear"/>
+            <w:tcMar>
+              <w:top w:type="dxa" w:w="50"/>
+              <w:left w:type="dxa" w:w="80"/>
+              <w:bottom w:type="dxa" w:w="50"/>
+              <w:right w:type="dxa" w:w="80"/>
+            </w:tcMar>
+            <w:vAlign w:val="center"/>
+          </w:tcPr>
+          <w:p>
+            <w:pPr>
+              <w:keepNext w:val="false"/>
+              <w:spacing w:after="0" w:line="240"/>
+              <w:jc w:val="left"/>
+            </w:pPr>
+            <w:r>
+              <w:rPr>
+                <w:rFonts w:ascii="Arial" w:cs="Arial" w:eastAsia="Arial" w:hAnsi="Arial"/>
+                <w:sz w:val="15"/>
+                <w:szCs w:val="15"/>
+              </w:rPr>
+              <w:t xml:space="preserve">Satisfacción de usuarios</w:t>
+            </w:r>
+          </w:p>
+        </w:tc>
+        <w:tc>
+          <w:tcPr>
+            <w:tcW w:type="dxa" w:w="1880"/>
+            <w:shd w:fill="F5F8FC" w:color="auto" w:val="clear"/>
+            <w:tcMar>
+              <w:top w:type="dxa" w:w="50"/>
+              <w:left w:type="dxa" w:w="80"/>
+              <w:bottom w:type="dxa" w:w="50"/>
+              <w:right w:type="dxa" w:w="80"/>
+            </w:tcMar>
+            <w:vAlign w:val="center"/>
+          </w:tcPr>
+          <w:p>
+            <w:pPr>
+              <w:keepNext w:val="false"/>
+              <w:spacing w:after="0" w:line="240"/>
+              <w:jc w:val="left"/>
+            </w:pPr>
+            <w:r>
+              <w:rPr>
+                <w:rFonts w:ascii="Arial" w:cs="Arial" w:eastAsia="Arial" w:hAnsi="Arial"/>
+                <w:sz w:val="15"/>
+                <w:szCs w:val="15"/>
+              </w:rPr>
+              <w:t xml:space="preserve">No disponible</w:t>
+            </w:r>
+          </w:p>
+        </w:tc>
+        <w:tc>
+          <w:tcPr>
+            <w:tcW w:type="dxa" w:w="2256"/>
+            <w:shd w:fill="F5F8FC" w:color="auto" w:val="clear"/>
+            <w:tcMar>
+              <w:top w:type="dxa" w:w="50"/>
+              <w:left w:type="dxa" w:w="80"/>
+              <w:bottom w:type="dxa" w:w="50"/>
+              <w:right w:type="dxa" w:w="80"/>
+            </w:tcMar>
+            <w:vAlign w:val="center"/>
+          </w:tcPr>
+          <w:p>
+            <w:pPr>
+              <w:keepNext w:val="false"/>
+              <w:spacing w:after="0" w:line="240"/>
+              <w:jc w:val="left"/>
+            </w:pPr>
+            <w:r>
+              <w:rPr>
+                <w:rFonts w:ascii="Arial" w:cs="Arial" w:eastAsia="Arial" w:hAnsi="Arial"/>
+                <w:sz w:val="15"/>
+                <w:szCs w:val="15"/>
+              </w:rPr>
+              <w:t xml:space="preserve">No medida (limitación declarada)</w:t>
+            </w:r>
+          </w:p>
+        </w:tc>
+        <w:tc>
+          <w:tcPr>
+            <w:tcW w:type="dxa" w:w="1696"/>
+            <w:shd w:fill="F5F8FC" w:color="auto" w:val="clear"/>
+            <w:tcMar>
+              <w:top w:type="dxa" w:w="50"/>
+              <w:left w:type="dxa" w:w="80"/>
+              <w:bottom w:type="dxa" w:w="50"/>
+              <w:right w:type="dxa" w:w="80"/>
+            </w:tcMar>
+            <w:vAlign w:val="center"/>
+          </w:tcPr>
+          <w:p>
+            <w:pPr>
+              <w:keepNext w:val="false"/>
+              <w:spacing w:after="0" w:line="240"/>
+              <w:jc w:val="left"/>
+            </w:pPr>
+            <w:r>
+              <w:rPr>
+                <w:rFonts w:ascii="Arial" w:cs="Arial" w:eastAsia="Arial" w:hAnsi="Arial"/>
+                <w:sz w:val="15"/>
+                <w:szCs w:val="15"/>
+              </w:rPr>
               <w:t xml:space="preserve">Pendiente: encuesta con supervisores</w:t>
+            </w:r>
+          </w:p>
+        </w:tc>
+      </w:tr>
+    </w:tbl>
+    <w:p>
+      <w:pPr>
+        <w:spacing w:after="60"/>
+      </w:pPr>
+    </w:p>
+    <w:p>
+      <w:pPr>
+        <w:pStyle w:val="Heading1"/>
+        <w:keepNext/>
+        <w:spacing w:after="120" w:before="280"/>
+      </w:pPr>
+      <w:r>
+        <w:rPr>
+          <w:rFonts w:ascii="Calibri" w:cs="Calibri" w:eastAsia="Calibri" w:hAnsi="Calibri"/>
+          <w:b/>
+          <w:bCs/>
+          <w:color w:val="2E74B5"/>
+          <w:sz w:val="26"/>
+          <w:szCs w:val="26"/>
+        </w:rPr>
+        <w:t xml:space="preserve">ANEXO C. ESTADO DE AVANCE DEL PROYECTO</w:t>
+      </w:r>
+    </w:p>
+    <w:p>
+      <w:pPr>
+        <w:spacing w:after="120" w:line="264"/>
+        <w:jc w:val="both"/>
+      </w:pPr>
+      <w:r>
+        <w:rPr>
+          <w:rFonts w:ascii="Arial" w:cs="Arial" w:eastAsia="Arial" w:hAnsi="Arial"/>
+          <w:sz w:val="21"/>
+          <w:szCs w:val="21"/>
+        </w:rPr>
+        <w:t xml:space="preserve">La Tabla 11 resume el estado de cada componente al 29 de septiembre de 2026, con la evidencia que lo respalda en el repositorio.</w:t>
+      </w:r>
+    </w:p>
+    <w:p>
+      <w:pPr>
+        <w:keepNext/>
+        <w:spacing w:after="80" w:before="160"/>
+        <w:jc w:val="center"/>
+      </w:pPr>
+      <w:r>
+        <w:rPr>
+          <w:rFonts w:ascii="Arial" w:cs="Arial" w:eastAsia="Arial" w:hAnsi="Arial"/>
+          <w:b/>
+          <w:bCs/>
+          <w:sz w:val="18"/>
+          <w:szCs w:val="18"/>
+        </w:rPr>
+        <w:t xml:space="preserve">Tabla 11. </w:t>
+      </w:r>
+      <w:r>
+        <w:rPr>
+          <w:rFonts w:ascii="Arial" w:cs="Arial" w:eastAsia="Arial" w:hAnsi="Arial"/>
+          <w:sz w:val="18"/>
+          <w:szCs w:val="18"/>
+        </w:rPr>
+        <w:t xml:space="preserve">Estado de avance por componente</w:t>
+      </w:r>
+    </w:p>
+    <w:tbl>
+      <w:tblPr>
+        <w:tblW w:type="dxa" w:w="9404"/>
+        <w:tblBorders>
+          <w:top w:val="single" w:color="8EAADB" w:sz="4"/>
+          <w:left w:val="single" w:color="8EAADB" w:sz="4"/>
+          <w:bottom w:val="single" w:color="8EAADB" w:sz="4"/>
+          <w:right w:val="single" w:color="8EAADB" w:sz="4"/>
+          <w:insideH w:val="single" w:color="8EAADB" w:sz="4"/>
+          <w:insideV w:val="single" w:color="8EAADB" w:sz="4"/>
+        </w:tblBorders>
+        <w:tblLayout w:type="fixed"/>
+      </w:tblPr>
+      <w:tblGrid>
+        <w:gridCol w:w="2068"/>
+        <w:gridCol w:w="1316"/>
+        <w:gridCol w:w="6020"/>
+      </w:tblGrid>
+      <w:tr>
+        <w:trPr>
+          <w:cantSplit/>
+          <w:tblHeader/>
+        </w:trPr>
+        <w:tc>
+          <w:tcPr>
+            <w:tcW w:type="dxa" w:w="2068"/>
+            <w:shd w:fill="DCE6F1" w:color="auto" w:val="clear"/>
+            <w:tcMar>
+              <w:top w:type="dxa" w:w="50"/>
+              <w:left w:type="dxa" w:w="80"/>
+              <w:bottom w:type="dxa" w:w="50"/>
+              <w:right w:type="dxa" w:w="80"/>
+            </w:tcMar>
+            <w:vAlign w:val="center"/>
+          </w:tcPr>
+          <w:p>
+            <w:pPr>
+              <w:keepNext/>
+              <w:spacing w:after="0" w:line="240"/>
+              <w:jc w:val="center"/>
+            </w:pPr>
+            <w:r>
+              <w:rPr>
+                <w:rFonts w:ascii="Arial" w:cs="Arial" w:eastAsia="Arial" w:hAnsi="Arial"/>
+                <w:b/>
+                <w:bCs/>
+                <w:sz w:val="15"/>
+                <w:szCs w:val="15"/>
+              </w:rPr>
+              <w:t xml:space="preserve">Componente</w:t>
+            </w:r>
+          </w:p>
+        </w:tc>
+        <w:tc>
+          <w:tcPr>
+            <w:tcW w:type="dxa" w:w="1316"/>
+            <w:shd w:fill="DCE6F1" w:color="auto" w:val="clear"/>
+            <w:tcMar>
+              <w:top w:type="dxa" w:w="50"/>
+              <w:left w:type="dxa" w:w="80"/>
+              <w:bottom w:type="dxa" w:w="50"/>
+              <w:right w:type="dxa" w:w="80"/>
+            </w:tcMar>
+            <w:vAlign w:val="center"/>
+          </w:tcPr>
+          <w:p>
+            <w:pPr>
+              <w:keepNext/>
+              <w:spacing w:after="0" w:line="240"/>
+              <w:jc w:val="center"/>
+            </w:pPr>
+            <w:r>
+              <w:rPr>
+                <w:rFonts w:ascii="Arial" w:cs="Arial" w:eastAsia="Arial" w:hAnsi="Arial"/>
+                <w:b/>
+                <w:bCs/>
+                <w:sz w:val="15"/>
+                <w:szCs w:val="15"/>
+              </w:rPr>
+              <w:t xml:space="preserve">Estado</w:t>
+            </w:r>
+          </w:p>
+        </w:tc>
+        <w:tc>
+          <w:tcPr>
+            <w:tcW w:type="dxa" w:w="6020"/>
+            <w:shd w:fill="DCE6F1" w:color="auto" w:val="clear"/>
+            <w:tcMar>
+              <w:top w:type="dxa" w:w="50"/>
+              <w:left w:type="dxa" w:w="80"/>
+              <w:bottom w:type="dxa" w:w="50"/>
+              <w:right w:type="dxa" w:w="80"/>
+            </w:tcMar>
+            <w:vAlign w:val="center"/>
+          </w:tcPr>
+          <w:p>
+            <w:pPr>
+              <w:keepNext/>
+              <w:spacing w:after="0" w:line="240"/>
+              <w:jc w:val="center"/>
+            </w:pPr>
+            <w:r>
+              <w:rPr>
+                <w:rFonts w:ascii="Arial" w:cs="Arial" w:eastAsia="Arial" w:hAnsi="Arial"/>
+                <w:b/>
+                <w:bCs/>
+                <w:sz w:val="15"/>
+                <w:szCs w:val="15"/>
+              </w:rPr>
+              <w:t xml:space="preserve">Evidencia y detalle</w:t>
+            </w:r>
+          </w:p>
+        </w:tc>
+      </w:tr>
+      <w:tr>
+        <w:trPr>
+          <w:cantSplit/>
+        </w:trPr>
+        <w:tc>
+          <w:tcPr>
+            <w:tcW w:type="dxa" w:w="2068"/>
+            <w:tcMar>
+              <w:top w:type="dxa" w:w="50"/>
+              <w:left w:type="dxa" w:w="80"/>
+              <w:bottom w:type="dxa" w:w="50"/>
+              <w:right w:type="dxa" w:w="80"/>
+            </w:tcMar>
+            <w:vAlign w:val="center"/>
+          </w:tcPr>
+          <w:p>
+            <w:pPr>
+              <w:keepNext w:val="false"/>
+              <w:spacing w:after="0" w:line="240"/>
+              <w:jc w:val="left"/>
+            </w:pPr>
+            <w:r>
+              <w:rPr>
+                <w:rFonts w:ascii="Arial" w:cs="Arial" w:eastAsia="Arial" w:hAnsi="Arial"/>
+                <w:sz w:val="15"/>
+                <w:szCs w:val="15"/>
+              </w:rPr>
+              <w:t xml:space="preserve">Integración de fuentes oficiales</w:t>
+            </w:r>
+          </w:p>
+        </w:tc>
+        <w:tc>
+          <w:tcPr>
+            <w:tcW w:type="dxa" w:w="1316"/>
+            <w:tcMar>
+              <w:top w:type="dxa" w:w="50"/>
+              <w:left w:type="dxa" w:w="80"/>
+              <w:bottom w:type="dxa" w:w="50"/>
+              <w:right w:type="dxa" w:w="80"/>
+            </w:tcMar>
+            <w:vAlign w:val="center"/>
+          </w:tcPr>
+          <w:p>
+            <w:pPr>
+              <w:keepNext w:val="false"/>
+              <w:spacing w:after="0" w:line="240"/>
+              <w:jc w:val="left"/>
+            </w:pPr>
+            <w:r>
+              <w:rPr>
+                <w:rFonts w:ascii="Arial" w:cs="Arial" w:eastAsia="Arial" w:hAnsi="Arial"/>
+                <w:sz w:val="15"/>
+                <w:szCs w:val="15"/>
+              </w:rPr>
+              <w:t xml:space="preserve">Completo</w:t>
+            </w:r>
+          </w:p>
+        </w:tc>
+        <w:tc>
+          <w:tcPr>
+            <w:tcW w:type="dxa" w:w="6020"/>
+            <w:tcMar>
+              <w:top w:type="dxa" w:w="50"/>
+              <w:left w:type="dxa" w:w="80"/>
+              <w:bottom w:type="dxa" w:w="50"/>
+              <w:right w:type="dxa" w:w="80"/>
+            </w:tcMar>
+            <w:vAlign w:val="center"/>
+          </w:tcPr>
+          <w:p>
+            <w:pPr>
+              <w:keepNext w:val="false"/>
+              <w:spacing w:after="0" w:line="240"/>
+              <w:jc w:val="left"/>
+            </w:pPr>
+            <w:r>
+              <w:rPr>
+                <w:rFonts w:ascii="Arial" w:cs="Arial" w:eastAsia="Arial" w:hAnsi="Arial"/>
+                <w:sz w:val="15"/>
+                <w:szCs w:val="15"/>
+              </w:rPr>
+              <w:t xml:space="preserve">OECE, MEF y Contraloría; corte congelado al 25/09/2026 con huellas SHA-256; precisión de enlace 99,1 %.</w:t>
+            </w:r>
+          </w:p>
+        </w:tc>
+      </w:tr>
+      <w:tr>
+        <w:trPr>
+          <w:cantSplit/>
+        </w:trPr>
+        <w:tc>
+          <w:tcPr>
+            <w:tcW w:type="dxa" w:w="2068"/>
+            <w:shd w:fill="F5F8FC" w:color="auto" w:val="clear"/>
+            <w:tcMar>
+              <w:top w:type="dxa" w:w="50"/>
+              <w:left w:type="dxa" w:w="80"/>
+              <w:bottom w:type="dxa" w:w="50"/>
+              <w:right w:type="dxa" w:w="80"/>
+            </w:tcMar>
+            <w:vAlign w:val="center"/>
+          </w:tcPr>
+          <w:p>
+            <w:pPr>
+              <w:keepNext w:val="false"/>
+              <w:spacing w:after="0" w:line="240"/>
+              <w:jc w:val="left"/>
+            </w:pPr>
+            <w:r>
+              <w:rPr>
+                <w:rFonts w:ascii="Arial" w:cs="Arial" w:eastAsia="Arial" w:hAnsi="Arial"/>
+                <w:sz w:val="15"/>
+                <w:szCs w:val="15"/>
+              </w:rPr>
+              <w:t xml:space="preserve">Modelo de alerta a 60 días (A y B)</w:t>
+            </w:r>
+          </w:p>
+        </w:tc>
+        <w:tc>
+          <w:tcPr>
+            <w:tcW w:type="dxa" w:w="1316"/>
+            <w:shd w:fill="F5F8FC" w:color="auto" w:val="clear"/>
+            <w:tcMar>
+              <w:top w:type="dxa" w:w="50"/>
+              <w:left w:type="dxa" w:w="80"/>
+              <w:bottom w:type="dxa" w:w="50"/>
+              <w:right w:type="dxa" w:w="80"/>
+            </w:tcMar>
+            <w:vAlign w:val="center"/>
+          </w:tcPr>
+          <w:p>
+            <w:pPr>
+              <w:keepNext w:val="false"/>
+              <w:spacing w:after="0" w:line="240"/>
+              <w:jc w:val="left"/>
+            </w:pPr>
+            <w:r>
+              <w:rPr>
+                <w:rFonts w:ascii="Arial" w:cs="Arial" w:eastAsia="Arial" w:hAnsi="Arial"/>
+                <w:sz w:val="15"/>
+                <w:szCs w:val="15"/>
+              </w:rPr>
+              <w:t xml:space="preserve">Completo</w:t>
+            </w:r>
+          </w:p>
+        </w:tc>
+        <w:tc>
+          <w:tcPr>
+            <w:tcW w:type="dxa" w:w="6020"/>
+            <w:shd w:fill="F5F8FC" w:color="auto" w:val="clear"/>
+            <w:tcMar>
+              <w:top w:type="dxa" w:w="50"/>
+              <w:left w:type="dxa" w:w="80"/>
+              <w:bottom w:type="dxa" w:w="50"/>
+              <w:right w:type="dxa" w:w="80"/>
+            </w:tcMar>
+            <w:vAlign w:val="center"/>
+          </w:tcPr>
+          <w:p>
+            <w:pPr>
+              <w:keepNext w:val="false"/>
+              <w:spacing w:after="0" w:line="240"/>
+              <w:jc w:val="left"/>
+            </w:pPr>
+            <w:r>
+              <w:rPr>
+                <w:rFonts w:ascii="Arial" w:cs="Arial" w:eastAsia="Arial" w:hAnsi="Arial"/>
+                <w:sz w:val="15"/>
+                <w:szCs w:val="15"/>
+              </w:rPr>
+              <w:t xml:space="preserve">Prueba temporal ciega, rolling-origin, semillas y bootstrap; H1 aceptada a escala nacional; probabilidades calibradas.</w:t>
+            </w:r>
+          </w:p>
+        </w:tc>
+      </w:tr>
+      <w:tr>
+        <w:trPr>
+          <w:cantSplit/>
+        </w:trPr>
+        <w:tc>
+          <w:tcPr>
+            <w:tcW w:type="dxa" w:w="2068"/>
+            <w:tcMar>
+              <w:top w:type="dxa" w:w="50"/>
+              <w:left w:type="dxa" w:w="80"/>
+              <w:bottom w:type="dxa" w:w="50"/>
+              <w:right w:type="dxa" w:w="80"/>
+            </w:tcMar>
+            <w:vAlign w:val="center"/>
+          </w:tcPr>
+          <w:p>
+            <w:pPr>
+              <w:keepNext w:val="false"/>
+              <w:spacing w:after="0" w:line="240"/>
+              <w:jc w:val="left"/>
+            </w:pPr>
+            <w:r>
+              <w:rPr>
+                <w:rFonts w:ascii="Arial" w:cs="Arial" w:eastAsia="Arial" w:hAnsi="Arial"/>
+                <w:sz w:val="15"/>
+                <w:szCs w:val="15"/>
+              </w:rPr>
+              <w:t xml:space="preserve">Modelos de cartera INFOBRAS</w:t>
+            </w:r>
+          </w:p>
+        </w:tc>
+        <w:tc>
+          <w:tcPr>
+            <w:tcW w:type="dxa" w:w="1316"/>
+            <w:tcMar>
+              <w:top w:type="dxa" w:w="50"/>
+              <w:left w:type="dxa" w:w="80"/>
+              <w:bottom w:type="dxa" w:w="50"/>
+              <w:right w:type="dxa" w:w="80"/>
+            </w:tcMar>
+            <w:vAlign w:val="center"/>
+          </w:tcPr>
+          <w:p>
+            <w:pPr>
+              <w:keepNext w:val="false"/>
+              <w:spacing w:after="0" w:line="240"/>
+              <w:jc w:val="left"/>
+            </w:pPr>
+            <w:r>
+              <w:rPr>
+                <w:rFonts w:ascii="Arial" w:cs="Arial" w:eastAsia="Arial" w:hAnsi="Arial"/>
+                <w:sz w:val="15"/>
+                <w:szCs w:val="15"/>
+              </w:rPr>
+              <w:t xml:space="preserve">Completo</w:t>
+            </w:r>
+          </w:p>
+        </w:tc>
+        <w:tc>
+          <w:tcPr>
+            <w:tcW w:type="dxa" w:w="6020"/>
+            <w:tcMar>
+              <w:top w:type="dxa" w:w="50"/>
+              <w:left w:type="dxa" w:w="80"/>
+              <w:bottom w:type="dxa" w:w="50"/>
+              <w:right w:type="dxa" w:w="80"/>
+            </w:tcMar>
+            <w:vAlign w:val="center"/>
+          </w:tcPr>
+          <w:p>
+            <w:pPr>
+              <w:keepNext w:val="false"/>
+              <w:spacing w:after="0" w:line="240"/>
+              <w:jc w:val="left"/>
+            </w:pPr>
+            <w:r>
+              <w:rPr>
+                <w:rFonts w:ascii="Arial" w:cs="Arial" w:eastAsia="Arial" w:hAnsi="Arial"/>
+                <w:sz w:val="15"/>
+                <w:szCs w:val="15"/>
+              </w:rPr>
+              <w:t xml:space="preserve">Al inicio (ROC-AUC 0,733) y con seguimiento SIAF (0,753) para 139 159 obras.</w:t>
+            </w:r>
+          </w:p>
+        </w:tc>
+      </w:tr>
+      <w:tr>
+        <w:trPr>
+          <w:cantSplit/>
+        </w:trPr>
+        <w:tc>
+          <w:tcPr>
+            <w:tcW w:type="dxa" w:w="2068"/>
+            <w:shd w:fill="F5F8FC" w:color="auto" w:val="clear"/>
+            <w:tcMar>
+              <w:top w:type="dxa" w:w="50"/>
+              <w:left w:type="dxa" w:w="80"/>
+              <w:bottom w:type="dxa" w:w="50"/>
+              <w:right w:type="dxa" w:w="80"/>
+            </w:tcMar>
+            <w:vAlign w:val="center"/>
+          </w:tcPr>
+          <w:p>
+            <w:pPr>
+              <w:keepNext w:val="false"/>
+              <w:spacing w:after="0" w:line="240"/>
+              <w:jc w:val="left"/>
+            </w:pPr>
+            <w:r>
+              <w:rPr>
+                <w:rFonts w:ascii="Arial" w:cs="Arial" w:eastAsia="Arial" w:hAnsi="Arial"/>
+                <w:sz w:val="15"/>
+                <w:szCs w:val="15"/>
+              </w:rPr>
+              <w:t xml:space="preserve">API y base de datos</w:t>
+            </w:r>
+          </w:p>
+        </w:tc>
+        <w:tc>
+          <w:tcPr>
+            <w:tcW w:type="dxa" w:w="1316"/>
+            <w:shd w:fill="F5F8FC" w:color="auto" w:val="clear"/>
+            <w:tcMar>
+              <w:top w:type="dxa" w:w="50"/>
+              <w:left w:type="dxa" w:w="80"/>
+              <w:bottom w:type="dxa" w:w="50"/>
+              <w:right w:type="dxa" w:w="80"/>
+            </w:tcMar>
+            <w:vAlign w:val="center"/>
+          </w:tcPr>
+          <w:p>
+            <w:pPr>
+              <w:keepNext w:val="false"/>
+              <w:spacing w:after="0" w:line="240"/>
+              <w:jc w:val="left"/>
+            </w:pPr>
+            <w:r>
+              <w:rPr>
+                <w:rFonts w:ascii="Arial" w:cs="Arial" w:eastAsia="Arial" w:hAnsi="Arial"/>
+                <w:sz w:val="15"/>
+                <w:szCs w:val="15"/>
+              </w:rPr>
+              <w:t xml:space="preserve">Completo</w:t>
+            </w:r>
+          </w:p>
+        </w:tc>
+        <w:tc>
+          <w:tcPr>
+            <w:tcW w:type="dxa" w:w="6020"/>
+            <w:shd w:fill="F5F8FC" w:color="auto" w:val="clear"/>
+            <w:tcMar>
+              <w:top w:type="dxa" w:w="50"/>
+              <w:left w:type="dxa" w:w="80"/>
+              <w:bottom w:type="dxa" w:w="50"/>
+              <w:right w:type="dxa" w:w="80"/>
+            </w:tcMar>
+            <w:vAlign w:val="center"/>
+          </w:tcPr>
+          <w:p>
+            <w:pPr>
+              <w:keepNext w:val="false"/>
+              <w:spacing w:after="0" w:line="240"/>
+              <w:jc w:val="left"/>
+            </w:pPr>
+            <w:r>
+              <w:rPr>
+                <w:rFonts w:ascii="Arial" w:cs="Arial" w:eastAsia="Arial" w:hAnsi="Arial"/>
+                <w:sz w:val="15"/>
+                <w:szCs w:val="15"/>
+              </w:rPr>
+              <w:t xml:space="preserve">FastAPI y PostgreSQL 16 con vistas materializadas, caché por versión de datos y tiempos máximos de consulta.</w:t>
+            </w:r>
+          </w:p>
+        </w:tc>
+      </w:tr>
+      <w:tr>
+        <w:trPr>
+          <w:cantSplit/>
+        </w:trPr>
+        <w:tc>
+          <w:tcPr>
+            <w:tcW w:type="dxa" w:w="2068"/>
+            <w:tcMar>
+              <w:top w:type="dxa" w:w="50"/>
+              <w:left w:type="dxa" w:w="80"/>
+              <w:bottom w:type="dxa" w:w="50"/>
+              <w:right w:type="dxa" w:w="80"/>
+            </w:tcMar>
+            <w:vAlign w:val="center"/>
+          </w:tcPr>
+          <w:p>
+            <w:pPr>
+              <w:keepNext w:val="false"/>
+              <w:spacing w:after="0" w:line="240"/>
+              <w:jc w:val="left"/>
+            </w:pPr>
+            <w:r>
+              <w:rPr>
+                <w:rFonts w:ascii="Arial" w:cs="Arial" w:eastAsia="Arial" w:hAnsi="Arial"/>
+                <w:sz w:val="15"/>
+                <w:szCs w:val="15"/>
+              </w:rPr>
+              <w:t xml:space="preserve">Carga con compuerta de integridad</w:t>
+            </w:r>
+          </w:p>
+        </w:tc>
+        <w:tc>
+          <w:tcPr>
+            <w:tcW w:type="dxa" w:w="1316"/>
+            <w:tcMar>
+              <w:top w:type="dxa" w:w="50"/>
+              <w:left w:type="dxa" w:w="80"/>
+              <w:bottom w:type="dxa" w:w="50"/>
+              <w:right w:type="dxa" w:w="80"/>
+            </w:tcMar>
+            <w:vAlign w:val="center"/>
+          </w:tcPr>
+          <w:p>
+            <w:pPr>
+              <w:keepNext w:val="false"/>
+              <w:spacing w:after="0" w:line="240"/>
+              <w:jc w:val="left"/>
+            </w:pPr>
+            <w:r>
+              <w:rPr>
+                <w:rFonts w:ascii="Arial" w:cs="Arial" w:eastAsia="Arial" w:hAnsi="Arial"/>
+                <w:sz w:val="15"/>
+                <w:szCs w:val="15"/>
+              </w:rPr>
+              <w:t xml:space="preserve">Completo</w:t>
+            </w:r>
+          </w:p>
+        </w:tc>
+        <w:tc>
+          <w:tcPr>
+            <w:tcW w:type="dxa" w:w="6020"/>
+            <w:tcMar>
+              <w:top w:type="dxa" w:w="50"/>
+              <w:left w:type="dxa" w:w="80"/>
+              <w:bottom w:type="dxa" w:w="50"/>
+              <w:right w:type="dxa" w:w="80"/>
+            </w:tcMar>
+            <w:vAlign w:val="center"/>
+          </w:tcPr>
+          <w:p>
+            <w:pPr>
+              <w:keepNext w:val="false"/>
+              <w:spacing w:after="0" w:line="240"/>
+              <w:jc w:val="left"/>
+            </w:pPr>
+            <w:r>
+              <w:rPr>
+                <w:rFonts w:ascii="Arial" w:cs="Arial" w:eastAsia="Arial" w:hAnsi="Arial"/>
+                <w:sz w:val="15"/>
+                <w:szCs w:val="15"/>
+              </w:rPr>
+              <w:t xml:space="preserve">Validación de entradas, conciliación, 11 chequeos críticos y caída máxima de 20 %; historial auditable de cargas.</w:t>
+            </w:r>
+          </w:p>
+        </w:tc>
+      </w:tr>
+      <w:tr>
+        <w:trPr>
+          <w:cantSplit/>
+        </w:trPr>
+        <w:tc>
+          <w:tcPr>
+            <w:tcW w:type="dxa" w:w="2068"/>
+            <w:shd w:fill="F5F8FC" w:color="auto" w:val="clear"/>
+            <w:tcMar>
+              <w:top w:type="dxa" w:w="50"/>
+              <w:left w:type="dxa" w:w="80"/>
+              <w:bottom w:type="dxa" w:w="50"/>
+              <w:right w:type="dxa" w:w="80"/>
+            </w:tcMar>
+            <w:vAlign w:val="center"/>
+          </w:tcPr>
+          <w:p>
+            <w:pPr>
+              <w:keepNext w:val="false"/>
+              <w:spacing w:after="0" w:line="240"/>
+              <w:jc w:val="left"/>
+            </w:pPr>
+            <w:r>
+              <w:rPr>
+                <w:rFonts w:ascii="Arial" w:cs="Arial" w:eastAsia="Arial" w:hAnsi="Arial"/>
+                <w:sz w:val="15"/>
+                <w:szCs w:val="15"/>
+              </w:rPr>
+              <w:t xml:space="preserve">Operación autónoma y monitoreo</w:t>
+            </w:r>
+          </w:p>
+        </w:tc>
+        <w:tc>
+          <w:tcPr>
+            <w:tcW w:type="dxa" w:w="1316"/>
+            <w:shd w:fill="F5F8FC" w:color="auto" w:val="clear"/>
+            <w:tcMar>
+              <w:top w:type="dxa" w:w="50"/>
+              <w:left w:type="dxa" w:w="80"/>
+              <w:bottom w:type="dxa" w:w="50"/>
+              <w:right w:type="dxa" w:w="80"/>
+            </w:tcMar>
+            <w:vAlign w:val="center"/>
+          </w:tcPr>
+          <w:p>
+            <w:pPr>
+              <w:keepNext w:val="false"/>
+              <w:spacing w:after="0" w:line="240"/>
+              <w:jc w:val="left"/>
+            </w:pPr>
+            <w:r>
+              <w:rPr>
+                <w:rFonts w:ascii="Arial" w:cs="Arial" w:eastAsia="Arial" w:hAnsi="Arial"/>
+                <w:sz w:val="15"/>
+                <w:szCs w:val="15"/>
+              </w:rPr>
+              <w:t xml:space="preserve">Completo</w:t>
+            </w:r>
+          </w:p>
+        </w:tc>
+        <w:tc>
+          <w:tcPr>
+            <w:tcW w:type="dxa" w:w="6020"/>
+            <w:shd w:fill="F5F8FC" w:color="auto" w:val="clear"/>
+            <w:tcMar>
+              <w:top w:type="dxa" w:w="50"/>
+              <w:left w:type="dxa" w:w="80"/>
+              <w:bottom w:type="dxa" w:w="50"/>
+              <w:right w:type="dxa" w:w="80"/>
+            </w:tcMar>
+            <w:vAlign w:val="center"/>
+          </w:tcPr>
+          <w:p>
+            <w:pPr>
+              <w:keepNext w:val="false"/>
+              <w:spacing w:after="0" w:line="240"/>
+              <w:jc w:val="left"/>
+            </w:pPr>
+            <w:r>
+              <w:rPr>
+                <w:rFonts w:ascii="Arial" w:cs="Arial" w:eastAsia="Arial" w:hAnsi="Arial"/>
+                <w:sz w:val="15"/>
+                <w:szCs w:val="15"/>
+              </w:rPr>
+              <w:t xml:space="preserve">Candado, reintentos, recuperación, latido, avisos por correo, deriva PSI y anomalías de la tasa de riesgo alto.</w:t>
+            </w:r>
+          </w:p>
+        </w:tc>
+      </w:tr>
+      <w:tr>
+        <w:trPr>
+          <w:cantSplit/>
+        </w:trPr>
+        <w:tc>
+          <w:tcPr>
+            <w:tcW w:type="dxa" w:w="2068"/>
+            <w:tcMar>
+              <w:top w:type="dxa" w:w="50"/>
+              <w:left w:type="dxa" w:w="80"/>
+              <w:bottom w:type="dxa" w:w="50"/>
+              <w:right w:type="dxa" w:w="80"/>
+            </w:tcMar>
+            <w:vAlign w:val="center"/>
+          </w:tcPr>
+          <w:p>
+            <w:pPr>
+              <w:keepNext w:val="false"/>
+              <w:spacing w:after="0" w:line="240"/>
+              <w:jc w:val="left"/>
+            </w:pPr>
+            <w:r>
+              <w:rPr>
+                <w:rFonts w:ascii="Arial" w:cs="Arial" w:eastAsia="Arial" w:hAnsi="Arial"/>
+                <w:sz w:val="15"/>
+                <w:szCs w:val="15"/>
+              </w:rPr>
+              <w:t xml:space="preserve">Seguridad</w:t>
+            </w:r>
+          </w:p>
+        </w:tc>
+        <w:tc>
+          <w:tcPr>
+            <w:tcW w:type="dxa" w:w="1316"/>
+            <w:tcMar>
+              <w:top w:type="dxa" w:w="50"/>
+              <w:left w:type="dxa" w:w="80"/>
+              <w:bottom w:type="dxa" w:w="50"/>
+              <w:right w:type="dxa" w:w="80"/>
+            </w:tcMar>
+            <w:vAlign w:val="center"/>
+          </w:tcPr>
+          <w:p>
+            <w:pPr>
+              <w:keepNext w:val="false"/>
+              <w:spacing w:after="0" w:line="240"/>
+              <w:jc w:val="left"/>
+            </w:pPr>
+            <w:r>
+              <w:rPr>
+                <w:rFonts w:ascii="Arial" w:cs="Arial" w:eastAsia="Arial" w:hAnsi="Arial"/>
+                <w:sz w:val="15"/>
+                <w:szCs w:val="15"/>
+              </w:rPr>
+              <w:t xml:space="preserve">Completo</w:t>
+            </w:r>
+          </w:p>
+        </w:tc>
+        <w:tc>
+          <w:tcPr>
+            <w:tcW w:type="dxa" w:w="6020"/>
+            <w:tcMar>
+              <w:top w:type="dxa" w:w="50"/>
+              <w:left w:type="dxa" w:w="80"/>
+              <w:bottom w:type="dxa" w:w="50"/>
+              <w:right w:type="dxa" w:w="80"/>
+            </w:tcMar>
+            <w:vAlign w:val="center"/>
+          </w:tcPr>
+          <w:p>
+            <w:pPr>
+              <w:keepNext w:val="false"/>
+              <w:spacing w:after="0" w:line="240"/>
+              <w:jc w:val="left"/>
+            </w:pPr>
+            <w:r>
+              <w:rPr>
+                <w:rFonts w:ascii="Arial" w:cs="Arial" w:eastAsia="Arial" w:hAnsi="Arial"/>
+                <w:sz w:val="15"/>
+                <w:szCs w:val="15"/>
+              </w:rPr>
+              <w:t xml:space="preserve">13 de 13 casos OWASP; límites de ingreso por cuenta e IP; JWT endurecido; proxy de confianza declarado.</w:t>
+            </w:r>
+          </w:p>
+        </w:tc>
+      </w:tr>
+      <w:tr>
+        <w:trPr>
+          <w:cantSplit/>
+        </w:trPr>
+        <w:tc>
+          <w:tcPr>
+            <w:tcW w:type="dxa" w:w="2068"/>
+            <w:shd w:fill="F5F8FC" w:color="auto" w:val="clear"/>
+            <w:tcMar>
+              <w:top w:type="dxa" w:w="50"/>
+              <w:left w:type="dxa" w:w="80"/>
+              <w:bottom w:type="dxa" w:w="50"/>
+              <w:right w:type="dxa" w:w="80"/>
+            </w:tcMar>
+            <w:vAlign w:val="center"/>
+          </w:tcPr>
+          <w:p>
+            <w:pPr>
+              <w:keepNext w:val="false"/>
+              <w:spacing w:after="0" w:line="240"/>
+              <w:jc w:val="left"/>
+            </w:pPr>
+            <w:r>
+              <w:rPr>
+                <w:rFonts w:ascii="Arial" w:cs="Arial" w:eastAsia="Arial" w:hAnsi="Arial"/>
+                <w:sz w:val="15"/>
+                <w:szCs w:val="15"/>
+              </w:rPr>
+              <w:t xml:space="preserve">Interfaz web y sistema de diseño</w:t>
+            </w:r>
+          </w:p>
+        </w:tc>
+        <w:tc>
+          <w:tcPr>
+            <w:tcW w:type="dxa" w:w="1316"/>
+            <w:shd w:fill="F5F8FC" w:color="auto" w:val="clear"/>
+            <w:tcMar>
+              <w:top w:type="dxa" w:w="50"/>
+              <w:left w:type="dxa" w:w="80"/>
+              <w:bottom w:type="dxa" w:w="50"/>
+              <w:right w:type="dxa" w:w="80"/>
+            </w:tcMar>
+            <w:vAlign w:val="center"/>
+          </w:tcPr>
+          <w:p>
+            <w:pPr>
+              <w:keepNext w:val="false"/>
+              <w:spacing w:after="0" w:line="240"/>
+              <w:jc w:val="left"/>
+            </w:pPr>
+            <w:r>
+              <w:rPr>
+                <w:rFonts w:ascii="Arial" w:cs="Arial" w:eastAsia="Arial" w:hAnsi="Arial"/>
+                <w:sz w:val="15"/>
+                <w:szCs w:val="15"/>
+              </w:rPr>
+              <w:t xml:space="preserve">Completo</w:t>
+            </w:r>
+          </w:p>
+        </w:tc>
+        <w:tc>
+          <w:tcPr>
+            <w:tcW w:type="dxa" w:w="6020"/>
+            <w:shd w:fill="F5F8FC" w:color="auto" w:val="clear"/>
+            <w:tcMar>
+              <w:top w:type="dxa" w:w="50"/>
+              <w:left w:type="dxa" w:w="80"/>
+              <w:bottom w:type="dxa" w:w="50"/>
+              <w:right w:type="dxa" w:w="80"/>
+            </w:tcMar>
+            <w:vAlign w:val="center"/>
+          </w:tcPr>
+          <w:p>
+            <w:pPr>
+              <w:keepNext w:val="false"/>
+              <w:spacing w:after="0" w:line="240"/>
+              <w:jc w:val="left"/>
+            </w:pPr>
+            <w:r>
+              <w:rPr>
+                <w:rFonts w:ascii="Arial" w:cs="Arial" w:eastAsia="Arial" w:hAnsi="Arial"/>
+                <w:sz w:val="15"/>
+                <w:szCs w:val="15"/>
+              </w:rPr>
+              <w:t xml:space="preserve">Rediseño institucional y accesible; Lighthouse 100 en accesibilidad en las páginas evaluadas; vista móvil verificada a 375 px.</w:t>
+            </w:r>
+          </w:p>
+        </w:tc>
+      </w:tr>
+      <w:tr>
+        <w:trPr>
+          <w:cantSplit/>
+        </w:trPr>
+        <w:tc>
+          <w:tcPr>
+            <w:tcW w:type="dxa" w:w="2068"/>
+            <w:tcMar>
+              <w:top w:type="dxa" w:w="50"/>
+              <w:left w:type="dxa" w:w="80"/>
+              <w:bottom w:type="dxa" w:w="50"/>
+              <w:right w:type="dxa" w:w="80"/>
+            </w:tcMar>
+            <w:vAlign w:val="center"/>
+          </w:tcPr>
+          <w:p>
+            <w:pPr>
+              <w:keepNext w:val="false"/>
+              <w:spacing w:after="0" w:line="240"/>
+              <w:jc w:val="left"/>
+            </w:pPr>
+            <w:r>
+              <w:rPr>
+                <w:rFonts w:ascii="Arial" w:cs="Arial" w:eastAsia="Arial" w:hAnsi="Arial"/>
+                <w:sz w:val="15"/>
+                <w:szCs w:val="15"/>
+              </w:rPr>
+              <w:t xml:space="preserve">Informe técnico en PDF</w:t>
+            </w:r>
+          </w:p>
+        </w:tc>
+        <w:tc>
+          <w:tcPr>
+            <w:tcW w:type="dxa" w:w="1316"/>
+            <w:tcMar>
+              <w:top w:type="dxa" w:w="50"/>
+              <w:left w:type="dxa" w:w="80"/>
+              <w:bottom w:type="dxa" w:w="50"/>
+              <w:right w:type="dxa" w:w="80"/>
+            </w:tcMar>
+            <w:vAlign w:val="center"/>
+          </w:tcPr>
+          <w:p>
+            <w:pPr>
+              <w:keepNext w:val="false"/>
+              <w:spacing w:after="0" w:line="240"/>
+              <w:jc w:val="left"/>
+            </w:pPr>
+            <w:r>
+              <w:rPr>
+                <w:rFonts w:ascii="Arial" w:cs="Arial" w:eastAsia="Arial" w:hAnsi="Arial"/>
+                <w:sz w:val="15"/>
+                <w:szCs w:val="15"/>
+              </w:rPr>
+              <w:t xml:space="preserve">Completo</w:t>
+            </w:r>
+          </w:p>
+        </w:tc>
+        <w:tc>
+          <w:tcPr>
+            <w:tcW w:type="dxa" w:w="6020"/>
+            <w:tcMar>
+              <w:top w:type="dxa" w:w="50"/>
+              <w:left w:type="dxa" w:w="80"/>
+              <w:bottom w:type="dxa" w:w="50"/>
+              <w:right w:type="dxa" w:w="80"/>
+            </w:tcMar>
+            <w:vAlign w:val="center"/>
+          </w:tcPr>
+          <w:p>
+            <w:pPr>
+              <w:keepNext w:val="false"/>
+              <w:spacing w:after="0" w:line="240"/>
+              <w:jc w:val="left"/>
+            </w:pPr>
+            <w:r>
+              <w:rPr>
+                <w:rFonts w:ascii="Arial" w:cs="Arial" w:eastAsia="Arial" w:hAnsi="Arial"/>
+                <w:sz w:val="15"/>
+                <w:szCs w:val="15"/>
+              </w:rPr>
+              <w:t xml:space="preserve">Rediseñado con el sistema visual: resumen ejecutivo, escala de riesgo, factores, evidencia y marco normativo.</w:t>
+            </w:r>
+          </w:p>
+        </w:tc>
+      </w:tr>
+      <w:tr>
+        <w:trPr>
+          <w:cantSplit/>
+        </w:trPr>
+        <w:tc>
+          <w:tcPr>
+            <w:tcW w:type="dxa" w:w="2068"/>
+            <w:shd w:fill="F5F8FC" w:color="auto" w:val="clear"/>
+            <w:tcMar>
+              <w:top w:type="dxa" w:w="50"/>
+              <w:left w:type="dxa" w:w="80"/>
+              <w:bottom w:type="dxa" w:w="50"/>
+              <w:right w:type="dxa" w:w="80"/>
+            </w:tcMar>
+            <w:vAlign w:val="center"/>
+          </w:tcPr>
+          <w:p>
+            <w:pPr>
+              <w:keepNext w:val="false"/>
+              <w:spacing w:after="0" w:line="240"/>
+              <w:jc w:val="left"/>
+            </w:pPr>
+            <w:r>
+              <w:rPr>
+                <w:rFonts w:ascii="Arial" w:cs="Arial" w:eastAsia="Arial" w:hAnsi="Arial"/>
+                <w:sz w:val="15"/>
+                <w:szCs w:val="15"/>
+              </w:rPr>
+              <w:t xml:space="preserve">Pruebas automatizadas</w:t>
+            </w:r>
+          </w:p>
+        </w:tc>
+        <w:tc>
+          <w:tcPr>
+            <w:tcW w:type="dxa" w:w="1316"/>
+            <w:shd w:fill="F5F8FC" w:color="auto" w:val="clear"/>
+            <w:tcMar>
+              <w:top w:type="dxa" w:w="50"/>
+              <w:left w:type="dxa" w:w="80"/>
+              <w:bottom w:type="dxa" w:w="50"/>
+              <w:right w:type="dxa" w:w="80"/>
+            </w:tcMar>
+            <w:vAlign w:val="center"/>
+          </w:tcPr>
+          <w:p>
+            <w:pPr>
+              <w:keepNext w:val="false"/>
+              <w:spacing w:after="0" w:line="240"/>
+              <w:jc w:val="left"/>
+            </w:pPr>
+            <w:r>
+              <w:rPr>
+                <w:rFonts w:ascii="Arial" w:cs="Arial" w:eastAsia="Arial" w:hAnsi="Arial"/>
+                <w:sz w:val="15"/>
+                <w:szCs w:val="15"/>
+              </w:rPr>
+              <w:t xml:space="preserve">Completo</w:t>
+            </w:r>
+          </w:p>
+        </w:tc>
+        <w:tc>
+          <w:tcPr>
+            <w:tcW w:type="dxa" w:w="6020"/>
+            <w:shd w:fill="F5F8FC" w:color="auto" w:val="clear"/>
+            <w:tcMar>
+              <w:top w:type="dxa" w:w="50"/>
+              <w:left w:type="dxa" w:w="80"/>
+              <w:bottom w:type="dxa" w:w="50"/>
+              <w:right w:type="dxa" w:w="80"/>
+            </w:tcMar>
+            <w:vAlign w:val="center"/>
+          </w:tcPr>
+          <w:p>
+            <w:pPr>
+              <w:keepNext w:val="false"/>
+              <w:spacing w:after="0" w:line="240"/>
+              <w:jc w:val="left"/>
+            </w:pPr>
+            <w:r>
+              <w:rPr>
+                <w:rFonts w:ascii="Arial" w:cs="Arial" w:eastAsia="Arial" w:hAnsi="Arial"/>
+                <w:sz w:val="15"/>
+                <w:szCs w:val="15"/>
+              </w:rPr>
+              <w:t xml:space="preserve">192 pruebas del backend (incluidas 36 de extremo a extremo) y 12 de la interfaz, todas aprobadas.</w:t>
+            </w:r>
+          </w:p>
+        </w:tc>
+      </w:tr>
+      <w:tr>
+        <w:trPr>
+          <w:cantSplit/>
+        </w:trPr>
+        <w:tc>
+          <w:tcPr>
+            <w:tcW w:type="dxa" w:w="2068"/>
+            <w:tcMar>
+              <w:top w:type="dxa" w:w="50"/>
+              <w:left w:type="dxa" w:w="80"/>
+              <w:bottom w:type="dxa" w:w="50"/>
+              <w:right w:type="dxa" w:w="80"/>
+            </w:tcMar>
+            <w:vAlign w:val="center"/>
+          </w:tcPr>
+          <w:p>
+            <w:pPr>
+              <w:keepNext w:val="false"/>
+              <w:spacing w:after="0" w:line="240"/>
+              <w:jc w:val="left"/>
+            </w:pPr>
+            <w:r>
+              <w:rPr>
+                <w:rFonts w:ascii="Arial" w:cs="Arial" w:eastAsia="Arial" w:hAnsi="Arial"/>
+                <w:sz w:val="15"/>
+                <w:szCs w:val="15"/>
+              </w:rPr>
+              <w:t xml:space="preserve">Despliegue público</w:t>
+            </w:r>
+          </w:p>
+        </w:tc>
+        <w:tc>
+          <w:tcPr>
+            <w:tcW w:type="dxa" w:w="1316"/>
+            <w:tcMar>
+              <w:top w:type="dxa" w:w="50"/>
+              <w:left w:type="dxa" w:w="80"/>
+              <w:bottom w:type="dxa" w:w="50"/>
+              <w:right w:type="dxa" w:w="80"/>
+            </w:tcMar>
+            <w:vAlign w:val="center"/>
+          </w:tcPr>
+          <w:p>
+            <w:pPr>
+              <w:keepNext w:val="false"/>
+              <w:spacing w:after="0" w:line="240"/>
+              <w:jc w:val="left"/>
+            </w:pPr>
+            <w:r>
+              <w:rPr>
+                <w:rFonts w:ascii="Arial" w:cs="Arial" w:eastAsia="Arial" w:hAnsi="Arial"/>
+                <w:sz w:val="15"/>
+                <w:szCs w:val="15"/>
+              </w:rPr>
+              <w:t xml:space="preserve">Pendiente</w:t>
+            </w:r>
+          </w:p>
+        </w:tc>
+        <w:tc>
+          <w:tcPr>
+            <w:tcW w:type="dxa" w:w="6020"/>
+            <w:tcMar>
+              <w:top w:type="dxa" w:w="50"/>
+              <w:left w:type="dxa" w:w="80"/>
+              <w:bottom w:type="dxa" w:w="50"/>
+              <w:right w:type="dxa" w:w="80"/>
+            </w:tcMar>
+            <w:vAlign w:val="center"/>
+          </w:tcPr>
+          <w:p>
+            <w:pPr>
+              <w:keepNext w:val="false"/>
+              <w:spacing w:after="0" w:line="240"/>
+              <w:jc w:val="left"/>
+            </w:pPr>
+            <w:r>
+              <w:rPr>
+                <w:rFonts w:ascii="Arial" w:cs="Arial" w:eastAsia="Arial" w:hAnsi="Arial"/>
+                <w:sz w:val="15"/>
+                <w:szCs w:val="15"/>
+              </w:rPr>
+              <w:t xml:space="preserve">Configuración de producción lista (Caddy con HTTPS); falta un servidor contratado.</w:t>
+            </w:r>
+          </w:p>
+        </w:tc>
+      </w:tr>
+      <w:tr>
+        <w:trPr>
+          <w:cantSplit/>
+        </w:trPr>
+        <w:tc>
+          <w:tcPr>
+            <w:tcW w:type="dxa" w:w="2068"/>
+            <w:shd w:fill="F5F8FC" w:color="auto" w:val="clear"/>
+            <w:tcMar>
+              <w:top w:type="dxa" w:w="50"/>
+              <w:left w:type="dxa" w:w="80"/>
+              <w:bottom w:type="dxa" w:w="50"/>
+              <w:right w:type="dxa" w:w="80"/>
+            </w:tcMar>
+            <w:vAlign w:val="center"/>
+          </w:tcPr>
+          <w:p>
+            <w:pPr>
+              <w:keepNext w:val="false"/>
+              <w:spacing w:after="0" w:line="240"/>
+              <w:jc w:val="left"/>
+            </w:pPr>
+            <w:r>
+              <w:rPr>
+                <w:rFonts w:ascii="Arial" w:cs="Arial" w:eastAsia="Arial" w:hAnsi="Arial"/>
+                <w:sz w:val="15"/>
+                <w:szCs w:val="15"/>
+              </w:rPr>
+              <w:t xml:space="preserve">Evaluación con usuarios</w:t>
+            </w:r>
+          </w:p>
+        </w:tc>
+        <w:tc>
+          <w:tcPr>
+            <w:tcW w:type="dxa" w:w="1316"/>
+            <w:shd w:fill="F5F8FC" w:color="auto" w:val="clear"/>
+            <w:tcMar>
+              <w:top w:type="dxa" w:w="50"/>
+              <w:left w:type="dxa" w:w="80"/>
+              <w:bottom w:type="dxa" w:w="50"/>
+              <w:right w:type="dxa" w:w="80"/>
+            </w:tcMar>
+            <w:vAlign w:val="center"/>
+          </w:tcPr>
+          <w:p>
+            <w:pPr>
+              <w:keepNext w:val="false"/>
+              <w:spacing w:after="0" w:line="240"/>
+              <w:jc w:val="left"/>
+            </w:pPr>
+            <w:r>
+              <w:rPr>
+                <w:rFonts w:ascii="Arial" w:cs="Arial" w:eastAsia="Arial" w:hAnsi="Arial"/>
+                <w:sz w:val="15"/>
+                <w:szCs w:val="15"/>
+              </w:rPr>
+              <w:t xml:space="preserve">Pendiente</w:t>
+            </w:r>
+          </w:p>
+        </w:tc>
+        <w:tc>
+          <w:tcPr>
+            <w:tcW w:type="dxa" w:w="6020"/>
+            <w:shd w:fill="F5F8FC" w:color="auto" w:val="clear"/>
+            <w:tcMar>
+              <w:top w:type="dxa" w:w="50"/>
+              <w:left w:type="dxa" w:w="80"/>
+              <w:bottom w:type="dxa" w:w="50"/>
+              <w:right w:type="dxa" w:w="80"/>
+            </w:tcMar>
+            <w:vAlign w:val="center"/>
+          </w:tcPr>
+          <w:p>
+            <w:pPr>
+              <w:keepNext w:val="false"/>
+              <w:spacing w:after="0" w:line="240"/>
+              <w:jc w:val="left"/>
+            </w:pPr>
+            <w:r>
+              <w:rPr>
+                <w:rFonts w:ascii="Arial" w:cs="Arial" w:eastAsia="Arial" w:hAnsi="Arial"/>
+                <w:sz w:val="15"/>
+                <w:szCs w:val="15"/>
+              </w:rPr>
+              <w:t xml:space="preserve">Usabilidad y utilidad percibida con supervisores y órganos de control.</w:t>
             </w:r>
           </w:p>
         </w:tc>

</xml_diff>

<commit_message>
docs(articulo): refresh figures with the redesigned interface and add monitoring and PDF figures
Architecture figure now shows the load integrity gate, materialized views and autonomous operation; interface screenshots are captured from the running system by docs/articulo/capturar_interfaz.py; URLs in the document are clickable hyperlinks.
</commit_message>
<xml_diff>
--- a/docs/articulo/Articulo_Cientifico_Final.docx
+++ b/docs/articulo/Articulo_Cientifico_Final.docx
@@ -6376,7 +6376,7 @@
           <w:sz w:val="21"/>
           <w:szCs w:val="21"/>
         </w:rPr>
-        <w:t xml:space="preserve">La Fig. 1 muestra la arquitectura. El pipeline de datos (Python y DuckDB) descarga, normaliza, integra y genera las variables; el componente de modelado entrena, evalúa y produce predicciones, explicaciones, evidencia y escenarios de sensibilidad; los resultados se cargan transaccionalmente en PostgreSQL; la API REST los expone a la interfaz web, servida por nginx, que además actúa como proxy inverso con limitación de tasa por dirección IP. Un proceso programado sincroniza mensualmente las fuentes y envía el resumen semanal.</w:t>
+        <w:t xml:space="preserve">La Fig. 1 muestra la arquitectura. El pipeline de datos (Python y DuckDB) descarga, normaliza, integra y genera las variables; el componente de modelado entrena, evalúa y produce predicciones, explicaciones, evidencia y escenarios de sensibilidad; los resultados pasan por una compuerta de integridad y se cargan transaccionalmente en PostgreSQL, con vistas materializadas para las consultas frecuentes; la API REST los expone a la interfaz web, servida por nginx, que además actúa como proxy inverso con limitación de tasa por dirección IP. Un proceso programado y autónomo sincroniza mensualmente las fuentes, vigila la deriva del modelo, avisa por correo ante fallas y envía el resumen semanal.</w:t>
       </w:r>
     </w:p>
     <w:p>
@@ -6388,9 +6388,9 @@
       <w:r>
         <w:drawing>
           <wp:inline distT="0" distB="0" distL="0" distR="0">
-            <wp:extent cx="4943475" cy="2543175"/>
+            <wp:extent cx="5229225" cy="3095625"/>
             <wp:effectExtent t="0" r="0" b="0" l="0"/>
-            <wp:docPr id="1" name="arquitectura" descr="Arquitectura del prototipo SATO: flujo desde las fuentes oficiales hasta la interfaz." title="Figura 1"/>
+            <wp:docPr id="1" name="arquitectura" descr="Arquitectura del prototipo SATO: flujo desde las fuentes oficiales hasta la interfaz, con la compuerta de integridad de la carga y la operación autónoma." title="Figura 1"/>
             <wp:cNvGraphicFramePr>
               <a:graphicFrameLocks xmlns:a="http://schemas.openxmlformats.org/drawingml/2006/main" noChangeAspect="1"/>
             </wp:cNvGraphicFramePr>
@@ -6413,7 +6413,7 @@
                   <pic:spPr bwMode="auto">
                     <a:xfrm>
                       <a:off x="0" y="0"/>
-                      <a:ext cx="4943475" cy="2543175"/>
+                      <a:ext cx="5229225" cy="3095625"/>
                     </a:xfrm>
                     <a:prstGeom prst="rect">
                       <a:avLst/>
@@ -6447,7 +6447,7 @@
           <w:sz w:val="18"/>
           <w:szCs w:val="18"/>
         </w:rPr>
-        <w:t xml:space="preserve">Arquitectura del prototipo SATO: flujo desde las fuentes oficiales hasta la interfaz.</w:t>
+        <w:t xml:space="preserve">Arquitectura del prototipo SATO: flujo desde las fuentes oficiales hasta la interfaz, con la compuerta de integridad de la carga y la operación autónoma.</w:t>
       </w:r>
     </w:p>
     <w:p>
@@ -7040,7 +7040,7 @@
           <w:sz w:val="21"/>
           <w:szCs w:val="21"/>
         </w:rPr>
-        <w:t xml:space="preserve">El sistema se despliega con Docker Compose en cinco servicios: base de datos, API, web, cargador y proceso programado; una superposición de producción añade Caddy con HTTPS automático. El código se publicó en un repositorio público de GitHub con integración continua. El despliegue en un servidor público no se realizó porque la cuenta de alojamiento disponible no tenía un servidor contratado; el prototipo se evaluó en un entorno local equivalente.</w:t>
+        <w:t xml:space="preserve">El sistema se despliega con Docker Compose en cinco servicios: base de datos, API, web, cargador y proceso programado; una superposición de producción añade Caddy con HTTPS automático. El código se publicó en un repositorio público de GitHub (https://github.com/OwerLopez/sato_peru_2026) con integración continua. El despliegue en un servidor público no se realizó porque la cuenta de alojamiento disponible no tenía un servidor contratado; el prototipo se evaluó en un entorno local equivalente.</w:t>
       </w:r>
     </w:p>
     <w:p>
@@ -7154,39 +7154,7 @@
           <w:sz w:val="21"/>
           <w:szCs w:val="21"/>
         </w:rPr>
-        <w:t xml:space="preserve"> La interfaz se rediseñó con un sistema visual institucional y accesible: tipografías Lexend (títulos y cifras) y Source Sans 3 (texto) de 16 px, contraste AAA en el texto secundario, foco visible de 3 px, áreas táctiles de 44 px, colores de riesgo reservados y acompañados siempre de un ícono de forma distinta, una paleta de gráficos validada para daltonismo y contraste, y la eliminación de los gráficos de doble eje, sustituidos por paneles sincronizados. En teléfonos, las listas se muestran como tarjetas; cada gráfico tiene una vista de tabla equivalente; y la suscripción ofrece las provincias tomadas de los datos. El informe técnico en PDF se rediseñó con el mismo sistema: portada institucional, resumen ejecutivo con la escala de riesgo y el umbral del modelo, indicadores clave, serie histórica, barras divergentes de los factores, evidencia documental en tarjetas, numeración de páginas y la advertencia de que no es un documento oficial.</w:t>
-      </w:r>
-    </w:p>
-    <w:p>
-      <w:pPr>
-        <w:pStyle w:val="Heading2"/>
-        <w:keepNext/>
-        <w:spacing w:after="80" w:before="180"/>
-      </w:pPr>
-      <w:r>
-        <w:rPr>
-          <w:rFonts w:ascii="Calibri" w:cs="Calibri" w:eastAsia="Calibri" w:hAnsi="Calibri"/>
-          <w:b/>
-          <w:bCs/>
-          <w:color w:val="2E74B5"/>
-          <w:sz w:val="22"/>
-          <w:szCs w:val="22"/>
-        </w:rPr>
-        <w:t xml:space="preserve">4.9 Funcionamiento del prototipo</w:t>
-      </w:r>
-    </w:p>
-    <w:p>
-      <w:pPr>
-        <w:spacing w:after="120" w:line="264"/>
-        <w:jc w:val="both"/>
-      </w:pPr>
-      <w:r>
-        <w:rPr>
-          <w:rFonts w:ascii="Arial" w:cs="Arial" w:eastAsia="Arial" w:hAnsi="Arial"/>
-          <w:sz w:val="21"/>
-          <w:szCs w:val="21"/>
-        </w:rPr>
-        <w:t xml:space="preserve">La interfaz organiza la información por niveles: resumen, indicadores y detalle bajo demanda. El panorama (Fig. 2) resume en una frase el estado del ámbito elegido, muestra cuatro indicadores sin doble conteo, la lista de obras que requieren atención (cada una abre un panel lateral con su explicación), el mapa de riesgo y la tasa real de acierto de cada nivel en la validación con datos pasados. La ficha de una obra (Fig. 3) presenta el nivel de riesgo, la probabilidad, cuántas veces supera el promedio, la posición relativa y la confiabilidad del nivel, con los tres factores principales en lenguaje claro y el acceso al informe en PDF. En la pestaña de factores (Fig. 4) cada factor indica si eleva o reduce el riesgo y abre la evidencia oficial que lo sustenta; el detalle técnico (variable y contribución TreeSHAP) se muestra solo si el usuario lo pide. La página de validación (Fig. 5) responde en lenguaje sencillo si el modelo distingue las obras que se atrasan, si sus probabilidades son realistas y si sirve para priorizar, y conserva en pestañas el detalle técnico. Todos los términos técnicos tienen ayuda contextual enlazada a un glosario.</w:t>
+        <w:t xml:space="preserve"> La interfaz se rediseñó con un sistema visual institucional y accesible: tipografías Lexend (títulos y cifras) y Source Sans 3 (texto) de 16 px, contraste AAA en el texto secundario, foco visible de 3 px, áreas táctiles de 44 px, colores de riesgo reservados y acompañados siempre de un ícono de forma distinta, una paleta de gráficos validada para daltonismo y contraste, y la eliminación de los gráficos de doble eje, sustituidos por paneles sincronizados. En teléfonos, las listas se muestran como tarjetas; cada gráfico tiene una vista de tabla equivalente; y la suscripción ofrece las provincias tomadas de los datos. El informe técnico en PDF se rediseñó con el mismo sistema: portada institucional, resumen ejecutivo con la escala de riesgo y el umbral del modelo, indicadores clave, serie histórica, barras divergentes de los factores, evidencia documental en tarjetas, numeración de páginas y la advertencia de que no es un documento oficial (Fig. 3). La página de estado y monitoreo (Fig. 2) publica la frescura de los datos, el resultado de la última actualización, los chequeos de calidad, el desempeño realizado del modelo en los cortes ya vencidos, la proporción de obras en nivel alto frente a su mediana histórica y la deriva de las variables.</w:t>
       </w:r>
     </w:p>
     <w:p>
@@ -7198,9 +7166,9 @@
       <w:r>
         <w:drawing>
           <wp:inline distT="0" distB="0" distL="0" distR="0">
-            <wp:extent cx="3714750" cy="2733675"/>
+            <wp:extent cx="5810250" cy="5905500"/>
             <wp:effectExtent t="0" r="0" b="0" l="0"/>
-            <wp:docPr id="1" name="panorama" descr="Panorama de riesgo (ámbito nacional, corte del 31 de agosto de 2026): resumen, indicadores, obras que requieren atención, mapa y confiabilidad de las alertas." title="Figura 2"/>
+            <wp:docPr id="1" name="estado" descr="Página de estado y monitoreo: estado de la plataforma, frescura de los datos, chequeos de calidad, desempeño realizado del modelo y detección de anomalías en la proporción de obras en nivel alto." title="Figura 2"/>
             <wp:cNvGraphicFramePr>
               <a:graphicFrameLocks xmlns:a="http://schemas.openxmlformats.org/drawingml/2006/main" noChangeAspect="1"/>
             </wp:cNvGraphicFramePr>
@@ -7223,7 +7191,7 @@
                   <pic:spPr bwMode="auto">
                     <a:xfrm>
                       <a:off x="0" y="0"/>
-                      <a:ext cx="3714750" cy="2733675"/>
+                      <a:ext cx="5810250" cy="5905500"/>
                     </a:xfrm>
                     <a:prstGeom prst="rect">
                       <a:avLst/>
@@ -7257,7 +7225,7 @@
           <w:sz w:val="18"/>
           <w:szCs w:val="18"/>
         </w:rPr>
-        <w:t xml:space="preserve">Panorama de riesgo (ámbito nacional, corte del 31 de agosto de 2026): resumen, indicadores, obras que requieren atención, mapa y confiabilidad de las alertas.</w:t>
+        <w:t xml:space="preserve">Página de estado y monitoreo: estado de la plataforma, frescura de los datos, chequeos de calidad, desempeño realizado del modelo y detección de anomalías en la proporción de obras en nivel alto.</w:t>
       </w:r>
     </w:p>
     <w:p>
@@ -7269,9 +7237,9 @@
       <w:r>
         <w:drawing>
           <wp:inline distT="0" distB="0" distL="0" distR="0">
-            <wp:extent cx="5810250" cy="2305050"/>
+            <wp:extent cx="4067175" cy="5753100"/>
             <wp:effectExtent t="0" r="0" b="0" l="0"/>
-            <wp:docPr id="1" name="ficha" descr="Resumen del riesgo en la ficha de una obra en ejecución: nivel, probabilidad, veces el promedio, posición relativa, confiabilidad del nivel y factores principales en lenguaje claro." title="Figura 3"/>
+            <wp:docPr id="1" name="informe_pdf" descr="Primera página del informe técnico en PDF generado para una obra en nivel alto: resumen ejecutivo, escala de riesgo con el umbral del modelo e identificación de la obra." title="Figura 3"/>
             <wp:cNvGraphicFramePr>
               <a:graphicFrameLocks xmlns:a="http://schemas.openxmlformats.org/drawingml/2006/main" noChangeAspect="1"/>
             </wp:cNvGraphicFramePr>
@@ -7294,7 +7262,7 @@
                   <pic:spPr bwMode="auto">
                     <a:xfrm>
                       <a:off x="0" y="0"/>
-                      <a:ext cx="5810250" cy="2305050"/>
+                      <a:ext cx="4067175" cy="5753100"/>
                     </a:xfrm>
                     <a:prstGeom prst="rect">
                       <a:avLst/>
@@ -7328,7 +7296,39 @@
           <w:sz w:val="18"/>
           <w:szCs w:val="18"/>
         </w:rPr>
-        <w:t xml:space="preserve">Resumen del riesgo en la ficha de una obra en ejecución: nivel, probabilidad, veces el promedio, posición relativa, confiabilidad del nivel y factores principales en lenguaje claro.</w:t>
+        <w:t xml:space="preserve">Primera página del informe técnico en PDF generado para una obra en nivel alto: resumen ejecutivo, escala de riesgo con el umbral del modelo e identificación de la obra.</w:t>
+      </w:r>
+    </w:p>
+    <w:p>
+      <w:pPr>
+        <w:pStyle w:val="Heading2"/>
+        <w:keepNext/>
+        <w:spacing w:after="80" w:before="180"/>
+      </w:pPr>
+      <w:r>
+        <w:rPr>
+          <w:rFonts w:ascii="Calibri" w:cs="Calibri" w:eastAsia="Calibri" w:hAnsi="Calibri"/>
+          <w:b/>
+          <w:bCs/>
+          <w:color w:val="2E74B5"/>
+          <w:sz w:val="22"/>
+          <w:szCs w:val="22"/>
+        </w:rPr>
+        <w:t xml:space="preserve">4.9 Funcionamiento del prototipo</w:t>
+      </w:r>
+    </w:p>
+    <w:p>
+      <w:pPr>
+        <w:spacing w:after="120" w:line="264"/>
+        <w:jc w:val="both"/>
+      </w:pPr>
+      <w:r>
+        <w:rPr>
+          <w:rFonts w:ascii="Arial" w:cs="Arial" w:eastAsia="Arial" w:hAnsi="Arial"/>
+          <w:sz w:val="21"/>
+          <w:szCs w:val="21"/>
+        </w:rPr>
+        <w:t xml:space="preserve">La interfaz organiza la información por niveles: resumen, indicadores y detalle bajo demanda, con una franja permanente que aclara que es un prototipo de investigación y no un sitio oficial. El panorama (Fig. 4) resume en una frase el estado del ámbito elegido, muestra cuatro indicadores sin doble conteo, la lista de obras que requieren atención (cada una abre un panel lateral con su explicación), el mapa de riesgo y la tasa real de acierto de cada nivel en la validación con datos pasados. La ficha de una obra (Fig. 5) presenta el nivel de riesgo, la probabilidad, cuántas veces supera el promedio, la posición relativa y la confiabilidad del nivel, con los tres factores principales en lenguaje claro y el acceso al informe en PDF. En la pestaña de factores (Fig. 6) cada factor indica si eleva o reduce el riesgo y abre la evidencia oficial que lo sustenta; el detalle técnico (variable y contribución TreeSHAP) se muestra solo si el usuario lo pide. La página de validación (Fig. 7) responde en lenguaje sencillo si el modelo distingue las obras que se atrasan, si sus probabilidades son realistas y si sirve para priorizar, y conserva en pestañas el detalle técnico. Todos los términos técnicos tienen ayuda contextual enlazada a un glosario.</w:t>
       </w:r>
     </w:p>
     <w:p>
@@ -7340,9 +7340,9 @@
       <w:r>
         <w:drawing>
           <wp:inline distT="0" distB="0" distL="0" distR="0">
-            <wp:extent cx="5229225" cy="3705225"/>
+            <wp:extent cx="4648200" cy="5448300"/>
             <wp:effectExtent t="0" r="0" b="0" l="0"/>
-            <wp:docPr id="1" name="factores" descr="Factores de la misma obra en lenguaje claro, con su efecto sobre el riesgo, el grupo de origen y el acceso a la evidencia documental." title="Figura 4"/>
+            <wp:docPr id="1" name="panorama" descr="Panorama de riesgo con el sistema de diseño institucional (ámbito nacional, corte del 31 de agosto de 2026): resumen, indicadores con su tendencia, obras que requieren atención y mapa de riesgo." title="Figura 4"/>
             <wp:cNvGraphicFramePr>
               <a:graphicFrameLocks xmlns:a="http://schemas.openxmlformats.org/drawingml/2006/main" noChangeAspect="1"/>
             </wp:cNvGraphicFramePr>
@@ -7365,7 +7365,7 @@
                   <pic:spPr bwMode="auto">
                     <a:xfrm>
                       <a:off x="0" y="0"/>
-                      <a:ext cx="5229225" cy="3705225"/>
+                      <a:ext cx="4648200" cy="5448300"/>
                     </a:xfrm>
                     <a:prstGeom prst="rect">
                       <a:avLst/>
@@ -7399,7 +7399,7 @@
           <w:sz w:val="18"/>
           <w:szCs w:val="18"/>
         </w:rPr>
-        <w:t xml:space="preserve">Factores de la misma obra en lenguaje claro, con su efecto sobre el riesgo, el grupo de origen y el acceso a la evidencia documental.</w:t>
+        <w:t xml:space="preserve">Panorama de riesgo con el sistema de diseño institucional (ámbito nacional, corte del 31 de agosto de 2026): resumen, indicadores con su tendencia, obras que requieren atención y mapa de riesgo.</w:t>
       </w:r>
     </w:p>
     <w:p>
@@ -7411,9 +7411,9 @@
       <w:r>
         <w:drawing>
           <wp:inline distT="0" distB="0" distL="0" distR="0">
-            <wp:extent cx="5810250" cy="2295525"/>
+            <wp:extent cx="5524500" cy="4533900"/>
             <wp:effectExtent t="0" r="0" b="0" l="0"/>
-            <wp:docPr id="1" name="validacion" descr="Página de validación: calibración por deciles de riesgo y resultado real de cada nivel en el backtest as-of." title="Figura 5"/>
+            <wp:docPr id="1" name="ficha" descr="Ficha de una obra en ejecución: nivel, probabilidad, veces el promedio, posición relativa, confiabilidad del nivel, factores principales en lenguaje claro y acceso al informe técnico en PDF." title="Figura 5"/>
             <wp:cNvGraphicFramePr>
               <a:graphicFrameLocks xmlns:a="http://schemas.openxmlformats.org/drawingml/2006/main" noChangeAspect="1"/>
             </wp:cNvGraphicFramePr>
@@ -7436,7 +7436,7 @@
                   <pic:spPr bwMode="auto">
                     <a:xfrm>
                       <a:off x="0" y="0"/>
-                      <a:ext cx="5810250" cy="2295525"/>
+                      <a:ext cx="5524500" cy="4533900"/>
                     </a:xfrm>
                     <a:prstGeom prst="rect">
                       <a:avLst/>
@@ -7470,6 +7470,148 @@
           <w:sz w:val="18"/>
           <w:szCs w:val="18"/>
         </w:rPr>
+        <w:t xml:space="preserve">Ficha de una obra en ejecución: nivel, probabilidad, veces el promedio, posición relativa, confiabilidad del nivel, factores principales en lenguaje claro y acceso al informe técnico en PDF.</w:t>
+      </w:r>
+    </w:p>
+    <w:p>
+      <w:pPr>
+        <w:keepNext/>
+        <w:spacing w:after="60" w:before="120"/>
+        <w:jc w:val="center"/>
+      </w:pPr>
+      <w:r>
+        <w:drawing>
+          <wp:inline distT="0" distB="0" distL="0" distR="0">
+            <wp:extent cx="4362450" cy="7391400"/>
+            <wp:effectExtent t="0" r="0" b="0" l="0"/>
+            <wp:docPr id="1" name="factores" descr="Factores de la misma obra en lenguaje claro, con su efecto sobre el riesgo, el grupo de origen y el acceso a la evidencia documental." title="Figura 6"/>
+            <wp:cNvGraphicFramePr>
+              <a:graphicFrameLocks xmlns:a="http://schemas.openxmlformats.org/drawingml/2006/main" noChangeAspect="1"/>
+            </wp:cNvGraphicFramePr>
+            <a:graphic xmlns:a="http://schemas.openxmlformats.org/drawingml/2006/main">
+              <a:graphicData uri="http://schemas.openxmlformats.org/drawingml/2006/picture">
+                <pic:pic xmlns:pic="http://schemas.openxmlformats.org/drawingml/2006/picture">
+                  <pic:nvPicPr>
+                    <pic:cNvPr id="0" name="" descr=""/>
+                    <pic:cNvPicPr>
+                      <a:picLocks noChangeAspect="1" noChangeArrowheads="1"/>
+                    </pic:cNvPicPr>
+                  </pic:nvPicPr>
+                  <pic:blipFill>
+                    <a:blip r:embed="rId14" cstate="none"/>
+                    <a:srcRect/>
+                    <a:stretch>
+                      <a:fillRect/>
+                    </a:stretch>
+                  </pic:blipFill>
+                  <pic:spPr bwMode="auto">
+                    <a:xfrm>
+                      <a:off x="0" y="0"/>
+                      <a:ext cx="4362450" cy="7391400"/>
+                    </a:xfrm>
+                    <a:prstGeom prst="rect">
+                      <a:avLst/>
+                    </a:prstGeom>
+                  </pic:spPr>
+                </pic:pic>
+              </a:graphicData>
+            </a:graphic>
+          </wp:inline>
+        </w:drawing>
+      </w:r>
+    </w:p>
+    <w:p>
+      <w:pPr>
+        <w:spacing w:after="200"/>
+        <w:jc w:val="center"/>
+      </w:pPr>
+      <w:r>
+        <w:rPr>
+          <w:rFonts w:ascii="Arial" w:cs="Arial" w:eastAsia="Arial" w:hAnsi="Arial"/>
+          <w:b/>
+          <w:bCs/>
+          <w:sz w:val="18"/>
+          <w:szCs w:val="18"/>
+        </w:rPr>
+        <w:t xml:space="preserve">Fig. 6. </w:t>
+      </w:r>
+      <w:r>
+        <w:rPr>
+          <w:rFonts w:ascii="Arial" w:cs="Arial" w:eastAsia="Arial" w:hAnsi="Arial"/>
+          <w:sz w:val="18"/>
+          <w:szCs w:val="18"/>
+        </w:rPr>
+        <w:t xml:space="preserve">Factores de la misma obra en lenguaje claro, con su efecto sobre el riesgo, el grupo de origen y el acceso a la evidencia documental.</w:t>
+      </w:r>
+    </w:p>
+    <w:p>
+      <w:pPr>
+        <w:keepNext/>
+        <w:spacing w:after="60" w:before="120"/>
+        <w:jc w:val="center"/>
+      </w:pPr>
+      <w:r>
+        <w:drawing>
+          <wp:inline distT="0" distB="0" distL="0" distR="0">
+            <wp:extent cx="5810250" cy="5676900"/>
+            <wp:effectExtent t="0" r="0" b="0" l="0"/>
+            <wp:docPr id="1" name="validacion" descr="Página de validación: calibración por deciles de riesgo y resultado real de cada nivel en el backtest as-of." title="Figura 7"/>
+            <wp:cNvGraphicFramePr>
+              <a:graphicFrameLocks xmlns:a="http://schemas.openxmlformats.org/drawingml/2006/main" noChangeAspect="1"/>
+            </wp:cNvGraphicFramePr>
+            <a:graphic xmlns:a="http://schemas.openxmlformats.org/drawingml/2006/main">
+              <a:graphicData uri="http://schemas.openxmlformats.org/drawingml/2006/picture">
+                <pic:pic xmlns:pic="http://schemas.openxmlformats.org/drawingml/2006/picture">
+                  <pic:nvPicPr>
+                    <pic:cNvPr id="0" name="" descr=""/>
+                    <pic:cNvPicPr>
+                      <a:picLocks noChangeAspect="1" noChangeArrowheads="1"/>
+                    </pic:cNvPicPr>
+                  </pic:nvPicPr>
+                  <pic:blipFill>
+                    <a:blip r:embed="rId15" cstate="none"/>
+                    <a:srcRect/>
+                    <a:stretch>
+                      <a:fillRect/>
+                    </a:stretch>
+                  </pic:blipFill>
+                  <pic:spPr bwMode="auto">
+                    <a:xfrm>
+                      <a:off x="0" y="0"/>
+                      <a:ext cx="5810250" cy="5676900"/>
+                    </a:xfrm>
+                    <a:prstGeom prst="rect">
+                      <a:avLst/>
+                    </a:prstGeom>
+                  </pic:spPr>
+                </pic:pic>
+              </a:graphicData>
+            </a:graphic>
+          </wp:inline>
+        </w:drawing>
+      </w:r>
+    </w:p>
+    <w:p>
+      <w:pPr>
+        <w:spacing w:after="200"/>
+        <w:jc w:val="center"/>
+      </w:pPr>
+      <w:r>
+        <w:rPr>
+          <w:rFonts w:ascii="Arial" w:cs="Arial" w:eastAsia="Arial" w:hAnsi="Arial"/>
+          <w:b/>
+          <w:bCs/>
+          <w:sz w:val="18"/>
+          <w:szCs w:val="18"/>
+        </w:rPr>
+        <w:t xml:space="preserve">Fig. 7. </w:t>
+      </w:r>
+      <w:r>
+        <w:rPr>
+          <w:rFonts w:ascii="Arial" w:cs="Arial" w:eastAsia="Arial" w:hAnsi="Arial"/>
+          <w:sz w:val="18"/>
+          <w:szCs w:val="18"/>
+        </w:rPr>
         <w:t xml:space="preserve">Página de validación: calibración por deciles de riesgo y resultado real de cada nivel en el backtest as-of.</w:t>
       </w:r>
     </w:p>
@@ -7594,7 +7736,7 @@
           <w:sz w:val="21"/>
           <w:szCs w:val="21"/>
         </w:rPr>
-        <w:t xml:space="preserve"> La Tabla 5 y la Fig. 6 presentan el experimento central. En la prueba temporal nacional (16 756 observaciones, 5 158 obras, 842 positivos, prevalencia 5,0 %), el modelo A obtuvo ROC-AUC de 0,742 y PR-AUC de 0,139, y el modelo B, 0,774 y 0,158. La variante B sin la categoría léxica que menciona la regla del 80 % (control de un posible atajo) mantuvo la mejora. El Brier de B fue 0,045. Como referencia, la regla heurística experta obtuvo PR-AUC de 0,071 y ROC-AUC de 0,588, y la regresión logística con las variables de A, 0,115 y 0,707. Con las variables de B, el bosque aleatorio (PR-AUC 0,163) y XGBoost (0,158) alcanzaron valores similares a LightGBM, lo que indica que la ganancia proviene de la información añadida y no del algoritmo. Entrenar solo con obras de Arequipa redujo el PR-AUC nacional de A a 0,082, lo que justifica el entrenamiento nacional.</w:t>
+        <w:t xml:space="preserve"> La Tabla 5 y la Fig. 8 presentan el experimento central. En la prueba temporal nacional (16 756 observaciones, 5 158 obras, 842 positivos, prevalencia 5,0 %), el modelo A obtuvo ROC-AUC de 0,742 y PR-AUC de 0,139, y el modelo B, 0,774 y 0,158. La variante B sin la categoría léxica que menciona la regla del 80 % (control de un posible atajo) mantuvo la mejora. El Brier de B fue 0,045. Como referencia, la regla heurística experta obtuvo PR-AUC de 0,071 y ROC-AUC de 0,588, y la regresión logística con las variables de A, 0,115 y 0,707. Con las variables de B, el bosque aleatorio (PR-AUC 0,163) y XGBoost (0,158) alcanzaron valores similares a LightGBM, lo que indica que la ganancia proviene de la información añadida y no del algoritmo. Entrenar solo con obras de Arequipa redujo el PR-AUC nacional de A a 0,082, lo que justifica el entrenamiento nacional.</w:t>
       </w:r>
     </w:p>
     <w:p>
@@ -9718,205 +9860,7 @@
           <wp:inline distT="0" distB="0" distL="0" distR="0">
             <wp:extent cx="5810250" cy="2438400"/>
             <wp:effectExtent t="0" r="0" b="0" l="0"/>
-            <wp:docPr id="1" name="rocpr" descr="Curvas ROC y precisión-exhaustividad de los modelos A y B en la prueba temporal nacional (H = 60 días)." title="Figura 6"/>
-            <wp:cNvGraphicFramePr>
-              <a:graphicFrameLocks xmlns:a="http://schemas.openxmlformats.org/drawingml/2006/main" noChangeAspect="1"/>
-            </wp:cNvGraphicFramePr>
-            <a:graphic xmlns:a="http://schemas.openxmlformats.org/drawingml/2006/main">
-              <a:graphicData uri="http://schemas.openxmlformats.org/drawingml/2006/picture">
-                <pic:pic xmlns:pic="http://schemas.openxmlformats.org/drawingml/2006/picture">
-                  <pic:nvPicPr>
-                    <pic:cNvPr id="0" name="" descr=""/>
-                    <pic:cNvPicPr>
-                      <a:picLocks noChangeAspect="1" noChangeArrowheads="1"/>
-                    </pic:cNvPicPr>
-                  </pic:nvPicPr>
-                  <pic:blipFill>
-                    <a:blip r:embed="rId14" cstate="none"/>
-                    <a:srcRect/>
-                    <a:stretch>
-                      <a:fillRect/>
-                    </a:stretch>
-                  </pic:blipFill>
-                  <pic:spPr bwMode="auto">
-                    <a:xfrm>
-                      <a:off x="0" y="0"/>
-                      <a:ext cx="5810250" cy="2438400"/>
-                    </a:xfrm>
-                    <a:prstGeom prst="rect">
-                      <a:avLst/>
-                    </a:prstGeom>
-                  </pic:spPr>
-                </pic:pic>
-              </a:graphicData>
-            </a:graphic>
-          </wp:inline>
-        </w:drawing>
-      </w:r>
-    </w:p>
-    <w:p>
-      <w:pPr>
-        <w:spacing w:after="200"/>
-        <w:jc w:val="center"/>
-      </w:pPr>
-      <w:r>
-        <w:rPr>
-          <w:rFonts w:ascii="Arial" w:cs="Arial" w:eastAsia="Arial" w:hAnsi="Arial"/>
-          <w:b/>
-          <w:bCs/>
-          <w:sz w:val="18"/>
-          <w:szCs w:val="18"/>
-        </w:rPr>
-        <w:t xml:space="preserve">Fig. 6. </w:t>
-      </w:r>
-      <w:r>
-        <w:rPr>
-          <w:rFonts w:ascii="Arial" w:cs="Arial" w:eastAsia="Arial" w:hAnsi="Arial"/>
-          <w:sz w:val="18"/>
-          <w:szCs w:val="18"/>
-        </w:rPr>
-        <w:t xml:space="preserve">Curvas ROC y precisión-exhaustividad de los modelos A y B en la prueba temporal nacional (H = 60 días).</w:t>
-      </w:r>
-    </w:p>
-    <w:p>
-      <w:pPr>
-        <w:spacing w:after="120" w:line="264"/>
-        <w:jc w:val="both"/>
-      </w:pPr>
-      <w:r>
-        <w:rPr>
-          <w:rFonts w:ascii="Arial" w:cs="Arial" w:eastAsia="Arial" w:hAnsi="Arial"/>
-          <w:sz w:val="21"/>
-          <w:szCs w:val="21"/>
-        </w:rPr>
-        <w:t xml:space="preserve">En la evaluación rolling-origin (Fig. 7), B superó a A en ROC-AUC en los cuatro orígenes y en PR-AUC en tres de cuatro (en el origen de marzo de 2026, 0,152 frente a 0,159). Con cinco semillas, el PR-AUC nacional fue 0,138 ± 0,002 (A) frente a 0,162 ± 0,004 (B), y el ROC-AUC 0,742 ± 0,003 frente a 0,772 ± 0,003: la brecha es varias veces mayor que la variación por semilla.</w:t>
-      </w:r>
-    </w:p>
-    <w:p>
-      <w:pPr>
-        <w:keepNext/>
-        <w:spacing w:after="60" w:before="120"/>
-        <w:jc w:val="center"/>
-      </w:pPr>
-      <w:r>
-        <w:drawing>
-          <wp:inline distT="0" distB="0" distL="0" distR="0">
-            <wp:extent cx="5810250" cy="2200275"/>
-            <wp:effectExtent t="0" r="0" b="0" l="0"/>
-            <wp:docPr id="1" name="rolling" descr="Evaluación rolling-origin nacional (H = 60): cada punto es un modelo reentrenado con datos hasta el origen y probado en los tres meses siguientes." title="Figura 7"/>
-            <wp:cNvGraphicFramePr>
-              <a:graphicFrameLocks xmlns:a="http://schemas.openxmlformats.org/drawingml/2006/main" noChangeAspect="1"/>
-            </wp:cNvGraphicFramePr>
-            <a:graphic xmlns:a="http://schemas.openxmlformats.org/drawingml/2006/main">
-              <a:graphicData uri="http://schemas.openxmlformats.org/drawingml/2006/picture">
-                <pic:pic xmlns:pic="http://schemas.openxmlformats.org/drawingml/2006/picture">
-                  <pic:nvPicPr>
-                    <pic:cNvPr id="0" name="" descr=""/>
-                    <pic:cNvPicPr>
-                      <a:picLocks noChangeAspect="1" noChangeArrowheads="1"/>
-                    </pic:cNvPicPr>
-                  </pic:nvPicPr>
-                  <pic:blipFill>
-                    <a:blip r:embed="rId15" cstate="none"/>
-                    <a:srcRect/>
-                    <a:stretch>
-                      <a:fillRect/>
-                    </a:stretch>
-                  </pic:blipFill>
-                  <pic:spPr bwMode="auto">
-                    <a:xfrm>
-                      <a:off x="0" y="0"/>
-                      <a:ext cx="5810250" cy="2200275"/>
-                    </a:xfrm>
-                    <a:prstGeom prst="rect">
-                      <a:avLst/>
-                    </a:prstGeom>
-                  </pic:spPr>
-                </pic:pic>
-              </a:graphicData>
-            </a:graphic>
-          </wp:inline>
-        </w:drawing>
-      </w:r>
-    </w:p>
-    <w:p>
-      <w:pPr>
-        <w:spacing w:after="200"/>
-        <w:jc w:val="center"/>
-      </w:pPr>
-      <w:r>
-        <w:rPr>
-          <w:rFonts w:ascii="Arial" w:cs="Arial" w:eastAsia="Arial" w:hAnsi="Arial"/>
-          <w:b/>
-          <w:bCs/>
-          <w:sz w:val="18"/>
-          <w:szCs w:val="18"/>
-        </w:rPr>
-        <w:t xml:space="preserve">Fig. 7. </w:t>
-      </w:r>
-      <w:r>
-        <w:rPr>
-          <w:rFonts w:ascii="Arial" w:cs="Arial" w:eastAsia="Arial" w:hAnsi="Arial"/>
-          <w:sz w:val="18"/>
-          <w:szCs w:val="18"/>
-        </w:rPr>
-        <w:t xml:space="preserve">Evaluación rolling-origin nacional (H = 60): cada punto es un modelo reentrenado con datos hasta el origen y probado en los tres meses siguientes.</w:t>
-      </w:r>
-    </w:p>
-    <w:p>
-      <w:pPr>
-        <w:spacing w:after="120" w:line="264"/>
-        <w:jc w:val="both"/>
-      </w:pPr>
-      <w:r>
-        <w:rPr>
-          <w:rFonts w:ascii="Arial" w:cs="Arial" w:eastAsia="Arial" w:hAnsi="Arial"/>
-          <w:b/>
-          <w:bCs/>
-          <w:sz w:val="21"/>
-          <w:szCs w:val="21"/>
-        </w:rPr>
-        <w:t xml:space="preserve">Calibración.</w:t>
-      </w:r>
-      <w:r>
-        <w:rPr>
-          <w:rFonts w:ascii="Arial" w:cs="Arial" w:eastAsia="Arial" w:hAnsi="Arial"/>
-          <w:sz w:val="21"/>
-          <w:szCs w:val="21"/>
-        </w:rPr>
-        <w:t xml:space="preserve"> En el backtest </w:t>
-      </w:r>
-      <w:r>
-        <w:rPr>
-          <w:rFonts w:ascii="Arial" w:cs="Arial" w:eastAsia="Arial" w:hAnsi="Arial"/>
-          <w:i/>
-          <w:iCs/>
-          <w:sz w:val="21"/>
-          <w:szCs w:val="21"/>
-        </w:rPr>
-        <w:t xml:space="preserve">as-of</w:t>
-      </w:r>
-      <w:r>
-        <w:rPr>
-          <w:rFonts w:ascii="Arial" w:cs="Arial" w:eastAsia="Arial" w:hAnsi="Arial"/>
-          <w:sz w:val="21"/>
-          <w:szCs w:val="21"/>
-        </w:rPr>
-        <w:t xml:space="preserve"> (39 038 observaciones obra-mes con resultado conocido), la probabilidad media estimada y la tasa observada del evento coinciden en los diez deciles de riesgo (Fig. 8): 1,5 % frente a 1,1 % en el decil inferior y 20,0 % frente a 17,7 % en el superior. Por nivel, el evento ocurrió en 17,6 % de las observaciones en nivel alto, 8,5 % en nivel medio y 3,1 % en nivel bajo, frente a una tasa promedio de 5,6 %. Estas tasas son las que la interfaz muestra como confiabilidad de cada nivel.</w:t>
-      </w:r>
-    </w:p>
-    <w:p>
-      <w:pPr>
-        <w:keepNext/>
-        <w:spacing w:after="60" w:before="120"/>
-        <w:jc w:val="center"/>
-      </w:pPr>
-      <w:r>
-        <w:drawing>
-          <wp:inline distT="0" distB="0" distL="0" distR="0">
-            <wp:extent cx="5810250" cy="2266950"/>
-            <wp:effectExtent t="0" r="0" b="0" l="0"/>
-            <wp:docPr id="1" name="calibracion_alerta" descr="Calibración del modelo de alerta en el backtest as-of: (a) probabilidad estimada media frente a tasa observada por decil; (b) tasa observada por nivel de riesgo." title="Figura 8"/>
+            <wp:docPr id="1" name="rocpr" descr="Curvas ROC y precisión-exhaustividad de los modelos A y B en la prueba temporal nacional (H = 60 días)." title="Figura 8"/>
             <wp:cNvGraphicFramePr>
               <a:graphicFrameLocks xmlns:a="http://schemas.openxmlformats.org/drawingml/2006/main" noChangeAspect="1"/>
             </wp:cNvGraphicFramePr>
@@ -9939,7 +9883,7 @@
                   <pic:spPr bwMode="auto">
                     <a:xfrm>
                       <a:off x="0" y="0"/>
-                      <a:ext cx="5810250" cy="2266950"/>
+                      <a:ext cx="5810250" cy="2438400"/>
                     </a:xfrm>
                     <a:prstGeom prst="rect">
                       <a:avLst/>
@@ -9973,7 +9917,7 @@
           <w:sz w:val="18"/>
           <w:szCs w:val="18"/>
         </w:rPr>
-        <w:t xml:space="preserve">Calibración del modelo de alerta en el backtest as-of: (a) probabilidad estimada media frente a tasa observada por decil; (b) tasa observada por nivel de riesgo.</w:t>
+        <w:t xml:space="preserve">Curvas ROC y precisión-exhaustividad de los modelos A y B en la prueba temporal nacional (H = 60 días).</w:t>
       </w:r>
     </w:p>
     <w:p>
@@ -9984,1455 +9928,10 @@
       <w:r>
         <w:rPr>
           <w:rFonts w:ascii="Arial" w:cs="Arial" w:eastAsia="Arial" w:hAnsi="Arial"/>
-          <w:b/>
-          <w:bCs/>
           <w:sz w:val="21"/>
           <w:szCs w:val="21"/>
         </w:rPr>
-        <w:t xml:space="preserve">Modelos de cartera.</w:t>
-      </w:r>
-      <w:r>
-        <w:rPr>
-          <w:rFonts w:ascii="Arial" w:cs="Arial" w:eastAsia="Arial" w:hAnsi="Arial"/>
-          <w:sz w:val="21"/>
-          <w:szCs w:val="21"/>
-        </w:rPr>
-        <w:t xml:space="preserve"> La Tabla 6 resume la prueba temporal. Al inicio de la obra, LightGBM alcanzó ROC-AUC de 0,733 frente a 0,658 de la regla basada en el historial de la entidad (diferencia +0,075; IC 95 % [0,063; 0,086]). Con el seguimiento mensual del SIAF, el ROC-AUC subió de 0,723 a 0,753 sobre la misma muestra (+0,030; IC 95 % [0,026; 0,033]). La Fig. 9 muestra que los niveles de riesgo separan efectivamente las tasas de retraso observadas.</w:t>
-      </w:r>
-    </w:p>
-    <w:p>
-      <w:pPr>
-        <w:keepNext/>
-        <w:spacing w:after="80" w:before="160"/>
-        <w:jc w:val="center"/>
-      </w:pPr>
-      <w:r>
-        <w:rPr>
-          <w:rFonts w:ascii="Arial" w:cs="Arial" w:eastAsia="Arial" w:hAnsi="Arial"/>
-          <w:b/>
-          <w:bCs/>
-          <w:sz w:val="18"/>
-          <w:szCs w:val="18"/>
-        </w:rPr>
-        <w:t xml:space="preserve">Tabla 6. </w:t>
-      </w:r>
-      <w:r>
-        <w:rPr>
-          <w:rFonts w:ascii="Arial" w:cs="Arial" w:eastAsia="Arial" w:hAnsi="Arial"/>
-          <w:sz w:val="18"/>
-          <w:szCs w:val="18"/>
-        </w:rPr>
-        <w:t xml:space="preserve">Modelos de la cartera INFOBRAS: resultados en la prueba temporal nacional</w:t>
-      </w:r>
-    </w:p>
-    <w:tbl>
-      <w:tblPr>
-        <w:tblW w:type="dxa" w:w="9404"/>
-        <w:tblBorders>
-          <w:top w:val="single" w:color="8EAADB" w:sz="4"/>
-          <w:left w:val="single" w:color="8EAADB" w:sz="4"/>
-          <w:bottom w:val="single" w:color="8EAADB" w:sz="4"/>
-          <w:right w:val="single" w:color="8EAADB" w:sz="4"/>
-          <w:insideH w:val="single" w:color="8EAADB" w:sz="4"/>
-          <w:insideV w:val="single" w:color="8EAADB" w:sz="4"/>
-        </w:tblBorders>
-        <w:tblLayout w:type="fixed"/>
-      </w:tblPr>
-      <w:tblGrid>
-        <w:gridCol w:w="2445"/>
-        <w:gridCol w:w="2256"/>
-        <w:gridCol w:w="1128"/>
-        <w:gridCol w:w="1128"/>
-        <w:gridCol w:w="1222"/>
-        <w:gridCol w:w="1225"/>
-      </w:tblGrid>
-      <w:tr>
-        <w:trPr>
-          <w:cantSplit/>
-          <w:tblHeader/>
-        </w:trPr>
-        <w:tc>
-          <w:tcPr>
-            <w:tcW w:type="dxa" w:w="2445"/>
-            <w:shd w:fill="DCE6F1" w:color="auto" w:val="clear"/>
-            <w:tcMar>
-              <w:top w:type="dxa" w:w="50"/>
-              <w:left w:type="dxa" w:w="80"/>
-              <w:bottom w:type="dxa" w:w="50"/>
-              <w:right w:type="dxa" w:w="80"/>
-            </w:tcMar>
-            <w:vAlign w:val="center"/>
-          </w:tcPr>
-          <w:p>
-            <w:pPr>
-              <w:keepNext/>
-              <w:spacing w:after="0" w:line="240"/>
-              <w:jc w:val="center"/>
-            </w:pPr>
-            <w:r>
-              <w:rPr>
-                <w:rFonts w:ascii="Arial" w:cs="Arial" w:eastAsia="Arial" w:hAnsi="Arial"/>
-                <w:b/>
-                <w:bCs/>
-                <w:sz w:val="16"/>
-                <w:szCs w:val="16"/>
-              </w:rPr>
-              <w:t xml:space="preserve">Modelo</w:t>
-            </w:r>
-          </w:p>
-        </w:tc>
-        <w:tc>
-          <w:tcPr>
-            <w:tcW w:type="dxa" w:w="2256"/>
-            <w:shd w:fill="DCE6F1" w:color="auto" w:val="clear"/>
-            <w:tcMar>
-              <w:top w:type="dxa" w:w="50"/>
-              <w:left w:type="dxa" w:w="80"/>
-              <w:bottom w:type="dxa" w:w="50"/>
-              <w:right w:type="dxa" w:w="80"/>
-            </w:tcMar>
-            <w:vAlign w:val="center"/>
-          </w:tcPr>
-          <w:p>
-            <w:pPr>
-              <w:keepNext/>
-              <w:spacing w:after="0" w:line="240"/>
-              <w:jc w:val="center"/>
-            </w:pPr>
-            <w:r>
-              <w:rPr>
-                <w:rFonts w:ascii="Arial" w:cs="Arial" w:eastAsia="Arial" w:hAnsi="Arial"/>
-                <w:b/>
-                <w:bCs/>
-                <w:sz w:val="16"/>
-                <w:szCs w:val="16"/>
-              </w:rPr>
-              <w:t xml:space="preserve">Prueba</w:t>
-            </w:r>
-          </w:p>
-        </w:tc>
-        <w:tc>
-          <w:tcPr>
-            <w:tcW w:type="dxa" w:w="1128"/>
-            <w:shd w:fill="DCE6F1" w:color="auto" w:val="clear"/>
-            <w:tcMar>
-              <w:top w:type="dxa" w:w="50"/>
-              <w:left w:type="dxa" w:w="80"/>
-              <w:bottom w:type="dxa" w:w="50"/>
-              <w:right w:type="dxa" w:w="80"/>
-            </w:tcMar>
-            <w:vAlign w:val="center"/>
-          </w:tcPr>
-          <w:p>
-            <w:pPr>
-              <w:keepNext/>
-              <w:spacing w:after="0" w:line="240"/>
-              <w:jc w:val="center"/>
-            </w:pPr>
-            <w:r>
-              <w:rPr>
-                <w:rFonts w:ascii="Arial" w:cs="Arial" w:eastAsia="Arial" w:hAnsi="Arial"/>
-                <w:b/>
-                <w:bCs/>
-                <w:sz w:val="16"/>
-                <w:szCs w:val="16"/>
-              </w:rPr>
-              <w:t xml:space="preserve">ROC-AUC</w:t>
-            </w:r>
-          </w:p>
-        </w:tc>
-        <w:tc>
-          <w:tcPr>
-            <w:tcW w:type="dxa" w:w="1128"/>
-            <w:shd w:fill="DCE6F1" w:color="auto" w:val="clear"/>
-            <w:tcMar>
-              <w:top w:type="dxa" w:w="50"/>
-              <w:left w:type="dxa" w:w="80"/>
-              <w:bottom w:type="dxa" w:w="50"/>
-              <w:right w:type="dxa" w:w="80"/>
-            </w:tcMar>
-            <w:vAlign w:val="center"/>
-          </w:tcPr>
-          <w:p>
-            <w:pPr>
-              <w:keepNext/>
-              <w:spacing w:after="0" w:line="240"/>
-              <w:jc w:val="center"/>
-            </w:pPr>
-            <w:r>
-              <w:rPr>
-                <w:rFonts w:ascii="Arial" w:cs="Arial" w:eastAsia="Arial" w:hAnsi="Arial"/>
-                <w:b/>
-                <w:bCs/>
-                <w:sz w:val="16"/>
-                <w:szCs w:val="16"/>
-              </w:rPr>
-              <w:t xml:space="preserve">PR-AUC</w:t>
-            </w:r>
-          </w:p>
-        </w:tc>
-        <w:tc>
-          <w:tcPr>
-            <w:tcW w:type="dxa" w:w="1222"/>
-            <w:shd w:fill="DCE6F1" w:color="auto" w:val="clear"/>
-            <w:tcMar>
-              <w:top w:type="dxa" w:w="50"/>
-              <w:left w:type="dxa" w:w="80"/>
-              <w:bottom w:type="dxa" w:w="50"/>
-              <w:right w:type="dxa" w:w="80"/>
-            </w:tcMar>
-            <w:vAlign w:val="center"/>
-          </w:tcPr>
-          <w:p>
-            <w:pPr>
-              <w:keepNext/>
-              <w:spacing w:after="0" w:line="240"/>
-              <w:jc w:val="center"/>
-            </w:pPr>
-            <w:r>
-              <w:rPr>
-                <w:rFonts w:ascii="Arial" w:cs="Arial" w:eastAsia="Arial" w:hAnsi="Arial"/>
-                <w:b/>
-                <w:bCs/>
-                <w:sz w:val="16"/>
-                <w:szCs w:val="16"/>
-              </w:rPr>
-              <w:t xml:space="preserve">Prevalencia</w:t>
-            </w:r>
-          </w:p>
-        </w:tc>
-        <w:tc>
-          <w:tcPr>
-            <w:tcW w:type="dxa" w:w="1225"/>
-            <w:shd w:fill="DCE6F1" w:color="auto" w:val="clear"/>
-            <w:tcMar>
-              <w:top w:type="dxa" w:w="50"/>
-              <w:left w:type="dxa" w:w="80"/>
-              <w:bottom w:type="dxa" w:w="50"/>
-              <w:right w:type="dxa" w:w="80"/>
-            </w:tcMar>
-            <w:vAlign w:val="center"/>
-          </w:tcPr>
-          <w:p>
-            <w:pPr>
-              <w:keepNext/>
-              <w:spacing w:after="0" w:line="240"/>
-              <w:jc w:val="center"/>
-            </w:pPr>
-            <w:r>
-              <w:rPr>
-                <w:rFonts w:ascii="Arial" w:cs="Arial" w:eastAsia="Arial" w:hAnsi="Arial"/>
-                <w:b/>
-                <w:bCs/>
-                <w:sz w:val="16"/>
-                <w:szCs w:val="16"/>
-              </w:rPr>
-              <w:t xml:space="preserve">ROC-AUC Arequipa</w:t>
-            </w:r>
-          </w:p>
-        </w:tc>
-      </w:tr>
-      <w:tr>
-        <w:trPr>
-          <w:cantSplit/>
-        </w:trPr>
-        <w:tc>
-          <w:tcPr>
-            <w:tcW w:type="dxa" w:w="2445"/>
-            <w:tcMar>
-              <w:top w:type="dxa" w:w="50"/>
-              <w:left w:type="dxa" w:w="80"/>
-              <w:bottom w:type="dxa" w:w="50"/>
-              <w:right w:type="dxa" w:w="80"/>
-            </w:tcMar>
-            <w:vAlign w:val="center"/>
-          </w:tcPr>
-          <w:p>
-            <w:pPr>
-              <w:keepNext/>
-              <w:spacing w:after="0" w:line="240"/>
-              <w:jc w:val="left"/>
-            </w:pPr>
-            <w:r>
-              <w:rPr>
-                <w:rFonts w:ascii="Arial" w:cs="Arial" w:eastAsia="Arial" w:hAnsi="Arial"/>
-                <w:sz w:val="16"/>
-                <w:szCs w:val="16"/>
-              </w:rPr>
-              <w:t xml:space="preserve">Regla: historial de la entidad</w:t>
-            </w:r>
-          </w:p>
-        </w:tc>
-        <w:tc>
-          <w:tcPr>
-            <w:tcW w:type="dxa" w:w="2256"/>
-            <w:tcMar>
-              <w:top w:type="dxa" w:w="50"/>
-              <w:left w:type="dxa" w:w="80"/>
-              <w:bottom w:type="dxa" w:w="50"/>
-              <w:right w:type="dxa" w:w="80"/>
-            </w:tcMar>
-            <w:vAlign w:val="center"/>
-          </w:tcPr>
-          <w:p>
-            <w:pPr>
-              <w:keepNext/>
-              <w:spacing w:after="0" w:line="240"/>
-              <w:jc w:val="left"/>
-            </w:pPr>
-            <w:r>
-              <w:rPr>
-                <w:rFonts w:ascii="Arial" w:cs="Arial" w:eastAsia="Arial" w:hAnsi="Arial"/>
-                <w:sz w:val="16"/>
-                <w:szCs w:val="16"/>
-              </w:rPr>
-              <w:t xml:space="preserve">Inicios 2022-01 a 2024-06 (26 025 obras)</w:t>
-            </w:r>
-          </w:p>
-        </w:tc>
-        <w:tc>
-          <w:tcPr>
-            <w:tcW w:type="dxa" w:w="1128"/>
-            <w:tcMar>
-              <w:top w:type="dxa" w:w="50"/>
-              <w:left w:type="dxa" w:w="80"/>
-              <w:bottom w:type="dxa" w:w="50"/>
-              <w:right w:type="dxa" w:w="80"/>
-            </w:tcMar>
-            <w:vAlign w:val="center"/>
-          </w:tcPr>
-          <w:p>
-            <w:pPr>
-              <w:keepNext/>
-              <w:spacing w:after="0" w:line="240"/>
-              <w:jc w:val="center"/>
-            </w:pPr>
-            <w:r>
-              <w:rPr>
-                <w:rFonts w:ascii="Arial" w:cs="Arial" w:eastAsia="Arial" w:hAnsi="Arial"/>
-                <w:sz w:val="16"/>
-                <w:szCs w:val="16"/>
-              </w:rPr>
-              <w:t xml:space="preserve">0,658</w:t>
-            </w:r>
-          </w:p>
-        </w:tc>
-        <w:tc>
-          <w:tcPr>
-            <w:tcW w:type="dxa" w:w="1128"/>
-            <w:tcMar>
-              <w:top w:type="dxa" w:w="50"/>
-              <w:left w:type="dxa" w:w="80"/>
-              <w:bottom w:type="dxa" w:w="50"/>
-              <w:right w:type="dxa" w:w="80"/>
-            </w:tcMar>
-            <w:vAlign w:val="center"/>
-          </w:tcPr>
-          <w:p>
-            <w:pPr>
-              <w:keepNext/>
-              <w:spacing w:after="0" w:line="240"/>
-              <w:jc w:val="center"/>
-            </w:pPr>
-            <w:r>
-              <w:rPr>
-                <w:rFonts w:ascii="Arial" w:cs="Arial" w:eastAsia="Arial" w:hAnsi="Arial"/>
-                <w:sz w:val="16"/>
-                <w:szCs w:val="16"/>
-              </w:rPr>
-              <w:t xml:space="preserve">0,690</w:t>
-            </w:r>
-          </w:p>
-        </w:tc>
-        <w:tc>
-          <w:tcPr>
-            <w:tcW w:type="dxa" w:w="1222"/>
-            <w:tcMar>
-              <w:top w:type="dxa" w:w="50"/>
-              <w:left w:type="dxa" w:w="80"/>
-              <w:bottom w:type="dxa" w:w="50"/>
-              <w:right w:type="dxa" w:w="80"/>
-            </w:tcMar>
-            <w:vAlign w:val="center"/>
-          </w:tcPr>
-          <w:p>
-            <w:pPr>
-              <w:keepNext/>
-              <w:spacing w:after="0" w:line="240"/>
-              <w:jc w:val="center"/>
-            </w:pPr>
-            <w:r>
-              <w:rPr>
-                <w:rFonts w:ascii="Arial" w:cs="Arial" w:eastAsia="Arial" w:hAnsi="Arial"/>
-                <w:sz w:val="16"/>
-                <w:szCs w:val="16"/>
-              </w:rPr>
-              <w:t xml:space="preserve">0,524</w:t>
-            </w:r>
-          </w:p>
-        </w:tc>
-        <w:tc>
-          <w:tcPr>
-            <w:tcW w:type="dxa" w:w="1225"/>
-            <w:tcMar>
-              <w:top w:type="dxa" w:w="50"/>
-              <w:left w:type="dxa" w:w="80"/>
-              <w:bottom w:type="dxa" w:w="50"/>
-              <w:right w:type="dxa" w:w="80"/>
-            </w:tcMar>
-            <w:vAlign w:val="center"/>
-          </w:tcPr>
-          <w:p>
-            <w:pPr>
-              <w:keepNext/>
-              <w:spacing w:after="0" w:line="240"/>
-              <w:jc w:val="center"/>
-            </w:pPr>
-            <w:r>
-              <w:rPr>
-                <w:rFonts w:ascii="Arial" w:cs="Arial" w:eastAsia="Arial" w:hAnsi="Arial"/>
-                <w:sz w:val="16"/>
-                <w:szCs w:val="16"/>
-              </w:rPr>
-              <w:t xml:space="preserve">0,661</w:t>
-            </w:r>
-          </w:p>
-        </w:tc>
-      </w:tr>
-      <w:tr>
-        <w:trPr>
-          <w:cantSplit/>
-        </w:trPr>
-        <w:tc>
-          <w:tcPr>
-            <w:tcW w:type="dxa" w:w="2445"/>
-            <w:shd w:fill="F5F8FC" w:color="auto" w:val="clear"/>
-            <w:tcMar>
-              <w:top w:type="dxa" w:w="50"/>
-              <w:left w:type="dxa" w:w="80"/>
-              <w:bottom w:type="dxa" w:w="50"/>
-              <w:right w:type="dxa" w:w="80"/>
-            </w:tcMar>
-            <w:vAlign w:val="center"/>
-          </w:tcPr>
-          <w:p>
-            <w:pPr>
-              <w:keepNext/>
-              <w:spacing w:after="0" w:line="240"/>
-              <w:jc w:val="left"/>
-            </w:pPr>
-            <w:r>
-              <w:rPr>
-                <w:rFonts w:ascii="Arial" w:cs="Arial" w:eastAsia="Arial" w:hAnsi="Arial"/>
-                <w:sz w:val="16"/>
-                <w:szCs w:val="16"/>
-              </w:rPr>
-              <w:t xml:space="preserve">Regresión logística</w:t>
-            </w:r>
-          </w:p>
-        </w:tc>
-        <w:tc>
-          <w:tcPr>
-            <w:tcW w:type="dxa" w:w="2256"/>
-            <w:shd w:fill="F5F8FC" w:color="auto" w:val="clear"/>
-            <w:tcMar>
-              <w:top w:type="dxa" w:w="50"/>
-              <w:left w:type="dxa" w:w="80"/>
-              <w:bottom w:type="dxa" w:w="50"/>
-              <w:right w:type="dxa" w:w="80"/>
-            </w:tcMar>
-            <w:vAlign w:val="center"/>
-          </w:tcPr>
-          <w:p>
-            <w:pPr>
-              <w:keepNext/>
-              <w:spacing w:after="0" w:line="240"/>
-              <w:jc w:val="left"/>
-            </w:pPr>
-            <w:r>
-              <w:rPr>
-                <w:rFonts w:ascii="Arial" w:cs="Arial" w:eastAsia="Arial" w:hAnsi="Arial"/>
-                <w:sz w:val="16"/>
-                <w:szCs w:val="16"/>
-              </w:rPr>
-              <w:t xml:space="preserve">Ídem</w:t>
-            </w:r>
-          </w:p>
-        </w:tc>
-        <w:tc>
-          <w:tcPr>
-            <w:tcW w:type="dxa" w:w="1128"/>
-            <w:shd w:fill="F5F8FC" w:color="auto" w:val="clear"/>
-            <w:tcMar>
-              <w:top w:type="dxa" w:w="50"/>
-              <w:left w:type="dxa" w:w="80"/>
-              <w:bottom w:type="dxa" w:w="50"/>
-              <w:right w:type="dxa" w:w="80"/>
-            </w:tcMar>
-            <w:vAlign w:val="center"/>
-          </w:tcPr>
-          <w:p>
-            <w:pPr>
-              <w:keepNext/>
-              <w:spacing w:after="0" w:line="240"/>
-              <w:jc w:val="center"/>
-            </w:pPr>
-            <w:r>
-              <w:rPr>
-                <w:rFonts w:ascii="Arial" w:cs="Arial" w:eastAsia="Arial" w:hAnsi="Arial"/>
-                <w:sz w:val="16"/>
-                <w:szCs w:val="16"/>
-              </w:rPr>
-              <w:t xml:space="preserve">0,718</w:t>
-            </w:r>
-          </w:p>
-        </w:tc>
-        <w:tc>
-          <w:tcPr>
-            <w:tcW w:type="dxa" w:w="1128"/>
-            <w:shd w:fill="F5F8FC" w:color="auto" w:val="clear"/>
-            <w:tcMar>
-              <w:top w:type="dxa" w:w="50"/>
-              <w:left w:type="dxa" w:w="80"/>
-              <w:bottom w:type="dxa" w:w="50"/>
-              <w:right w:type="dxa" w:w="80"/>
-            </w:tcMar>
-            <w:vAlign w:val="center"/>
-          </w:tcPr>
-          <w:p>
-            <w:pPr>
-              <w:keepNext/>
-              <w:spacing w:after="0" w:line="240"/>
-              <w:jc w:val="center"/>
-            </w:pPr>
-            <w:r>
-              <w:rPr>
-                <w:rFonts w:ascii="Arial" w:cs="Arial" w:eastAsia="Arial" w:hAnsi="Arial"/>
-                <w:sz w:val="16"/>
-                <w:szCs w:val="16"/>
-              </w:rPr>
-              <w:t xml:space="preserve">0,742</w:t>
-            </w:r>
-          </w:p>
-        </w:tc>
-        <w:tc>
-          <w:tcPr>
-            <w:tcW w:type="dxa" w:w="1222"/>
-            <w:shd w:fill="F5F8FC" w:color="auto" w:val="clear"/>
-            <w:tcMar>
-              <w:top w:type="dxa" w:w="50"/>
-              <w:left w:type="dxa" w:w="80"/>
-              <w:bottom w:type="dxa" w:w="50"/>
-              <w:right w:type="dxa" w:w="80"/>
-            </w:tcMar>
-            <w:vAlign w:val="center"/>
-          </w:tcPr>
-          <w:p>
-            <w:pPr>
-              <w:keepNext/>
-              <w:spacing w:after="0" w:line="240"/>
-              <w:jc w:val="center"/>
-            </w:pPr>
-            <w:r>
-              <w:rPr>
-                <w:rFonts w:ascii="Arial" w:cs="Arial" w:eastAsia="Arial" w:hAnsi="Arial"/>
-                <w:sz w:val="16"/>
-                <w:szCs w:val="16"/>
-              </w:rPr>
-              <w:t xml:space="preserve">0,524</w:t>
-            </w:r>
-          </w:p>
-        </w:tc>
-        <w:tc>
-          <w:tcPr>
-            <w:tcW w:type="dxa" w:w="1225"/>
-            <w:shd w:fill="F5F8FC" w:color="auto" w:val="clear"/>
-            <w:tcMar>
-              <w:top w:type="dxa" w:w="50"/>
-              <w:left w:type="dxa" w:w="80"/>
-              <w:bottom w:type="dxa" w:w="50"/>
-              <w:right w:type="dxa" w:w="80"/>
-            </w:tcMar>
-            <w:vAlign w:val="center"/>
-          </w:tcPr>
-          <w:p>
-            <w:pPr>
-              <w:keepNext/>
-              <w:spacing w:after="0" w:line="240"/>
-              <w:jc w:val="center"/>
-            </w:pPr>
-            <w:r>
-              <w:rPr>
-                <w:rFonts w:ascii="Arial" w:cs="Arial" w:eastAsia="Arial" w:hAnsi="Arial"/>
-                <w:sz w:val="16"/>
-                <w:szCs w:val="16"/>
-              </w:rPr>
-              <w:t xml:space="preserve">0,730</w:t>
-            </w:r>
-          </w:p>
-        </w:tc>
-      </w:tr>
-      <w:tr>
-        <w:trPr>
-          <w:cantSplit/>
-        </w:trPr>
-        <w:tc>
-          <w:tcPr>
-            <w:tcW w:type="dxa" w:w="2445"/>
-            <w:tcMar>
-              <w:top w:type="dxa" w:w="50"/>
-              <w:left w:type="dxa" w:w="80"/>
-              <w:bottom w:type="dxa" w:w="50"/>
-              <w:right w:type="dxa" w:w="80"/>
-            </w:tcMar>
-            <w:vAlign w:val="center"/>
-          </w:tcPr>
-          <w:p>
-            <w:pPr>
-              <w:keepNext/>
-              <w:spacing w:after="0" w:line="240"/>
-              <w:jc w:val="left"/>
-            </w:pPr>
-            <w:r>
-              <w:rPr>
-                <w:rFonts w:ascii="Arial" w:cs="Arial" w:eastAsia="Arial" w:hAnsi="Arial"/>
-                <w:sz w:val="16"/>
-                <w:szCs w:val="16"/>
-              </w:rPr>
-              <w:t xml:space="preserve">Bosque aleatorio</w:t>
-            </w:r>
-          </w:p>
-        </w:tc>
-        <w:tc>
-          <w:tcPr>
-            <w:tcW w:type="dxa" w:w="2256"/>
-            <w:tcMar>
-              <w:top w:type="dxa" w:w="50"/>
-              <w:left w:type="dxa" w:w="80"/>
-              <w:bottom w:type="dxa" w:w="50"/>
-              <w:right w:type="dxa" w:w="80"/>
-            </w:tcMar>
-            <w:vAlign w:val="center"/>
-          </w:tcPr>
-          <w:p>
-            <w:pPr>
-              <w:keepNext/>
-              <w:spacing w:after="0" w:line="240"/>
-              <w:jc w:val="left"/>
-            </w:pPr>
-            <w:r>
-              <w:rPr>
-                <w:rFonts w:ascii="Arial" w:cs="Arial" w:eastAsia="Arial" w:hAnsi="Arial"/>
-                <w:sz w:val="16"/>
-                <w:szCs w:val="16"/>
-              </w:rPr>
-              <w:t xml:space="preserve">Ídem</w:t>
-            </w:r>
-          </w:p>
-        </w:tc>
-        <w:tc>
-          <w:tcPr>
-            <w:tcW w:type="dxa" w:w="1128"/>
-            <w:tcMar>
-              <w:top w:type="dxa" w:w="50"/>
-              <w:left w:type="dxa" w:w="80"/>
-              <w:bottom w:type="dxa" w:w="50"/>
-              <w:right w:type="dxa" w:w="80"/>
-            </w:tcMar>
-            <w:vAlign w:val="center"/>
-          </w:tcPr>
-          <w:p>
-            <w:pPr>
-              <w:keepNext/>
-              <w:spacing w:after="0" w:line="240"/>
-              <w:jc w:val="center"/>
-            </w:pPr>
-            <w:r>
-              <w:rPr>
-                <w:rFonts w:ascii="Arial" w:cs="Arial" w:eastAsia="Arial" w:hAnsi="Arial"/>
-                <w:sz w:val="16"/>
-                <w:szCs w:val="16"/>
-              </w:rPr>
-              <w:t xml:space="preserve">0,741</w:t>
-            </w:r>
-          </w:p>
-        </w:tc>
-        <w:tc>
-          <w:tcPr>
-            <w:tcW w:type="dxa" w:w="1128"/>
-            <w:tcMar>
-              <w:top w:type="dxa" w:w="50"/>
-              <w:left w:type="dxa" w:w="80"/>
-              <w:bottom w:type="dxa" w:w="50"/>
-              <w:right w:type="dxa" w:w="80"/>
-            </w:tcMar>
-            <w:vAlign w:val="center"/>
-          </w:tcPr>
-          <w:p>
-            <w:pPr>
-              <w:keepNext/>
-              <w:spacing w:after="0" w:line="240"/>
-              <w:jc w:val="center"/>
-            </w:pPr>
-            <w:r>
-              <w:rPr>
-                <w:rFonts w:ascii="Arial" w:cs="Arial" w:eastAsia="Arial" w:hAnsi="Arial"/>
-                <w:sz w:val="16"/>
-                <w:szCs w:val="16"/>
-              </w:rPr>
-              <w:t xml:space="preserve">0,767</w:t>
-            </w:r>
-          </w:p>
-        </w:tc>
-        <w:tc>
-          <w:tcPr>
-            <w:tcW w:type="dxa" w:w="1222"/>
-            <w:tcMar>
-              <w:top w:type="dxa" w:w="50"/>
-              <w:left w:type="dxa" w:w="80"/>
-              <w:bottom w:type="dxa" w:w="50"/>
-              <w:right w:type="dxa" w:w="80"/>
-            </w:tcMar>
-            <w:vAlign w:val="center"/>
-          </w:tcPr>
-          <w:p>
-            <w:pPr>
-              <w:keepNext/>
-              <w:spacing w:after="0" w:line="240"/>
-              <w:jc w:val="center"/>
-            </w:pPr>
-            <w:r>
-              <w:rPr>
-                <w:rFonts w:ascii="Arial" w:cs="Arial" w:eastAsia="Arial" w:hAnsi="Arial"/>
-                <w:sz w:val="16"/>
-                <w:szCs w:val="16"/>
-              </w:rPr>
-              <w:t xml:space="preserve">0,524</w:t>
-            </w:r>
-          </w:p>
-        </w:tc>
-        <w:tc>
-          <w:tcPr>
-            <w:tcW w:type="dxa" w:w="1225"/>
-            <w:tcMar>
-              <w:top w:type="dxa" w:w="50"/>
-              <w:left w:type="dxa" w:w="80"/>
-              <w:bottom w:type="dxa" w:w="50"/>
-              <w:right w:type="dxa" w:w="80"/>
-            </w:tcMar>
-            <w:vAlign w:val="center"/>
-          </w:tcPr>
-          <w:p>
-            <w:pPr>
-              <w:keepNext/>
-              <w:spacing w:after="0" w:line="240"/>
-              <w:jc w:val="center"/>
-            </w:pPr>
-            <w:r>
-              <w:rPr>
-                <w:rFonts w:ascii="Arial" w:cs="Arial" w:eastAsia="Arial" w:hAnsi="Arial"/>
-                <w:sz w:val="16"/>
-                <w:szCs w:val="16"/>
-              </w:rPr>
-              <w:t xml:space="preserve">0,734</w:t>
-            </w:r>
-          </w:p>
-        </w:tc>
-      </w:tr>
-      <w:tr>
-        <w:trPr>
-          <w:cantSplit/>
-        </w:trPr>
-        <w:tc>
-          <w:tcPr>
-            <w:tcW w:type="dxa" w:w="2445"/>
-            <w:shd w:fill="F5F8FC" w:color="auto" w:val="clear"/>
-            <w:tcMar>
-              <w:top w:type="dxa" w:w="50"/>
-              <w:left w:type="dxa" w:w="80"/>
-              <w:bottom w:type="dxa" w:w="50"/>
-              <w:right w:type="dxa" w:w="80"/>
-            </w:tcMar>
-            <w:vAlign w:val="center"/>
-          </w:tcPr>
-          <w:p>
-            <w:pPr>
-              <w:keepNext/>
-              <w:spacing w:after="0" w:line="240"/>
-              <w:jc w:val="left"/>
-            </w:pPr>
-            <w:r>
-              <w:rPr>
-                <w:rFonts w:ascii="Arial" w:cs="Arial" w:eastAsia="Arial" w:hAnsi="Arial"/>
-                <w:sz w:val="16"/>
-                <w:szCs w:val="16"/>
-              </w:rPr>
-              <w:t xml:space="preserve">XGBoost</w:t>
-            </w:r>
-          </w:p>
-        </w:tc>
-        <w:tc>
-          <w:tcPr>
-            <w:tcW w:type="dxa" w:w="2256"/>
-            <w:shd w:fill="F5F8FC" w:color="auto" w:val="clear"/>
-            <w:tcMar>
-              <w:top w:type="dxa" w:w="50"/>
-              <w:left w:type="dxa" w:w="80"/>
-              <w:bottom w:type="dxa" w:w="50"/>
-              <w:right w:type="dxa" w:w="80"/>
-            </w:tcMar>
-            <w:vAlign w:val="center"/>
-          </w:tcPr>
-          <w:p>
-            <w:pPr>
-              <w:keepNext/>
-              <w:spacing w:after="0" w:line="240"/>
-              <w:jc w:val="left"/>
-            </w:pPr>
-            <w:r>
-              <w:rPr>
-                <w:rFonts w:ascii="Arial" w:cs="Arial" w:eastAsia="Arial" w:hAnsi="Arial"/>
-                <w:sz w:val="16"/>
-                <w:szCs w:val="16"/>
-              </w:rPr>
-              <w:t xml:space="preserve">Ídem</w:t>
-            </w:r>
-          </w:p>
-        </w:tc>
-        <w:tc>
-          <w:tcPr>
-            <w:tcW w:type="dxa" w:w="1128"/>
-            <w:shd w:fill="F5F8FC" w:color="auto" w:val="clear"/>
-            <w:tcMar>
-              <w:top w:type="dxa" w:w="50"/>
-              <w:left w:type="dxa" w:w="80"/>
-              <w:bottom w:type="dxa" w:w="50"/>
-              <w:right w:type="dxa" w:w="80"/>
-            </w:tcMar>
-            <w:vAlign w:val="center"/>
-          </w:tcPr>
-          <w:p>
-            <w:pPr>
-              <w:keepNext/>
-              <w:spacing w:after="0" w:line="240"/>
-              <w:jc w:val="center"/>
-            </w:pPr>
-            <w:r>
-              <w:rPr>
-                <w:rFonts w:ascii="Arial" w:cs="Arial" w:eastAsia="Arial" w:hAnsi="Arial"/>
-                <w:sz w:val="16"/>
-                <w:szCs w:val="16"/>
-              </w:rPr>
-              <w:t xml:space="preserve">0,701</w:t>
-            </w:r>
-          </w:p>
-        </w:tc>
-        <w:tc>
-          <w:tcPr>
-            <w:tcW w:type="dxa" w:w="1128"/>
-            <w:shd w:fill="F5F8FC" w:color="auto" w:val="clear"/>
-            <w:tcMar>
-              <w:top w:type="dxa" w:w="50"/>
-              <w:left w:type="dxa" w:w="80"/>
-              <w:bottom w:type="dxa" w:w="50"/>
-              <w:right w:type="dxa" w:w="80"/>
-            </w:tcMar>
-            <w:vAlign w:val="center"/>
-          </w:tcPr>
-          <w:p>
-            <w:pPr>
-              <w:keepNext/>
-              <w:spacing w:after="0" w:line="240"/>
-              <w:jc w:val="center"/>
-            </w:pPr>
-            <w:r>
-              <w:rPr>
-                <w:rFonts w:ascii="Arial" w:cs="Arial" w:eastAsia="Arial" w:hAnsi="Arial"/>
-                <w:sz w:val="16"/>
-                <w:szCs w:val="16"/>
-              </w:rPr>
-              <w:t xml:space="preserve">0,729</w:t>
-            </w:r>
-          </w:p>
-        </w:tc>
-        <w:tc>
-          <w:tcPr>
-            <w:tcW w:type="dxa" w:w="1222"/>
-            <w:shd w:fill="F5F8FC" w:color="auto" w:val="clear"/>
-            <w:tcMar>
-              <w:top w:type="dxa" w:w="50"/>
-              <w:left w:type="dxa" w:w="80"/>
-              <w:bottom w:type="dxa" w:w="50"/>
-              <w:right w:type="dxa" w:w="80"/>
-            </w:tcMar>
-            <w:vAlign w:val="center"/>
-          </w:tcPr>
-          <w:p>
-            <w:pPr>
-              <w:keepNext/>
-              <w:spacing w:after="0" w:line="240"/>
-              <w:jc w:val="center"/>
-            </w:pPr>
-            <w:r>
-              <w:rPr>
-                <w:rFonts w:ascii="Arial" w:cs="Arial" w:eastAsia="Arial" w:hAnsi="Arial"/>
-                <w:sz w:val="16"/>
-                <w:szCs w:val="16"/>
-              </w:rPr>
-              <w:t xml:space="preserve">0,524</w:t>
-            </w:r>
-          </w:p>
-        </w:tc>
-        <w:tc>
-          <w:tcPr>
-            <w:tcW w:type="dxa" w:w="1225"/>
-            <w:shd w:fill="F5F8FC" w:color="auto" w:val="clear"/>
-            <w:tcMar>
-              <w:top w:type="dxa" w:w="50"/>
-              <w:left w:type="dxa" w:w="80"/>
-              <w:bottom w:type="dxa" w:w="50"/>
-              <w:right w:type="dxa" w:w="80"/>
-            </w:tcMar>
-            <w:vAlign w:val="center"/>
-          </w:tcPr>
-          <w:p>
-            <w:pPr>
-              <w:keepNext/>
-              <w:spacing w:after="0" w:line="240"/>
-              <w:jc w:val="center"/>
-            </w:pPr>
-            <w:r>
-              <w:rPr>
-                <w:rFonts w:ascii="Arial" w:cs="Arial" w:eastAsia="Arial" w:hAnsi="Arial"/>
-                <w:sz w:val="16"/>
-                <w:szCs w:val="16"/>
-              </w:rPr>
-              <w:t xml:space="preserve">0,699</w:t>
-            </w:r>
-          </w:p>
-        </w:tc>
-      </w:tr>
-      <w:tr>
-        <w:trPr>
-          <w:cantSplit/>
-        </w:trPr>
-        <w:tc>
-          <w:tcPr>
-            <w:tcW w:type="dxa" w:w="2445"/>
-            <w:tcMar>
-              <w:top w:type="dxa" w:w="50"/>
-              <w:left w:type="dxa" w:w="80"/>
-              <w:bottom w:type="dxa" w:w="50"/>
-              <w:right w:type="dxa" w:w="80"/>
-            </w:tcMar>
-            <w:vAlign w:val="center"/>
-          </w:tcPr>
-          <w:p>
-            <w:pPr>
-              <w:keepNext/>
-              <w:spacing w:after="0" w:line="240"/>
-              <w:jc w:val="left"/>
-            </w:pPr>
-            <w:r>
-              <w:rPr>
-                <w:rFonts w:ascii="Arial" w:cs="Arial" w:eastAsia="Arial" w:hAnsi="Arial"/>
-                <w:sz w:val="16"/>
-                <w:szCs w:val="16"/>
-              </w:rPr>
-              <w:t xml:space="preserve">LightGBM al inicio</w:t>
-            </w:r>
-          </w:p>
-        </w:tc>
-        <w:tc>
-          <w:tcPr>
-            <w:tcW w:type="dxa" w:w="2256"/>
-            <w:tcMar>
-              <w:top w:type="dxa" w:w="50"/>
-              <w:left w:type="dxa" w:w="80"/>
-              <w:bottom w:type="dxa" w:w="50"/>
-              <w:right w:type="dxa" w:w="80"/>
-            </w:tcMar>
-            <w:vAlign w:val="center"/>
-          </w:tcPr>
-          <w:p>
-            <w:pPr>
-              <w:keepNext/>
-              <w:spacing w:after="0" w:line="240"/>
-              <w:jc w:val="left"/>
-            </w:pPr>
-            <w:r>
-              <w:rPr>
-                <w:rFonts w:ascii="Arial" w:cs="Arial" w:eastAsia="Arial" w:hAnsi="Arial"/>
-                <w:sz w:val="16"/>
-                <w:szCs w:val="16"/>
-              </w:rPr>
-              <w:t xml:space="preserve">Ídem</w:t>
-            </w:r>
-          </w:p>
-        </w:tc>
-        <w:tc>
-          <w:tcPr>
-            <w:tcW w:type="dxa" w:w="1128"/>
-            <w:tcMar>
-              <w:top w:type="dxa" w:w="50"/>
-              <w:left w:type="dxa" w:w="80"/>
-              <w:bottom w:type="dxa" w:w="50"/>
-              <w:right w:type="dxa" w:w="80"/>
-            </w:tcMar>
-            <w:vAlign w:val="center"/>
-          </w:tcPr>
-          <w:p>
-            <w:pPr>
-              <w:keepNext/>
-              <w:spacing w:after="0" w:line="240"/>
-              <w:jc w:val="center"/>
-            </w:pPr>
-            <w:r>
-              <w:rPr>
-                <w:rFonts w:ascii="Arial" w:cs="Arial" w:eastAsia="Arial" w:hAnsi="Arial"/>
-                <w:sz w:val="16"/>
-                <w:szCs w:val="16"/>
-              </w:rPr>
-              <w:t xml:space="preserve">0,733</w:t>
-            </w:r>
-          </w:p>
-        </w:tc>
-        <w:tc>
-          <w:tcPr>
-            <w:tcW w:type="dxa" w:w="1128"/>
-            <w:tcMar>
-              <w:top w:type="dxa" w:w="50"/>
-              <w:left w:type="dxa" w:w="80"/>
-              <w:bottom w:type="dxa" w:w="50"/>
-              <w:right w:type="dxa" w:w="80"/>
-            </w:tcMar>
-            <w:vAlign w:val="center"/>
-          </w:tcPr>
-          <w:p>
-            <w:pPr>
-              <w:keepNext/>
-              <w:spacing w:after="0" w:line="240"/>
-              <w:jc w:val="center"/>
-            </w:pPr>
-            <w:r>
-              <w:rPr>
-                <w:rFonts w:ascii="Arial" w:cs="Arial" w:eastAsia="Arial" w:hAnsi="Arial"/>
-                <w:sz w:val="16"/>
-                <w:szCs w:val="16"/>
-              </w:rPr>
-              <w:t xml:space="preserve">0,759</w:t>
-            </w:r>
-          </w:p>
-        </w:tc>
-        <w:tc>
-          <w:tcPr>
-            <w:tcW w:type="dxa" w:w="1222"/>
-            <w:tcMar>
-              <w:top w:type="dxa" w:w="50"/>
-              <w:left w:type="dxa" w:w="80"/>
-              <w:bottom w:type="dxa" w:w="50"/>
-              <w:right w:type="dxa" w:w="80"/>
-            </w:tcMar>
-            <w:vAlign w:val="center"/>
-          </w:tcPr>
-          <w:p>
-            <w:pPr>
-              <w:keepNext/>
-              <w:spacing w:after="0" w:line="240"/>
-              <w:jc w:val="center"/>
-            </w:pPr>
-            <w:r>
-              <w:rPr>
-                <w:rFonts w:ascii="Arial" w:cs="Arial" w:eastAsia="Arial" w:hAnsi="Arial"/>
-                <w:sz w:val="16"/>
-                <w:szCs w:val="16"/>
-              </w:rPr>
-              <w:t xml:space="preserve">0,524</w:t>
-            </w:r>
-          </w:p>
-        </w:tc>
-        <w:tc>
-          <w:tcPr>
-            <w:tcW w:type="dxa" w:w="1225"/>
-            <w:tcMar>
-              <w:top w:type="dxa" w:w="50"/>
-              <w:left w:type="dxa" w:w="80"/>
-              <w:bottom w:type="dxa" w:w="50"/>
-              <w:right w:type="dxa" w:w="80"/>
-            </w:tcMar>
-            <w:vAlign w:val="center"/>
-          </w:tcPr>
-          <w:p>
-            <w:pPr>
-              <w:keepNext/>
-              <w:spacing w:after="0" w:line="240"/>
-              <w:jc w:val="center"/>
-            </w:pPr>
-            <w:r>
-              <w:rPr>
-                <w:rFonts w:ascii="Arial" w:cs="Arial" w:eastAsia="Arial" w:hAnsi="Arial"/>
-                <w:sz w:val="16"/>
-                <w:szCs w:val="16"/>
-              </w:rPr>
-              <w:t xml:space="preserve">0,742</w:t>
-            </w:r>
-          </w:p>
-        </w:tc>
-      </w:tr>
-      <w:tr>
-        <w:trPr>
-          <w:cantSplit/>
-        </w:trPr>
-        <w:tc>
-          <w:tcPr>
-            <w:tcW w:type="dxa" w:w="2445"/>
-            <w:shd w:fill="F5F8FC" w:color="auto" w:val="clear"/>
-            <w:tcMar>
-              <w:top w:type="dxa" w:w="50"/>
-              <w:left w:type="dxa" w:w="80"/>
-              <w:bottom w:type="dxa" w:w="50"/>
-              <w:right w:type="dxa" w:w="80"/>
-            </w:tcMar>
-            <w:vAlign w:val="center"/>
-          </w:tcPr>
-          <w:p>
-            <w:pPr>
-              <w:keepNext/>
-              <w:spacing w:after="0" w:line="240"/>
-              <w:jc w:val="left"/>
-            </w:pPr>
-            <w:r>
-              <w:rPr>
-                <w:rFonts w:ascii="Arial" w:cs="Arial" w:eastAsia="Arial" w:hAnsi="Arial"/>
-                <w:sz w:val="16"/>
-                <w:szCs w:val="16"/>
-              </w:rPr>
-              <w:t xml:space="preserve">LightGBM al inicio</w:t>
-            </w:r>
-          </w:p>
-        </w:tc>
-        <w:tc>
-          <w:tcPr>
-            <w:tcW w:type="dxa" w:w="2256"/>
-            <w:shd w:fill="F5F8FC" w:color="auto" w:val="clear"/>
-            <w:tcMar>
-              <w:top w:type="dxa" w:w="50"/>
-              <w:left w:type="dxa" w:w="80"/>
-              <w:bottom w:type="dxa" w:w="50"/>
-              <w:right w:type="dxa" w:w="80"/>
-            </w:tcMar>
-            <w:vAlign w:val="center"/>
-          </w:tcPr>
-          <w:p>
-            <w:pPr>
-              <w:keepNext/>
-              <w:spacing w:after="0" w:line="240"/>
-              <w:jc w:val="left"/>
-            </w:pPr>
-            <w:r>
-              <w:rPr>
-                <w:rFonts w:ascii="Arial" w:cs="Arial" w:eastAsia="Arial" w:hAnsi="Arial"/>
-                <w:sz w:val="16"/>
-                <w:szCs w:val="16"/>
-              </w:rPr>
-              <w:t xml:space="preserve">Cortes 2024-01 a 2025-12 (25 063 obs.)</w:t>
-            </w:r>
-          </w:p>
-        </w:tc>
-        <w:tc>
-          <w:tcPr>
-            <w:tcW w:type="dxa" w:w="1128"/>
-            <w:shd w:fill="F5F8FC" w:color="auto" w:val="clear"/>
-            <w:tcMar>
-              <w:top w:type="dxa" w:w="50"/>
-              <w:left w:type="dxa" w:w="80"/>
-              <w:bottom w:type="dxa" w:w="50"/>
-              <w:right w:type="dxa" w:w="80"/>
-            </w:tcMar>
-            <w:vAlign w:val="center"/>
-          </w:tcPr>
-          <w:p>
-            <w:pPr>
-              <w:keepNext/>
-              <w:spacing w:after="0" w:line="240"/>
-              <w:jc w:val="center"/>
-            </w:pPr>
-            <w:r>
-              <w:rPr>
-                <w:rFonts w:ascii="Arial" w:cs="Arial" w:eastAsia="Arial" w:hAnsi="Arial"/>
-                <w:sz w:val="16"/>
-                <w:szCs w:val="16"/>
-              </w:rPr>
-              <w:t xml:space="preserve">0,723</w:t>
-            </w:r>
-          </w:p>
-        </w:tc>
-        <w:tc>
-          <w:tcPr>
-            <w:tcW w:type="dxa" w:w="1128"/>
-            <w:shd w:fill="F5F8FC" w:color="auto" w:val="clear"/>
-            <w:tcMar>
-              <w:top w:type="dxa" w:w="50"/>
-              <w:left w:type="dxa" w:w="80"/>
-              <w:bottom w:type="dxa" w:w="50"/>
-              <w:right w:type="dxa" w:w="80"/>
-            </w:tcMar>
-            <w:vAlign w:val="center"/>
-          </w:tcPr>
-          <w:p>
-            <w:pPr>
-              <w:keepNext/>
-              <w:spacing w:after="0" w:line="240"/>
-              <w:jc w:val="center"/>
-            </w:pPr>
-            <w:r>
-              <w:rPr>
-                <w:rFonts w:ascii="Arial" w:cs="Arial" w:eastAsia="Arial" w:hAnsi="Arial"/>
-                <w:sz w:val="16"/>
-                <w:szCs w:val="16"/>
-              </w:rPr>
-              <w:t xml:space="preserve">0,831</w:t>
-            </w:r>
-          </w:p>
-        </w:tc>
-        <w:tc>
-          <w:tcPr>
-            <w:tcW w:type="dxa" w:w="1222"/>
-            <w:shd w:fill="F5F8FC" w:color="auto" w:val="clear"/>
-            <w:tcMar>
-              <w:top w:type="dxa" w:w="50"/>
-              <w:left w:type="dxa" w:w="80"/>
-              <w:bottom w:type="dxa" w:w="50"/>
-              <w:right w:type="dxa" w:w="80"/>
-            </w:tcMar>
-            <w:vAlign w:val="center"/>
-          </w:tcPr>
-          <w:p>
-            <w:pPr>
-              <w:keepNext/>
-              <w:spacing w:after="0" w:line="240"/>
-              <w:jc w:val="center"/>
-            </w:pPr>
-            <w:r>
-              <w:rPr>
-                <w:rFonts w:ascii="Arial" w:cs="Arial" w:eastAsia="Arial" w:hAnsi="Arial"/>
-                <w:sz w:val="16"/>
-                <w:szCs w:val="16"/>
-              </w:rPr>
-              <w:t xml:space="preserve">0,649</w:t>
-            </w:r>
-          </w:p>
-        </w:tc>
-        <w:tc>
-          <w:tcPr>
-            <w:tcW w:type="dxa" w:w="1225"/>
-            <w:shd w:fill="F5F8FC" w:color="auto" w:val="clear"/>
-            <w:tcMar>
-              <w:top w:type="dxa" w:w="50"/>
-              <w:left w:type="dxa" w:w="80"/>
-              <w:bottom w:type="dxa" w:w="50"/>
-              <w:right w:type="dxa" w:w="80"/>
-            </w:tcMar>
-            <w:vAlign w:val="center"/>
-          </w:tcPr>
-          <w:p>
-            <w:pPr>
-              <w:keepNext/>
-              <w:spacing w:after="0" w:line="240"/>
-              <w:jc w:val="center"/>
-            </w:pPr>
-            <w:r>
-              <w:rPr>
-                <w:rFonts w:ascii="Arial" w:cs="Arial" w:eastAsia="Arial" w:hAnsi="Arial"/>
-                <w:sz w:val="16"/>
-                <w:szCs w:val="16"/>
-              </w:rPr>
-              <w:t xml:space="preserve">0,736</w:t>
-            </w:r>
-          </w:p>
-        </w:tc>
-      </w:tr>
-      <w:tr>
-        <w:trPr>
-          <w:cantSplit/>
-        </w:trPr>
-        <w:tc>
-          <w:tcPr>
-            <w:tcW w:type="dxa" w:w="2445"/>
-            <w:tcMar>
-              <w:top w:type="dxa" w:w="50"/>
-              <w:left w:type="dxa" w:w="80"/>
-              <w:bottom w:type="dxa" w:w="50"/>
-              <w:right w:type="dxa" w:w="80"/>
-            </w:tcMar>
-            <w:vAlign w:val="center"/>
-          </w:tcPr>
-          <w:p>
-            <w:pPr>
-              <w:keepNext/>
-              <w:spacing w:after="0" w:line="240"/>
-              <w:jc w:val="left"/>
-            </w:pPr>
-            <w:r>
-              <w:rPr>
-                <w:rFonts w:ascii="Arial" w:cs="Arial" w:eastAsia="Arial" w:hAnsi="Arial"/>
-                <w:sz w:val="16"/>
-                <w:szCs w:val="16"/>
-              </w:rPr>
-              <w:t xml:space="preserve">LightGBM de seguimiento (SIAF)</w:t>
-            </w:r>
-          </w:p>
-        </w:tc>
-        <w:tc>
-          <w:tcPr>
-            <w:tcW w:type="dxa" w:w="2256"/>
-            <w:tcMar>
-              <w:top w:type="dxa" w:w="50"/>
-              <w:left w:type="dxa" w:w="80"/>
-              <w:bottom w:type="dxa" w:w="50"/>
-              <w:right w:type="dxa" w:w="80"/>
-            </w:tcMar>
-            <w:vAlign w:val="center"/>
-          </w:tcPr>
-          <w:p>
-            <w:pPr>
-              <w:keepNext/>
-              <w:spacing w:after="0" w:line="240"/>
-              <w:jc w:val="left"/>
-            </w:pPr>
-            <w:r>
-              <w:rPr>
-                <w:rFonts w:ascii="Arial" w:cs="Arial" w:eastAsia="Arial" w:hAnsi="Arial"/>
-                <w:sz w:val="16"/>
-                <w:szCs w:val="16"/>
-              </w:rPr>
-              <w:t xml:space="preserve">Ídem</w:t>
-            </w:r>
-          </w:p>
-        </w:tc>
-        <w:tc>
-          <w:tcPr>
-            <w:tcW w:type="dxa" w:w="1128"/>
-            <w:tcMar>
-              <w:top w:type="dxa" w:w="50"/>
-              <w:left w:type="dxa" w:w="80"/>
-              <w:bottom w:type="dxa" w:w="50"/>
-              <w:right w:type="dxa" w:w="80"/>
-            </w:tcMar>
-            <w:vAlign w:val="center"/>
-          </w:tcPr>
-          <w:p>
-            <w:pPr>
-              <w:keepNext/>
-              <w:spacing w:after="0" w:line="240"/>
-              <w:jc w:val="center"/>
-            </w:pPr>
-            <w:r>
-              <w:rPr>
-                <w:rFonts w:ascii="Arial" w:cs="Arial" w:eastAsia="Arial" w:hAnsi="Arial"/>
-                <w:sz w:val="16"/>
-                <w:szCs w:val="16"/>
-              </w:rPr>
-              <w:t xml:space="preserve">0,753</w:t>
-            </w:r>
-          </w:p>
-        </w:tc>
-        <w:tc>
-          <w:tcPr>
-            <w:tcW w:type="dxa" w:w="1128"/>
-            <w:tcMar>
-              <w:top w:type="dxa" w:w="50"/>
-              <w:left w:type="dxa" w:w="80"/>
-              <w:bottom w:type="dxa" w:w="50"/>
-              <w:right w:type="dxa" w:w="80"/>
-            </w:tcMar>
-            <w:vAlign w:val="center"/>
-          </w:tcPr>
-          <w:p>
-            <w:pPr>
-              <w:keepNext/>
-              <w:spacing w:after="0" w:line="240"/>
-              <w:jc w:val="center"/>
-            </w:pPr>
-            <w:r>
-              <w:rPr>
-                <w:rFonts w:ascii="Arial" w:cs="Arial" w:eastAsia="Arial" w:hAnsi="Arial"/>
-                <w:sz w:val="16"/>
-                <w:szCs w:val="16"/>
-              </w:rPr>
-              <w:t xml:space="preserve">0,855</w:t>
-            </w:r>
-          </w:p>
-        </w:tc>
-        <w:tc>
-          <w:tcPr>
-            <w:tcW w:type="dxa" w:w="1222"/>
-            <w:tcMar>
-              <w:top w:type="dxa" w:w="50"/>
-              <w:left w:type="dxa" w:w="80"/>
-              <w:bottom w:type="dxa" w:w="50"/>
-              <w:right w:type="dxa" w:w="80"/>
-            </w:tcMar>
-            <w:vAlign w:val="center"/>
-          </w:tcPr>
-          <w:p>
-            <w:pPr>
-              <w:keepNext/>
-              <w:spacing w:after="0" w:line="240"/>
-              <w:jc w:val="center"/>
-            </w:pPr>
-            <w:r>
-              <w:rPr>
-                <w:rFonts w:ascii="Arial" w:cs="Arial" w:eastAsia="Arial" w:hAnsi="Arial"/>
-                <w:sz w:val="16"/>
-                <w:szCs w:val="16"/>
-              </w:rPr>
-              <w:t xml:space="preserve">0,649</w:t>
-            </w:r>
-          </w:p>
-        </w:tc>
-        <w:tc>
-          <w:tcPr>
-            <w:tcW w:type="dxa" w:w="1225"/>
-            <w:tcMar>
-              <w:top w:type="dxa" w:w="50"/>
-              <w:left w:type="dxa" w:w="80"/>
-              <w:bottom w:type="dxa" w:w="50"/>
-              <w:right w:type="dxa" w:w="80"/>
-            </w:tcMar>
-            <w:vAlign w:val="center"/>
-          </w:tcPr>
-          <w:p>
-            <w:pPr>
-              <w:keepNext/>
-              <w:spacing w:after="0" w:line="240"/>
-              <w:jc w:val="center"/>
-            </w:pPr>
-            <w:r>
-              <w:rPr>
-                <w:rFonts w:ascii="Arial" w:cs="Arial" w:eastAsia="Arial" w:hAnsi="Arial"/>
-                <w:sz w:val="16"/>
-                <w:szCs w:val="16"/>
-              </w:rPr>
-              <w:t xml:space="preserve">0,763</w:t>
-            </w:r>
-          </w:p>
-        </w:tc>
-      </w:tr>
-    </w:tbl>
-    <w:p>
-      <w:pPr>
-        <w:spacing w:after="60"/>
-      </w:pPr>
-      <w:r>
-        <w:rPr>
-          <w:rFonts w:ascii="Arial" w:cs="Arial" w:eastAsia="Arial" w:hAnsi="Arial"/>
-          <w:i/>
-          <w:iCs/>
-          <w:sz w:val="16"/>
-          <w:szCs w:val="16"/>
-        </w:rPr>
-        <w:t xml:space="preserve">Nota: Fuente: artifacts/exante/resultados_y_30.json y resultados_seguimiento.json. Bootstrap por entidad (300 remuestreos).</w:t>
+        <w:t xml:space="preserve">En la evaluación rolling-origin (Fig. 9), B superó a A en ROC-AUC en los cuatro orígenes y en PR-AUC en tres de cuatro (en el origen de marzo de 2026, 0,152 frente a 0,159). Con cinco semillas, el PR-AUC nacional fue 0,138 ± 0,002 (A) frente a 0,162 ± 0,004 (B), y el ROC-AUC 0,742 ± 0,003 frente a 0,772 ± 0,003: la brecha es varias veces mayor que la variación por semilla.</w:t>
       </w:r>
     </w:p>
     <w:p>
@@ -11444,9 +9943,9 @@
       <w:r>
         <w:drawing>
           <wp:inline distT="0" distB="0" distL="0" distR="0">
-            <wp:extent cx="5810250" cy="2343150"/>
+            <wp:extent cx="5810250" cy="2200275"/>
             <wp:effectExtent t="0" r="0" b="0" l="0"/>
-            <wp:docPr id="1" name="calibracion" descr="Tasa de retraso significativo observada por nivel de riesgo en el periodo de prueba de la cartera INFOBRAS." title="Figura 9"/>
+            <wp:docPr id="1" name="rolling" descr="Evaluación rolling-origin nacional (H = 60): cada punto es un modelo reentrenado con datos hasta el origen y probado en los tres meses siguientes." title="Figura 9"/>
             <wp:cNvGraphicFramePr>
               <a:graphicFrameLocks xmlns:a="http://schemas.openxmlformats.org/drawingml/2006/main" noChangeAspect="1"/>
             </wp:cNvGraphicFramePr>
@@ -11469,7 +9968,7 @@
                   <pic:spPr bwMode="auto">
                     <a:xfrm>
                       <a:off x="0" y="0"/>
-                      <a:ext cx="5810250" cy="2343150"/>
+                      <a:ext cx="5810250" cy="2200275"/>
                     </a:xfrm>
                     <a:prstGeom prst="rect">
                       <a:avLst/>
@@ -11503,7 +10002,7 @@
           <w:sz w:val="18"/>
           <w:szCs w:val="18"/>
         </w:rPr>
-        <w:t xml:space="preserve">Tasa de retraso significativo observada por nivel de riesgo en el periodo de prueba de la cartera INFOBRAS.</w:t>
+        <w:t xml:space="preserve">Evaluación rolling-origin nacional (H = 60): cada punto es un modelo reentrenado con datos hasta el origen y probado en los tres meses siguientes.</w:t>
       </w:r>
     </w:p>
     <w:p>
@@ -11514,10 +10013,38 @@
       <w:r>
         <w:rPr>
           <w:rFonts w:ascii="Arial" w:cs="Arial" w:eastAsia="Arial" w:hAnsi="Arial"/>
+          <w:b/>
+          <w:bCs/>
           <w:sz w:val="21"/>
           <w:szCs w:val="21"/>
         </w:rPr>
-        <w:t xml:space="preserve">El análisis de sensibilidad de la etiqueta (Fig. 10) muestra que LightGBM supera a la regla en todos los umbrales (ROC-AUC 0,762, 0,733, 0,721 y 0,705 para 10, 30, 50 y 100 % del plazo; diferencias con IC que excluyen el cero). La ablación del nombre de la obra no cambió el resultado (ROC-AUC 0,732 sin texto frente a 0,733).</w:t>
+        <w:t xml:space="preserve">Calibración.</w:t>
+      </w:r>
+      <w:r>
+        <w:rPr>
+          <w:rFonts w:ascii="Arial" w:cs="Arial" w:eastAsia="Arial" w:hAnsi="Arial"/>
+          <w:sz w:val="21"/>
+          <w:szCs w:val="21"/>
+        </w:rPr>
+        <w:t xml:space="preserve"> En el backtest </w:t>
+      </w:r>
+      <w:r>
+        <w:rPr>
+          <w:rFonts w:ascii="Arial" w:cs="Arial" w:eastAsia="Arial" w:hAnsi="Arial"/>
+          <w:i/>
+          <w:iCs/>
+          <w:sz w:val="21"/>
+          <w:szCs w:val="21"/>
+        </w:rPr>
+        <w:t xml:space="preserve">as-of</w:t>
+      </w:r>
+      <w:r>
+        <w:rPr>
+          <w:rFonts w:ascii="Arial" w:cs="Arial" w:eastAsia="Arial" w:hAnsi="Arial"/>
+          <w:sz w:val="21"/>
+          <w:szCs w:val="21"/>
+        </w:rPr>
+        <w:t xml:space="preserve"> (39 038 observaciones obra-mes con resultado conocido), la probabilidad media estimada y la tasa observada del evento coinciden en los diez deciles de riesgo (Fig. 10): 1,5 % frente a 1,1 % en el decil inferior y 20,0 % frente a 17,7 % en el superior. Por nivel, el evento ocurrió en 17,6 % de las observaciones en nivel alto, 8,5 % en nivel medio y 3,1 % en nivel bajo, frente a una tasa promedio de 5,6 %. Estas tasas son las que la interfaz muestra como confiabilidad de cada nivel.</w:t>
       </w:r>
     </w:p>
     <w:p>
@@ -11531,7 +10058,7 @@
           <wp:inline distT="0" distB="0" distL="0" distR="0">
             <wp:extent cx="5810250" cy="2266950"/>
             <wp:effectExtent t="0" r="0" b="0" l="0"/>
-            <wp:docPr id="1" name="sensibilidad" descr="Sensibilidad del modelo de cartera al umbral que define el retraso significativo." title="Figura 10"/>
+            <wp:docPr id="1" name="calibracion_alerta" descr="Calibración del modelo de alerta en el backtest as-of: (a) probabilidad estimada media frente a tasa observada por decil; (b) tasa observada por nivel de riesgo." title="Figura 10"/>
             <wp:cNvGraphicFramePr>
               <a:graphicFrameLocks xmlns:a="http://schemas.openxmlformats.org/drawingml/2006/main" noChangeAspect="1"/>
             </wp:cNvGraphicFramePr>
@@ -11588,6 +10115,1621 @@
           <w:sz w:val="18"/>
           <w:szCs w:val="18"/>
         </w:rPr>
+        <w:t xml:space="preserve">Calibración del modelo de alerta en el backtest as-of: (a) probabilidad estimada media frente a tasa observada por decil; (b) tasa observada por nivel de riesgo.</w:t>
+      </w:r>
+    </w:p>
+    <w:p>
+      <w:pPr>
+        <w:spacing w:after="120" w:line="264"/>
+        <w:jc w:val="both"/>
+      </w:pPr>
+      <w:r>
+        <w:rPr>
+          <w:rFonts w:ascii="Arial" w:cs="Arial" w:eastAsia="Arial" w:hAnsi="Arial"/>
+          <w:b/>
+          <w:bCs/>
+          <w:sz w:val="21"/>
+          <w:szCs w:val="21"/>
+        </w:rPr>
+        <w:t xml:space="preserve">Modelos de cartera.</w:t>
+      </w:r>
+      <w:r>
+        <w:rPr>
+          <w:rFonts w:ascii="Arial" w:cs="Arial" w:eastAsia="Arial" w:hAnsi="Arial"/>
+          <w:sz w:val="21"/>
+          <w:szCs w:val="21"/>
+        </w:rPr>
+        <w:t xml:space="preserve"> La Tabla 6 resume la prueba temporal. Al inicio de la obra, LightGBM alcanzó ROC-AUC de 0,733 frente a 0,658 de la regla basada en el historial de la entidad (diferencia +0,075; IC 95 % [0,063; 0,086]). Con el seguimiento mensual del SIAF, el ROC-AUC subió de 0,723 a 0,753 sobre la misma muestra (+0,030; IC 95 % [0,026; 0,033]). La Fig. 11 muestra que los niveles de riesgo separan efectivamente las tasas de retraso observadas.</w:t>
+      </w:r>
+    </w:p>
+    <w:p>
+      <w:pPr>
+        <w:keepNext/>
+        <w:spacing w:after="80" w:before="160"/>
+        <w:jc w:val="center"/>
+      </w:pPr>
+      <w:r>
+        <w:rPr>
+          <w:rFonts w:ascii="Arial" w:cs="Arial" w:eastAsia="Arial" w:hAnsi="Arial"/>
+          <w:b/>
+          <w:bCs/>
+          <w:sz w:val="18"/>
+          <w:szCs w:val="18"/>
+        </w:rPr>
+        <w:t xml:space="preserve">Tabla 6. </w:t>
+      </w:r>
+      <w:r>
+        <w:rPr>
+          <w:rFonts w:ascii="Arial" w:cs="Arial" w:eastAsia="Arial" w:hAnsi="Arial"/>
+          <w:sz w:val="18"/>
+          <w:szCs w:val="18"/>
+        </w:rPr>
+        <w:t xml:space="preserve">Modelos de la cartera INFOBRAS: resultados en la prueba temporal nacional</w:t>
+      </w:r>
+    </w:p>
+    <w:tbl>
+      <w:tblPr>
+        <w:tblW w:type="dxa" w:w="9404"/>
+        <w:tblBorders>
+          <w:top w:val="single" w:color="8EAADB" w:sz="4"/>
+          <w:left w:val="single" w:color="8EAADB" w:sz="4"/>
+          <w:bottom w:val="single" w:color="8EAADB" w:sz="4"/>
+          <w:right w:val="single" w:color="8EAADB" w:sz="4"/>
+          <w:insideH w:val="single" w:color="8EAADB" w:sz="4"/>
+          <w:insideV w:val="single" w:color="8EAADB" w:sz="4"/>
+        </w:tblBorders>
+        <w:tblLayout w:type="fixed"/>
+      </w:tblPr>
+      <w:tblGrid>
+        <w:gridCol w:w="2445"/>
+        <w:gridCol w:w="2256"/>
+        <w:gridCol w:w="1128"/>
+        <w:gridCol w:w="1128"/>
+        <w:gridCol w:w="1222"/>
+        <w:gridCol w:w="1225"/>
+      </w:tblGrid>
+      <w:tr>
+        <w:trPr>
+          <w:cantSplit/>
+          <w:tblHeader/>
+        </w:trPr>
+        <w:tc>
+          <w:tcPr>
+            <w:tcW w:type="dxa" w:w="2445"/>
+            <w:shd w:fill="DCE6F1" w:color="auto" w:val="clear"/>
+            <w:tcMar>
+              <w:top w:type="dxa" w:w="50"/>
+              <w:left w:type="dxa" w:w="80"/>
+              <w:bottom w:type="dxa" w:w="50"/>
+              <w:right w:type="dxa" w:w="80"/>
+            </w:tcMar>
+            <w:vAlign w:val="center"/>
+          </w:tcPr>
+          <w:p>
+            <w:pPr>
+              <w:keepNext/>
+              <w:spacing w:after="0" w:line="240"/>
+              <w:jc w:val="center"/>
+            </w:pPr>
+            <w:r>
+              <w:rPr>
+                <w:rFonts w:ascii="Arial" w:cs="Arial" w:eastAsia="Arial" w:hAnsi="Arial"/>
+                <w:b/>
+                <w:bCs/>
+                <w:sz w:val="16"/>
+                <w:szCs w:val="16"/>
+              </w:rPr>
+              <w:t xml:space="preserve">Modelo</w:t>
+            </w:r>
+          </w:p>
+        </w:tc>
+        <w:tc>
+          <w:tcPr>
+            <w:tcW w:type="dxa" w:w="2256"/>
+            <w:shd w:fill="DCE6F1" w:color="auto" w:val="clear"/>
+            <w:tcMar>
+              <w:top w:type="dxa" w:w="50"/>
+              <w:left w:type="dxa" w:w="80"/>
+              <w:bottom w:type="dxa" w:w="50"/>
+              <w:right w:type="dxa" w:w="80"/>
+            </w:tcMar>
+            <w:vAlign w:val="center"/>
+          </w:tcPr>
+          <w:p>
+            <w:pPr>
+              <w:keepNext/>
+              <w:spacing w:after="0" w:line="240"/>
+              <w:jc w:val="center"/>
+            </w:pPr>
+            <w:r>
+              <w:rPr>
+                <w:rFonts w:ascii="Arial" w:cs="Arial" w:eastAsia="Arial" w:hAnsi="Arial"/>
+                <w:b/>
+                <w:bCs/>
+                <w:sz w:val="16"/>
+                <w:szCs w:val="16"/>
+              </w:rPr>
+              <w:t xml:space="preserve">Prueba</w:t>
+            </w:r>
+          </w:p>
+        </w:tc>
+        <w:tc>
+          <w:tcPr>
+            <w:tcW w:type="dxa" w:w="1128"/>
+            <w:shd w:fill="DCE6F1" w:color="auto" w:val="clear"/>
+            <w:tcMar>
+              <w:top w:type="dxa" w:w="50"/>
+              <w:left w:type="dxa" w:w="80"/>
+              <w:bottom w:type="dxa" w:w="50"/>
+              <w:right w:type="dxa" w:w="80"/>
+            </w:tcMar>
+            <w:vAlign w:val="center"/>
+          </w:tcPr>
+          <w:p>
+            <w:pPr>
+              <w:keepNext/>
+              <w:spacing w:after="0" w:line="240"/>
+              <w:jc w:val="center"/>
+            </w:pPr>
+            <w:r>
+              <w:rPr>
+                <w:rFonts w:ascii="Arial" w:cs="Arial" w:eastAsia="Arial" w:hAnsi="Arial"/>
+                <w:b/>
+                <w:bCs/>
+                <w:sz w:val="16"/>
+                <w:szCs w:val="16"/>
+              </w:rPr>
+              <w:t xml:space="preserve">ROC-AUC</w:t>
+            </w:r>
+          </w:p>
+        </w:tc>
+        <w:tc>
+          <w:tcPr>
+            <w:tcW w:type="dxa" w:w="1128"/>
+            <w:shd w:fill="DCE6F1" w:color="auto" w:val="clear"/>
+            <w:tcMar>
+              <w:top w:type="dxa" w:w="50"/>
+              <w:left w:type="dxa" w:w="80"/>
+              <w:bottom w:type="dxa" w:w="50"/>
+              <w:right w:type="dxa" w:w="80"/>
+            </w:tcMar>
+            <w:vAlign w:val="center"/>
+          </w:tcPr>
+          <w:p>
+            <w:pPr>
+              <w:keepNext/>
+              <w:spacing w:after="0" w:line="240"/>
+              <w:jc w:val="center"/>
+            </w:pPr>
+            <w:r>
+              <w:rPr>
+                <w:rFonts w:ascii="Arial" w:cs="Arial" w:eastAsia="Arial" w:hAnsi="Arial"/>
+                <w:b/>
+                <w:bCs/>
+                <w:sz w:val="16"/>
+                <w:szCs w:val="16"/>
+              </w:rPr>
+              <w:t xml:space="preserve">PR-AUC</w:t>
+            </w:r>
+          </w:p>
+        </w:tc>
+        <w:tc>
+          <w:tcPr>
+            <w:tcW w:type="dxa" w:w="1222"/>
+            <w:shd w:fill="DCE6F1" w:color="auto" w:val="clear"/>
+            <w:tcMar>
+              <w:top w:type="dxa" w:w="50"/>
+              <w:left w:type="dxa" w:w="80"/>
+              <w:bottom w:type="dxa" w:w="50"/>
+              <w:right w:type="dxa" w:w="80"/>
+            </w:tcMar>
+            <w:vAlign w:val="center"/>
+          </w:tcPr>
+          <w:p>
+            <w:pPr>
+              <w:keepNext/>
+              <w:spacing w:after="0" w:line="240"/>
+              <w:jc w:val="center"/>
+            </w:pPr>
+            <w:r>
+              <w:rPr>
+                <w:rFonts w:ascii="Arial" w:cs="Arial" w:eastAsia="Arial" w:hAnsi="Arial"/>
+                <w:b/>
+                <w:bCs/>
+                <w:sz w:val="16"/>
+                <w:szCs w:val="16"/>
+              </w:rPr>
+              <w:t xml:space="preserve">Prevalencia</w:t>
+            </w:r>
+          </w:p>
+        </w:tc>
+        <w:tc>
+          <w:tcPr>
+            <w:tcW w:type="dxa" w:w="1225"/>
+            <w:shd w:fill="DCE6F1" w:color="auto" w:val="clear"/>
+            <w:tcMar>
+              <w:top w:type="dxa" w:w="50"/>
+              <w:left w:type="dxa" w:w="80"/>
+              <w:bottom w:type="dxa" w:w="50"/>
+              <w:right w:type="dxa" w:w="80"/>
+            </w:tcMar>
+            <w:vAlign w:val="center"/>
+          </w:tcPr>
+          <w:p>
+            <w:pPr>
+              <w:keepNext/>
+              <w:spacing w:after="0" w:line="240"/>
+              <w:jc w:val="center"/>
+            </w:pPr>
+            <w:r>
+              <w:rPr>
+                <w:rFonts w:ascii="Arial" w:cs="Arial" w:eastAsia="Arial" w:hAnsi="Arial"/>
+                <w:b/>
+                <w:bCs/>
+                <w:sz w:val="16"/>
+                <w:szCs w:val="16"/>
+              </w:rPr>
+              <w:t xml:space="preserve">ROC-AUC Arequipa</w:t>
+            </w:r>
+          </w:p>
+        </w:tc>
+      </w:tr>
+      <w:tr>
+        <w:trPr>
+          <w:cantSplit/>
+        </w:trPr>
+        <w:tc>
+          <w:tcPr>
+            <w:tcW w:type="dxa" w:w="2445"/>
+            <w:tcMar>
+              <w:top w:type="dxa" w:w="50"/>
+              <w:left w:type="dxa" w:w="80"/>
+              <w:bottom w:type="dxa" w:w="50"/>
+              <w:right w:type="dxa" w:w="80"/>
+            </w:tcMar>
+            <w:vAlign w:val="center"/>
+          </w:tcPr>
+          <w:p>
+            <w:pPr>
+              <w:keepNext/>
+              <w:spacing w:after="0" w:line="240"/>
+              <w:jc w:val="left"/>
+            </w:pPr>
+            <w:r>
+              <w:rPr>
+                <w:rFonts w:ascii="Arial" w:cs="Arial" w:eastAsia="Arial" w:hAnsi="Arial"/>
+                <w:sz w:val="16"/>
+                <w:szCs w:val="16"/>
+              </w:rPr>
+              <w:t xml:space="preserve">Regla: historial de la entidad</w:t>
+            </w:r>
+          </w:p>
+        </w:tc>
+        <w:tc>
+          <w:tcPr>
+            <w:tcW w:type="dxa" w:w="2256"/>
+            <w:tcMar>
+              <w:top w:type="dxa" w:w="50"/>
+              <w:left w:type="dxa" w:w="80"/>
+              <w:bottom w:type="dxa" w:w="50"/>
+              <w:right w:type="dxa" w:w="80"/>
+            </w:tcMar>
+            <w:vAlign w:val="center"/>
+          </w:tcPr>
+          <w:p>
+            <w:pPr>
+              <w:keepNext/>
+              <w:spacing w:after="0" w:line="240"/>
+              <w:jc w:val="left"/>
+            </w:pPr>
+            <w:r>
+              <w:rPr>
+                <w:rFonts w:ascii="Arial" w:cs="Arial" w:eastAsia="Arial" w:hAnsi="Arial"/>
+                <w:sz w:val="16"/>
+                <w:szCs w:val="16"/>
+              </w:rPr>
+              <w:t xml:space="preserve">Inicios 2022-01 a 2024-06 (26 025 obras)</w:t>
+            </w:r>
+          </w:p>
+        </w:tc>
+        <w:tc>
+          <w:tcPr>
+            <w:tcW w:type="dxa" w:w="1128"/>
+            <w:tcMar>
+              <w:top w:type="dxa" w:w="50"/>
+              <w:left w:type="dxa" w:w="80"/>
+              <w:bottom w:type="dxa" w:w="50"/>
+              <w:right w:type="dxa" w:w="80"/>
+            </w:tcMar>
+            <w:vAlign w:val="center"/>
+          </w:tcPr>
+          <w:p>
+            <w:pPr>
+              <w:keepNext/>
+              <w:spacing w:after="0" w:line="240"/>
+              <w:jc w:val="center"/>
+            </w:pPr>
+            <w:r>
+              <w:rPr>
+                <w:rFonts w:ascii="Arial" w:cs="Arial" w:eastAsia="Arial" w:hAnsi="Arial"/>
+                <w:sz w:val="16"/>
+                <w:szCs w:val="16"/>
+              </w:rPr>
+              <w:t xml:space="preserve">0,658</w:t>
+            </w:r>
+          </w:p>
+        </w:tc>
+        <w:tc>
+          <w:tcPr>
+            <w:tcW w:type="dxa" w:w="1128"/>
+            <w:tcMar>
+              <w:top w:type="dxa" w:w="50"/>
+              <w:left w:type="dxa" w:w="80"/>
+              <w:bottom w:type="dxa" w:w="50"/>
+              <w:right w:type="dxa" w:w="80"/>
+            </w:tcMar>
+            <w:vAlign w:val="center"/>
+          </w:tcPr>
+          <w:p>
+            <w:pPr>
+              <w:keepNext/>
+              <w:spacing w:after="0" w:line="240"/>
+              <w:jc w:val="center"/>
+            </w:pPr>
+            <w:r>
+              <w:rPr>
+                <w:rFonts w:ascii="Arial" w:cs="Arial" w:eastAsia="Arial" w:hAnsi="Arial"/>
+                <w:sz w:val="16"/>
+                <w:szCs w:val="16"/>
+              </w:rPr>
+              <w:t xml:space="preserve">0,690</w:t>
+            </w:r>
+          </w:p>
+        </w:tc>
+        <w:tc>
+          <w:tcPr>
+            <w:tcW w:type="dxa" w:w="1222"/>
+            <w:tcMar>
+              <w:top w:type="dxa" w:w="50"/>
+              <w:left w:type="dxa" w:w="80"/>
+              <w:bottom w:type="dxa" w:w="50"/>
+              <w:right w:type="dxa" w:w="80"/>
+            </w:tcMar>
+            <w:vAlign w:val="center"/>
+          </w:tcPr>
+          <w:p>
+            <w:pPr>
+              <w:keepNext/>
+              <w:spacing w:after="0" w:line="240"/>
+              <w:jc w:val="center"/>
+            </w:pPr>
+            <w:r>
+              <w:rPr>
+                <w:rFonts w:ascii="Arial" w:cs="Arial" w:eastAsia="Arial" w:hAnsi="Arial"/>
+                <w:sz w:val="16"/>
+                <w:szCs w:val="16"/>
+              </w:rPr>
+              <w:t xml:space="preserve">0,524</w:t>
+            </w:r>
+          </w:p>
+        </w:tc>
+        <w:tc>
+          <w:tcPr>
+            <w:tcW w:type="dxa" w:w="1225"/>
+            <w:tcMar>
+              <w:top w:type="dxa" w:w="50"/>
+              <w:left w:type="dxa" w:w="80"/>
+              <w:bottom w:type="dxa" w:w="50"/>
+              <w:right w:type="dxa" w:w="80"/>
+            </w:tcMar>
+            <w:vAlign w:val="center"/>
+          </w:tcPr>
+          <w:p>
+            <w:pPr>
+              <w:keepNext/>
+              <w:spacing w:after="0" w:line="240"/>
+              <w:jc w:val="center"/>
+            </w:pPr>
+            <w:r>
+              <w:rPr>
+                <w:rFonts w:ascii="Arial" w:cs="Arial" w:eastAsia="Arial" w:hAnsi="Arial"/>
+                <w:sz w:val="16"/>
+                <w:szCs w:val="16"/>
+              </w:rPr>
+              <w:t xml:space="preserve">0,661</w:t>
+            </w:r>
+          </w:p>
+        </w:tc>
+      </w:tr>
+      <w:tr>
+        <w:trPr>
+          <w:cantSplit/>
+        </w:trPr>
+        <w:tc>
+          <w:tcPr>
+            <w:tcW w:type="dxa" w:w="2445"/>
+            <w:shd w:fill="F5F8FC" w:color="auto" w:val="clear"/>
+            <w:tcMar>
+              <w:top w:type="dxa" w:w="50"/>
+              <w:left w:type="dxa" w:w="80"/>
+              <w:bottom w:type="dxa" w:w="50"/>
+              <w:right w:type="dxa" w:w="80"/>
+            </w:tcMar>
+            <w:vAlign w:val="center"/>
+          </w:tcPr>
+          <w:p>
+            <w:pPr>
+              <w:keepNext/>
+              <w:spacing w:after="0" w:line="240"/>
+              <w:jc w:val="left"/>
+            </w:pPr>
+            <w:r>
+              <w:rPr>
+                <w:rFonts w:ascii="Arial" w:cs="Arial" w:eastAsia="Arial" w:hAnsi="Arial"/>
+                <w:sz w:val="16"/>
+                <w:szCs w:val="16"/>
+              </w:rPr>
+              <w:t xml:space="preserve">Regresión logística</w:t>
+            </w:r>
+          </w:p>
+        </w:tc>
+        <w:tc>
+          <w:tcPr>
+            <w:tcW w:type="dxa" w:w="2256"/>
+            <w:shd w:fill="F5F8FC" w:color="auto" w:val="clear"/>
+            <w:tcMar>
+              <w:top w:type="dxa" w:w="50"/>
+              <w:left w:type="dxa" w:w="80"/>
+              <w:bottom w:type="dxa" w:w="50"/>
+              <w:right w:type="dxa" w:w="80"/>
+            </w:tcMar>
+            <w:vAlign w:val="center"/>
+          </w:tcPr>
+          <w:p>
+            <w:pPr>
+              <w:keepNext/>
+              <w:spacing w:after="0" w:line="240"/>
+              <w:jc w:val="left"/>
+            </w:pPr>
+            <w:r>
+              <w:rPr>
+                <w:rFonts w:ascii="Arial" w:cs="Arial" w:eastAsia="Arial" w:hAnsi="Arial"/>
+                <w:sz w:val="16"/>
+                <w:szCs w:val="16"/>
+              </w:rPr>
+              <w:t xml:space="preserve">Ídem</w:t>
+            </w:r>
+          </w:p>
+        </w:tc>
+        <w:tc>
+          <w:tcPr>
+            <w:tcW w:type="dxa" w:w="1128"/>
+            <w:shd w:fill="F5F8FC" w:color="auto" w:val="clear"/>
+            <w:tcMar>
+              <w:top w:type="dxa" w:w="50"/>
+              <w:left w:type="dxa" w:w="80"/>
+              <w:bottom w:type="dxa" w:w="50"/>
+              <w:right w:type="dxa" w:w="80"/>
+            </w:tcMar>
+            <w:vAlign w:val="center"/>
+          </w:tcPr>
+          <w:p>
+            <w:pPr>
+              <w:keepNext/>
+              <w:spacing w:after="0" w:line="240"/>
+              <w:jc w:val="center"/>
+            </w:pPr>
+            <w:r>
+              <w:rPr>
+                <w:rFonts w:ascii="Arial" w:cs="Arial" w:eastAsia="Arial" w:hAnsi="Arial"/>
+                <w:sz w:val="16"/>
+                <w:szCs w:val="16"/>
+              </w:rPr>
+              <w:t xml:space="preserve">0,718</w:t>
+            </w:r>
+          </w:p>
+        </w:tc>
+        <w:tc>
+          <w:tcPr>
+            <w:tcW w:type="dxa" w:w="1128"/>
+            <w:shd w:fill="F5F8FC" w:color="auto" w:val="clear"/>
+            <w:tcMar>
+              <w:top w:type="dxa" w:w="50"/>
+              <w:left w:type="dxa" w:w="80"/>
+              <w:bottom w:type="dxa" w:w="50"/>
+              <w:right w:type="dxa" w:w="80"/>
+            </w:tcMar>
+            <w:vAlign w:val="center"/>
+          </w:tcPr>
+          <w:p>
+            <w:pPr>
+              <w:keepNext/>
+              <w:spacing w:after="0" w:line="240"/>
+              <w:jc w:val="center"/>
+            </w:pPr>
+            <w:r>
+              <w:rPr>
+                <w:rFonts w:ascii="Arial" w:cs="Arial" w:eastAsia="Arial" w:hAnsi="Arial"/>
+                <w:sz w:val="16"/>
+                <w:szCs w:val="16"/>
+              </w:rPr>
+              <w:t xml:space="preserve">0,742</w:t>
+            </w:r>
+          </w:p>
+        </w:tc>
+        <w:tc>
+          <w:tcPr>
+            <w:tcW w:type="dxa" w:w="1222"/>
+            <w:shd w:fill="F5F8FC" w:color="auto" w:val="clear"/>
+            <w:tcMar>
+              <w:top w:type="dxa" w:w="50"/>
+              <w:left w:type="dxa" w:w="80"/>
+              <w:bottom w:type="dxa" w:w="50"/>
+              <w:right w:type="dxa" w:w="80"/>
+            </w:tcMar>
+            <w:vAlign w:val="center"/>
+          </w:tcPr>
+          <w:p>
+            <w:pPr>
+              <w:keepNext/>
+              <w:spacing w:after="0" w:line="240"/>
+              <w:jc w:val="center"/>
+            </w:pPr>
+            <w:r>
+              <w:rPr>
+                <w:rFonts w:ascii="Arial" w:cs="Arial" w:eastAsia="Arial" w:hAnsi="Arial"/>
+                <w:sz w:val="16"/>
+                <w:szCs w:val="16"/>
+              </w:rPr>
+              <w:t xml:space="preserve">0,524</w:t>
+            </w:r>
+          </w:p>
+        </w:tc>
+        <w:tc>
+          <w:tcPr>
+            <w:tcW w:type="dxa" w:w="1225"/>
+            <w:shd w:fill="F5F8FC" w:color="auto" w:val="clear"/>
+            <w:tcMar>
+              <w:top w:type="dxa" w:w="50"/>
+              <w:left w:type="dxa" w:w="80"/>
+              <w:bottom w:type="dxa" w:w="50"/>
+              <w:right w:type="dxa" w:w="80"/>
+            </w:tcMar>
+            <w:vAlign w:val="center"/>
+          </w:tcPr>
+          <w:p>
+            <w:pPr>
+              <w:keepNext/>
+              <w:spacing w:after="0" w:line="240"/>
+              <w:jc w:val="center"/>
+            </w:pPr>
+            <w:r>
+              <w:rPr>
+                <w:rFonts w:ascii="Arial" w:cs="Arial" w:eastAsia="Arial" w:hAnsi="Arial"/>
+                <w:sz w:val="16"/>
+                <w:szCs w:val="16"/>
+              </w:rPr>
+              <w:t xml:space="preserve">0,730</w:t>
+            </w:r>
+          </w:p>
+        </w:tc>
+      </w:tr>
+      <w:tr>
+        <w:trPr>
+          <w:cantSplit/>
+        </w:trPr>
+        <w:tc>
+          <w:tcPr>
+            <w:tcW w:type="dxa" w:w="2445"/>
+            <w:tcMar>
+              <w:top w:type="dxa" w:w="50"/>
+              <w:left w:type="dxa" w:w="80"/>
+              <w:bottom w:type="dxa" w:w="50"/>
+              <w:right w:type="dxa" w:w="80"/>
+            </w:tcMar>
+            <w:vAlign w:val="center"/>
+          </w:tcPr>
+          <w:p>
+            <w:pPr>
+              <w:keepNext/>
+              <w:spacing w:after="0" w:line="240"/>
+              <w:jc w:val="left"/>
+            </w:pPr>
+            <w:r>
+              <w:rPr>
+                <w:rFonts w:ascii="Arial" w:cs="Arial" w:eastAsia="Arial" w:hAnsi="Arial"/>
+                <w:sz w:val="16"/>
+                <w:szCs w:val="16"/>
+              </w:rPr>
+              <w:t xml:space="preserve">Bosque aleatorio</w:t>
+            </w:r>
+          </w:p>
+        </w:tc>
+        <w:tc>
+          <w:tcPr>
+            <w:tcW w:type="dxa" w:w="2256"/>
+            <w:tcMar>
+              <w:top w:type="dxa" w:w="50"/>
+              <w:left w:type="dxa" w:w="80"/>
+              <w:bottom w:type="dxa" w:w="50"/>
+              <w:right w:type="dxa" w:w="80"/>
+            </w:tcMar>
+            <w:vAlign w:val="center"/>
+          </w:tcPr>
+          <w:p>
+            <w:pPr>
+              <w:keepNext/>
+              <w:spacing w:after="0" w:line="240"/>
+              <w:jc w:val="left"/>
+            </w:pPr>
+            <w:r>
+              <w:rPr>
+                <w:rFonts w:ascii="Arial" w:cs="Arial" w:eastAsia="Arial" w:hAnsi="Arial"/>
+                <w:sz w:val="16"/>
+                <w:szCs w:val="16"/>
+              </w:rPr>
+              <w:t xml:space="preserve">Ídem</w:t>
+            </w:r>
+          </w:p>
+        </w:tc>
+        <w:tc>
+          <w:tcPr>
+            <w:tcW w:type="dxa" w:w="1128"/>
+            <w:tcMar>
+              <w:top w:type="dxa" w:w="50"/>
+              <w:left w:type="dxa" w:w="80"/>
+              <w:bottom w:type="dxa" w:w="50"/>
+              <w:right w:type="dxa" w:w="80"/>
+            </w:tcMar>
+            <w:vAlign w:val="center"/>
+          </w:tcPr>
+          <w:p>
+            <w:pPr>
+              <w:keepNext/>
+              <w:spacing w:after="0" w:line="240"/>
+              <w:jc w:val="center"/>
+            </w:pPr>
+            <w:r>
+              <w:rPr>
+                <w:rFonts w:ascii="Arial" w:cs="Arial" w:eastAsia="Arial" w:hAnsi="Arial"/>
+                <w:sz w:val="16"/>
+                <w:szCs w:val="16"/>
+              </w:rPr>
+              <w:t xml:space="preserve">0,741</w:t>
+            </w:r>
+          </w:p>
+        </w:tc>
+        <w:tc>
+          <w:tcPr>
+            <w:tcW w:type="dxa" w:w="1128"/>
+            <w:tcMar>
+              <w:top w:type="dxa" w:w="50"/>
+              <w:left w:type="dxa" w:w="80"/>
+              <w:bottom w:type="dxa" w:w="50"/>
+              <w:right w:type="dxa" w:w="80"/>
+            </w:tcMar>
+            <w:vAlign w:val="center"/>
+          </w:tcPr>
+          <w:p>
+            <w:pPr>
+              <w:keepNext/>
+              <w:spacing w:after="0" w:line="240"/>
+              <w:jc w:val="center"/>
+            </w:pPr>
+            <w:r>
+              <w:rPr>
+                <w:rFonts w:ascii="Arial" w:cs="Arial" w:eastAsia="Arial" w:hAnsi="Arial"/>
+                <w:sz w:val="16"/>
+                <w:szCs w:val="16"/>
+              </w:rPr>
+              <w:t xml:space="preserve">0,767</w:t>
+            </w:r>
+          </w:p>
+        </w:tc>
+        <w:tc>
+          <w:tcPr>
+            <w:tcW w:type="dxa" w:w="1222"/>
+            <w:tcMar>
+              <w:top w:type="dxa" w:w="50"/>
+              <w:left w:type="dxa" w:w="80"/>
+              <w:bottom w:type="dxa" w:w="50"/>
+              <w:right w:type="dxa" w:w="80"/>
+            </w:tcMar>
+            <w:vAlign w:val="center"/>
+          </w:tcPr>
+          <w:p>
+            <w:pPr>
+              <w:keepNext/>
+              <w:spacing w:after="0" w:line="240"/>
+              <w:jc w:val="center"/>
+            </w:pPr>
+            <w:r>
+              <w:rPr>
+                <w:rFonts w:ascii="Arial" w:cs="Arial" w:eastAsia="Arial" w:hAnsi="Arial"/>
+                <w:sz w:val="16"/>
+                <w:szCs w:val="16"/>
+              </w:rPr>
+              <w:t xml:space="preserve">0,524</w:t>
+            </w:r>
+          </w:p>
+        </w:tc>
+        <w:tc>
+          <w:tcPr>
+            <w:tcW w:type="dxa" w:w="1225"/>
+            <w:tcMar>
+              <w:top w:type="dxa" w:w="50"/>
+              <w:left w:type="dxa" w:w="80"/>
+              <w:bottom w:type="dxa" w:w="50"/>
+              <w:right w:type="dxa" w:w="80"/>
+            </w:tcMar>
+            <w:vAlign w:val="center"/>
+          </w:tcPr>
+          <w:p>
+            <w:pPr>
+              <w:keepNext/>
+              <w:spacing w:after="0" w:line="240"/>
+              <w:jc w:val="center"/>
+            </w:pPr>
+            <w:r>
+              <w:rPr>
+                <w:rFonts w:ascii="Arial" w:cs="Arial" w:eastAsia="Arial" w:hAnsi="Arial"/>
+                <w:sz w:val="16"/>
+                <w:szCs w:val="16"/>
+              </w:rPr>
+              <w:t xml:space="preserve">0,734</w:t>
+            </w:r>
+          </w:p>
+        </w:tc>
+      </w:tr>
+      <w:tr>
+        <w:trPr>
+          <w:cantSplit/>
+        </w:trPr>
+        <w:tc>
+          <w:tcPr>
+            <w:tcW w:type="dxa" w:w="2445"/>
+            <w:shd w:fill="F5F8FC" w:color="auto" w:val="clear"/>
+            <w:tcMar>
+              <w:top w:type="dxa" w:w="50"/>
+              <w:left w:type="dxa" w:w="80"/>
+              <w:bottom w:type="dxa" w:w="50"/>
+              <w:right w:type="dxa" w:w="80"/>
+            </w:tcMar>
+            <w:vAlign w:val="center"/>
+          </w:tcPr>
+          <w:p>
+            <w:pPr>
+              <w:keepNext/>
+              <w:spacing w:after="0" w:line="240"/>
+              <w:jc w:val="left"/>
+            </w:pPr>
+            <w:r>
+              <w:rPr>
+                <w:rFonts w:ascii="Arial" w:cs="Arial" w:eastAsia="Arial" w:hAnsi="Arial"/>
+                <w:sz w:val="16"/>
+                <w:szCs w:val="16"/>
+              </w:rPr>
+              <w:t xml:space="preserve">XGBoost</w:t>
+            </w:r>
+          </w:p>
+        </w:tc>
+        <w:tc>
+          <w:tcPr>
+            <w:tcW w:type="dxa" w:w="2256"/>
+            <w:shd w:fill="F5F8FC" w:color="auto" w:val="clear"/>
+            <w:tcMar>
+              <w:top w:type="dxa" w:w="50"/>
+              <w:left w:type="dxa" w:w="80"/>
+              <w:bottom w:type="dxa" w:w="50"/>
+              <w:right w:type="dxa" w:w="80"/>
+            </w:tcMar>
+            <w:vAlign w:val="center"/>
+          </w:tcPr>
+          <w:p>
+            <w:pPr>
+              <w:keepNext/>
+              <w:spacing w:after="0" w:line="240"/>
+              <w:jc w:val="left"/>
+            </w:pPr>
+            <w:r>
+              <w:rPr>
+                <w:rFonts w:ascii="Arial" w:cs="Arial" w:eastAsia="Arial" w:hAnsi="Arial"/>
+                <w:sz w:val="16"/>
+                <w:szCs w:val="16"/>
+              </w:rPr>
+              <w:t xml:space="preserve">Ídem</w:t>
+            </w:r>
+          </w:p>
+        </w:tc>
+        <w:tc>
+          <w:tcPr>
+            <w:tcW w:type="dxa" w:w="1128"/>
+            <w:shd w:fill="F5F8FC" w:color="auto" w:val="clear"/>
+            <w:tcMar>
+              <w:top w:type="dxa" w:w="50"/>
+              <w:left w:type="dxa" w:w="80"/>
+              <w:bottom w:type="dxa" w:w="50"/>
+              <w:right w:type="dxa" w:w="80"/>
+            </w:tcMar>
+            <w:vAlign w:val="center"/>
+          </w:tcPr>
+          <w:p>
+            <w:pPr>
+              <w:keepNext/>
+              <w:spacing w:after="0" w:line="240"/>
+              <w:jc w:val="center"/>
+            </w:pPr>
+            <w:r>
+              <w:rPr>
+                <w:rFonts w:ascii="Arial" w:cs="Arial" w:eastAsia="Arial" w:hAnsi="Arial"/>
+                <w:sz w:val="16"/>
+                <w:szCs w:val="16"/>
+              </w:rPr>
+              <w:t xml:space="preserve">0,701</w:t>
+            </w:r>
+          </w:p>
+        </w:tc>
+        <w:tc>
+          <w:tcPr>
+            <w:tcW w:type="dxa" w:w="1128"/>
+            <w:shd w:fill="F5F8FC" w:color="auto" w:val="clear"/>
+            <w:tcMar>
+              <w:top w:type="dxa" w:w="50"/>
+              <w:left w:type="dxa" w:w="80"/>
+              <w:bottom w:type="dxa" w:w="50"/>
+              <w:right w:type="dxa" w:w="80"/>
+            </w:tcMar>
+            <w:vAlign w:val="center"/>
+          </w:tcPr>
+          <w:p>
+            <w:pPr>
+              <w:keepNext/>
+              <w:spacing w:after="0" w:line="240"/>
+              <w:jc w:val="center"/>
+            </w:pPr>
+            <w:r>
+              <w:rPr>
+                <w:rFonts w:ascii="Arial" w:cs="Arial" w:eastAsia="Arial" w:hAnsi="Arial"/>
+                <w:sz w:val="16"/>
+                <w:szCs w:val="16"/>
+              </w:rPr>
+              <w:t xml:space="preserve">0,729</w:t>
+            </w:r>
+          </w:p>
+        </w:tc>
+        <w:tc>
+          <w:tcPr>
+            <w:tcW w:type="dxa" w:w="1222"/>
+            <w:shd w:fill="F5F8FC" w:color="auto" w:val="clear"/>
+            <w:tcMar>
+              <w:top w:type="dxa" w:w="50"/>
+              <w:left w:type="dxa" w:w="80"/>
+              <w:bottom w:type="dxa" w:w="50"/>
+              <w:right w:type="dxa" w:w="80"/>
+            </w:tcMar>
+            <w:vAlign w:val="center"/>
+          </w:tcPr>
+          <w:p>
+            <w:pPr>
+              <w:keepNext/>
+              <w:spacing w:after="0" w:line="240"/>
+              <w:jc w:val="center"/>
+            </w:pPr>
+            <w:r>
+              <w:rPr>
+                <w:rFonts w:ascii="Arial" w:cs="Arial" w:eastAsia="Arial" w:hAnsi="Arial"/>
+                <w:sz w:val="16"/>
+                <w:szCs w:val="16"/>
+              </w:rPr>
+              <w:t xml:space="preserve">0,524</w:t>
+            </w:r>
+          </w:p>
+        </w:tc>
+        <w:tc>
+          <w:tcPr>
+            <w:tcW w:type="dxa" w:w="1225"/>
+            <w:shd w:fill="F5F8FC" w:color="auto" w:val="clear"/>
+            <w:tcMar>
+              <w:top w:type="dxa" w:w="50"/>
+              <w:left w:type="dxa" w:w="80"/>
+              <w:bottom w:type="dxa" w:w="50"/>
+              <w:right w:type="dxa" w:w="80"/>
+            </w:tcMar>
+            <w:vAlign w:val="center"/>
+          </w:tcPr>
+          <w:p>
+            <w:pPr>
+              <w:keepNext/>
+              <w:spacing w:after="0" w:line="240"/>
+              <w:jc w:val="center"/>
+            </w:pPr>
+            <w:r>
+              <w:rPr>
+                <w:rFonts w:ascii="Arial" w:cs="Arial" w:eastAsia="Arial" w:hAnsi="Arial"/>
+                <w:sz w:val="16"/>
+                <w:szCs w:val="16"/>
+              </w:rPr>
+              <w:t xml:space="preserve">0,699</w:t>
+            </w:r>
+          </w:p>
+        </w:tc>
+      </w:tr>
+      <w:tr>
+        <w:trPr>
+          <w:cantSplit/>
+        </w:trPr>
+        <w:tc>
+          <w:tcPr>
+            <w:tcW w:type="dxa" w:w="2445"/>
+            <w:tcMar>
+              <w:top w:type="dxa" w:w="50"/>
+              <w:left w:type="dxa" w:w="80"/>
+              <w:bottom w:type="dxa" w:w="50"/>
+              <w:right w:type="dxa" w:w="80"/>
+            </w:tcMar>
+            <w:vAlign w:val="center"/>
+          </w:tcPr>
+          <w:p>
+            <w:pPr>
+              <w:keepNext/>
+              <w:spacing w:after="0" w:line="240"/>
+              <w:jc w:val="left"/>
+            </w:pPr>
+            <w:r>
+              <w:rPr>
+                <w:rFonts w:ascii="Arial" w:cs="Arial" w:eastAsia="Arial" w:hAnsi="Arial"/>
+                <w:sz w:val="16"/>
+                <w:szCs w:val="16"/>
+              </w:rPr>
+              <w:t xml:space="preserve">LightGBM al inicio</w:t>
+            </w:r>
+          </w:p>
+        </w:tc>
+        <w:tc>
+          <w:tcPr>
+            <w:tcW w:type="dxa" w:w="2256"/>
+            <w:tcMar>
+              <w:top w:type="dxa" w:w="50"/>
+              <w:left w:type="dxa" w:w="80"/>
+              <w:bottom w:type="dxa" w:w="50"/>
+              <w:right w:type="dxa" w:w="80"/>
+            </w:tcMar>
+            <w:vAlign w:val="center"/>
+          </w:tcPr>
+          <w:p>
+            <w:pPr>
+              <w:keepNext/>
+              <w:spacing w:after="0" w:line="240"/>
+              <w:jc w:val="left"/>
+            </w:pPr>
+            <w:r>
+              <w:rPr>
+                <w:rFonts w:ascii="Arial" w:cs="Arial" w:eastAsia="Arial" w:hAnsi="Arial"/>
+                <w:sz w:val="16"/>
+                <w:szCs w:val="16"/>
+              </w:rPr>
+              <w:t xml:space="preserve">Ídem</w:t>
+            </w:r>
+          </w:p>
+        </w:tc>
+        <w:tc>
+          <w:tcPr>
+            <w:tcW w:type="dxa" w:w="1128"/>
+            <w:tcMar>
+              <w:top w:type="dxa" w:w="50"/>
+              <w:left w:type="dxa" w:w="80"/>
+              <w:bottom w:type="dxa" w:w="50"/>
+              <w:right w:type="dxa" w:w="80"/>
+            </w:tcMar>
+            <w:vAlign w:val="center"/>
+          </w:tcPr>
+          <w:p>
+            <w:pPr>
+              <w:keepNext/>
+              <w:spacing w:after="0" w:line="240"/>
+              <w:jc w:val="center"/>
+            </w:pPr>
+            <w:r>
+              <w:rPr>
+                <w:rFonts w:ascii="Arial" w:cs="Arial" w:eastAsia="Arial" w:hAnsi="Arial"/>
+                <w:sz w:val="16"/>
+                <w:szCs w:val="16"/>
+              </w:rPr>
+              <w:t xml:space="preserve">0,733</w:t>
+            </w:r>
+          </w:p>
+        </w:tc>
+        <w:tc>
+          <w:tcPr>
+            <w:tcW w:type="dxa" w:w="1128"/>
+            <w:tcMar>
+              <w:top w:type="dxa" w:w="50"/>
+              <w:left w:type="dxa" w:w="80"/>
+              <w:bottom w:type="dxa" w:w="50"/>
+              <w:right w:type="dxa" w:w="80"/>
+            </w:tcMar>
+            <w:vAlign w:val="center"/>
+          </w:tcPr>
+          <w:p>
+            <w:pPr>
+              <w:keepNext/>
+              <w:spacing w:after="0" w:line="240"/>
+              <w:jc w:val="center"/>
+            </w:pPr>
+            <w:r>
+              <w:rPr>
+                <w:rFonts w:ascii="Arial" w:cs="Arial" w:eastAsia="Arial" w:hAnsi="Arial"/>
+                <w:sz w:val="16"/>
+                <w:szCs w:val="16"/>
+              </w:rPr>
+              <w:t xml:space="preserve">0,759</w:t>
+            </w:r>
+          </w:p>
+        </w:tc>
+        <w:tc>
+          <w:tcPr>
+            <w:tcW w:type="dxa" w:w="1222"/>
+            <w:tcMar>
+              <w:top w:type="dxa" w:w="50"/>
+              <w:left w:type="dxa" w:w="80"/>
+              <w:bottom w:type="dxa" w:w="50"/>
+              <w:right w:type="dxa" w:w="80"/>
+            </w:tcMar>
+            <w:vAlign w:val="center"/>
+          </w:tcPr>
+          <w:p>
+            <w:pPr>
+              <w:keepNext/>
+              <w:spacing w:after="0" w:line="240"/>
+              <w:jc w:val="center"/>
+            </w:pPr>
+            <w:r>
+              <w:rPr>
+                <w:rFonts w:ascii="Arial" w:cs="Arial" w:eastAsia="Arial" w:hAnsi="Arial"/>
+                <w:sz w:val="16"/>
+                <w:szCs w:val="16"/>
+              </w:rPr>
+              <w:t xml:space="preserve">0,524</w:t>
+            </w:r>
+          </w:p>
+        </w:tc>
+        <w:tc>
+          <w:tcPr>
+            <w:tcW w:type="dxa" w:w="1225"/>
+            <w:tcMar>
+              <w:top w:type="dxa" w:w="50"/>
+              <w:left w:type="dxa" w:w="80"/>
+              <w:bottom w:type="dxa" w:w="50"/>
+              <w:right w:type="dxa" w:w="80"/>
+            </w:tcMar>
+            <w:vAlign w:val="center"/>
+          </w:tcPr>
+          <w:p>
+            <w:pPr>
+              <w:keepNext/>
+              <w:spacing w:after="0" w:line="240"/>
+              <w:jc w:val="center"/>
+            </w:pPr>
+            <w:r>
+              <w:rPr>
+                <w:rFonts w:ascii="Arial" w:cs="Arial" w:eastAsia="Arial" w:hAnsi="Arial"/>
+                <w:sz w:val="16"/>
+                <w:szCs w:val="16"/>
+              </w:rPr>
+              <w:t xml:space="preserve">0,742</w:t>
+            </w:r>
+          </w:p>
+        </w:tc>
+      </w:tr>
+      <w:tr>
+        <w:trPr>
+          <w:cantSplit/>
+        </w:trPr>
+        <w:tc>
+          <w:tcPr>
+            <w:tcW w:type="dxa" w:w="2445"/>
+            <w:shd w:fill="F5F8FC" w:color="auto" w:val="clear"/>
+            <w:tcMar>
+              <w:top w:type="dxa" w:w="50"/>
+              <w:left w:type="dxa" w:w="80"/>
+              <w:bottom w:type="dxa" w:w="50"/>
+              <w:right w:type="dxa" w:w="80"/>
+            </w:tcMar>
+            <w:vAlign w:val="center"/>
+          </w:tcPr>
+          <w:p>
+            <w:pPr>
+              <w:keepNext/>
+              <w:spacing w:after="0" w:line="240"/>
+              <w:jc w:val="left"/>
+            </w:pPr>
+            <w:r>
+              <w:rPr>
+                <w:rFonts w:ascii="Arial" w:cs="Arial" w:eastAsia="Arial" w:hAnsi="Arial"/>
+                <w:sz w:val="16"/>
+                <w:szCs w:val="16"/>
+              </w:rPr>
+              <w:t xml:space="preserve">LightGBM al inicio</w:t>
+            </w:r>
+          </w:p>
+        </w:tc>
+        <w:tc>
+          <w:tcPr>
+            <w:tcW w:type="dxa" w:w="2256"/>
+            <w:shd w:fill="F5F8FC" w:color="auto" w:val="clear"/>
+            <w:tcMar>
+              <w:top w:type="dxa" w:w="50"/>
+              <w:left w:type="dxa" w:w="80"/>
+              <w:bottom w:type="dxa" w:w="50"/>
+              <w:right w:type="dxa" w:w="80"/>
+            </w:tcMar>
+            <w:vAlign w:val="center"/>
+          </w:tcPr>
+          <w:p>
+            <w:pPr>
+              <w:keepNext/>
+              <w:spacing w:after="0" w:line="240"/>
+              <w:jc w:val="left"/>
+            </w:pPr>
+            <w:r>
+              <w:rPr>
+                <w:rFonts w:ascii="Arial" w:cs="Arial" w:eastAsia="Arial" w:hAnsi="Arial"/>
+                <w:sz w:val="16"/>
+                <w:szCs w:val="16"/>
+              </w:rPr>
+              <w:t xml:space="preserve">Cortes 2024-01 a 2025-12 (25 063 obs.)</w:t>
+            </w:r>
+          </w:p>
+        </w:tc>
+        <w:tc>
+          <w:tcPr>
+            <w:tcW w:type="dxa" w:w="1128"/>
+            <w:shd w:fill="F5F8FC" w:color="auto" w:val="clear"/>
+            <w:tcMar>
+              <w:top w:type="dxa" w:w="50"/>
+              <w:left w:type="dxa" w:w="80"/>
+              <w:bottom w:type="dxa" w:w="50"/>
+              <w:right w:type="dxa" w:w="80"/>
+            </w:tcMar>
+            <w:vAlign w:val="center"/>
+          </w:tcPr>
+          <w:p>
+            <w:pPr>
+              <w:keepNext/>
+              <w:spacing w:after="0" w:line="240"/>
+              <w:jc w:val="center"/>
+            </w:pPr>
+            <w:r>
+              <w:rPr>
+                <w:rFonts w:ascii="Arial" w:cs="Arial" w:eastAsia="Arial" w:hAnsi="Arial"/>
+                <w:sz w:val="16"/>
+                <w:szCs w:val="16"/>
+              </w:rPr>
+              <w:t xml:space="preserve">0,723</w:t>
+            </w:r>
+          </w:p>
+        </w:tc>
+        <w:tc>
+          <w:tcPr>
+            <w:tcW w:type="dxa" w:w="1128"/>
+            <w:shd w:fill="F5F8FC" w:color="auto" w:val="clear"/>
+            <w:tcMar>
+              <w:top w:type="dxa" w:w="50"/>
+              <w:left w:type="dxa" w:w="80"/>
+              <w:bottom w:type="dxa" w:w="50"/>
+              <w:right w:type="dxa" w:w="80"/>
+            </w:tcMar>
+            <w:vAlign w:val="center"/>
+          </w:tcPr>
+          <w:p>
+            <w:pPr>
+              <w:keepNext/>
+              <w:spacing w:after="0" w:line="240"/>
+              <w:jc w:val="center"/>
+            </w:pPr>
+            <w:r>
+              <w:rPr>
+                <w:rFonts w:ascii="Arial" w:cs="Arial" w:eastAsia="Arial" w:hAnsi="Arial"/>
+                <w:sz w:val="16"/>
+                <w:szCs w:val="16"/>
+              </w:rPr>
+              <w:t xml:space="preserve">0,831</w:t>
+            </w:r>
+          </w:p>
+        </w:tc>
+        <w:tc>
+          <w:tcPr>
+            <w:tcW w:type="dxa" w:w="1222"/>
+            <w:shd w:fill="F5F8FC" w:color="auto" w:val="clear"/>
+            <w:tcMar>
+              <w:top w:type="dxa" w:w="50"/>
+              <w:left w:type="dxa" w:w="80"/>
+              <w:bottom w:type="dxa" w:w="50"/>
+              <w:right w:type="dxa" w:w="80"/>
+            </w:tcMar>
+            <w:vAlign w:val="center"/>
+          </w:tcPr>
+          <w:p>
+            <w:pPr>
+              <w:keepNext/>
+              <w:spacing w:after="0" w:line="240"/>
+              <w:jc w:val="center"/>
+            </w:pPr>
+            <w:r>
+              <w:rPr>
+                <w:rFonts w:ascii="Arial" w:cs="Arial" w:eastAsia="Arial" w:hAnsi="Arial"/>
+                <w:sz w:val="16"/>
+                <w:szCs w:val="16"/>
+              </w:rPr>
+              <w:t xml:space="preserve">0,649</w:t>
+            </w:r>
+          </w:p>
+        </w:tc>
+        <w:tc>
+          <w:tcPr>
+            <w:tcW w:type="dxa" w:w="1225"/>
+            <w:shd w:fill="F5F8FC" w:color="auto" w:val="clear"/>
+            <w:tcMar>
+              <w:top w:type="dxa" w:w="50"/>
+              <w:left w:type="dxa" w:w="80"/>
+              <w:bottom w:type="dxa" w:w="50"/>
+              <w:right w:type="dxa" w:w="80"/>
+            </w:tcMar>
+            <w:vAlign w:val="center"/>
+          </w:tcPr>
+          <w:p>
+            <w:pPr>
+              <w:keepNext/>
+              <w:spacing w:after="0" w:line="240"/>
+              <w:jc w:val="center"/>
+            </w:pPr>
+            <w:r>
+              <w:rPr>
+                <w:rFonts w:ascii="Arial" w:cs="Arial" w:eastAsia="Arial" w:hAnsi="Arial"/>
+                <w:sz w:val="16"/>
+                <w:szCs w:val="16"/>
+              </w:rPr>
+              <w:t xml:space="preserve">0,736</w:t>
+            </w:r>
+          </w:p>
+        </w:tc>
+      </w:tr>
+      <w:tr>
+        <w:trPr>
+          <w:cantSplit/>
+        </w:trPr>
+        <w:tc>
+          <w:tcPr>
+            <w:tcW w:type="dxa" w:w="2445"/>
+            <w:tcMar>
+              <w:top w:type="dxa" w:w="50"/>
+              <w:left w:type="dxa" w:w="80"/>
+              <w:bottom w:type="dxa" w:w="50"/>
+              <w:right w:type="dxa" w:w="80"/>
+            </w:tcMar>
+            <w:vAlign w:val="center"/>
+          </w:tcPr>
+          <w:p>
+            <w:pPr>
+              <w:keepNext/>
+              <w:spacing w:after="0" w:line="240"/>
+              <w:jc w:val="left"/>
+            </w:pPr>
+            <w:r>
+              <w:rPr>
+                <w:rFonts w:ascii="Arial" w:cs="Arial" w:eastAsia="Arial" w:hAnsi="Arial"/>
+                <w:sz w:val="16"/>
+                <w:szCs w:val="16"/>
+              </w:rPr>
+              <w:t xml:space="preserve">LightGBM de seguimiento (SIAF)</w:t>
+            </w:r>
+          </w:p>
+        </w:tc>
+        <w:tc>
+          <w:tcPr>
+            <w:tcW w:type="dxa" w:w="2256"/>
+            <w:tcMar>
+              <w:top w:type="dxa" w:w="50"/>
+              <w:left w:type="dxa" w:w="80"/>
+              <w:bottom w:type="dxa" w:w="50"/>
+              <w:right w:type="dxa" w:w="80"/>
+            </w:tcMar>
+            <w:vAlign w:val="center"/>
+          </w:tcPr>
+          <w:p>
+            <w:pPr>
+              <w:keepNext/>
+              <w:spacing w:after="0" w:line="240"/>
+              <w:jc w:val="left"/>
+            </w:pPr>
+            <w:r>
+              <w:rPr>
+                <w:rFonts w:ascii="Arial" w:cs="Arial" w:eastAsia="Arial" w:hAnsi="Arial"/>
+                <w:sz w:val="16"/>
+                <w:szCs w:val="16"/>
+              </w:rPr>
+              <w:t xml:space="preserve">Ídem</w:t>
+            </w:r>
+          </w:p>
+        </w:tc>
+        <w:tc>
+          <w:tcPr>
+            <w:tcW w:type="dxa" w:w="1128"/>
+            <w:tcMar>
+              <w:top w:type="dxa" w:w="50"/>
+              <w:left w:type="dxa" w:w="80"/>
+              <w:bottom w:type="dxa" w:w="50"/>
+              <w:right w:type="dxa" w:w="80"/>
+            </w:tcMar>
+            <w:vAlign w:val="center"/>
+          </w:tcPr>
+          <w:p>
+            <w:pPr>
+              <w:keepNext/>
+              <w:spacing w:after="0" w:line="240"/>
+              <w:jc w:val="center"/>
+            </w:pPr>
+            <w:r>
+              <w:rPr>
+                <w:rFonts w:ascii="Arial" w:cs="Arial" w:eastAsia="Arial" w:hAnsi="Arial"/>
+                <w:sz w:val="16"/>
+                <w:szCs w:val="16"/>
+              </w:rPr>
+              <w:t xml:space="preserve">0,753</w:t>
+            </w:r>
+          </w:p>
+        </w:tc>
+        <w:tc>
+          <w:tcPr>
+            <w:tcW w:type="dxa" w:w="1128"/>
+            <w:tcMar>
+              <w:top w:type="dxa" w:w="50"/>
+              <w:left w:type="dxa" w:w="80"/>
+              <w:bottom w:type="dxa" w:w="50"/>
+              <w:right w:type="dxa" w:w="80"/>
+            </w:tcMar>
+            <w:vAlign w:val="center"/>
+          </w:tcPr>
+          <w:p>
+            <w:pPr>
+              <w:keepNext/>
+              <w:spacing w:after="0" w:line="240"/>
+              <w:jc w:val="center"/>
+            </w:pPr>
+            <w:r>
+              <w:rPr>
+                <w:rFonts w:ascii="Arial" w:cs="Arial" w:eastAsia="Arial" w:hAnsi="Arial"/>
+                <w:sz w:val="16"/>
+                <w:szCs w:val="16"/>
+              </w:rPr>
+              <w:t xml:space="preserve">0,855</w:t>
+            </w:r>
+          </w:p>
+        </w:tc>
+        <w:tc>
+          <w:tcPr>
+            <w:tcW w:type="dxa" w:w="1222"/>
+            <w:tcMar>
+              <w:top w:type="dxa" w:w="50"/>
+              <w:left w:type="dxa" w:w="80"/>
+              <w:bottom w:type="dxa" w:w="50"/>
+              <w:right w:type="dxa" w:w="80"/>
+            </w:tcMar>
+            <w:vAlign w:val="center"/>
+          </w:tcPr>
+          <w:p>
+            <w:pPr>
+              <w:keepNext/>
+              <w:spacing w:after="0" w:line="240"/>
+              <w:jc w:val="center"/>
+            </w:pPr>
+            <w:r>
+              <w:rPr>
+                <w:rFonts w:ascii="Arial" w:cs="Arial" w:eastAsia="Arial" w:hAnsi="Arial"/>
+                <w:sz w:val="16"/>
+                <w:szCs w:val="16"/>
+              </w:rPr>
+              <w:t xml:space="preserve">0,649</w:t>
+            </w:r>
+          </w:p>
+        </w:tc>
+        <w:tc>
+          <w:tcPr>
+            <w:tcW w:type="dxa" w:w="1225"/>
+            <w:tcMar>
+              <w:top w:type="dxa" w:w="50"/>
+              <w:left w:type="dxa" w:w="80"/>
+              <w:bottom w:type="dxa" w:w="50"/>
+              <w:right w:type="dxa" w:w="80"/>
+            </w:tcMar>
+            <w:vAlign w:val="center"/>
+          </w:tcPr>
+          <w:p>
+            <w:pPr>
+              <w:keepNext/>
+              <w:spacing w:after="0" w:line="240"/>
+              <w:jc w:val="center"/>
+            </w:pPr>
+            <w:r>
+              <w:rPr>
+                <w:rFonts w:ascii="Arial" w:cs="Arial" w:eastAsia="Arial" w:hAnsi="Arial"/>
+                <w:sz w:val="16"/>
+                <w:szCs w:val="16"/>
+              </w:rPr>
+              <w:t xml:space="preserve">0,763</w:t>
+            </w:r>
+          </w:p>
+        </w:tc>
+      </w:tr>
+    </w:tbl>
+    <w:p>
+      <w:pPr>
+        <w:spacing w:after="60"/>
+      </w:pPr>
+      <w:r>
+        <w:rPr>
+          <w:rFonts w:ascii="Arial" w:cs="Arial" w:eastAsia="Arial" w:hAnsi="Arial"/>
+          <w:i/>
+          <w:iCs/>
+          <w:sz w:val="16"/>
+          <w:szCs w:val="16"/>
+        </w:rPr>
+        <w:t xml:space="preserve">Nota: Fuente: artifacts/exante/resultados_y_30.json y resultados_seguimiento.json. Bootstrap por entidad (300 remuestreos).</w:t>
+      </w:r>
+    </w:p>
+    <w:p>
+      <w:pPr>
+        <w:keepNext/>
+        <w:spacing w:after="60" w:before="120"/>
+        <w:jc w:val="center"/>
+      </w:pPr>
+      <w:r>
+        <w:drawing>
+          <wp:inline distT="0" distB="0" distL="0" distR="0">
+            <wp:extent cx="5810250" cy="2343150"/>
+            <wp:effectExtent t="0" r="0" b="0" l="0"/>
+            <wp:docPr id="1" name="calibracion" descr="Tasa de retraso significativo observada por nivel de riesgo en el periodo de prueba de la cartera INFOBRAS." title="Figura 11"/>
+            <wp:cNvGraphicFramePr>
+              <a:graphicFrameLocks xmlns:a="http://schemas.openxmlformats.org/drawingml/2006/main" noChangeAspect="1"/>
+            </wp:cNvGraphicFramePr>
+            <a:graphic xmlns:a="http://schemas.openxmlformats.org/drawingml/2006/main">
+              <a:graphicData uri="http://schemas.openxmlformats.org/drawingml/2006/picture">
+                <pic:pic xmlns:pic="http://schemas.openxmlformats.org/drawingml/2006/picture">
+                  <pic:nvPicPr>
+                    <pic:cNvPr id="0" name="" descr=""/>
+                    <pic:cNvPicPr>
+                      <a:picLocks noChangeAspect="1" noChangeArrowheads="1"/>
+                    </pic:cNvPicPr>
+                  </pic:nvPicPr>
+                  <pic:blipFill>
+                    <a:blip r:embed="rId19" cstate="none"/>
+                    <a:srcRect/>
+                    <a:stretch>
+                      <a:fillRect/>
+                    </a:stretch>
+                  </pic:blipFill>
+                  <pic:spPr bwMode="auto">
+                    <a:xfrm>
+                      <a:off x="0" y="0"/>
+                      <a:ext cx="5810250" cy="2343150"/>
+                    </a:xfrm>
+                    <a:prstGeom prst="rect">
+                      <a:avLst/>
+                    </a:prstGeom>
+                  </pic:spPr>
+                </pic:pic>
+              </a:graphicData>
+            </a:graphic>
+          </wp:inline>
+        </w:drawing>
+      </w:r>
+    </w:p>
+    <w:p>
+      <w:pPr>
+        <w:spacing w:after="200"/>
+        <w:jc w:val="center"/>
+      </w:pPr>
+      <w:r>
+        <w:rPr>
+          <w:rFonts w:ascii="Arial" w:cs="Arial" w:eastAsia="Arial" w:hAnsi="Arial"/>
+          <w:b/>
+          <w:bCs/>
+          <w:sz w:val="18"/>
+          <w:szCs w:val="18"/>
+        </w:rPr>
+        <w:t xml:space="preserve">Fig. 11. </w:t>
+      </w:r>
+      <w:r>
+        <w:rPr>
+          <w:rFonts w:ascii="Arial" w:cs="Arial" w:eastAsia="Arial" w:hAnsi="Arial"/>
+          <w:sz w:val="18"/>
+          <w:szCs w:val="18"/>
+        </w:rPr>
+        <w:t xml:space="preserve">Tasa de retraso significativo observada por nivel de riesgo en el periodo de prueba de la cartera INFOBRAS.</w:t>
+      </w:r>
+    </w:p>
+    <w:p>
+      <w:pPr>
+        <w:spacing w:after="120" w:line="264"/>
+        <w:jc w:val="both"/>
+      </w:pPr>
+      <w:r>
+        <w:rPr>
+          <w:rFonts w:ascii="Arial" w:cs="Arial" w:eastAsia="Arial" w:hAnsi="Arial"/>
+          <w:sz w:val="21"/>
+          <w:szCs w:val="21"/>
+        </w:rPr>
+        <w:t xml:space="preserve">El análisis de sensibilidad de la etiqueta (Fig. 12) muestra que LightGBM supera a la regla en todos los umbrales (ROC-AUC 0,762, 0,733, 0,721 y 0,705 para 10, 30, 50 y 100 % del plazo; diferencias con IC que excluyen el cero). La ablación del nombre de la obra no cambió el resultado (ROC-AUC 0,732 sin texto frente a 0,733).</w:t>
+      </w:r>
+    </w:p>
+    <w:p>
+      <w:pPr>
+        <w:keepNext/>
+        <w:spacing w:after="60" w:before="120"/>
+        <w:jc w:val="center"/>
+      </w:pPr>
+      <w:r>
+        <w:drawing>
+          <wp:inline distT="0" distB="0" distL="0" distR="0">
+            <wp:extent cx="5810250" cy="2266950"/>
+            <wp:effectExtent t="0" r="0" b="0" l="0"/>
+            <wp:docPr id="1" name="sensibilidad" descr="Sensibilidad del modelo de cartera al umbral que define el retraso significativo." title="Figura 12"/>
+            <wp:cNvGraphicFramePr>
+              <a:graphicFrameLocks xmlns:a="http://schemas.openxmlformats.org/drawingml/2006/main" noChangeAspect="1"/>
+            </wp:cNvGraphicFramePr>
+            <a:graphic xmlns:a="http://schemas.openxmlformats.org/drawingml/2006/main">
+              <a:graphicData uri="http://schemas.openxmlformats.org/drawingml/2006/picture">
+                <pic:pic xmlns:pic="http://schemas.openxmlformats.org/drawingml/2006/picture">
+                  <pic:nvPicPr>
+                    <pic:cNvPr id="0" name="" descr=""/>
+                    <pic:cNvPicPr>
+                      <a:picLocks noChangeAspect="1" noChangeArrowheads="1"/>
+                    </pic:cNvPicPr>
+                  </pic:nvPicPr>
+                  <pic:blipFill>
+                    <a:blip r:embed="rId20" cstate="none"/>
+                    <a:srcRect/>
+                    <a:stretch>
+                      <a:fillRect/>
+                    </a:stretch>
+                  </pic:blipFill>
+                  <pic:spPr bwMode="auto">
+                    <a:xfrm>
+                      <a:off x="0" y="0"/>
+                      <a:ext cx="5810250" cy="2266950"/>
+                    </a:xfrm>
+                    <a:prstGeom prst="rect">
+                      <a:avLst/>
+                    </a:prstGeom>
+                  </pic:spPr>
+                </pic:pic>
+              </a:graphicData>
+            </a:graphic>
+          </wp:inline>
+        </w:drawing>
+      </w:r>
+    </w:p>
+    <w:p>
+      <w:pPr>
+        <w:spacing w:after="200"/>
+        <w:jc w:val="center"/>
+      </w:pPr>
+      <w:r>
+        <w:rPr>
+          <w:rFonts w:ascii="Arial" w:cs="Arial" w:eastAsia="Arial" w:hAnsi="Arial"/>
+          <w:b/>
+          <w:bCs/>
+          <w:sz w:val="18"/>
+          <w:szCs w:val="18"/>
+        </w:rPr>
+        <w:t xml:space="preserve">Fig. 12. </w:t>
+      </w:r>
+      <w:r>
+        <w:rPr>
+          <w:rFonts w:ascii="Arial" w:cs="Arial" w:eastAsia="Arial" w:hAnsi="Arial"/>
+          <w:sz w:val="18"/>
+          <w:szCs w:val="18"/>
+        </w:rPr>
         <w:t xml:space="preserve">Sensibilidad del modelo de cartera al umbral que define el retraso significativo.</w:t>
       </w:r>
     </w:p>
@@ -12674,7 +12816,7 @@
           <w:sz w:val="21"/>
           <w:szCs w:val="21"/>
         </w:rPr>
-        <w:t xml:space="preserve">La Fig. 11 muestra la importancia TreeSHAP por grupo de variables del modelo B: el contenido de los asientos aporta el 46,0 % y los registros estructurados del cuaderno el 28,5 %; el SIAF, el 7,1 %. Entre las representaciones de texto (PR-AUC nacional con H = 60; A = 0,139), el léxico de causas alcanzó 0,147, las puntuaciones supervisadas TF-IDF 0,152 y las de embeddings 0,148, mientras que los embeddings reducidos sin supervisión quedaron en 0,141; la combinación llegó a 0,158. Cualitativamente, en las tres alertas de mayor riesgo del corte vigente los factores principales fueron el vocabulario de los asientos recientes y la proporción de asientos que mencionan atrasos y penalidades, verificables en los asientos citados como evidencia. Por sector, evaluado sin reentrenar sobre la misma prueba, el ROC-AUC del modelo de alerta varió entre 0,752 (educación) y 0,803 (salud) y el del modelo de seguimiento de la cartera entre 0,720 (energía y minas) y 0,783 (agricultura), con intervalos que se superponen en la mayoría de los sectores; ningún sector concentra la señal, lo que respalda un modelo nacional multisectorial en lugar de uno por sector.</w:t>
+        <w:t xml:space="preserve">La Fig. 13 muestra la importancia TreeSHAP por grupo de variables del modelo B: el contenido de los asientos aporta el 46,0 % y los registros estructurados del cuaderno el 28,5 %; el SIAF, el 7,1 %. Entre las representaciones de texto (PR-AUC nacional con H = 60; A = 0,139), el léxico de causas alcanzó 0,147, las puntuaciones supervisadas TF-IDF 0,152 y las de embeddings 0,148, mientras que los embeddings reducidos sin supervisión quedaron en 0,141; la combinación llegó a 0,158. Cualitativamente, en las tres alertas de mayor riesgo del corte vigente los factores principales fueron el vocabulario de los asientos recientes y la proporción de asientos que mencionan atrasos y penalidades, verificables en los asientos citados como evidencia. Por sector, evaluado sin reentrenar sobre la misma prueba, el ROC-AUC del modelo de alerta varió entre 0,752 (educación) y 0,803 (salud) y el del modelo de seguimiento de la cartera entre 0,720 (energía y minas) y 0,783 (agricultura), con intervalos que se superponen en la mayoría de los sectores; ningún sector concentra la señal, lo que respalda un modelo nacional multisectorial en lugar de uno por sector.</w:t>
       </w:r>
     </w:p>
     <w:p>
@@ -12688,7 +12830,7 @@
           <wp:inline distT="0" distB="0" distL="0" distR="0">
             <wp:extent cx="4648200" cy="1838325"/>
             <wp:effectExtent t="0" r="0" b="0" l="0"/>
-            <wp:docPr id="1" name="importancia" descr="Importancia TreeSHAP por grupo de variables del modelo B en la prueba nacional (H = 60)." title="Figura 11"/>
+            <wp:docPr id="1" name="importancia" descr="Importancia TreeSHAP por grupo de variables del modelo B en la prueba nacional (H = 60)." title="Figura 13"/>
             <wp:cNvGraphicFramePr>
               <a:graphicFrameLocks xmlns:a="http://schemas.openxmlformats.org/drawingml/2006/main" noChangeAspect="1"/>
             </wp:cNvGraphicFramePr>
@@ -12702,7 +12844,7 @@
                     </pic:cNvPicPr>
                   </pic:nvPicPr>
                   <pic:blipFill>
-                    <a:blip r:embed="rId19" cstate="none"/>
+                    <a:blip r:embed="rId21" cstate="none"/>
                     <a:srcRect/>
                     <a:stretch>
                       <a:fillRect/>
@@ -12737,7 +12879,7 @@
           <w:sz w:val="18"/>
           <w:szCs w:val="18"/>
         </w:rPr>
-        <w:t xml:space="preserve">Fig. 11. </w:t>
+        <w:t xml:space="preserve">Fig. 13. </w:t>
       </w:r>
       <w:r>
         <w:rPr>
@@ -14585,7 +14727,27 @@
           <w:sz w:val="21"/>
           <w:szCs w:val="21"/>
         </w:rPr>
-        <w:t xml:space="preserve">El código, los resultados de los experimentos, los scripts de evaluación y los que generan las figuras y verifican las referencias están disponibles en https://github.com/OwerLopez/sato_peru_2026. Los datos brutos no se redistribuyen por su tamaño; se descargan de las fuentes oficiales con el pipeline incluido, que registra la URL y la huella SHA-256 de cada archivo usado.</w:t>
+        <w:t xml:space="preserve">El código, los resultados de los experimentos, los scripts de evaluación y los que generan las figuras y verifican las referencias están disponibles en </w:t>
+      </w:r>
+      <w:hyperlink w:history="1" r:id="rIdbh1g3sghnivkiepehdu-j">
+        <w:r>
+          <w:rPr>
+            <w:rFonts w:ascii="Arial" w:cs="Arial" w:eastAsia="Arial" w:hAnsi="Arial"/>
+            <w:color w:val="0563C1"/>
+            <w:sz w:val="21"/>
+            <w:szCs w:val="21"/>
+            <w:u w:val="single"/>
+          </w:rPr>
+          <w:t xml:space="preserve">https://github.com/OwerLopez/sato_peru_2026</w:t>
+        </w:r>
+      </w:hyperlink>
+      <w:r>
+        <w:rPr>
+          <w:rFonts w:ascii="Arial" w:cs="Arial" w:eastAsia="Arial" w:hAnsi="Arial"/>
+          <w:sz w:val="21"/>
+          <w:szCs w:val="21"/>
+        </w:rPr>
+        <w:t xml:space="preserve">. Los datos brutos no se redistribuyen por su tamaño; se descargan de las fuentes oficiales con el pipeline incluido, que registra la URL y la huella SHA-256 de cada archivo usado.</w:t>
       </w:r>
     </w:p>
     <w:p>
@@ -14805,7 +14967,27 @@
           <w:sz w:val="18"/>
           <w:szCs w:val="18"/>
         </w:rPr>
-        <w:t xml:space="preserve">Contraloría General de la República, "Obras paralizadas: documentos" (reportes trimestrales, cortes 2023-09 a 2026-06), Plataforma del Estado Peruano. [Online]. Available: https://www.gob.pe/institucion/contraloria/colecciones/18230-obras-paralizadas-documentos (accedido: 26 de septiembre de 2026).</w:t>
+        <w:t xml:space="preserve">Contraloría General de la República, "Obras paralizadas: documentos" (reportes trimestrales, cortes 2023-09 a 2026-06), Plataforma del Estado Peruano. [Online]. Available: </w:t>
+      </w:r>
+      <w:hyperlink w:history="1" r:id="rIdgarl-jgiihcx7utct7a2p">
+        <w:r>
+          <w:rPr>
+            <w:rFonts w:ascii="Arial" w:cs="Arial" w:eastAsia="Arial" w:hAnsi="Arial"/>
+            <w:color w:val="0563C1"/>
+            <w:sz w:val="18"/>
+            <w:szCs w:val="18"/>
+            <w:u w:val="single"/>
+          </w:rPr>
+          <w:t xml:space="preserve">https://www.gob.pe/institucion/contraloria/colecciones/18230-obras-paralizadas-documentos</w:t>
+        </w:r>
+      </w:hyperlink>
+      <w:r>
+        <w:rPr>
+          <w:rFonts w:ascii="Arial" w:cs="Arial" w:eastAsia="Arial" w:hAnsi="Arial"/>
+          <w:sz w:val="18"/>
+          <w:szCs w:val="18"/>
+        </w:rPr>
+        <w:t xml:space="preserve"> (accedido: 26 de septiembre de 2026).</w:t>
       </w:r>
     </w:p>
     <w:p>
@@ -14849,7 +15031,27 @@
           <w:sz w:val="18"/>
           <w:szCs w:val="18"/>
         </w:rPr>
-        <w:t xml:space="preserve">, 22 oct. 2022. [Online]. Available: https://www.mef.gob.pe/es/normatividad-inv-publica/instrumento/ley-inv-pub/30189-ley-n-31589/file (accedido: 26 de septiembre de 2026).</w:t>
+        <w:t xml:space="preserve">, 22 oct. 2022. [Online]. Available: </w:t>
+      </w:r>
+      <w:hyperlink w:history="1" r:id="rIdvjozptj8ovrp1zinlybcl">
+        <w:r>
+          <w:rPr>
+            <w:rFonts w:ascii="Arial" w:cs="Arial" w:eastAsia="Arial" w:hAnsi="Arial"/>
+            <w:color w:val="0563C1"/>
+            <w:sz w:val="18"/>
+            <w:szCs w:val="18"/>
+            <w:u w:val="single"/>
+          </w:rPr>
+          <w:t xml:space="preserve">https://www.mef.gob.pe/es/normatividad-inv-publica/instrumento/ley-inv-pub/30189-ley-n-31589/file</w:t>
+        </w:r>
+      </w:hyperlink>
+      <w:r>
+        <w:rPr>
+          <w:rFonts w:ascii="Arial" w:cs="Arial" w:eastAsia="Arial" w:hAnsi="Arial"/>
+          <w:sz w:val="18"/>
+          <w:szCs w:val="18"/>
+        </w:rPr>
+        <w:t xml:space="preserve"> (accedido: 26 de septiembre de 2026).</w:t>
       </w:r>
     </w:p>
     <w:p>
@@ -14875,7 +15077,27 @@
           <w:sz w:val="18"/>
           <w:szCs w:val="18"/>
         </w:rPr>
-        <w:t xml:space="preserve">Organismo Especializado para las Contrataciones Públicas Eficientes (OECE), "Datos abiertos del cuaderno de obra digital: cuadernos, asientos y valorizaciones" (archivos mensuales 2024-06 a 2026-08), enlazados desde la Plataforma Nacional de Datos Abiertos. [Online]. Available: https://www.datosabiertos.gob.pe (accedido: 26 de septiembre de 2026).</w:t>
+        <w:t xml:space="preserve">Organismo Especializado para las Contrataciones Públicas Eficientes (OECE), "Datos abiertos del cuaderno de obra digital: cuadernos, asientos y valorizaciones" (archivos mensuales 2024-06 a 2026-08), enlazados desde la Plataforma Nacional de Datos Abiertos. [Online]. Available: </w:t>
+      </w:r>
+      <w:hyperlink w:history="1" r:id="rIdswxeny4j5sdnfar-xj0ud">
+        <w:r>
+          <w:rPr>
+            <w:rFonts w:ascii="Arial" w:cs="Arial" w:eastAsia="Arial" w:hAnsi="Arial"/>
+            <w:color w:val="0563C1"/>
+            <w:sz w:val="18"/>
+            <w:szCs w:val="18"/>
+            <w:u w:val="single"/>
+          </w:rPr>
+          <w:t xml:space="preserve">https://www.datosabiertos.gob.pe</w:t>
+        </w:r>
+      </w:hyperlink>
+      <w:r>
+        <w:rPr>
+          <w:rFonts w:ascii="Arial" w:cs="Arial" w:eastAsia="Arial" w:hAnsi="Arial"/>
+          <w:sz w:val="18"/>
+          <w:szCs w:val="18"/>
+        </w:rPr>
+        <w:t xml:space="preserve"> (accedido: 26 de septiembre de 2026).</w:t>
       </w:r>
     </w:p>
     <w:p>
@@ -14901,7 +15123,27 @@
           <w:sz w:val="18"/>
           <w:szCs w:val="18"/>
         </w:rPr>
-        <w:t xml:space="preserve">Ministerio de Economía y Finanzas, "Plataforma de datos abiertos del MEF: Banco de Inversiones, Formato 12-B y ejecución presupuestal (SIAF)." [Online]. Available: https://datosabiertos.mef.gob.pe (accedido: 26 de septiembre de 2026).</w:t>
+        <w:t xml:space="preserve">Ministerio de Economía y Finanzas, "Plataforma de datos abiertos del MEF: Banco de Inversiones, Formato 12-B y ejecución presupuestal (SIAF)." [Online]. Available: </w:t>
+      </w:r>
+      <w:hyperlink w:history="1" r:id="rIdxvjrewqfgvjpy-voypkdp">
+        <w:r>
+          <w:rPr>
+            <w:rFonts w:ascii="Arial" w:cs="Arial" w:eastAsia="Arial" w:hAnsi="Arial"/>
+            <w:color w:val="0563C1"/>
+            <w:sz w:val="18"/>
+            <w:szCs w:val="18"/>
+            <w:u w:val="single"/>
+          </w:rPr>
+          <w:t xml:space="preserve">https://datosabiertos.mef.gob.pe</w:t>
+        </w:r>
+      </w:hyperlink>
+      <w:r>
+        <w:rPr>
+          <w:rFonts w:ascii="Arial" w:cs="Arial" w:eastAsia="Arial" w:hAnsi="Arial"/>
+          <w:sz w:val="18"/>
+          <w:szCs w:val="18"/>
+        </w:rPr>
+        <w:t xml:space="preserve"> (accedido: 26 de septiembre de 2026).</w:t>
       </w:r>
     </w:p>
     <w:p>
@@ -14927,7 +15169,27 @@
           <w:sz w:val="18"/>
           <w:szCs w:val="18"/>
         </w:rPr>
-        <w:t xml:space="preserve">Contraloría General de la República, "INFOBRAS: DataSet de obras públicas" (archivo XLSX generado el 25 sep. 2026). [Online]. Available: https://infobras.contraloria.gob.pe/InfobrasWeb/DataSets (accedido: 26 de septiembre de 2026).</w:t>
+        <w:t xml:space="preserve">Contraloría General de la República, "INFOBRAS: DataSet de obras públicas" (archivo XLSX generado el 25 sep. 2026). [Online]. Available: </w:t>
+      </w:r>
+      <w:hyperlink w:history="1" r:id="rIdijsfr6kiduiood_5ymrdn">
+        <w:r>
+          <w:rPr>
+            <w:rFonts w:ascii="Arial" w:cs="Arial" w:eastAsia="Arial" w:hAnsi="Arial"/>
+            <w:color w:val="0563C1"/>
+            <w:sz w:val="18"/>
+            <w:szCs w:val="18"/>
+            <w:u w:val="single"/>
+          </w:rPr>
+          <w:t xml:space="preserve">https://infobras.contraloria.gob.pe/InfobrasWeb/DataSets</w:t>
+        </w:r>
+      </w:hyperlink>
+      <w:r>
+        <w:rPr>
+          <w:rFonts w:ascii="Arial" w:cs="Arial" w:eastAsia="Arial" w:hAnsi="Arial"/>
+          <w:sz w:val="18"/>
+          <w:szCs w:val="18"/>
+        </w:rPr>
+        <w:t xml:space="preserve"> (accedido: 26 de septiembre de 2026).</w:t>
       </w:r>
     </w:p>
     <w:p>
@@ -14953,7 +15215,27 @@
           <w:sz w:val="18"/>
           <w:szCs w:val="18"/>
         </w:rPr>
-        <w:t xml:space="preserve">Ministerio de Economía y Finanzas, "Decreto Supremo N.° 344-2018-EF. Reglamento de la Ley N.° 30225, Ley de Contrataciones del Estado," Lima, Perú, 2018. [Online]. Available: https://www.gob.pe/institucion/mef/normas-legales/235964-344-2018-ef (accedido: 26 de septiembre de 2026).</w:t>
+        <w:t xml:space="preserve">Ministerio de Economía y Finanzas, "Decreto Supremo N.° 344-2018-EF. Reglamento de la Ley N.° 30225, Ley de Contrataciones del Estado," Lima, Perú, 2018. [Online]. Available: </w:t>
+      </w:r>
+      <w:hyperlink w:history="1" r:id="rIdnlvohgiryznq_wwonhrsk">
+        <w:r>
+          <w:rPr>
+            <w:rFonts w:ascii="Arial" w:cs="Arial" w:eastAsia="Arial" w:hAnsi="Arial"/>
+            <w:color w:val="0563C1"/>
+            <w:sz w:val="18"/>
+            <w:szCs w:val="18"/>
+            <w:u w:val="single"/>
+          </w:rPr>
+          <w:t xml:space="preserve">https://www.gob.pe/institucion/mef/normas-legales/235964-344-2018-ef</w:t>
+        </w:r>
+      </w:hyperlink>
+      <w:r>
+        <w:rPr>
+          <w:rFonts w:ascii="Arial" w:cs="Arial" w:eastAsia="Arial" w:hAnsi="Arial"/>
+          <w:sz w:val="18"/>
+          <w:szCs w:val="18"/>
+        </w:rPr>
+        <w:t xml:space="preserve"> (accedido: 26 de septiembre de 2026).</w:t>
       </w:r>
     </w:p>
     <w:p>
@@ -14979,7 +15261,27 @@
           <w:sz w:val="18"/>
           <w:szCs w:val="18"/>
         </w:rPr>
-        <w:t xml:space="preserve">Ministerio de Economía y Finanzas, "Decreto Supremo N.° 009-2025-EF. Reglamento de la Ley N.° 32069, Ley General de Contrataciones Públicas," Lima, Perú, 2025. [Online]. Available: https://www.gob.pe/institucion/mef/normas-legales/6401561-009-2025-ef (accedido: 26 de septiembre de 2026).</w:t>
+        <w:t xml:space="preserve">Ministerio de Economía y Finanzas, "Decreto Supremo N.° 009-2025-EF. Reglamento de la Ley N.° 32069, Ley General de Contrataciones Públicas," Lima, Perú, 2025. [Online]. Available: </w:t>
+      </w:r>
+      <w:hyperlink w:history="1" r:id="rIdye2f6i8l1oeuyx6u3ayjz">
+        <w:r>
+          <w:rPr>
+            <w:rFonts w:ascii="Arial" w:cs="Arial" w:eastAsia="Arial" w:hAnsi="Arial"/>
+            <w:color w:val="0563C1"/>
+            <w:sz w:val="18"/>
+            <w:szCs w:val="18"/>
+            <w:u w:val="single"/>
+          </w:rPr>
+          <w:t xml:space="preserve">https://www.gob.pe/institucion/mef/normas-legales/6401561-009-2025-ef</w:t>
+        </w:r>
+      </w:hyperlink>
+      <w:r>
+        <w:rPr>
+          <w:rFonts w:ascii="Arial" w:cs="Arial" w:eastAsia="Arial" w:hAnsi="Arial"/>
+          <w:sz w:val="18"/>
+          <w:szCs w:val="18"/>
+        </w:rPr>
+        <w:t xml:space="preserve"> (accedido: 26 de septiembre de 2026).</w:t>
       </w:r>
     </w:p>
     <w:p>
@@ -15727,7 +16029,27 @@
           <w:sz w:val="18"/>
           <w:szCs w:val="18"/>
         </w:rPr>
-        <w:t xml:space="preserve">Organismo Especializado para las Contrataciones Públicas Eficientes (OECE), "Ley N.° 32069, Ley General de Contrataciones Públicas, y su Reglamento" (compendio normativo), Plataforma del Estado Peruano. [Online]. Available: https://www.gob.pe/es/o/45029 (accedido: 26 de septiembre de 2026).</w:t>
+        <w:t xml:space="preserve">Organismo Especializado para las Contrataciones Públicas Eficientes (OECE), "Ley N.° 32069, Ley General de Contrataciones Públicas, y su Reglamento" (compendio normativo), Plataforma del Estado Peruano. [Online]. Available: </w:t>
+      </w:r>
+      <w:hyperlink w:history="1" r:id="rIdm_cloohnslzauzdbnodow">
+        <w:r>
+          <w:rPr>
+            <w:rFonts w:ascii="Arial" w:cs="Arial" w:eastAsia="Arial" w:hAnsi="Arial"/>
+            <w:color w:val="0563C1"/>
+            <w:sz w:val="18"/>
+            <w:szCs w:val="18"/>
+            <w:u w:val="single"/>
+          </w:rPr>
+          <w:t xml:space="preserve">https://www.gob.pe/es/o/45029</w:t>
+        </w:r>
+      </w:hyperlink>
+      <w:r>
+        <w:rPr>
+          <w:rFonts w:ascii="Arial" w:cs="Arial" w:eastAsia="Arial" w:hAnsi="Arial"/>
+          <w:sz w:val="18"/>
+          <w:szCs w:val="18"/>
+        </w:rPr>
+        <w:t xml:space="preserve"> (accedido: 26 de septiembre de 2026).</w:t>
       </w:r>
     </w:p>
     <w:p>
@@ -15947,8 +16269,20 @@
           <w:sz w:val="18"/>
           <w:szCs w:val="18"/>
         </w:rPr>
-        <w:t xml:space="preserve">, 2017. [Online]. Available: https://papers.nips.cc/paper_files/paper/2017/hash/8a20a8621978632d76c43dfd28b67767-Abstract.html</w:t>
-      </w:r>
+        <w:t xml:space="preserve">, 2017. [Online]. Available: </w:t>
+      </w:r>
+      <w:hyperlink w:history="1" r:id="rIdm0nazlibk9bzxcl_1ooan">
+        <w:r>
+          <w:rPr>
+            <w:rFonts w:ascii="Arial" w:cs="Arial" w:eastAsia="Arial" w:hAnsi="Arial"/>
+            <w:color w:val="0563C1"/>
+            <w:sz w:val="18"/>
+            <w:szCs w:val="18"/>
+            <w:u w:val="single"/>
+          </w:rPr>
+          <w:t xml:space="preserve">https://papers.nips.cc/paper_files/paper/2017/hash/8a20a8621978632d76c43dfd28b67767-Abstract.html</w:t>
+        </w:r>
+      </w:hyperlink>
     </w:p>
     <w:p>
       <w:pPr>
@@ -16299,7 +16633,27 @@
           <w:sz w:val="18"/>
           <w:szCs w:val="18"/>
         </w:rPr>
-        <w:t xml:space="preserve">OWASP Foundation, "OWASP Top 10:2021." [Online]. Available: https://owasp.org/Top10/ (accedido: 26 de septiembre de 2026).</w:t>
+        <w:t xml:space="preserve">OWASP Foundation, "OWASP Top 10:2021." [Online]. Available: </w:t>
+      </w:r>
+      <w:hyperlink w:history="1" r:id="rId0rtopymsbdmi67kine0cj">
+        <w:r>
+          <w:rPr>
+            <w:rFonts w:ascii="Arial" w:cs="Arial" w:eastAsia="Arial" w:hAnsi="Arial"/>
+            <w:color w:val="0563C1"/>
+            <w:sz w:val="18"/>
+            <w:szCs w:val="18"/>
+            <w:u w:val="single"/>
+          </w:rPr>
+          <w:t xml:space="preserve">https://owasp.org/Top10/</w:t>
+        </w:r>
+      </w:hyperlink>
+      <w:r>
+        <w:rPr>
+          <w:rFonts w:ascii="Arial" w:cs="Arial" w:eastAsia="Arial" w:hAnsi="Arial"/>
+          <w:sz w:val="18"/>
+          <w:szCs w:val="18"/>
+        </w:rPr>
+        <w:t xml:space="preserve"> (accedido: 26 de septiembre de 2026).</w:t>
       </w:r>
     </w:p>
     <w:p>
@@ -16493,8 +16847,20 @@
           <w:sz w:val="18"/>
           <w:szCs w:val="18"/>
         </w:rPr>
-        <w:t xml:space="preserve">, 2017. [Online]. Available: https://papers.nips.cc/paper_files/paper/2017/hash/6449f44a102fde848669bdd9eb6b76fa-Abstract.html</w:t>
-      </w:r>
+        <w:t xml:space="preserve">, 2017. [Online]. Available: </w:t>
+      </w:r>
+      <w:hyperlink w:history="1" r:id="rIdghla2jl46jote6jdwmby-">
+        <w:r>
+          <w:rPr>
+            <w:rFonts w:ascii="Arial" w:cs="Arial" w:eastAsia="Arial" w:hAnsi="Arial"/>
+            <w:color w:val="0563C1"/>
+            <w:sz w:val="18"/>
+            <w:szCs w:val="18"/>
+            <w:u w:val="single"/>
+          </w:rPr>
+          <w:t xml:space="preserve">https://papers.nips.cc/paper_files/paper/2017/hash/6449f44a102fde848669bdd9eb6b76fa-Abstract.html</w:t>
+        </w:r>
+      </w:hyperlink>
     </w:p>
     <w:p>
       <w:pPr>
@@ -16643,8 +17009,20 @@
           <w:sz w:val="18"/>
           <w:szCs w:val="18"/>
         </w:rPr>
-        <w:t xml:space="preserve">, vol. 12, pp. 2825–2830, 2011. [Online]. Available: https://jmlr.org/papers/v12/pedregosa11a.html</w:t>
-      </w:r>
+        <w:t xml:space="preserve">, vol. 12, pp. 2825–2830, 2011. [Online]. Available: </w:t>
+      </w:r>
+      <w:hyperlink w:history="1" r:id="rIdbkswx5kvdpz4fazwkkwhb">
+        <w:r>
+          <w:rPr>
+            <w:rFonts w:ascii="Arial" w:cs="Arial" w:eastAsia="Arial" w:hAnsi="Arial"/>
+            <w:color w:val="0563C1"/>
+            <w:sz w:val="18"/>
+            <w:szCs w:val="18"/>
+            <w:u w:val="single"/>
+          </w:rPr>
+          <w:t xml:space="preserve">https://jmlr.org/papers/v12/pedregosa11a.html</w:t>
+        </w:r>
+      </w:hyperlink>
     </w:p>
     <w:p>
       <w:pPr>

</xml_diff>

<commit_message>
docs(articulo): update prototype metrics with the current interface and test suite
Lighthouse re-measured on the redesigned interface (accessibility 100 on panorama, ficha and cartera) and the full suite re-run (192 passed, 0 failed).
</commit_message>
<xml_diff>
--- a/docs/articulo/Articulo_Cientifico_Final.docx
+++ b/docs/articulo/Articulo_Cientifico_Final.docx
@@ -12388,7 +12388,7 @@
                 <w:sz w:val="16"/>
                 <w:szCs w:val="16"/>
               </w:rPr>
-              <w:t xml:space="preserve">93, 99 y 99; LCP 1,67 s en el panorama</w:t>
+              <w:t xml:space="preserve">94, 99 y 100; LCP 1,60 s en el panorama</w:t>
             </w:r>
           </w:p>
         </w:tc>
@@ -12784,7 +12784,7 @@
           <w:sz w:val="16"/>
           <w:szCs w:val="16"/>
         </w:rPr>
-        <w:t xml:space="preserve">Nota: La prueba de carga se ejecutó directamente contra la API, con el límite de tasa de la aplicación elevado, porque un generador de carga desde una sola IP solo mediría el limitador. En la primera medición de la interfaz rediseñada la accesibilidad fue 100, 93 y 96; se corrigieron el contraste del texto secundario, un atributo ARIA no permitido y el desplazamiento del diseño al cargar los filtros. Fuente: docs/articulo/evaluacion/.</w:t>
+        <w:t xml:space="preserve">Nota: La prueba de carga se ejecutó directamente contra la API, con el límite de tasa de la aplicación elevado, porque un generador de carga desde una sola IP solo mediría el limitador. En la primera medición de la interfaz rediseñada la accesibilidad fue 100, 93 y 96; se corrigieron el contraste del texto secundario, un atributo ARIA no permitido y el desplazamiento del diseño al cargar los filtros. La medición vigente corresponde al sistema de diseño institucional (29 de septiembre de 2026); en ella se corrigió además un desplazamiento del pie de página que reducía el rendimiento del panorama. Fuente: docs/articulo/evaluacion/.</w:t>
       </w:r>
     </w:p>
     <w:p>
@@ -14729,7 +14729,7 @@
         </w:rPr>
         <w:t xml:space="preserve">El código, los resultados de los experimentos, los scripts de evaluación y los que generan las figuras y verifican las referencias están disponibles en </w:t>
       </w:r>
-      <w:hyperlink w:history="1" r:id="rIdbh1g3sghnivkiepehdu-j">
+      <w:hyperlink w:history="1" r:id="rIdld84llffmvspl1dojkzyh">
         <w:r>
           <w:rPr>
             <w:rFonts w:ascii="Arial" w:cs="Arial" w:eastAsia="Arial" w:hAnsi="Arial"/>
@@ -14969,7 +14969,7 @@
         </w:rPr>
         <w:t xml:space="preserve">Contraloría General de la República, "Obras paralizadas: documentos" (reportes trimestrales, cortes 2023-09 a 2026-06), Plataforma del Estado Peruano. [Online]. Available: </w:t>
       </w:r>
-      <w:hyperlink w:history="1" r:id="rIdgarl-jgiihcx7utct7a2p">
+      <w:hyperlink w:history="1" r:id="rIdzxlklbmxrp_07arsuk8pr">
         <w:r>
           <w:rPr>
             <w:rFonts w:ascii="Arial" w:cs="Arial" w:eastAsia="Arial" w:hAnsi="Arial"/>
@@ -15033,7 +15033,7 @@
         </w:rPr>
         <w:t xml:space="preserve">, 22 oct. 2022. [Online]. Available: </w:t>
       </w:r>
-      <w:hyperlink w:history="1" r:id="rIdvjozptj8ovrp1zinlybcl">
+      <w:hyperlink w:history="1" r:id="rIdz2t2xikspmvlxyaqx-3pn">
         <w:r>
           <w:rPr>
             <w:rFonts w:ascii="Arial" w:cs="Arial" w:eastAsia="Arial" w:hAnsi="Arial"/>
@@ -15079,7 +15079,7 @@
         </w:rPr>
         <w:t xml:space="preserve">Organismo Especializado para las Contrataciones Públicas Eficientes (OECE), "Datos abiertos del cuaderno de obra digital: cuadernos, asientos y valorizaciones" (archivos mensuales 2024-06 a 2026-08), enlazados desde la Plataforma Nacional de Datos Abiertos. [Online]. Available: </w:t>
       </w:r>
-      <w:hyperlink w:history="1" r:id="rIdswxeny4j5sdnfar-xj0ud">
+      <w:hyperlink w:history="1" r:id="rIdknhdoct1smc89nnqef_gp">
         <w:r>
           <w:rPr>
             <w:rFonts w:ascii="Arial" w:cs="Arial" w:eastAsia="Arial" w:hAnsi="Arial"/>
@@ -15125,7 +15125,7 @@
         </w:rPr>
         <w:t xml:space="preserve">Ministerio de Economía y Finanzas, "Plataforma de datos abiertos del MEF: Banco de Inversiones, Formato 12-B y ejecución presupuestal (SIAF)." [Online]. Available: </w:t>
       </w:r>
-      <w:hyperlink w:history="1" r:id="rIdxvjrewqfgvjpy-voypkdp">
+      <w:hyperlink w:history="1" r:id="rIdaknjwvwajkcwyo2e3uzaq">
         <w:r>
           <w:rPr>
             <w:rFonts w:ascii="Arial" w:cs="Arial" w:eastAsia="Arial" w:hAnsi="Arial"/>
@@ -15171,7 +15171,7 @@
         </w:rPr>
         <w:t xml:space="preserve">Contraloría General de la República, "INFOBRAS: DataSet de obras públicas" (archivo XLSX generado el 25 sep. 2026). [Online]. Available: </w:t>
       </w:r>
-      <w:hyperlink w:history="1" r:id="rIdijsfr6kiduiood_5ymrdn">
+      <w:hyperlink w:history="1" r:id="rIds3a8wnba10zm4ncv98znl">
         <w:r>
           <w:rPr>
             <w:rFonts w:ascii="Arial" w:cs="Arial" w:eastAsia="Arial" w:hAnsi="Arial"/>
@@ -15217,7 +15217,7 @@
         </w:rPr>
         <w:t xml:space="preserve">Ministerio de Economía y Finanzas, "Decreto Supremo N.° 344-2018-EF. Reglamento de la Ley N.° 30225, Ley de Contrataciones del Estado," Lima, Perú, 2018. [Online]. Available: </w:t>
       </w:r>
-      <w:hyperlink w:history="1" r:id="rIdnlvohgiryznq_wwonhrsk">
+      <w:hyperlink w:history="1" r:id="rIdyjuyx7rztp072tn8ykfw7">
         <w:r>
           <w:rPr>
             <w:rFonts w:ascii="Arial" w:cs="Arial" w:eastAsia="Arial" w:hAnsi="Arial"/>
@@ -15263,7 +15263,7 @@
         </w:rPr>
         <w:t xml:space="preserve">Ministerio de Economía y Finanzas, "Decreto Supremo N.° 009-2025-EF. Reglamento de la Ley N.° 32069, Ley General de Contrataciones Públicas," Lima, Perú, 2025. [Online]. Available: </w:t>
       </w:r>
-      <w:hyperlink w:history="1" r:id="rIdye2f6i8l1oeuyx6u3ayjz">
+      <w:hyperlink w:history="1" r:id="rIdz5gy3uyirkp-b_xqbgs_g">
         <w:r>
           <w:rPr>
             <w:rFonts w:ascii="Arial" w:cs="Arial" w:eastAsia="Arial" w:hAnsi="Arial"/>
@@ -16031,7 +16031,7 @@
         </w:rPr>
         <w:t xml:space="preserve">Organismo Especializado para las Contrataciones Públicas Eficientes (OECE), "Ley N.° 32069, Ley General de Contrataciones Públicas, y su Reglamento" (compendio normativo), Plataforma del Estado Peruano. [Online]. Available: </w:t>
       </w:r>
-      <w:hyperlink w:history="1" r:id="rIdm_cloohnslzauzdbnodow">
+      <w:hyperlink w:history="1" r:id="rIdtn0qflpneknp2fnjyodti">
         <w:r>
           <w:rPr>
             <w:rFonts w:ascii="Arial" w:cs="Arial" w:eastAsia="Arial" w:hAnsi="Arial"/>
@@ -16271,7 +16271,7 @@
         </w:rPr>
         <w:t xml:space="preserve">, 2017. [Online]. Available: </w:t>
       </w:r>
-      <w:hyperlink w:history="1" r:id="rIdm0nazlibk9bzxcl_1ooan">
+      <w:hyperlink w:history="1" r:id="rIdxnoneok0ap3lljnn9v9ib">
         <w:r>
           <w:rPr>
             <w:rFonts w:ascii="Arial" w:cs="Arial" w:eastAsia="Arial" w:hAnsi="Arial"/>
@@ -16635,7 +16635,7 @@
         </w:rPr>
         <w:t xml:space="preserve">OWASP Foundation, "OWASP Top 10:2021." [Online]. Available: </w:t>
       </w:r>
-      <w:hyperlink w:history="1" r:id="rId0rtopymsbdmi67kine0cj">
+      <w:hyperlink w:history="1" r:id="rIduseypezjwd-dyj1yylzlb">
         <w:r>
           <w:rPr>
             <w:rFonts w:ascii="Arial" w:cs="Arial" w:eastAsia="Arial" w:hAnsi="Arial"/>
@@ -16849,7 +16849,7 @@
         </w:rPr>
         <w:t xml:space="preserve">, 2017. [Online]. Available: </w:t>
       </w:r>
-      <w:hyperlink w:history="1" r:id="rIdghla2jl46jote6jdwmby-">
+      <w:hyperlink w:history="1" r:id="rIdljnn6fukwzgatznczneca">
         <w:r>
           <w:rPr>
             <w:rFonts w:ascii="Arial" w:cs="Arial" w:eastAsia="Arial" w:hAnsi="Arial"/>
@@ -17011,7 +17011,7 @@
         </w:rPr>
         <w:t xml:space="preserve">, vol. 12, pp. 2825–2830, 2011. [Online]. Available: </w:t>
       </w:r>
-      <w:hyperlink w:history="1" r:id="rIdbkswx5kvdpz4fazwkkwhb">
+      <w:hyperlink w:history="1" r:id="rIdzjy5wb7vdomfxs_eubfvg">
         <w:r>
           <w:rPr>
             <w:rFonts w:ascii="Arial" w:cs="Arial" w:eastAsia="Arial" w:hAnsi="Arial"/>

</xml_diff>